<commit_message>
continuando o site junto do professor Space for Men
</commit_message>
<xml_diff>
--- a/apostila/Projeto Space For Men.docx
+++ b/apostila/Projeto Space For Men.docx
@@ -4941,6 +4941,9 @@
     </w:p>
     <w:p>
       <w:r>
+        <w:rPr>
+          <w:noProof/>
+        </w:rPr>
         <w:drawing>
           <wp:inline distT="0" distB="0" distL="0" distR="0" wp14:anchorId="365C0DA4" wp14:editId="176D8E5A">
             <wp:extent cx="3790950" cy="2936751"/>
@@ -5071,6 +5074,9 @@
         </mc:AlternateContent>
       </w:r>
       <w:r>
+        <w:rPr>
+          <w:noProof/>
+        </w:rPr>
         <w:drawing>
           <wp:inline distT="0" distB="0" distL="0" distR="0" wp14:anchorId="7EFBDAE4" wp14:editId="44235A96">
             <wp:extent cx="3810000" cy="2928583"/>
@@ -5108,6 +5114,9 @@
         </w:drawing>
       </w:r>
       <w:r>
+        <w:rPr>
+          <w:noProof/>
+        </w:rPr>
         <w:drawing>
           <wp:inline distT="0" distB="0" distL="0" distR="0" wp14:anchorId="7B77AA22" wp14:editId="7000AF56">
             <wp:extent cx="2446020" cy="847725"/>
@@ -5145,6 +5154,9 @@
         </w:drawing>
       </w:r>
       <w:r>
+        <w:rPr>
+          <w:noProof/>
+        </w:rPr>
         <w:drawing>
           <wp:inline distT="0" distB="0" distL="0" distR="0" wp14:anchorId="4EDBDD20" wp14:editId="6BD1C4FD">
             <wp:extent cx="2762250" cy="1062154"/>
@@ -5275,6 +5287,9 @@
         </mc:AlternateContent>
       </w:r>
       <w:r>
+        <w:rPr>
+          <w:noProof/>
+        </w:rPr>
         <w:drawing>
           <wp:inline distT="0" distB="0" distL="0" distR="0" wp14:anchorId="33C68F42" wp14:editId="183B90DE">
             <wp:extent cx="1743075" cy="973718"/>
@@ -5312,6 +5327,9 @@
         </w:drawing>
       </w:r>
       <w:r>
+        <w:rPr>
+          <w:noProof/>
+        </w:rPr>
         <w:drawing>
           <wp:inline distT="0" distB="0" distL="0" distR="0" wp14:anchorId="33695B02" wp14:editId="31113328">
             <wp:extent cx="5400040" cy="2551430"/>
@@ -5372,6 +5390,9 @@
     </w:p>
     <w:p>
       <w:r>
+        <w:rPr>
+          <w:noProof/>
+        </w:rPr>
         <w:drawing>
           <wp:inline distT="0" distB="0" distL="0" distR="0" wp14:anchorId="7F8A987F" wp14:editId="26D1AE5F">
             <wp:extent cx="2476500" cy="1068064"/>
@@ -5409,6 +5430,9 @@
         </w:drawing>
       </w:r>
       <w:r>
+        <w:rPr>
+          <w:noProof/>
+        </w:rPr>
         <w:drawing>
           <wp:inline distT="0" distB="0" distL="0" distR="0" wp14:anchorId="7A5579ED" wp14:editId="06B84519">
             <wp:extent cx="2771775" cy="1060277"/>
@@ -5586,6 +5610,9 @@
     </w:p>
     <w:p>
       <w:r>
+        <w:rPr>
+          <w:noProof/>
+        </w:rPr>
         <w:drawing>
           <wp:inline distT="0" distB="0" distL="0" distR="0" wp14:anchorId="75C44A34" wp14:editId="1B5E730F">
             <wp:extent cx="2076740" cy="1314633"/>
@@ -5656,6 +5683,9 @@
     </w:p>
     <w:p>
       <w:r>
+        <w:rPr>
+          <w:noProof/>
+        </w:rPr>
         <w:drawing>
           <wp:inline distT="0" distB="0" distL="0" distR="0" wp14:anchorId="2104E447" wp14:editId="4CC9BCDD">
             <wp:extent cx="1743318" cy="1038370"/>
@@ -5724,6 +5754,9 @@
     </w:p>
     <w:p>
       <w:r>
+        <w:rPr>
+          <w:noProof/>
+        </w:rPr>
         <w:drawing>
           <wp:inline distT="0" distB="0" distL="0" distR="0" wp14:anchorId="18A9770E" wp14:editId="68152A0E">
             <wp:extent cx="1695687" cy="1457528"/>
@@ -5919,6 +5952,9 @@
     </w:p>
     <w:p>
       <w:r>
+        <w:rPr>
+          <w:noProof/>
+        </w:rPr>
         <w:drawing>
           <wp:inline distT="0" distB="0" distL="0" distR="0" wp14:anchorId="1AB46E05" wp14:editId="5391E352">
             <wp:extent cx="3067050" cy="1963049"/>
@@ -5956,6 +5992,9 @@
         </w:drawing>
       </w:r>
       <w:r>
+        <w:rPr>
+          <w:noProof/>
+        </w:rPr>
         <w:drawing>
           <wp:inline distT="0" distB="0" distL="0" distR="0" wp14:anchorId="390EB139" wp14:editId="7CAC3088">
             <wp:extent cx="3785992" cy="1504950"/>
@@ -5992,10 +6031,1423 @@
           </wp:inline>
         </w:drawing>
       </w:r>
+    </w:p>
+    <w:p/>
+    <w:p/>
+    <w:p/>
+    <w:p>
+      <w:r>
+        <w:rPr>
+          <w:noProof/>
+        </w:rPr>
+        <w:lastRenderedPageBreak/>
+        <mc:AlternateContent>
+          <mc:Choice Requires="wps">
+            <w:drawing>
+              <wp:anchor distT="0" distB="0" distL="114300" distR="114300" simplePos="0" relativeHeight="251697152" behindDoc="0" locked="0" layoutInCell="1" allowOverlap="1">
+                <wp:simplePos x="0" y="0"/>
+                <wp:positionH relativeFrom="column">
+                  <wp:posOffset>1367790</wp:posOffset>
+                </wp:positionH>
+                <wp:positionV relativeFrom="paragraph">
+                  <wp:posOffset>167005</wp:posOffset>
+                </wp:positionV>
+                <wp:extent cx="1200150" cy="828675"/>
+                <wp:effectExtent l="38100" t="0" r="19050" b="47625"/>
+                <wp:wrapNone/>
+                <wp:docPr id="106" name="Conector de Seta Reta 106"/>
+                <wp:cNvGraphicFramePr/>
+                <a:graphic xmlns:a="http://schemas.openxmlformats.org/drawingml/2006/main">
+                  <a:graphicData uri="http://schemas.microsoft.com/office/word/2010/wordprocessingShape">
+                    <wps:wsp>
+                      <wps:cNvCnPr/>
+                      <wps:spPr>
+                        <a:xfrm flipH="1">
+                          <a:off x="0" y="0"/>
+                          <a:ext cx="1200150" cy="828675"/>
+                        </a:xfrm>
+                        <a:prstGeom prst="straightConnector1">
+                          <a:avLst/>
+                        </a:prstGeom>
+                        <a:ln>
+                          <a:tailEnd type="triangle"/>
+                        </a:ln>
+                      </wps:spPr>
+                      <wps:style>
+                        <a:lnRef idx="1">
+                          <a:schemeClr val="accent1"/>
+                        </a:lnRef>
+                        <a:fillRef idx="0">
+                          <a:schemeClr val="accent1"/>
+                        </a:fillRef>
+                        <a:effectRef idx="0">
+                          <a:schemeClr val="accent1"/>
+                        </a:effectRef>
+                        <a:fontRef idx="minor">
+                          <a:schemeClr val="tx1"/>
+                        </a:fontRef>
+                      </wps:style>
+                      <wps:bodyPr/>
+                    </wps:wsp>
+                  </a:graphicData>
+                </a:graphic>
+              </wp:anchor>
+            </w:drawing>
+          </mc:Choice>
+          <mc:Fallback>
+            <w:pict>
+              <v:shapetype w14:anchorId="25931D57" id="_x0000_t32" coordsize="21600,21600" o:spt="32" o:oned="t" path="m,l21600,21600e" filled="f">
+                <v:path arrowok="t" fillok="f" o:connecttype="none"/>
+                <o:lock v:ext="edit" shapetype="t"/>
+              </v:shapetype>
+              <v:shape id="Conector de Seta Reta 106" o:spid="_x0000_s1026" type="#_x0000_t32" style="position:absolute;margin-left:107.7pt;margin-top:13.15pt;width:94.5pt;height:65.25pt;flip:x;z-index:251697152;visibility:visible;mso-wrap-style:square;mso-wrap-distance-left:9pt;mso-wrap-distance-top:0;mso-wrap-distance-right:9pt;mso-wrap-distance-bottom:0;mso-position-horizontal:absolute;mso-position-horizontal-relative:text;mso-position-vertical:absolute;mso-position-vertical-relative:text" o:gfxdata="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" strokecolor="#4472c4 [3204]" strokeweight=".5pt">
+                <v:stroke endarrow="block" joinstyle="miter"/>
+              </v:shape>
+            </w:pict>
+          </mc:Fallback>
+        </mc:AlternateContent>
+      </w:r>
+      <w:r>
+        <w:t xml:space="preserve">40 – Na </w:t>
+      </w:r>
+      <w:proofErr w:type="spellStart"/>
+      <w:r>
+        <w:t>Class</w:t>
+      </w:r>
+      <w:proofErr w:type="spellEnd"/>
+      <w:r>
+        <w:t xml:space="preserve"> produtos inserimos um espaço interno que aumentou o tamanho tanto para cima como para baixo.</w:t>
+      </w:r>
+    </w:p>
+    <w:p>
+      <w:pPr>
+        <w:rPr>
+          <w:noProof/>
+        </w:rPr>
+      </w:pPr>
+      <w:r>
+        <w:rPr>
+          <w:noProof/>
+        </w:rPr>
+        <w:t xml:space="preserve"> </w:t>
+      </w:r>
+      <w:r>
+        <w:drawing>
+          <wp:inline distT="0" distB="0" distL="0" distR="0" wp14:anchorId="763AEFCE" wp14:editId="1E2355DD">
+            <wp:extent cx="1448002" cy="866896"/>
+            <wp:effectExtent l="0" t="0" r="0" b="9525"/>
+            <wp:docPr id="91" name="Imagem 91"/>
+            <wp:cNvGraphicFramePr>
+              <a:graphicFrameLocks xmlns:a="http://schemas.openxmlformats.org/drawingml/2006/main" noChangeAspect="1"/>
+            </wp:cNvGraphicFramePr>
+            <a:graphic xmlns:a="http://schemas.openxmlformats.org/drawingml/2006/main">
+              <a:graphicData uri="http://schemas.openxmlformats.org/drawingml/2006/picture">
+                <pic:pic xmlns:pic="http://schemas.openxmlformats.org/drawingml/2006/picture">
+                  <pic:nvPicPr>
+                    <pic:cNvPr id="1" name=""/>
+                    <pic:cNvPicPr/>
+                  </pic:nvPicPr>
+                  <pic:blipFill>
+                    <a:blip r:embed="rId76"/>
+                    <a:stretch>
+                      <a:fillRect/>
+                    </a:stretch>
+                  </pic:blipFill>
+                  <pic:spPr>
+                    <a:xfrm>
+                      <a:off x="0" y="0"/>
+                      <a:ext cx="1448002" cy="866896"/>
+                    </a:xfrm>
+                    <a:prstGeom prst="rect">
+                      <a:avLst/>
+                    </a:prstGeom>
+                  </pic:spPr>
+                </pic:pic>
+              </a:graphicData>
+            </a:graphic>
+          </wp:inline>
+        </w:drawing>
+      </w:r>
+      <w:r>
+        <w:rPr>
+          <w:noProof/>
+        </w:rPr>
+        <w:drawing>
+          <wp:inline distT="0" distB="0" distL="0" distR="0" wp14:anchorId="0FED3045" wp14:editId="6D6D1E6F">
+            <wp:extent cx="4010025" cy="3179163"/>
+            <wp:effectExtent l="0" t="0" r="0" b="2540"/>
+            <wp:docPr id="105" name="Imagem 105"/>
+            <wp:cNvGraphicFramePr>
+              <a:graphicFrameLocks xmlns:a="http://schemas.openxmlformats.org/drawingml/2006/main" noChangeAspect="1"/>
+            </wp:cNvGraphicFramePr>
+            <a:graphic xmlns:a="http://schemas.openxmlformats.org/drawingml/2006/main">
+              <a:graphicData uri="http://schemas.openxmlformats.org/drawingml/2006/picture">
+                <pic:pic xmlns:pic="http://schemas.openxmlformats.org/drawingml/2006/picture">
+                  <pic:nvPicPr>
+                    <pic:cNvPr id="1" name=""/>
+                    <pic:cNvPicPr/>
+                  </pic:nvPicPr>
+                  <pic:blipFill>
+                    <a:blip r:embed="rId77"/>
+                    <a:stretch>
+                      <a:fillRect/>
+                    </a:stretch>
+                  </pic:blipFill>
+                  <pic:spPr>
+                    <a:xfrm>
+                      <a:off x="0" y="0"/>
+                      <a:ext cx="4272444" cy="3387210"/>
+                    </a:xfrm>
+                    <a:prstGeom prst="rect">
+                      <a:avLst/>
+                    </a:prstGeom>
+                  </pic:spPr>
+                </pic:pic>
+              </a:graphicData>
+            </a:graphic>
+          </wp:inline>
+        </w:drawing>
+      </w:r>
+    </w:p>
+    <w:p>
+      <w:r>
+        <w:rPr>
+          <w:noProof/>
+        </w:rPr>
+        <mc:AlternateContent>
+          <mc:Choice Requires="wps">
+            <w:drawing>
+              <wp:anchor distT="0" distB="0" distL="114300" distR="114300" simplePos="0" relativeHeight="251699200" behindDoc="0" locked="0" layoutInCell="1" allowOverlap="1">
+                <wp:simplePos x="0" y="0"/>
+                <wp:positionH relativeFrom="column">
+                  <wp:posOffset>4091939</wp:posOffset>
+                </wp:positionH>
+                <wp:positionV relativeFrom="paragraph">
+                  <wp:posOffset>187960</wp:posOffset>
+                </wp:positionV>
+                <wp:extent cx="1238250" cy="2686050"/>
+                <wp:effectExtent l="38100" t="0" r="19050" b="57150"/>
+                <wp:wrapNone/>
+                <wp:docPr id="112" name="Conector de Seta Reta 112"/>
+                <wp:cNvGraphicFramePr/>
+                <a:graphic xmlns:a="http://schemas.openxmlformats.org/drawingml/2006/main">
+                  <a:graphicData uri="http://schemas.microsoft.com/office/word/2010/wordprocessingShape">
+                    <wps:wsp>
+                      <wps:cNvCnPr/>
+                      <wps:spPr>
+                        <a:xfrm flipH="1">
+                          <a:off x="0" y="0"/>
+                          <a:ext cx="1238250" cy="2686050"/>
+                        </a:xfrm>
+                        <a:prstGeom prst="straightConnector1">
+                          <a:avLst/>
+                        </a:prstGeom>
+                        <a:ln>
+                          <a:tailEnd type="triangle"/>
+                        </a:ln>
+                      </wps:spPr>
+                      <wps:style>
+                        <a:lnRef idx="1">
+                          <a:schemeClr val="accent1"/>
+                        </a:lnRef>
+                        <a:fillRef idx="0">
+                          <a:schemeClr val="accent1"/>
+                        </a:fillRef>
+                        <a:effectRef idx="0">
+                          <a:schemeClr val="accent1"/>
+                        </a:effectRef>
+                        <a:fontRef idx="minor">
+                          <a:schemeClr val="tx1"/>
+                        </a:fontRef>
+                      </wps:style>
+                      <wps:bodyPr/>
+                    </wps:wsp>
+                  </a:graphicData>
+                </a:graphic>
+                <wp14:sizeRelH relativeFrom="margin">
+                  <wp14:pctWidth>0</wp14:pctWidth>
+                </wp14:sizeRelH>
+                <wp14:sizeRelV relativeFrom="margin">
+                  <wp14:pctHeight>0</wp14:pctHeight>
+                </wp14:sizeRelV>
+              </wp:anchor>
+            </w:drawing>
+          </mc:Choice>
+          <mc:Fallback>
+            <w:pict>
+              <v:shape w14:anchorId="36B5A888" id="Conector de Seta Reta 112" o:spid="_x0000_s1026" type="#_x0000_t32" style="position:absolute;margin-left:322.2pt;margin-top:14.8pt;width:97.5pt;height:211.5pt;flip:x;z-index:251699200;visibility:visible;mso-wrap-style:square;mso-width-percent:0;mso-height-percent:0;mso-wrap-distance-left:9pt;mso-wrap-distance-top:0;mso-wrap-distance-right:9pt;mso-wrap-distance-bottom:0;mso-position-horizontal:absolute;mso-position-horizontal-relative:text;mso-position-vertical:absolute;mso-position-vertical-relative:text;mso-width-percent:0;mso-height-percent:0;mso-width-relative:margin;mso-height-relative:margin" o:gfxdata="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" strokecolor="#4472c4 [3204]" strokeweight=".5pt">
+                <v:stroke endarrow="block" joinstyle="miter"/>
+              </v:shape>
+            </w:pict>
+          </mc:Fallback>
+        </mc:AlternateContent>
+      </w:r>
+      <w:r>
+        <w:rPr>
+          <w:noProof/>
+        </w:rPr>
+        <mc:AlternateContent>
+          <mc:Choice Requires="wps">
+            <w:drawing>
+              <wp:anchor distT="0" distB="0" distL="114300" distR="114300" simplePos="0" relativeHeight="251698176" behindDoc="0" locked="0" layoutInCell="1" allowOverlap="1">
+                <wp:simplePos x="0" y="0"/>
+                <wp:positionH relativeFrom="column">
+                  <wp:posOffset>967740</wp:posOffset>
+                </wp:positionH>
+                <wp:positionV relativeFrom="paragraph">
+                  <wp:posOffset>340359</wp:posOffset>
+                </wp:positionV>
+                <wp:extent cx="2400300" cy="2581275"/>
+                <wp:effectExtent l="0" t="0" r="57150" b="47625"/>
+                <wp:wrapNone/>
+                <wp:docPr id="111" name="Conector de Seta Reta 111"/>
+                <wp:cNvGraphicFramePr/>
+                <a:graphic xmlns:a="http://schemas.openxmlformats.org/drawingml/2006/main">
+                  <a:graphicData uri="http://schemas.microsoft.com/office/word/2010/wordprocessingShape">
+                    <wps:wsp>
+                      <wps:cNvCnPr/>
+                      <wps:spPr>
+                        <a:xfrm>
+                          <a:off x="0" y="0"/>
+                          <a:ext cx="2400300" cy="2581275"/>
+                        </a:xfrm>
+                        <a:prstGeom prst="straightConnector1">
+                          <a:avLst/>
+                        </a:prstGeom>
+                        <a:ln>
+                          <a:tailEnd type="triangle"/>
+                        </a:ln>
+                      </wps:spPr>
+                      <wps:style>
+                        <a:lnRef idx="1">
+                          <a:schemeClr val="accent1"/>
+                        </a:lnRef>
+                        <a:fillRef idx="0">
+                          <a:schemeClr val="accent1"/>
+                        </a:fillRef>
+                        <a:effectRef idx="0">
+                          <a:schemeClr val="accent1"/>
+                        </a:effectRef>
+                        <a:fontRef idx="minor">
+                          <a:schemeClr val="tx1"/>
+                        </a:fontRef>
+                      </wps:style>
+                      <wps:bodyPr/>
+                    </wps:wsp>
+                  </a:graphicData>
+                </a:graphic>
+              </wp:anchor>
+            </w:drawing>
+          </mc:Choice>
+          <mc:Fallback>
+            <w:pict>
+              <v:shape w14:anchorId="63E3394D" id="Conector de Seta Reta 111" o:spid="_x0000_s1026" type="#_x0000_t32" style="position:absolute;margin-left:76.2pt;margin-top:26.8pt;width:189pt;height:203.25pt;z-index:251698176;visibility:visible;mso-wrap-style:square;mso-wrap-distance-left:9pt;mso-wrap-distance-top:0;mso-wrap-distance-right:9pt;mso-wrap-distance-bottom:0;mso-position-horizontal:absolute;mso-position-horizontal-relative:text;mso-position-vertical:absolute;mso-position-vertical-relative:text" o:gfxdata="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" strokecolor="#4472c4 [3204]" strokeweight=".5pt">
+                <v:stroke endarrow="block" joinstyle="miter"/>
+              </v:shape>
+            </w:pict>
+          </mc:Fallback>
+        </mc:AlternateContent>
+      </w:r>
+      <w:r>
+        <w:t xml:space="preserve">41 – </w:t>
+      </w:r>
+      <w:proofErr w:type="gramStart"/>
+      <w:r>
+        <w:t>No produtos</w:t>
+      </w:r>
+      <w:proofErr w:type="gramEnd"/>
+      <w:r>
+        <w:t xml:space="preserve"> li adicionamos um espaço interno para cima como para baixo e para direita e para a esquerda.</w:t>
+      </w:r>
+    </w:p>
+    <w:p>
+      <w:r>
+        <w:drawing>
+          <wp:inline distT="0" distB="0" distL="0" distR="0" wp14:anchorId="13758231" wp14:editId="2E388B2E">
+            <wp:extent cx="2381250" cy="2628035"/>
+            <wp:effectExtent l="0" t="0" r="0" b="1270"/>
+            <wp:docPr id="107" name="Imagem 107"/>
+            <wp:cNvGraphicFramePr>
+              <a:graphicFrameLocks xmlns:a="http://schemas.openxmlformats.org/drawingml/2006/main" noChangeAspect="1"/>
+            </wp:cNvGraphicFramePr>
+            <a:graphic xmlns:a="http://schemas.openxmlformats.org/drawingml/2006/main">
+              <a:graphicData uri="http://schemas.openxmlformats.org/drawingml/2006/picture">
+                <pic:pic xmlns:pic="http://schemas.openxmlformats.org/drawingml/2006/picture">
+                  <pic:nvPicPr>
+                    <pic:cNvPr id="1" name=""/>
+                    <pic:cNvPicPr/>
+                  </pic:nvPicPr>
+                  <pic:blipFill>
+                    <a:blip r:embed="rId78"/>
+                    <a:stretch>
+                      <a:fillRect/>
+                    </a:stretch>
+                  </pic:blipFill>
+                  <pic:spPr>
+                    <a:xfrm>
+                      <a:off x="0" y="0"/>
+                      <a:ext cx="2394114" cy="2642232"/>
+                    </a:xfrm>
+                    <a:prstGeom prst="rect">
+                      <a:avLst/>
+                    </a:prstGeom>
+                  </pic:spPr>
+                </pic:pic>
+              </a:graphicData>
+            </a:graphic>
+          </wp:inline>
+        </w:drawing>
+      </w:r>
+      <w:r>
+        <w:drawing>
+          <wp:inline distT="0" distB="0" distL="0" distR="0" wp14:anchorId="49FE2E4F" wp14:editId="4D287141">
+            <wp:extent cx="2390775" cy="1609725"/>
+            <wp:effectExtent l="0" t="0" r="9525" b="9525"/>
+            <wp:docPr id="108" name="Imagem 108"/>
+            <wp:cNvGraphicFramePr>
+              <a:graphicFrameLocks xmlns:a="http://schemas.openxmlformats.org/drawingml/2006/main" noChangeAspect="1"/>
+            </wp:cNvGraphicFramePr>
+            <a:graphic xmlns:a="http://schemas.openxmlformats.org/drawingml/2006/main">
+              <a:graphicData uri="http://schemas.openxmlformats.org/drawingml/2006/picture">
+                <pic:pic xmlns:pic="http://schemas.openxmlformats.org/drawingml/2006/picture">
+                  <pic:nvPicPr>
+                    <pic:cNvPr id="1" name=""/>
+                    <pic:cNvPicPr/>
+                  </pic:nvPicPr>
+                  <pic:blipFill>
+                    <a:blip r:embed="rId79"/>
+                    <a:stretch>
+                      <a:fillRect/>
+                    </a:stretch>
+                  </pic:blipFill>
+                  <pic:spPr>
+                    <a:xfrm>
+                      <a:off x="0" y="0"/>
+                      <a:ext cx="2391152" cy="1609979"/>
+                    </a:xfrm>
+                    <a:prstGeom prst="rect">
+                      <a:avLst/>
+                    </a:prstGeom>
+                  </pic:spPr>
+                </pic:pic>
+              </a:graphicData>
+            </a:graphic>
+          </wp:inline>
+        </w:drawing>
+      </w:r>
+    </w:p>
+    <w:p/>
+    <w:p/>
+    <w:p/>
+    <w:p>
+      <w:r>
+        <w:rPr>
+          <w:noProof/>
+        </w:rPr>
+        <w:lastRenderedPageBreak/>
+        <mc:AlternateContent>
+          <mc:Choice Requires="wps">
+            <w:drawing>
+              <wp:anchor distT="0" distB="0" distL="114300" distR="114300" simplePos="0" relativeHeight="251701248" behindDoc="0" locked="0" layoutInCell="1" allowOverlap="1">
+                <wp:simplePos x="0" y="0"/>
+                <wp:positionH relativeFrom="column">
+                  <wp:posOffset>5715</wp:posOffset>
+                </wp:positionH>
+                <wp:positionV relativeFrom="paragraph">
+                  <wp:posOffset>357505</wp:posOffset>
+                </wp:positionV>
+                <wp:extent cx="323850" cy="1619250"/>
+                <wp:effectExtent l="0" t="0" r="57150" b="57150"/>
+                <wp:wrapNone/>
+                <wp:docPr id="114" name="Conector de Seta Reta 114"/>
+                <wp:cNvGraphicFramePr/>
+                <a:graphic xmlns:a="http://schemas.openxmlformats.org/drawingml/2006/main">
+                  <a:graphicData uri="http://schemas.microsoft.com/office/word/2010/wordprocessingShape">
+                    <wps:wsp>
+                      <wps:cNvCnPr/>
+                      <wps:spPr>
+                        <a:xfrm>
+                          <a:off x="0" y="0"/>
+                          <a:ext cx="323850" cy="1619250"/>
+                        </a:xfrm>
+                        <a:prstGeom prst="straightConnector1">
+                          <a:avLst/>
+                        </a:prstGeom>
+                        <a:ln>
+                          <a:tailEnd type="triangle"/>
+                        </a:ln>
+                      </wps:spPr>
+                      <wps:style>
+                        <a:lnRef idx="1">
+                          <a:schemeClr val="accent1"/>
+                        </a:lnRef>
+                        <a:fillRef idx="0">
+                          <a:schemeClr val="accent1"/>
+                        </a:fillRef>
+                        <a:effectRef idx="0">
+                          <a:schemeClr val="accent1"/>
+                        </a:effectRef>
+                        <a:fontRef idx="minor">
+                          <a:schemeClr val="tx1"/>
+                        </a:fontRef>
+                      </wps:style>
+                      <wps:bodyPr/>
+                    </wps:wsp>
+                  </a:graphicData>
+                </a:graphic>
+              </wp:anchor>
+            </w:drawing>
+          </mc:Choice>
+          <mc:Fallback>
+            <w:pict>
+              <v:shape w14:anchorId="1E03A78A" id="Conector de Seta Reta 114" o:spid="_x0000_s1026" type="#_x0000_t32" style="position:absolute;margin-left:.45pt;margin-top:28.15pt;width:25.5pt;height:127.5pt;z-index:251701248;visibility:visible;mso-wrap-style:square;mso-wrap-distance-left:9pt;mso-wrap-distance-top:0;mso-wrap-distance-right:9pt;mso-wrap-distance-bottom:0;mso-position-horizontal:absolute;mso-position-horizontal-relative:text;mso-position-vertical:absolute;mso-position-vertical-relative:text" o:gfxdata="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" strokecolor="#4472c4 [3204]" strokeweight=".5pt">
+                <v:stroke endarrow="block" joinstyle="miter"/>
+              </v:shape>
+            </w:pict>
+          </mc:Fallback>
+        </mc:AlternateContent>
+      </w:r>
+      <w:r>
+        <w:rPr>
+          <w:noProof/>
+        </w:rPr>
+        <mc:AlternateContent>
+          <mc:Choice Requires="wps">
+            <w:drawing>
+              <wp:anchor distT="0" distB="0" distL="114300" distR="114300" simplePos="0" relativeHeight="251700224" behindDoc="0" locked="0" layoutInCell="1" allowOverlap="1">
+                <wp:simplePos x="0" y="0"/>
+                <wp:positionH relativeFrom="column">
+                  <wp:posOffset>2034540</wp:posOffset>
+                </wp:positionH>
+                <wp:positionV relativeFrom="paragraph">
+                  <wp:posOffset>167004</wp:posOffset>
+                </wp:positionV>
+                <wp:extent cx="342900" cy="1762125"/>
+                <wp:effectExtent l="38100" t="0" r="19050" b="47625"/>
+                <wp:wrapNone/>
+                <wp:docPr id="113" name="Conector de Seta Reta 113"/>
+                <wp:cNvGraphicFramePr/>
+                <a:graphic xmlns:a="http://schemas.openxmlformats.org/drawingml/2006/main">
+                  <a:graphicData uri="http://schemas.microsoft.com/office/word/2010/wordprocessingShape">
+                    <wps:wsp>
+                      <wps:cNvCnPr/>
+                      <wps:spPr>
+                        <a:xfrm flipH="1">
+                          <a:off x="0" y="0"/>
+                          <a:ext cx="342900" cy="1762125"/>
+                        </a:xfrm>
+                        <a:prstGeom prst="straightConnector1">
+                          <a:avLst/>
+                        </a:prstGeom>
+                        <a:ln>
+                          <a:tailEnd type="triangle"/>
+                        </a:ln>
+                      </wps:spPr>
+                      <wps:style>
+                        <a:lnRef idx="1">
+                          <a:schemeClr val="accent1"/>
+                        </a:lnRef>
+                        <a:fillRef idx="0">
+                          <a:schemeClr val="accent1"/>
+                        </a:fillRef>
+                        <a:effectRef idx="0">
+                          <a:schemeClr val="accent1"/>
+                        </a:effectRef>
+                        <a:fontRef idx="minor">
+                          <a:schemeClr val="tx1"/>
+                        </a:fontRef>
+                      </wps:style>
+                      <wps:bodyPr/>
+                    </wps:wsp>
+                  </a:graphicData>
+                </a:graphic>
+              </wp:anchor>
+            </w:drawing>
+          </mc:Choice>
+          <mc:Fallback>
+            <w:pict>
+              <v:shape w14:anchorId="0737F6A0" id="Conector de Seta Reta 113" o:spid="_x0000_s1026" type="#_x0000_t32" style="position:absolute;margin-left:160.2pt;margin-top:13.15pt;width:27pt;height:138.75pt;flip:x;z-index:251700224;visibility:visible;mso-wrap-style:square;mso-wrap-distance-left:9pt;mso-wrap-distance-top:0;mso-wrap-distance-right:9pt;mso-wrap-distance-bottom:0;mso-position-horizontal:absolute;mso-position-horizontal-relative:text;mso-position-vertical:absolute;mso-position-vertical-relative:text" o:gfxdata="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" strokecolor="#4472c4 [3204]" strokeweight=".5pt">
+                <v:stroke endarrow="block" joinstyle="miter"/>
+              </v:shape>
+            </w:pict>
+          </mc:Fallback>
+        </mc:AlternateContent>
+      </w:r>
+      <w:r>
+        <w:t>42 – Para ajustar o espaço utilizamos o box-</w:t>
+      </w:r>
+      <w:proofErr w:type="spellStart"/>
+      <w:r>
+        <w:t>sizing</w:t>
+      </w:r>
+      <w:proofErr w:type="spellEnd"/>
+      <w:r>
+        <w:t>, onde ele automaticamente ajustou o espaço.</w:t>
+      </w:r>
+    </w:p>
+    <w:p>
+      <w:r>
+        <w:drawing>
+          <wp:inline distT="0" distB="0" distL="0" distR="0" wp14:anchorId="67FFC03A" wp14:editId="5B274B74">
+            <wp:extent cx="2476846" cy="1857634"/>
+            <wp:effectExtent l="0" t="0" r="0" b="9525"/>
+            <wp:docPr id="109" name="Imagem 109"/>
+            <wp:cNvGraphicFramePr>
+              <a:graphicFrameLocks xmlns:a="http://schemas.openxmlformats.org/drawingml/2006/main" noChangeAspect="1"/>
+            </wp:cNvGraphicFramePr>
+            <a:graphic xmlns:a="http://schemas.openxmlformats.org/drawingml/2006/main">
+              <a:graphicData uri="http://schemas.openxmlformats.org/drawingml/2006/picture">
+                <pic:pic xmlns:pic="http://schemas.openxmlformats.org/drawingml/2006/picture">
+                  <pic:nvPicPr>
+                    <pic:cNvPr id="1" name=""/>
+                    <pic:cNvPicPr/>
+                  </pic:nvPicPr>
+                  <pic:blipFill>
+                    <a:blip r:embed="rId80"/>
+                    <a:stretch>
+                      <a:fillRect/>
+                    </a:stretch>
+                  </pic:blipFill>
+                  <pic:spPr>
+                    <a:xfrm>
+                      <a:off x="0" y="0"/>
+                      <a:ext cx="2476846" cy="1857634"/>
+                    </a:xfrm>
+                    <a:prstGeom prst="rect">
+                      <a:avLst/>
+                    </a:prstGeom>
+                  </pic:spPr>
+                </pic:pic>
+              </a:graphicData>
+            </a:graphic>
+          </wp:inline>
+        </w:drawing>
+      </w:r>
+      <w:r>
+        <w:drawing>
+          <wp:inline distT="0" distB="0" distL="0" distR="0" wp14:anchorId="3240E0C1" wp14:editId="18B66C14">
+            <wp:extent cx="2895600" cy="1537706"/>
+            <wp:effectExtent l="0" t="0" r="0" b="5715"/>
+            <wp:docPr id="110" name="Imagem 110"/>
+            <wp:cNvGraphicFramePr>
+              <a:graphicFrameLocks xmlns:a="http://schemas.openxmlformats.org/drawingml/2006/main" noChangeAspect="1"/>
+            </wp:cNvGraphicFramePr>
+            <a:graphic xmlns:a="http://schemas.openxmlformats.org/drawingml/2006/main">
+              <a:graphicData uri="http://schemas.openxmlformats.org/drawingml/2006/picture">
+                <pic:pic xmlns:pic="http://schemas.openxmlformats.org/drawingml/2006/picture">
+                  <pic:nvPicPr>
+                    <pic:cNvPr id="1" name=""/>
+                    <pic:cNvPicPr/>
+                  </pic:nvPicPr>
+                  <pic:blipFill>
+                    <a:blip r:embed="rId81"/>
+                    <a:stretch>
+                      <a:fillRect/>
+                    </a:stretch>
+                  </pic:blipFill>
+                  <pic:spPr>
+                    <a:xfrm>
+                      <a:off x="0" y="0"/>
+                      <a:ext cx="2992258" cy="1589036"/>
+                    </a:xfrm>
+                    <a:prstGeom prst="rect">
+                      <a:avLst/>
+                    </a:prstGeom>
+                  </pic:spPr>
+                </pic:pic>
+              </a:graphicData>
+            </a:graphic>
+          </wp:inline>
+        </w:drawing>
+      </w:r>
+    </w:p>
+    <w:p>
+      <w:r>
+        <w:rPr>
+          <w:noProof/>
+        </w:rPr>
+        <mc:AlternateContent>
+          <mc:Choice Requires="wps">
+            <w:drawing>
+              <wp:anchor distT="0" distB="0" distL="114300" distR="114300" simplePos="0" relativeHeight="251703296" behindDoc="0" locked="0" layoutInCell="1" allowOverlap="1">
+                <wp:simplePos x="0" y="0"/>
+                <wp:positionH relativeFrom="column">
+                  <wp:posOffset>53340</wp:posOffset>
+                </wp:positionH>
+                <wp:positionV relativeFrom="paragraph">
+                  <wp:posOffset>391795</wp:posOffset>
+                </wp:positionV>
+                <wp:extent cx="304800" cy="723900"/>
+                <wp:effectExtent l="0" t="0" r="57150" b="57150"/>
+                <wp:wrapNone/>
+                <wp:docPr id="118" name="Conector de Seta Reta 118"/>
+                <wp:cNvGraphicFramePr/>
+                <a:graphic xmlns:a="http://schemas.openxmlformats.org/drawingml/2006/main">
+                  <a:graphicData uri="http://schemas.microsoft.com/office/word/2010/wordprocessingShape">
+                    <wps:wsp>
+                      <wps:cNvCnPr/>
+                      <wps:spPr>
+                        <a:xfrm>
+                          <a:off x="0" y="0"/>
+                          <a:ext cx="304800" cy="723900"/>
+                        </a:xfrm>
+                        <a:prstGeom prst="straightConnector1">
+                          <a:avLst/>
+                        </a:prstGeom>
+                        <a:ln>
+                          <a:tailEnd type="triangle"/>
+                        </a:ln>
+                      </wps:spPr>
+                      <wps:style>
+                        <a:lnRef idx="1">
+                          <a:schemeClr val="accent1"/>
+                        </a:lnRef>
+                        <a:fillRef idx="0">
+                          <a:schemeClr val="accent1"/>
+                        </a:fillRef>
+                        <a:effectRef idx="0">
+                          <a:schemeClr val="accent1"/>
+                        </a:effectRef>
+                        <a:fontRef idx="minor">
+                          <a:schemeClr val="tx1"/>
+                        </a:fontRef>
+                      </wps:style>
+                      <wps:bodyPr/>
+                    </wps:wsp>
+                  </a:graphicData>
+                </a:graphic>
+              </wp:anchor>
+            </w:drawing>
+          </mc:Choice>
+          <mc:Fallback>
+            <w:pict>
+              <v:shape w14:anchorId="419DDAE7" id="Conector de Seta Reta 118" o:spid="_x0000_s1026" type="#_x0000_t32" style="position:absolute;margin-left:4.2pt;margin-top:30.85pt;width:24pt;height:57pt;z-index:251703296;visibility:visible;mso-wrap-style:square;mso-wrap-distance-left:9pt;mso-wrap-distance-top:0;mso-wrap-distance-right:9pt;mso-wrap-distance-bottom:0;mso-position-horizontal:absolute;mso-position-horizontal-relative:text;mso-position-vertical:absolute;mso-position-vertical-relative:text" o:gfxdata="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" strokecolor="#4472c4 [3204]" strokeweight=".5pt">
+                <v:stroke endarrow="block" joinstyle="miter"/>
+              </v:shape>
+            </w:pict>
+          </mc:Fallback>
+        </mc:AlternateContent>
+      </w:r>
+      <w:r>
+        <w:rPr>
+          <w:noProof/>
+        </w:rPr>
+        <mc:AlternateContent>
+          <mc:Choice Requires="wps">
+            <w:drawing>
+              <wp:anchor distT="0" distB="0" distL="114300" distR="114300" simplePos="0" relativeHeight="251702272" behindDoc="0" locked="0" layoutInCell="1" allowOverlap="1">
+                <wp:simplePos x="0" y="0"/>
+                <wp:positionH relativeFrom="column">
+                  <wp:posOffset>1577340</wp:posOffset>
+                </wp:positionH>
+                <wp:positionV relativeFrom="paragraph">
+                  <wp:posOffset>153670</wp:posOffset>
+                </wp:positionV>
+                <wp:extent cx="266700" cy="952500"/>
+                <wp:effectExtent l="57150" t="0" r="19050" b="57150"/>
+                <wp:wrapNone/>
+                <wp:docPr id="117" name="Conector de Seta Reta 117"/>
+                <wp:cNvGraphicFramePr/>
+                <a:graphic xmlns:a="http://schemas.openxmlformats.org/drawingml/2006/main">
+                  <a:graphicData uri="http://schemas.microsoft.com/office/word/2010/wordprocessingShape">
+                    <wps:wsp>
+                      <wps:cNvCnPr/>
+                      <wps:spPr>
+                        <a:xfrm flipH="1">
+                          <a:off x="0" y="0"/>
+                          <a:ext cx="266700" cy="952500"/>
+                        </a:xfrm>
+                        <a:prstGeom prst="straightConnector1">
+                          <a:avLst/>
+                        </a:prstGeom>
+                        <a:ln>
+                          <a:tailEnd type="triangle"/>
+                        </a:ln>
+                      </wps:spPr>
+                      <wps:style>
+                        <a:lnRef idx="1">
+                          <a:schemeClr val="accent1"/>
+                        </a:lnRef>
+                        <a:fillRef idx="0">
+                          <a:schemeClr val="accent1"/>
+                        </a:fillRef>
+                        <a:effectRef idx="0">
+                          <a:schemeClr val="accent1"/>
+                        </a:effectRef>
+                        <a:fontRef idx="minor">
+                          <a:schemeClr val="tx1"/>
+                        </a:fontRef>
+                      </wps:style>
+                      <wps:bodyPr/>
+                    </wps:wsp>
+                  </a:graphicData>
+                </a:graphic>
+              </wp:anchor>
+            </w:drawing>
+          </mc:Choice>
+          <mc:Fallback>
+            <w:pict>
+              <v:shape w14:anchorId="14F59D70" id="Conector de Seta Reta 117" o:spid="_x0000_s1026" type="#_x0000_t32" style="position:absolute;margin-left:124.2pt;margin-top:12.1pt;width:21pt;height:75pt;flip:x;z-index:251702272;visibility:visible;mso-wrap-style:square;mso-wrap-distance-left:9pt;mso-wrap-distance-top:0;mso-wrap-distance-right:9pt;mso-wrap-distance-bottom:0;mso-position-horizontal:absolute;mso-position-horizontal-relative:text;mso-position-vertical:absolute;mso-position-vertical-relative:text" o:gfxdata="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" strokecolor="#4472c4 [3204]" strokeweight=".5pt">
+                <v:stroke endarrow="block" joinstyle="miter"/>
+              </v:shape>
+            </w:pict>
+          </mc:Fallback>
+        </mc:AlternateContent>
+      </w:r>
+      <w:r>
+        <w:t xml:space="preserve">43 – Para arrumar o espaço entre o texto e o preço colocamos um espaço externo na </w:t>
+      </w:r>
+      <w:proofErr w:type="spellStart"/>
+      <w:r>
+        <w:t>class</w:t>
+      </w:r>
+      <w:proofErr w:type="spellEnd"/>
+      <w:r>
+        <w:t xml:space="preserve"> </w:t>
+      </w:r>
+      <w:proofErr w:type="spellStart"/>
+      <w:r>
+        <w:t>preco</w:t>
+      </w:r>
+      <w:proofErr w:type="spellEnd"/>
+      <w:r>
+        <w:t xml:space="preserve"> conforme imagem.</w:t>
+      </w:r>
+    </w:p>
+    <w:p>
+      <w:r>
+        <w:drawing>
+          <wp:inline distT="0" distB="0" distL="0" distR="0" wp14:anchorId="2CA899D3" wp14:editId="2635A752">
+            <wp:extent cx="1771897" cy="1114581"/>
+            <wp:effectExtent l="0" t="0" r="0" b="9525"/>
+            <wp:docPr id="115" name="Imagem 115"/>
+            <wp:cNvGraphicFramePr>
+              <a:graphicFrameLocks xmlns:a="http://schemas.openxmlformats.org/drawingml/2006/main" noChangeAspect="1"/>
+            </wp:cNvGraphicFramePr>
+            <a:graphic xmlns:a="http://schemas.openxmlformats.org/drawingml/2006/main">
+              <a:graphicData uri="http://schemas.openxmlformats.org/drawingml/2006/picture">
+                <pic:pic xmlns:pic="http://schemas.openxmlformats.org/drawingml/2006/picture">
+                  <pic:nvPicPr>
+                    <pic:cNvPr id="1" name=""/>
+                    <pic:cNvPicPr/>
+                  </pic:nvPicPr>
+                  <pic:blipFill>
+                    <a:blip r:embed="rId82"/>
+                    <a:stretch>
+                      <a:fillRect/>
+                    </a:stretch>
+                  </pic:blipFill>
+                  <pic:spPr>
+                    <a:xfrm>
+                      <a:off x="0" y="0"/>
+                      <a:ext cx="1771897" cy="1114581"/>
+                    </a:xfrm>
+                    <a:prstGeom prst="rect">
+                      <a:avLst/>
+                    </a:prstGeom>
+                  </pic:spPr>
+                </pic:pic>
+              </a:graphicData>
+            </a:graphic>
+          </wp:inline>
+        </w:drawing>
+      </w:r>
+      <w:r>
+        <w:drawing>
+          <wp:inline distT="0" distB="0" distL="0" distR="0" wp14:anchorId="18B57600" wp14:editId="1F9C6E61">
+            <wp:extent cx="3594467" cy="567055"/>
+            <wp:effectExtent l="0" t="0" r="6350" b="4445"/>
+            <wp:docPr id="116" name="Imagem 116"/>
+            <wp:cNvGraphicFramePr>
+              <a:graphicFrameLocks xmlns:a="http://schemas.openxmlformats.org/drawingml/2006/main" noChangeAspect="1"/>
+            </wp:cNvGraphicFramePr>
+            <a:graphic xmlns:a="http://schemas.openxmlformats.org/drawingml/2006/main">
+              <a:graphicData uri="http://schemas.openxmlformats.org/drawingml/2006/picture">
+                <pic:pic xmlns:pic="http://schemas.openxmlformats.org/drawingml/2006/picture">
+                  <pic:nvPicPr>
+                    <pic:cNvPr id="1" name=""/>
+                    <pic:cNvPicPr/>
+                  </pic:nvPicPr>
+                  <pic:blipFill>
+                    <a:blip r:embed="rId83"/>
+                    <a:stretch>
+                      <a:fillRect/>
+                    </a:stretch>
+                  </pic:blipFill>
+                  <pic:spPr>
+                    <a:xfrm>
+                      <a:off x="0" y="0"/>
+                      <a:ext cx="3745435" cy="590871"/>
+                    </a:xfrm>
+                    <a:prstGeom prst="rect">
+                      <a:avLst/>
+                    </a:prstGeom>
+                  </pic:spPr>
+                </pic:pic>
+              </a:graphicData>
+            </a:graphic>
+          </wp:inline>
+        </w:drawing>
+      </w:r>
+    </w:p>
+    <w:p>
+      <w:r>
+        <w:rPr>
+          <w:noProof/>
+        </w:rPr>
+        <mc:AlternateContent>
+          <mc:Choice Requires="wps">
+            <w:drawing>
+              <wp:anchor distT="0" distB="0" distL="114300" distR="114300" simplePos="0" relativeHeight="251705344" behindDoc="0" locked="0" layoutInCell="1" allowOverlap="1">
+                <wp:simplePos x="0" y="0"/>
+                <wp:positionH relativeFrom="column">
+                  <wp:posOffset>2282190</wp:posOffset>
+                </wp:positionH>
+                <wp:positionV relativeFrom="paragraph">
+                  <wp:posOffset>226059</wp:posOffset>
+                </wp:positionV>
+                <wp:extent cx="200025" cy="1495425"/>
+                <wp:effectExtent l="57150" t="0" r="28575" b="47625"/>
+                <wp:wrapNone/>
+                <wp:docPr id="122" name="Conector de Seta Reta 122"/>
+                <wp:cNvGraphicFramePr/>
+                <a:graphic xmlns:a="http://schemas.openxmlformats.org/drawingml/2006/main">
+                  <a:graphicData uri="http://schemas.microsoft.com/office/word/2010/wordprocessingShape">
+                    <wps:wsp>
+                      <wps:cNvCnPr/>
+                      <wps:spPr>
+                        <a:xfrm flipH="1">
+                          <a:off x="0" y="0"/>
+                          <a:ext cx="200025" cy="1495425"/>
+                        </a:xfrm>
+                        <a:prstGeom prst="straightConnector1">
+                          <a:avLst/>
+                        </a:prstGeom>
+                        <a:ln>
+                          <a:tailEnd type="triangle"/>
+                        </a:ln>
+                      </wps:spPr>
+                      <wps:style>
+                        <a:lnRef idx="1">
+                          <a:schemeClr val="accent1"/>
+                        </a:lnRef>
+                        <a:fillRef idx="0">
+                          <a:schemeClr val="accent1"/>
+                        </a:fillRef>
+                        <a:effectRef idx="0">
+                          <a:schemeClr val="accent1"/>
+                        </a:effectRef>
+                        <a:fontRef idx="minor">
+                          <a:schemeClr val="tx1"/>
+                        </a:fontRef>
+                      </wps:style>
+                      <wps:bodyPr/>
+                    </wps:wsp>
+                  </a:graphicData>
+                </a:graphic>
+              </wp:anchor>
+            </w:drawing>
+          </mc:Choice>
+          <mc:Fallback>
+            <w:pict>
+              <v:shape w14:anchorId="374D02E3" id="Conector de Seta Reta 122" o:spid="_x0000_s1026" type="#_x0000_t32" style="position:absolute;margin-left:179.7pt;margin-top:17.8pt;width:15.75pt;height:117.75pt;flip:x;z-index:251705344;visibility:visible;mso-wrap-style:square;mso-wrap-distance-left:9pt;mso-wrap-distance-top:0;mso-wrap-distance-right:9pt;mso-wrap-distance-bottom:0;mso-position-horizontal:absolute;mso-position-horizontal-relative:text;mso-position-vertical:absolute;mso-position-vertical-relative:text" o:gfxdata="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" strokecolor="#4472c4 [3204]" strokeweight=".5pt">
+                <v:stroke endarrow="block" joinstyle="miter"/>
+              </v:shape>
+            </w:pict>
+          </mc:Fallback>
+        </mc:AlternateContent>
+      </w:r>
+      <w:r>
+        <w:t>44 – Tiramos a cor de fundo dos produtos li e adicionamos uma borda conforme código.</w:t>
+      </w:r>
+    </w:p>
+    <w:p>
+      <w:r>
+        <w:rPr>
+          <w:noProof/>
+        </w:rPr>
+        <mc:AlternateContent>
+          <mc:Choice Requires="wps">
+            <w:drawing>
+              <wp:anchor distT="0" distB="0" distL="114300" distR="114300" simplePos="0" relativeHeight="251704320" behindDoc="0" locked="0" layoutInCell="1" allowOverlap="1">
+                <wp:simplePos x="0" y="0"/>
+                <wp:positionH relativeFrom="column">
+                  <wp:posOffset>158115</wp:posOffset>
+                </wp:positionH>
+                <wp:positionV relativeFrom="paragraph">
+                  <wp:posOffset>969010</wp:posOffset>
+                </wp:positionV>
+                <wp:extent cx="171450" cy="552450"/>
+                <wp:effectExtent l="0" t="0" r="76200" b="57150"/>
+                <wp:wrapNone/>
+                <wp:docPr id="121" name="Conector de Seta Reta 121"/>
+                <wp:cNvGraphicFramePr/>
+                <a:graphic xmlns:a="http://schemas.openxmlformats.org/drawingml/2006/main">
+                  <a:graphicData uri="http://schemas.microsoft.com/office/word/2010/wordprocessingShape">
+                    <wps:wsp>
+                      <wps:cNvCnPr/>
+                      <wps:spPr>
+                        <a:xfrm>
+                          <a:off x="0" y="0"/>
+                          <a:ext cx="171450" cy="552450"/>
+                        </a:xfrm>
+                        <a:prstGeom prst="straightConnector1">
+                          <a:avLst/>
+                        </a:prstGeom>
+                        <a:ln>
+                          <a:tailEnd type="triangle"/>
+                        </a:ln>
+                      </wps:spPr>
+                      <wps:style>
+                        <a:lnRef idx="1">
+                          <a:schemeClr val="accent1"/>
+                        </a:lnRef>
+                        <a:fillRef idx="0">
+                          <a:schemeClr val="accent1"/>
+                        </a:fillRef>
+                        <a:effectRef idx="0">
+                          <a:schemeClr val="accent1"/>
+                        </a:effectRef>
+                        <a:fontRef idx="minor">
+                          <a:schemeClr val="tx1"/>
+                        </a:fontRef>
+                      </wps:style>
+                      <wps:bodyPr/>
+                    </wps:wsp>
+                  </a:graphicData>
+                </a:graphic>
+              </wp:anchor>
+            </w:drawing>
+          </mc:Choice>
+          <mc:Fallback>
+            <w:pict>
+              <v:shape w14:anchorId="75104133" id="Conector de Seta Reta 121" o:spid="_x0000_s1026" type="#_x0000_t32" style="position:absolute;margin-left:12.45pt;margin-top:76.3pt;width:13.5pt;height:43.5pt;z-index:251704320;visibility:visible;mso-wrap-style:square;mso-wrap-distance-left:9pt;mso-wrap-distance-top:0;mso-wrap-distance-right:9pt;mso-wrap-distance-bottom:0;mso-position-horizontal:absolute;mso-position-horizontal-relative:text;mso-position-vertical:absolute;mso-position-vertical-relative:text" o:gfxdata="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" strokecolor="#4472c4 [3204]" strokeweight=".5pt">
+                <v:stroke endarrow="block" joinstyle="miter"/>
+              </v:shape>
+            </w:pict>
+          </mc:Fallback>
+        </mc:AlternateContent>
+      </w:r>
+      <w:r>
+        <w:drawing>
+          <wp:inline distT="0" distB="0" distL="0" distR="0" wp14:anchorId="7C8FF5EF" wp14:editId="4390C208">
+            <wp:extent cx="2514951" cy="1895740"/>
+            <wp:effectExtent l="0" t="0" r="0" b="9525"/>
+            <wp:docPr id="119" name="Imagem 119"/>
+            <wp:cNvGraphicFramePr>
+              <a:graphicFrameLocks xmlns:a="http://schemas.openxmlformats.org/drawingml/2006/main" noChangeAspect="1"/>
+            </wp:cNvGraphicFramePr>
+            <a:graphic xmlns:a="http://schemas.openxmlformats.org/drawingml/2006/main">
+              <a:graphicData uri="http://schemas.openxmlformats.org/drawingml/2006/picture">
+                <pic:pic xmlns:pic="http://schemas.openxmlformats.org/drawingml/2006/picture">
+                  <pic:nvPicPr>
+                    <pic:cNvPr id="1" name=""/>
+                    <pic:cNvPicPr/>
+                  </pic:nvPicPr>
+                  <pic:blipFill>
+                    <a:blip r:embed="rId84"/>
+                    <a:stretch>
+                      <a:fillRect/>
+                    </a:stretch>
+                  </pic:blipFill>
+                  <pic:spPr>
+                    <a:xfrm>
+                      <a:off x="0" y="0"/>
+                      <a:ext cx="2514951" cy="1895740"/>
+                    </a:xfrm>
+                    <a:prstGeom prst="rect">
+                      <a:avLst/>
+                    </a:prstGeom>
+                  </pic:spPr>
+                </pic:pic>
+              </a:graphicData>
+            </a:graphic>
+          </wp:inline>
+        </w:drawing>
+      </w:r>
+      <w:r>
+        <w:drawing>
+          <wp:inline distT="0" distB="0" distL="0" distR="0" wp14:anchorId="3CA0F9CB" wp14:editId="1D1E7784">
+            <wp:extent cx="2856676" cy="1878965"/>
+            <wp:effectExtent l="0" t="0" r="1270" b="6985"/>
+            <wp:docPr id="120" name="Imagem 120"/>
+            <wp:cNvGraphicFramePr>
+              <a:graphicFrameLocks xmlns:a="http://schemas.openxmlformats.org/drawingml/2006/main" noChangeAspect="1"/>
+            </wp:cNvGraphicFramePr>
+            <a:graphic xmlns:a="http://schemas.openxmlformats.org/drawingml/2006/main">
+              <a:graphicData uri="http://schemas.openxmlformats.org/drawingml/2006/picture">
+                <pic:pic xmlns:pic="http://schemas.openxmlformats.org/drawingml/2006/picture">
+                  <pic:nvPicPr>
+                    <pic:cNvPr id="1" name=""/>
+                    <pic:cNvPicPr/>
+                  </pic:nvPicPr>
+                  <pic:blipFill>
+                    <a:blip r:embed="rId85"/>
+                    <a:stretch>
+                      <a:fillRect/>
+                    </a:stretch>
+                  </pic:blipFill>
+                  <pic:spPr>
+                    <a:xfrm>
+                      <a:off x="0" y="0"/>
+                      <a:ext cx="2981897" cy="1961328"/>
+                    </a:xfrm>
+                    <a:prstGeom prst="rect">
+                      <a:avLst/>
+                    </a:prstGeom>
+                  </pic:spPr>
+                </pic:pic>
+              </a:graphicData>
+            </a:graphic>
+          </wp:inline>
+        </w:drawing>
+      </w:r>
+    </w:p>
+    <w:p>
+      <w:r>
+        <w:t>45 – Arredondamos os cantos da nossa borda utilizando o border-radius:10px.</w:t>
+      </w:r>
+    </w:p>
+    <w:p>
+      <w:r>
+        <w:drawing>
+          <wp:inline distT="0" distB="0" distL="0" distR="0" wp14:anchorId="3A90CAAC" wp14:editId="2CC55210">
+            <wp:extent cx="2391109" cy="2019582"/>
+            <wp:effectExtent l="0" t="0" r="9525" b="0"/>
+            <wp:docPr id="123" name="Imagem 123"/>
+            <wp:cNvGraphicFramePr>
+              <a:graphicFrameLocks xmlns:a="http://schemas.openxmlformats.org/drawingml/2006/main" noChangeAspect="1"/>
+            </wp:cNvGraphicFramePr>
+            <a:graphic xmlns:a="http://schemas.openxmlformats.org/drawingml/2006/main">
+              <a:graphicData uri="http://schemas.openxmlformats.org/drawingml/2006/picture">
+                <pic:pic xmlns:pic="http://schemas.openxmlformats.org/drawingml/2006/picture">
+                  <pic:nvPicPr>
+                    <pic:cNvPr id="1" name=""/>
+                    <pic:cNvPicPr/>
+                  </pic:nvPicPr>
+                  <pic:blipFill>
+                    <a:blip r:embed="rId86"/>
+                    <a:stretch>
+                      <a:fillRect/>
+                    </a:stretch>
+                  </pic:blipFill>
+                  <pic:spPr>
+                    <a:xfrm>
+                      <a:off x="0" y="0"/>
+                      <a:ext cx="2391109" cy="2019582"/>
+                    </a:xfrm>
+                    <a:prstGeom prst="rect">
+                      <a:avLst/>
+                    </a:prstGeom>
+                  </pic:spPr>
+                </pic:pic>
+              </a:graphicData>
+            </a:graphic>
+          </wp:inline>
+        </w:drawing>
+      </w:r>
+      <w:r>
+        <w:drawing>
+          <wp:inline distT="0" distB="0" distL="0" distR="0" wp14:anchorId="7E4C8782" wp14:editId="2AD5FCBE">
+            <wp:extent cx="1371791" cy="1962424"/>
+            <wp:effectExtent l="0" t="0" r="0" b="0"/>
+            <wp:docPr id="124" name="Imagem 124"/>
+            <wp:cNvGraphicFramePr>
+              <a:graphicFrameLocks xmlns:a="http://schemas.openxmlformats.org/drawingml/2006/main" noChangeAspect="1"/>
+            </wp:cNvGraphicFramePr>
+            <a:graphic xmlns:a="http://schemas.openxmlformats.org/drawingml/2006/main">
+              <a:graphicData uri="http://schemas.openxmlformats.org/drawingml/2006/picture">
+                <pic:pic xmlns:pic="http://schemas.openxmlformats.org/drawingml/2006/picture">
+                  <pic:nvPicPr>
+                    <pic:cNvPr id="1" name=""/>
+                    <pic:cNvPicPr/>
+                  </pic:nvPicPr>
+                  <pic:blipFill>
+                    <a:blip r:embed="rId87"/>
+                    <a:stretch>
+                      <a:fillRect/>
+                    </a:stretch>
+                  </pic:blipFill>
+                  <pic:spPr>
+                    <a:xfrm>
+                      <a:off x="0" y="0"/>
+                      <a:ext cx="1371791" cy="1962424"/>
+                    </a:xfrm>
+                    <a:prstGeom prst="rect">
+                      <a:avLst/>
+                    </a:prstGeom>
+                  </pic:spPr>
+                </pic:pic>
+              </a:graphicData>
+            </a:graphic>
+          </wp:inline>
+        </w:drawing>
+      </w:r>
+    </w:p>
+    <w:p>
+      <w:r>
+        <w:lastRenderedPageBreak/>
+        <w:t xml:space="preserve">46 – Vamos trabalhar com comportamento quando o usuário ao passar o mouse sobre o elemento, ele realizará uma ação, nessa situação vamos trabalhar com o menu ao passar o mouse o elemento muda de cor utilizando o </w:t>
+      </w:r>
+      <w:proofErr w:type="spellStart"/>
+      <w:r>
+        <w:t>hover</w:t>
+      </w:r>
+      <w:proofErr w:type="spellEnd"/>
+      <w:r>
+        <w:t>.</w:t>
+      </w:r>
+    </w:p>
+    <w:p>
+      <w:r>
+        <w:drawing>
+          <wp:inline distT="0" distB="0" distL="0" distR="0" wp14:anchorId="1171D0D5" wp14:editId="582A7583">
+            <wp:extent cx="1638529" cy="657317"/>
+            <wp:effectExtent l="0" t="0" r="0" b="9525"/>
+            <wp:docPr id="125" name="Imagem 125"/>
+            <wp:cNvGraphicFramePr>
+              <a:graphicFrameLocks xmlns:a="http://schemas.openxmlformats.org/drawingml/2006/main" noChangeAspect="1"/>
+            </wp:cNvGraphicFramePr>
+            <a:graphic xmlns:a="http://schemas.openxmlformats.org/drawingml/2006/main">
+              <a:graphicData uri="http://schemas.openxmlformats.org/drawingml/2006/picture">
+                <pic:pic xmlns:pic="http://schemas.openxmlformats.org/drawingml/2006/picture">
+                  <pic:nvPicPr>
+                    <pic:cNvPr id="1" name=""/>
+                    <pic:cNvPicPr/>
+                  </pic:nvPicPr>
+                  <pic:blipFill>
+                    <a:blip r:embed="rId88"/>
+                    <a:stretch>
+                      <a:fillRect/>
+                    </a:stretch>
+                  </pic:blipFill>
+                  <pic:spPr>
+                    <a:xfrm>
+                      <a:off x="0" y="0"/>
+                      <a:ext cx="1638529" cy="657317"/>
+                    </a:xfrm>
+                    <a:prstGeom prst="rect">
+                      <a:avLst/>
+                    </a:prstGeom>
+                  </pic:spPr>
+                </pic:pic>
+              </a:graphicData>
+            </a:graphic>
+          </wp:inline>
+        </w:drawing>
+      </w:r>
+      <w:r>
+        <w:drawing>
+          <wp:inline distT="0" distB="0" distL="0" distR="0" wp14:anchorId="37B9773E" wp14:editId="07E2C91D">
+            <wp:extent cx="2981325" cy="663292"/>
+            <wp:effectExtent l="0" t="0" r="0" b="3810"/>
+            <wp:docPr id="126" name="Imagem 126"/>
+            <wp:cNvGraphicFramePr>
+              <a:graphicFrameLocks xmlns:a="http://schemas.openxmlformats.org/drawingml/2006/main" noChangeAspect="1"/>
+            </wp:cNvGraphicFramePr>
+            <a:graphic xmlns:a="http://schemas.openxmlformats.org/drawingml/2006/main">
+              <a:graphicData uri="http://schemas.openxmlformats.org/drawingml/2006/picture">
+                <pic:pic xmlns:pic="http://schemas.openxmlformats.org/drawingml/2006/picture">
+                  <pic:nvPicPr>
+                    <pic:cNvPr id="1" name=""/>
+                    <pic:cNvPicPr/>
+                  </pic:nvPicPr>
+                  <pic:blipFill>
+                    <a:blip r:embed="rId89"/>
+                    <a:stretch>
+                      <a:fillRect/>
+                    </a:stretch>
+                  </pic:blipFill>
+                  <pic:spPr>
+                    <a:xfrm>
+                      <a:off x="0" y="0"/>
+                      <a:ext cx="3141598" cy="698950"/>
+                    </a:xfrm>
+                    <a:prstGeom prst="rect">
+                      <a:avLst/>
+                    </a:prstGeom>
+                  </pic:spPr>
+                </pic:pic>
+              </a:graphicData>
+            </a:graphic>
+          </wp:inline>
+        </w:drawing>
+      </w:r>
+    </w:p>
+    <w:p>
+      <w:r>
+        <w:t xml:space="preserve">47 – Ainda trabalhando com o </w:t>
+      </w:r>
+      <w:proofErr w:type="spellStart"/>
+      <w:r>
+        <w:t>hover</w:t>
+      </w:r>
+      <w:proofErr w:type="spellEnd"/>
+      <w:r>
+        <w:t>, ao passar o mouse adicionamos uma linha em cada item do menu.</w:t>
+      </w:r>
+    </w:p>
+    <w:p>
+      <w:r>
+        <w:drawing>
+          <wp:inline distT="0" distB="0" distL="0" distR="0" wp14:anchorId="763EF741" wp14:editId="6C6ABC93">
+            <wp:extent cx="2381582" cy="743054"/>
+            <wp:effectExtent l="0" t="0" r="0" b="0"/>
+            <wp:docPr id="127" name="Imagem 127"/>
+            <wp:cNvGraphicFramePr>
+              <a:graphicFrameLocks xmlns:a="http://schemas.openxmlformats.org/drawingml/2006/main" noChangeAspect="1"/>
+            </wp:cNvGraphicFramePr>
+            <a:graphic xmlns:a="http://schemas.openxmlformats.org/drawingml/2006/main">
+              <a:graphicData uri="http://schemas.openxmlformats.org/drawingml/2006/picture">
+                <pic:pic xmlns:pic="http://schemas.openxmlformats.org/drawingml/2006/picture">
+                  <pic:nvPicPr>
+                    <pic:cNvPr id="1" name=""/>
+                    <pic:cNvPicPr/>
+                  </pic:nvPicPr>
+                  <pic:blipFill>
+                    <a:blip r:embed="rId90"/>
+                    <a:stretch>
+                      <a:fillRect/>
+                    </a:stretch>
+                  </pic:blipFill>
+                  <pic:spPr>
+                    <a:xfrm>
+                      <a:off x="0" y="0"/>
+                      <a:ext cx="2381582" cy="743054"/>
+                    </a:xfrm>
+                    <a:prstGeom prst="rect">
+                      <a:avLst/>
+                    </a:prstGeom>
+                  </pic:spPr>
+                </pic:pic>
+              </a:graphicData>
+            </a:graphic>
+          </wp:inline>
+        </w:drawing>
+      </w:r>
+      <w:r>
+        <w:drawing>
+          <wp:inline distT="0" distB="0" distL="0" distR="0" wp14:anchorId="00637923" wp14:editId="3CD3C59B">
+            <wp:extent cx="2867025" cy="232896"/>
+            <wp:effectExtent l="0" t="0" r="0" b="0"/>
+            <wp:docPr id="128" name="Imagem 128"/>
+            <wp:cNvGraphicFramePr>
+              <a:graphicFrameLocks xmlns:a="http://schemas.openxmlformats.org/drawingml/2006/main" noChangeAspect="1"/>
+            </wp:cNvGraphicFramePr>
+            <a:graphic xmlns:a="http://schemas.openxmlformats.org/drawingml/2006/main">
+              <a:graphicData uri="http://schemas.openxmlformats.org/drawingml/2006/picture">
+                <pic:pic xmlns:pic="http://schemas.openxmlformats.org/drawingml/2006/picture">
+                  <pic:nvPicPr>
+                    <pic:cNvPr id="1" name=""/>
+                    <pic:cNvPicPr/>
+                  </pic:nvPicPr>
+                  <pic:blipFill>
+                    <a:blip r:embed="rId91"/>
+                    <a:stretch>
+                      <a:fillRect/>
+                    </a:stretch>
+                  </pic:blipFill>
+                  <pic:spPr>
+                    <a:xfrm>
+                      <a:off x="0" y="0"/>
+                      <a:ext cx="3066684" cy="249115"/>
+                    </a:xfrm>
+                    <a:prstGeom prst="rect">
+                      <a:avLst/>
+                    </a:prstGeom>
+                  </pic:spPr>
+                </pic:pic>
+              </a:graphicData>
+            </a:graphic>
+          </wp:inline>
+        </w:drawing>
+      </w:r>
+    </w:p>
+    <w:p>
+      <w:r>
+        <w:t>48 – Mudamos a cor da borda ao passar o mouse.</w:t>
+      </w:r>
+    </w:p>
+    <w:p>
+      <w:r>
+        <w:drawing>
+          <wp:inline distT="0" distB="0" distL="0" distR="0" wp14:anchorId="1ADB1511" wp14:editId="2EC6B8AF">
+            <wp:extent cx="2200582" cy="523948"/>
+            <wp:effectExtent l="0" t="0" r="9525" b="9525"/>
+            <wp:docPr id="129" name="Imagem 129"/>
+            <wp:cNvGraphicFramePr>
+              <a:graphicFrameLocks xmlns:a="http://schemas.openxmlformats.org/drawingml/2006/main" noChangeAspect="1"/>
+            </wp:cNvGraphicFramePr>
+            <a:graphic xmlns:a="http://schemas.openxmlformats.org/drawingml/2006/main">
+              <a:graphicData uri="http://schemas.openxmlformats.org/drawingml/2006/picture">
+                <pic:pic xmlns:pic="http://schemas.openxmlformats.org/drawingml/2006/picture">
+                  <pic:nvPicPr>
+                    <pic:cNvPr id="1" name=""/>
+                    <pic:cNvPicPr/>
+                  </pic:nvPicPr>
+                  <pic:blipFill>
+                    <a:blip r:embed="rId92"/>
+                    <a:stretch>
+                      <a:fillRect/>
+                    </a:stretch>
+                  </pic:blipFill>
+                  <pic:spPr>
+                    <a:xfrm>
+                      <a:off x="0" y="0"/>
+                      <a:ext cx="2200582" cy="523948"/>
+                    </a:xfrm>
+                    <a:prstGeom prst="rect">
+                      <a:avLst/>
+                    </a:prstGeom>
+                  </pic:spPr>
+                </pic:pic>
+              </a:graphicData>
+            </a:graphic>
+          </wp:inline>
+        </w:drawing>
+      </w:r>
+      <w:r>
+        <w:drawing>
+          <wp:inline distT="0" distB="0" distL="0" distR="0" wp14:anchorId="2907A0AD" wp14:editId="498645E7">
+            <wp:extent cx="2924583" cy="1962424"/>
+            <wp:effectExtent l="0" t="0" r="9525" b="0"/>
+            <wp:docPr id="130" name="Imagem 130"/>
+            <wp:cNvGraphicFramePr>
+              <a:graphicFrameLocks xmlns:a="http://schemas.openxmlformats.org/drawingml/2006/main" noChangeAspect="1"/>
+            </wp:cNvGraphicFramePr>
+            <a:graphic xmlns:a="http://schemas.openxmlformats.org/drawingml/2006/main">
+              <a:graphicData uri="http://schemas.openxmlformats.org/drawingml/2006/picture">
+                <pic:pic xmlns:pic="http://schemas.openxmlformats.org/drawingml/2006/picture">
+                  <pic:nvPicPr>
+                    <pic:cNvPr id="1" name=""/>
+                    <pic:cNvPicPr/>
+                  </pic:nvPicPr>
+                  <pic:blipFill>
+                    <a:blip r:embed="rId93"/>
+                    <a:stretch>
+                      <a:fillRect/>
+                    </a:stretch>
+                  </pic:blipFill>
+                  <pic:spPr>
+                    <a:xfrm>
+                      <a:off x="0" y="0"/>
+                      <a:ext cx="2924583" cy="1962424"/>
+                    </a:xfrm>
+                    <a:prstGeom prst="rect">
+                      <a:avLst/>
+                    </a:prstGeom>
+                  </pic:spPr>
+                </pic:pic>
+              </a:graphicData>
+            </a:graphic>
+          </wp:inline>
+        </w:drawing>
+      </w:r>
+    </w:p>
+    <w:p>
       <w:bookmarkStart w:id="0" w:name="_GoBack"/>
       <w:bookmarkEnd w:id="0"/>
     </w:p>
-    <w:p/>
     <w:sectPr>
       <w:pgSz w:w="11906" w:h="16838"/>
       <w:pgMar w:top="1417" w:right="1701" w:bottom="1417" w:left="1701" w:header="708" w:footer="708" w:gutter="0"/>
@@ -7605,7 +9057,7 @@
 </file>
 
 <file path=customXml/itemProps1.xml><?xml version="1.0" encoding="utf-8"?>
-<ds:datastoreItem xmlns:ds="http://schemas.openxmlformats.org/officeDocument/2006/customXml" ds:itemID="{FF8027B6-C859-476E-8924-4E799A3A2471}">
+<ds:datastoreItem xmlns:ds="http://schemas.openxmlformats.org/officeDocument/2006/customXml" ds:itemID="{B641A1E0-E2D5-41BB-8F78-8AB0898F9092}">
   <ds:schemaRefs>
     <ds:schemaRef ds:uri="http://schemas.openxmlformats.org/officeDocument/2006/bibliography"/>
   </ds:schemaRefs>

</xml_diff>

<commit_message>
continuando o site Space for Men 10/09/2026
</commit_message>
<xml_diff>
--- a/apostila/Projeto Space For Men.docx
+++ b/apostila/Projeto Space For Men.docx
@@ -4983,23 +4983,7 @@
     </w:p>
     <w:p>
       <w:r>
-        <w:t xml:space="preserve">34 – Para colocar os itens da lista de produtos um ao lado do outro adicionamos uma </w:t>
-      </w:r>
-      <w:proofErr w:type="spellStart"/>
-      <w:r>
-        <w:t>class</w:t>
-      </w:r>
-      <w:proofErr w:type="spellEnd"/>
-      <w:r>
-        <w:t xml:space="preserve"> no HTML chamada produtos e no CSS mudamos a natureza da lista para </w:t>
-      </w:r>
-      <w:proofErr w:type="spellStart"/>
-      <w:r>
-        <w:t>inline-block</w:t>
-      </w:r>
-      <w:proofErr w:type="spellEnd"/>
-      <w:r>
-        <w:t>.</w:t>
+        <w:t>34 – Para colocar os itens da lista de produtos um ao lado do outro adicionamos uma class no HTML chamada produtos e no CSS mudamos a natureza da lista para inline-block.</w:t>
       </w:r>
     </w:p>
     <w:p>
@@ -5200,23 +5184,7 @@
     <w:p>
       <w:r>
         <w:lastRenderedPageBreak/>
-        <w:t xml:space="preserve">35 – Para centralizar a nossa lista de produtos na </w:t>
-      </w:r>
-      <w:proofErr w:type="spellStart"/>
-      <w:r>
-        <w:t>class</w:t>
-      </w:r>
-      <w:proofErr w:type="spellEnd"/>
-      <w:r>
-        <w:t xml:space="preserve"> produtos demos uma largura de 940px e utilizamos o </w:t>
-      </w:r>
-      <w:proofErr w:type="spellStart"/>
-      <w:r>
-        <w:t>margin</w:t>
-      </w:r>
-      <w:proofErr w:type="spellEnd"/>
-      <w:r>
-        <w:t xml:space="preserve"> 0 auto:</w:t>
+        <w:t>35 – Para centralizar a nossa lista de produtos na class produtos demos uma largura de 940px e utilizamos o margin 0 auto:</w:t>
       </w:r>
     </w:p>
     <w:p>
@@ -5369,23 +5337,7 @@
     </w:p>
     <w:p>
       <w:r>
-        <w:t xml:space="preserve">Para centralizar o texto de cada item da lista utilizamos o </w:t>
-      </w:r>
-      <w:proofErr w:type="spellStart"/>
-      <w:r>
-        <w:t>text-align:center</w:t>
-      </w:r>
-      <w:proofErr w:type="spellEnd"/>
-      <w:r>
-        <w:t xml:space="preserve"> </w:t>
-      </w:r>
-      <w:proofErr w:type="gramStart"/>
-      <w:r>
-        <w:t>no produtos</w:t>
-      </w:r>
-      <w:proofErr w:type="gramEnd"/>
-      <w:r>
-        <w:t>;</w:t>
+        <w:t>Para centralizar o texto de cada item da lista utilizamos o text-align:center no produtos;</w:t>
       </w:r>
     </w:p>
     <w:p>
@@ -5665,15 +5617,7 @@
         <w:t xml:space="preserve"> </w:t>
       </w:r>
       <w:r>
-        <w:t xml:space="preserve">Utilizamos o CSS através de referência por exemplo utilizamos o nome da </w:t>
-      </w:r>
-      <w:proofErr w:type="spellStart"/>
-      <w:r>
-        <w:t>class</w:t>
-      </w:r>
-      <w:proofErr w:type="spellEnd"/>
-      <w:r>
-        <w:t xml:space="preserve"> e o elemento. </w:t>
+        <w:t xml:space="preserve">Utilizamos o CSS através de referência por exemplo utilizamos o nome da class e o elemento. </w:t>
       </w:r>
     </w:p>
     <w:p>
@@ -5725,31 +5669,7 @@
     </w:p>
     <w:p>
       <w:r>
-        <w:t xml:space="preserve">38 – Nos parágrafos da lista dos produtos adicionamos as </w:t>
-      </w:r>
-      <w:proofErr w:type="spellStart"/>
-      <w:r>
-        <w:t>class</w:t>
-      </w:r>
-      <w:proofErr w:type="spellEnd"/>
-      <w:r>
-        <w:t xml:space="preserve"> </w:t>
-      </w:r>
-      <w:proofErr w:type="spellStart"/>
-      <w:r>
-        <w:t>descricao</w:t>
-      </w:r>
-      <w:proofErr w:type="spellEnd"/>
-      <w:r>
-        <w:t xml:space="preserve"> e </w:t>
-      </w:r>
-      <w:proofErr w:type="spellStart"/>
-      <w:r>
-        <w:t>preco</w:t>
-      </w:r>
-      <w:proofErr w:type="spellEnd"/>
-      <w:r>
-        <w:t xml:space="preserve"> para trabalhar com esses dois elementos conforme código abaixo:</w:t>
+        <w:t>38 – Nos parágrafos da lista dos produtos adicionamos as class descricao e preco para trabalhar com esses dois elementos conforme código abaixo:</w:t>
       </w:r>
     </w:p>
     <w:p>
@@ -5928,26 +5848,10 @@
         </mc:AlternateContent>
       </w:r>
       <w:r>
-        <w:t xml:space="preserve">39 – </w:t>
-      </w:r>
-      <w:proofErr w:type="gramStart"/>
-      <w:r>
-        <w:t>No produtos</w:t>
-      </w:r>
-      <w:proofErr w:type="gramEnd"/>
-      <w:r>
-        <w:t xml:space="preserve"> li inserimos uma cor de fundo e </w:t>
-      </w:r>
-      <w:r>
-        <w:t xml:space="preserve">demos uma distância de 1.5% tanto para a esquerda, quanto para a direita utilizando </w:t>
-      </w:r>
-      <w:proofErr w:type="spellStart"/>
-      <w:r>
-        <w:t>margin</w:t>
-      </w:r>
-      <w:proofErr w:type="spellEnd"/>
-      <w:r>
-        <w:t>.</w:t>
+        <w:t xml:space="preserve">39 – No produtos li inserimos uma cor de fundo e </w:t>
+      </w:r>
+      <w:r>
+        <w:t>demos uma distância de 1.5% tanto para a esquerda, quanto para a direita utilizando margin.</w:t>
       </w:r>
     </w:p>
     <w:p>
@@ -6108,15 +6012,7 @@
         </mc:AlternateContent>
       </w:r>
       <w:r>
-        <w:t xml:space="preserve">40 – Na </w:t>
-      </w:r>
-      <w:proofErr w:type="spellStart"/>
-      <w:r>
-        <w:t>Class</w:t>
-      </w:r>
-      <w:proofErr w:type="spellEnd"/>
-      <w:r>
-        <w:t xml:space="preserve"> produtos inserimos um espaço interno que aumentou o tamanho tanto para cima como para baixo.</w:t>
+        <w:t>40 – Na Class produtos inserimos um espaço interno que aumentou o tamanho tanto para cima como para baixo.</w:t>
       </w:r>
     </w:p>
     <w:p>
@@ -6132,6 +6028,9 @@
         <w:t xml:space="preserve"> </w:t>
       </w:r>
       <w:r>
+        <w:rPr>
+          <w:noProof/>
+        </w:rPr>
         <w:drawing>
           <wp:inline distT="0" distB="0" distL="0" distR="0" wp14:anchorId="763AEFCE" wp14:editId="1E2355DD">
             <wp:extent cx="1448002" cy="866896"/>
@@ -6349,19 +6248,14 @@
         </mc:AlternateContent>
       </w:r>
       <w:r>
-        <w:t xml:space="preserve">41 – </w:t>
-      </w:r>
-      <w:proofErr w:type="gramStart"/>
-      <w:r>
-        <w:t>No produtos</w:t>
-      </w:r>
-      <w:proofErr w:type="gramEnd"/>
-      <w:r>
-        <w:t xml:space="preserve"> li adicionamos um espaço interno para cima como para baixo e para direita e para a esquerda.</w:t>
-      </w:r>
-    </w:p>
-    <w:p>
-      <w:r>
+        <w:t>41 – No produtos li adicionamos um espaço interno para cima como para baixo e para direita e para a esquerda.</w:t>
+      </w:r>
+    </w:p>
+    <w:p>
+      <w:r>
+        <w:rPr>
+          <w:noProof/>
+        </w:rPr>
         <w:drawing>
           <wp:inline distT="0" distB="0" distL="0" distR="0" wp14:anchorId="13758231" wp14:editId="2E388B2E">
             <wp:extent cx="2381250" cy="2628035"/>
@@ -6399,6 +6293,9 @@
         </w:drawing>
       </w:r>
       <w:r>
+        <w:rPr>
+          <w:noProof/>
+        </w:rPr>
         <w:drawing>
           <wp:inline distT="0" distB="0" distL="0" distR="0" wp14:anchorId="49FE2E4F" wp14:editId="4D287141">
             <wp:extent cx="2390775" cy="1609725"/>
@@ -6574,19 +6471,14 @@
         </mc:AlternateContent>
       </w:r>
       <w:r>
-        <w:t>42 – Para ajustar o espaço utilizamos o box-</w:t>
-      </w:r>
-      <w:proofErr w:type="spellStart"/>
-      <w:r>
-        <w:t>sizing</w:t>
-      </w:r>
-      <w:proofErr w:type="spellEnd"/>
-      <w:r>
-        <w:t>, onde ele automaticamente ajustou o espaço.</w:t>
-      </w:r>
-    </w:p>
-    <w:p>
-      <w:r>
+        <w:t>42 – Para ajustar o espaço utilizamos o box-sizing, onde ele automaticamente ajustou o espaço.</w:t>
+      </w:r>
+    </w:p>
+    <w:p>
+      <w:r>
+        <w:rPr>
+          <w:noProof/>
+        </w:rPr>
         <w:drawing>
           <wp:inline distT="0" distB="0" distL="0" distR="0" wp14:anchorId="67FFC03A" wp14:editId="5B274B74">
             <wp:extent cx="2476846" cy="1857634"/>
@@ -6624,6 +6516,9 @@
         </w:drawing>
       </w:r>
       <w:r>
+        <w:rPr>
+          <w:noProof/>
+        </w:rPr>
         <w:drawing>
           <wp:inline distT="0" distB="0" distL="0" distR="0" wp14:anchorId="3240E0C1" wp14:editId="18B66C14">
             <wp:extent cx="2895600" cy="1537706"/>
@@ -6795,27 +6690,14 @@
         </mc:AlternateContent>
       </w:r>
       <w:r>
-        <w:t xml:space="preserve">43 – Para arrumar o espaço entre o texto e o preço colocamos um espaço externo na </w:t>
-      </w:r>
-      <w:proofErr w:type="spellStart"/>
-      <w:r>
-        <w:t>class</w:t>
-      </w:r>
-      <w:proofErr w:type="spellEnd"/>
-      <w:r>
-        <w:t xml:space="preserve"> </w:t>
-      </w:r>
-      <w:proofErr w:type="spellStart"/>
-      <w:r>
-        <w:t>preco</w:t>
-      </w:r>
-      <w:proofErr w:type="spellEnd"/>
-      <w:r>
-        <w:t xml:space="preserve"> conforme imagem.</w:t>
-      </w:r>
-    </w:p>
-    <w:p>
-      <w:r>
+        <w:t>43 – Para arrumar o espaço entre o texto e o preço colocamos um espaço externo na class preco conforme imagem.</w:t>
+      </w:r>
+    </w:p>
+    <w:p>
+      <w:r>
+        <w:rPr>
+          <w:noProof/>
+        </w:rPr>
         <w:drawing>
           <wp:inline distT="0" distB="0" distL="0" distR="0" wp14:anchorId="2CA899D3" wp14:editId="2635A752">
             <wp:extent cx="1771897" cy="1114581"/>
@@ -6853,6 +6735,9 @@
         </w:drawing>
       </w:r>
       <w:r>
+        <w:rPr>
+          <w:noProof/>
+        </w:rPr>
         <w:drawing>
           <wp:inline distT="0" distB="0" distL="0" distR="0" wp14:anchorId="18B57600" wp14:editId="1F9C6E61">
             <wp:extent cx="3594467" cy="567055"/>
@@ -7029,6 +6914,9 @@
         </mc:AlternateContent>
       </w:r>
       <w:r>
+        <w:rPr>
+          <w:noProof/>
+        </w:rPr>
         <w:drawing>
           <wp:inline distT="0" distB="0" distL="0" distR="0" wp14:anchorId="7C8FF5EF" wp14:editId="4390C208">
             <wp:extent cx="2514951" cy="1895740"/>
@@ -7066,6 +6954,9 @@
         </w:drawing>
       </w:r>
       <w:r>
+        <w:rPr>
+          <w:noProof/>
+        </w:rPr>
         <w:drawing>
           <wp:inline distT="0" distB="0" distL="0" distR="0" wp14:anchorId="3CA0F9CB" wp14:editId="1D1E7784">
             <wp:extent cx="2856676" cy="1878965"/>
@@ -7110,6 +7001,9 @@
     </w:p>
     <w:p>
       <w:r>
+        <w:rPr>
+          <w:noProof/>
+        </w:rPr>
         <w:drawing>
           <wp:inline distT="0" distB="0" distL="0" distR="0" wp14:anchorId="3A90CAAC" wp14:editId="2CC55210">
             <wp:extent cx="2391109" cy="2019582"/>
@@ -7147,6 +7041,9 @@
         </w:drawing>
       </w:r>
       <w:r>
+        <w:rPr>
+          <w:noProof/>
+        </w:rPr>
         <w:drawing>
           <wp:inline distT="0" distB="0" distL="0" distR="0" wp14:anchorId="7E4C8782" wp14:editId="2AD5FCBE">
             <wp:extent cx="1371791" cy="1962424"/>
@@ -7187,19 +7084,14 @@
     <w:p>
       <w:r>
         <w:lastRenderedPageBreak/>
-        <w:t xml:space="preserve">46 – Vamos trabalhar com comportamento quando o usuário ao passar o mouse sobre o elemento, ele realizará uma ação, nessa situação vamos trabalhar com o menu ao passar o mouse o elemento muda de cor utilizando o </w:t>
-      </w:r>
-      <w:proofErr w:type="spellStart"/>
-      <w:r>
-        <w:t>hover</w:t>
-      </w:r>
-      <w:proofErr w:type="spellEnd"/>
-      <w:r>
-        <w:t>.</w:t>
-      </w:r>
-    </w:p>
-    <w:p>
-      <w:r>
+        <w:t>46 – Vamos trabalhar com comportamento quando o usuário ao passar o mouse sobre o elemento, ele realizará uma ação, nessa situação vamos trabalhar com o menu ao passar o mouse o elemento muda de cor utilizando o hover.</w:t>
+      </w:r>
+    </w:p>
+    <w:p>
+      <w:r>
+        <w:rPr>
+          <w:noProof/>
+        </w:rPr>
         <w:drawing>
           <wp:inline distT="0" distB="0" distL="0" distR="0" wp14:anchorId="1171D0D5" wp14:editId="582A7583">
             <wp:extent cx="1638529" cy="657317"/>
@@ -7237,6 +7129,9 @@
         </w:drawing>
       </w:r>
       <w:r>
+        <w:rPr>
+          <w:noProof/>
+        </w:rPr>
         <w:drawing>
           <wp:inline distT="0" distB="0" distL="0" distR="0" wp14:anchorId="37B9773E" wp14:editId="07E2C91D">
             <wp:extent cx="2981325" cy="663292"/>
@@ -7276,19 +7171,14 @@
     </w:p>
     <w:p>
       <w:r>
-        <w:t xml:space="preserve">47 – Ainda trabalhando com o </w:t>
-      </w:r>
-      <w:proofErr w:type="spellStart"/>
-      <w:r>
-        <w:t>hover</w:t>
-      </w:r>
-      <w:proofErr w:type="spellEnd"/>
-      <w:r>
-        <w:t>, ao passar o mouse adicionamos uma linha em cada item do menu.</w:t>
-      </w:r>
-    </w:p>
-    <w:p>
-      <w:r>
+        <w:t>47 – Ainda trabalhando com o hover, ao passar o mouse adicionamos uma linha em cada item do menu.</w:t>
+      </w:r>
+    </w:p>
+    <w:p>
+      <w:r>
+        <w:rPr>
+          <w:noProof/>
+        </w:rPr>
         <w:drawing>
           <wp:inline distT="0" distB="0" distL="0" distR="0" wp14:anchorId="763EF741" wp14:editId="6C6ABC93">
             <wp:extent cx="2381582" cy="743054"/>
@@ -7326,6 +7216,9 @@
         </w:drawing>
       </w:r>
       <w:r>
+        <w:rPr>
+          <w:noProof/>
+        </w:rPr>
         <w:drawing>
           <wp:inline distT="0" distB="0" distL="0" distR="0" wp14:anchorId="00637923" wp14:editId="3CD3C59B">
             <wp:extent cx="2867025" cy="232896"/>
@@ -7370,6 +7263,9 @@
     </w:p>
     <w:p>
       <w:r>
+        <w:rPr>
+          <w:noProof/>
+        </w:rPr>
         <w:drawing>
           <wp:inline distT="0" distB="0" distL="0" distR="0" wp14:anchorId="1ADB1511" wp14:editId="2EC6B8AF">
             <wp:extent cx="2200582" cy="523948"/>
@@ -7407,6 +7303,9 @@
         </w:drawing>
       </w:r>
       <w:r>
+        <w:rPr>
+          <w:noProof/>
+        </w:rPr>
         <w:drawing>
           <wp:inline distT="0" distB="0" distL="0" distR="0" wp14:anchorId="2907A0AD" wp14:editId="498645E7">
             <wp:extent cx="2924583" cy="1962424"/>
@@ -7445,8 +7344,364 @@
       </w:r>
     </w:p>
     <w:p>
+      <w:r>
+        <w:t xml:space="preserve">49 </w:t>
+      </w:r>
+      <w:r>
+        <w:t>–</w:t>
+      </w:r>
+      <w:r>
+        <w:t xml:space="preserve"> </w:t>
+      </w:r>
+      <w:r>
+        <w:t>Mudamos a cor da borda ao clicar sobre ela utilizando o active.</w:t>
+      </w:r>
+    </w:p>
+    <w:p>
+      <w:r>
+        <w:drawing>
+          <wp:inline distT="0" distB="0" distL="0" distR="0" wp14:anchorId="5A71BC09" wp14:editId="74454F2E">
+            <wp:extent cx="2105319" cy="533474"/>
+            <wp:effectExtent l="0" t="0" r="9525" b="0"/>
+            <wp:docPr id="132" name="Imagem 132"/>
+            <wp:cNvGraphicFramePr>
+              <a:graphicFrameLocks xmlns:a="http://schemas.openxmlformats.org/drawingml/2006/main" noChangeAspect="1"/>
+            </wp:cNvGraphicFramePr>
+            <a:graphic xmlns:a="http://schemas.openxmlformats.org/drawingml/2006/main">
+              <a:graphicData uri="http://schemas.openxmlformats.org/drawingml/2006/picture">
+                <pic:pic xmlns:pic="http://schemas.openxmlformats.org/drawingml/2006/picture">
+                  <pic:nvPicPr>
+                    <pic:cNvPr id="1" name=""/>
+                    <pic:cNvPicPr/>
+                  </pic:nvPicPr>
+                  <pic:blipFill>
+                    <a:blip r:embed="rId94"/>
+                    <a:stretch>
+                      <a:fillRect/>
+                    </a:stretch>
+                  </pic:blipFill>
+                  <pic:spPr>
+                    <a:xfrm>
+                      <a:off x="0" y="0"/>
+                      <a:ext cx="2105319" cy="533474"/>
+                    </a:xfrm>
+                    <a:prstGeom prst="rect">
+                      <a:avLst/>
+                    </a:prstGeom>
+                  </pic:spPr>
+                </pic:pic>
+              </a:graphicData>
+            </a:graphic>
+          </wp:inline>
+        </w:drawing>
+      </w:r>
+    </w:p>
+    <w:p>
+      <w:r>
+        <w:drawing>
+          <wp:inline distT="0" distB="0" distL="0" distR="0" wp14:anchorId="73795185" wp14:editId="29998425">
+            <wp:extent cx="1903115" cy="2705100"/>
+            <wp:effectExtent l="0" t="0" r="1905" b="0"/>
+            <wp:docPr id="133" name="Imagem 133"/>
+            <wp:cNvGraphicFramePr>
+              <a:graphicFrameLocks xmlns:a="http://schemas.openxmlformats.org/drawingml/2006/main" noChangeAspect="1"/>
+            </wp:cNvGraphicFramePr>
+            <a:graphic xmlns:a="http://schemas.openxmlformats.org/drawingml/2006/main">
+              <a:graphicData uri="http://schemas.openxmlformats.org/drawingml/2006/picture">
+                <pic:pic xmlns:pic="http://schemas.openxmlformats.org/drawingml/2006/picture">
+                  <pic:nvPicPr>
+                    <pic:cNvPr id="1" name=""/>
+                    <pic:cNvPicPr/>
+                  </pic:nvPicPr>
+                  <pic:blipFill>
+                    <a:blip r:embed="rId95"/>
+                    <a:stretch>
+                      <a:fillRect/>
+                    </a:stretch>
+                  </pic:blipFill>
+                  <pic:spPr>
+                    <a:xfrm>
+                      <a:off x="0" y="0"/>
+                      <a:ext cx="1953479" cy="2776687"/>
+                    </a:xfrm>
+                    <a:prstGeom prst="rect">
+                      <a:avLst/>
+                    </a:prstGeom>
+                  </pic:spPr>
+                </pic:pic>
+              </a:graphicData>
+            </a:graphic>
+          </wp:inline>
+        </w:drawing>
+      </w:r>
+    </w:p>
+    <w:p>
+      <w:r>
+        <w:lastRenderedPageBreak/>
+        <w:t>50 – Agora vamos deixar a nossa página mais interativa, colocando um hover no título, ou seja</w:t>
+      </w:r>
+      <w:r>
+        <w:t>,</w:t>
+      </w:r>
       <w:bookmarkStart w:id="0" w:name="_GoBack"/>
       <w:bookmarkEnd w:id="0"/>
+      <w:r>
+        <w:t xml:space="preserve"> vamos passar o mouse ele vai aumentar de tamanho passando uma impressão que a imagem está se movendo</w:t>
+      </w:r>
+    </w:p>
+    <w:p>
+      <w:r>
+        <w:drawing>
+          <wp:inline distT="0" distB="0" distL="0" distR="0" wp14:anchorId="28C4677B" wp14:editId="7470F8BB">
+            <wp:extent cx="1848108" cy="552527"/>
+            <wp:effectExtent l="0" t="0" r="0" b="0"/>
+            <wp:docPr id="134" name="Imagem 134"/>
+            <wp:cNvGraphicFramePr>
+              <a:graphicFrameLocks xmlns:a="http://schemas.openxmlformats.org/drawingml/2006/main" noChangeAspect="1"/>
+            </wp:cNvGraphicFramePr>
+            <a:graphic xmlns:a="http://schemas.openxmlformats.org/drawingml/2006/main">
+              <a:graphicData uri="http://schemas.openxmlformats.org/drawingml/2006/picture">
+                <pic:pic xmlns:pic="http://schemas.openxmlformats.org/drawingml/2006/picture">
+                  <pic:nvPicPr>
+                    <pic:cNvPr id="1" name=""/>
+                    <pic:cNvPicPr/>
+                  </pic:nvPicPr>
+                  <pic:blipFill>
+                    <a:blip r:embed="rId96"/>
+                    <a:stretch>
+                      <a:fillRect/>
+                    </a:stretch>
+                  </pic:blipFill>
+                  <pic:spPr>
+                    <a:xfrm>
+                      <a:off x="0" y="0"/>
+                      <a:ext cx="1848108" cy="552527"/>
+                    </a:xfrm>
+                    <a:prstGeom prst="rect">
+                      <a:avLst/>
+                    </a:prstGeom>
+                  </pic:spPr>
+                </pic:pic>
+              </a:graphicData>
+            </a:graphic>
+          </wp:inline>
+        </w:drawing>
+      </w:r>
+      <w:r>
+        <w:drawing>
+          <wp:inline distT="0" distB="0" distL="0" distR="0" wp14:anchorId="60A5FA2E" wp14:editId="50DC53A0">
+            <wp:extent cx="5400040" cy="3769995"/>
+            <wp:effectExtent l="0" t="0" r="0" b="1905"/>
+            <wp:docPr id="135" name="Imagem 135"/>
+            <wp:cNvGraphicFramePr>
+              <a:graphicFrameLocks xmlns:a="http://schemas.openxmlformats.org/drawingml/2006/main" noChangeAspect="1"/>
+            </wp:cNvGraphicFramePr>
+            <a:graphic xmlns:a="http://schemas.openxmlformats.org/drawingml/2006/main">
+              <a:graphicData uri="http://schemas.openxmlformats.org/drawingml/2006/picture">
+                <pic:pic xmlns:pic="http://schemas.openxmlformats.org/drawingml/2006/picture">
+                  <pic:nvPicPr>
+                    <pic:cNvPr id="1" name=""/>
+                    <pic:cNvPicPr/>
+                  </pic:nvPicPr>
+                  <pic:blipFill>
+                    <a:blip r:embed="rId97"/>
+                    <a:stretch>
+                      <a:fillRect/>
+                    </a:stretch>
+                  </pic:blipFill>
+                  <pic:spPr>
+                    <a:xfrm>
+                      <a:off x="0" y="0"/>
+                      <a:ext cx="5400040" cy="3769995"/>
+                    </a:xfrm>
+                    <a:prstGeom prst="rect">
+                      <a:avLst/>
+                    </a:prstGeom>
+                  </pic:spPr>
+                </pic:pic>
+              </a:graphicData>
+            </a:graphic>
+          </wp:inline>
+        </w:drawing>
+      </w:r>
+    </w:p>
+    <w:p>
+      <w:r>
+        <w:t>51 – Adicionamos uma imagem ao footer conforme código.</w:t>
+      </w:r>
+    </w:p>
+    <w:p>
+      <w:r>
+        <w:drawing>
+          <wp:inline distT="0" distB="0" distL="0" distR="0" wp14:anchorId="2359449A" wp14:editId="52835A7E">
+            <wp:extent cx="4143953" cy="562053"/>
+            <wp:effectExtent l="0" t="0" r="9525" b="9525"/>
+            <wp:docPr id="136" name="Imagem 136"/>
+            <wp:cNvGraphicFramePr>
+              <a:graphicFrameLocks xmlns:a="http://schemas.openxmlformats.org/drawingml/2006/main" noChangeAspect="1"/>
+            </wp:cNvGraphicFramePr>
+            <a:graphic xmlns:a="http://schemas.openxmlformats.org/drawingml/2006/main">
+              <a:graphicData uri="http://schemas.openxmlformats.org/drawingml/2006/picture">
+                <pic:pic xmlns:pic="http://schemas.openxmlformats.org/drawingml/2006/picture">
+                  <pic:nvPicPr>
+                    <pic:cNvPr id="1" name=""/>
+                    <pic:cNvPicPr/>
+                  </pic:nvPicPr>
+                  <pic:blipFill>
+                    <a:blip r:embed="rId98"/>
+                    <a:stretch>
+                      <a:fillRect/>
+                    </a:stretch>
+                  </pic:blipFill>
+                  <pic:spPr>
+                    <a:xfrm>
+                      <a:off x="0" y="0"/>
+                      <a:ext cx="4143953" cy="562053"/>
+                    </a:xfrm>
+                    <a:prstGeom prst="rect">
+                      <a:avLst/>
+                    </a:prstGeom>
+                  </pic:spPr>
+                </pic:pic>
+              </a:graphicData>
+            </a:graphic>
+          </wp:inline>
+        </w:drawing>
+      </w:r>
+    </w:p>
+    <w:p>
+      <w:r>
+        <w:t>52 – Como a imagem do footer é branca, precisamos adicionar uma cor de fundo.</w:t>
+      </w:r>
+    </w:p>
+    <w:p>
+      <w:r>
+        <w:drawing>
+          <wp:inline distT="0" distB="0" distL="0" distR="0" wp14:anchorId="3423006C" wp14:editId="1FC42BA0">
+            <wp:extent cx="2410161" cy="790685"/>
+            <wp:effectExtent l="0" t="0" r="9525" b="9525"/>
+            <wp:docPr id="137" name="Imagem 137"/>
+            <wp:cNvGraphicFramePr>
+              <a:graphicFrameLocks xmlns:a="http://schemas.openxmlformats.org/drawingml/2006/main" noChangeAspect="1"/>
+            </wp:cNvGraphicFramePr>
+            <a:graphic xmlns:a="http://schemas.openxmlformats.org/drawingml/2006/main">
+              <a:graphicData uri="http://schemas.openxmlformats.org/drawingml/2006/picture">
+                <pic:pic xmlns:pic="http://schemas.openxmlformats.org/drawingml/2006/picture">
+                  <pic:nvPicPr>
+                    <pic:cNvPr id="1" name=""/>
+                    <pic:cNvPicPr/>
+                  </pic:nvPicPr>
+                  <pic:blipFill>
+                    <a:blip r:embed="rId99"/>
+                    <a:stretch>
+                      <a:fillRect/>
+                    </a:stretch>
+                  </pic:blipFill>
+                  <pic:spPr>
+                    <a:xfrm>
+                      <a:off x="0" y="0"/>
+                      <a:ext cx="2410161" cy="790685"/>
+                    </a:xfrm>
+                    <a:prstGeom prst="rect">
+                      <a:avLst/>
+                    </a:prstGeom>
+                  </pic:spPr>
+                </pic:pic>
+              </a:graphicData>
+            </a:graphic>
+          </wp:inline>
+        </w:drawing>
+      </w:r>
+    </w:p>
+    <w:p>
+      <w:r>
+        <w:t xml:space="preserve">53 </w:t>
+      </w:r>
+      <w:r>
+        <w:t>–</w:t>
+      </w:r>
+      <w:r>
+        <w:t xml:space="preserve"> </w:t>
+      </w:r>
+      <w:r>
+        <w:t>Inserimos um parágrafo no footer e centralizamos os conteúdos dentro dele.</w:t>
+      </w:r>
+    </w:p>
+    <w:p>
+      <w:r>
+        <w:drawing>
+          <wp:inline distT="0" distB="0" distL="0" distR="0" wp14:anchorId="33276234" wp14:editId="3AF0ABE8">
+            <wp:extent cx="2467319" cy="771633"/>
+            <wp:effectExtent l="0" t="0" r="0" b="9525"/>
+            <wp:docPr id="138" name="Imagem 138"/>
+            <wp:cNvGraphicFramePr>
+              <a:graphicFrameLocks xmlns:a="http://schemas.openxmlformats.org/drawingml/2006/main" noChangeAspect="1"/>
+            </wp:cNvGraphicFramePr>
+            <a:graphic xmlns:a="http://schemas.openxmlformats.org/drawingml/2006/main">
+              <a:graphicData uri="http://schemas.openxmlformats.org/drawingml/2006/picture">
+                <pic:pic xmlns:pic="http://schemas.openxmlformats.org/drawingml/2006/picture">
+                  <pic:nvPicPr>
+                    <pic:cNvPr id="1" name=""/>
+                    <pic:cNvPicPr/>
+                  </pic:nvPicPr>
+                  <pic:blipFill>
+                    <a:blip r:embed="rId100"/>
+                    <a:stretch>
+                      <a:fillRect/>
+                    </a:stretch>
+                  </pic:blipFill>
+                  <pic:spPr>
+                    <a:xfrm>
+                      <a:off x="0" y="0"/>
+                      <a:ext cx="2467319" cy="771633"/>
+                    </a:xfrm>
+                    <a:prstGeom prst="rect">
+                      <a:avLst/>
+                    </a:prstGeom>
+                  </pic:spPr>
+                </pic:pic>
+              </a:graphicData>
+            </a:graphic>
+          </wp:inline>
+        </w:drawing>
+      </w:r>
+      <w:r>
+        <w:drawing>
+          <wp:inline distT="0" distB="0" distL="0" distR="0" wp14:anchorId="393566C6" wp14:editId="5F00CCE7">
+            <wp:extent cx="1250036" cy="1295400"/>
+            <wp:effectExtent l="0" t="0" r="7620" b="0"/>
+            <wp:docPr id="139" name="Imagem 139"/>
+            <wp:cNvGraphicFramePr>
+              <a:graphicFrameLocks xmlns:a="http://schemas.openxmlformats.org/drawingml/2006/main" noChangeAspect="1"/>
+            </wp:cNvGraphicFramePr>
+            <a:graphic xmlns:a="http://schemas.openxmlformats.org/drawingml/2006/main">
+              <a:graphicData uri="http://schemas.openxmlformats.org/drawingml/2006/picture">
+                <pic:pic xmlns:pic="http://schemas.openxmlformats.org/drawingml/2006/picture">
+                  <pic:nvPicPr>
+                    <pic:cNvPr id="1" name=""/>
+                    <pic:cNvPicPr/>
+                  </pic:nvPicPr>
+                  <pic:blipFill>
+                    <a:blip r:embed="rId101"/>
+                    <a:stretch>
+                      <a:fillRect/>
+                    </a:stretch>
+                  </pic:blipFill>
+                  <pic:spPr>
+                    <a:xfrm>
+                      <a:off x="0" y="0"/>
+                      <a:ext cx="1268206" cy="1314230"/>
+                    </a:xfrm>
+                    <a:prstGeom prst="rect">
+                      <a:avLst/>
+                    </a:prstGeom>
+                  </pic:spPr>
+                </pic:pic>
+              </a:graphicData>
+            </a:graphic>
+          </wp:inline>
+        </w:drawing>
+      </w:r>
     </w:p>
     <w:sectPr>
       <w:pgSz w:w="11906" w:h="16838"/>
@@ -9057,7 +9312,7 @@
 </file>
 
 <file path=customXml/itemProps1.xml><?xml version="1.0" encoding="utf-8"?>
-<ds:datastoreItem xmlns:ds="http://schemas.openxmlformats.org/officeDocument/2006/customXml" ds:itemID="{B641A1E0-E2D5-41BB-8F78-8AB0898F9092}">
+<ds:datastoreItem xmlns:ds="http://schemas.openxmlformats.org/officeDocument/2006/customXml" ds:itemID="{7087983F-3E08-45A8-A2AD-170384C2E013}">
   <ds:schemaRefs>
     <ds:schemaRef ds:uri="http://schemas.openxmlformats.org/officeDocument/2006/bibliography"/>
   </ds:schemaRefs>

</xml_diff>

<commit_message>
atualização do dia 11/09/2026
</commit_message>
<xml_diff>
--- a/apostila/Projeto Space For Men.docx
+++ b/apostila/Projeto Space For Men.docx
@@ -7359,6 +7359,9 @@
     </w:p>
     <w:p>
       <w:r>
+        <w:rPr>
+          <w:noProof/>
+        </w:rPr>
         <w:drawing>
           <wp:inline distT="0" distB="0" distL="0" distR="0" wp14:anchorId="5A71BC09" wp14:editId="74454F2E">
             <wp:extent cx="2105319" cy="533474"/>
@@ -7398,6 +7401,9 @@
     </w:p>
     <w:p>
       <w:r>
+        <w:rPr>
+          <w:noProof/>
+        </w:rPr>
         <w:drawing>
           <wp:inline distT="0" distB="0" distL="0" distR="0" wp14:anchorId="73795185" wp14:editId="29998425">
             <wp:extent cx="1903115" cy="2705100"/>
@@ -7443,14 +7449,15 @@
       <w:r>
         <w:t>,</w:t>
       </w:r>
-      <w:bookmarkStart w:id="0" w:name="_GoBack"/>
-      <w:bookmarkEnd w:id="0"/>
       <w:r>
         <w:t xml:space="preserve"> vamos passar o mouse ele vai aumentar de tamanho passando uma impressão que a imagem está se movendo</w:t>
       </w:r>
     </w:p>
     <w:p>
       <w:r>
+        <w:rPr>
+          <w:noProof/>
+        </w:rPr>
         <w:drawing>
           <wp:inline distT="0" distB="0" distL="0" distR="0" wp14:anchorId="28C4677B" wp14:editId="7470F8BB">
             <wp:extent cx="1848108" cy="552527"/>
@@ -7488,6 +7495,9 @@
         </w:drawing>
       </w:r>
       <w:r>
+        <w:rPr>
+          <w:noProof/>
+        </w:rPr>
         <w:drawing>
           <wp:inline distT="0" distB="0" distL="0" distR="0" wp14:anchorId="60A5FA2E" wp14:editId="50DC53A0">
             <wp:extent cx="5400040" cy="3769995"/>
@@ -7532,6 +7542,9 @@
     </w:p>
     <w:p>
       <w:r>
+        <w:rPr>
+          <w:noProof/>
+        </w:rPr>
         <w:drawing>
           <wp:inline distT="0" distB="0" distL="0" distR="0" wp14:anchorId="2359449A" wp14:editId="52835A7E">
             <wp:extent cx="4143953" cy="562053"/>
@@ -7576,6 +7589,9 @@
     </w:p>
     <w:p>
       <w:r>
+        <w:rPr>
+          <w:noProof/>
+        </w:rPr>
         <w:drawing>
           <wp:inline distT="0" distB="0" distL="0" distR="0" wp14:anchorId="3423006C" wp14:editId="1FC42BA0">
             <wp:extent cx="2410161" cy="790685"/>
@@ -7629,6 +7645,9 @@
     </w:p>
     <w:p>
       <w:r>
+        <w:rPr>
+          <w:noProof/>
+        </w:rPr>
         <w:drawing>
           <wp:inline distT="0" distB="0" distL="0" distR="0" wp14:anchorId="33276234" wp14:editId="3AF0ABE8">
             <wp:extent cx="2467319" cy="771633"/>
@@ -7666,6 +7685,9 @@
         </w:drawing>
       </w:r>
       <w:r>
+        <w:rPr>
+          <w:noProof/>
+        </w:rPr>
         <w:drawing>
           <wp:inline distT="0" distB="0" distL="0" distR="0" wp14:anchorId="393566C6" wp14:editId="5F00CCE7">
             <wp:extent cx="1250036" cy="1295400"/>
@@ -7702,6 +7724,518 @@
           </wp:inline>
         </w:drawing>
       </w:r>
+    </w:p>
+    <w:p>
+      <w:pPr>
+        <w:rPr>
+          <w:u w:val="single"/>
+        </w:rPr>
+      </w:pPr>
+      <w:r>
+        <w:rPr>
+          <w:noProof/>
+        </w:rPr>
+        <w:lastRenderedPageBreak/>
+        <mc:AlternateContent>
+          <mc:Choice Requires="wps">
+            <w:drawing>
+              <wp:anchor distT="0" distB="0" distL="114300" distR="114300" simplePos="0" relativeHeight="251707392" behindDoc="0" locked="0" layoutInCell="1" allowOverlap="1">
+                <wp:simplePos x="0" y="0"/>
+                <wp:positionH relativeFrom="column">
+                  <wp:posOffset>1415415</wp:posOffset>
+                </wp:positionH>
+                <wp:positionV relativeFrom="paragraph">
+                  <wp:posOffset>376555</wp:posOffset>
+                </wp:positionV>
+                <wp:extent cx="781050" cy="895350"/>
+                <wp:effectExtent l="0" t="0" r="76200" b="57150"/>
+                <wp:wrapNone/>
+                <wp:docPr id="141" name="Conector de Seta Reta 141"/>
+                <wp:cNvGraphicFramePr/>
+                <a:graphic xmlns:a="http://schemas.openxmlformats.org/drawingml/2006/main">
+                  <a:graphicData uri="http://schemas.microsoft.com/office/word/2010/wordprocessingShape">
+                    <wps:wsp>
+                      <wps:cNvCnPr/>
+                      <wps:spPr>
+                        <a:xfrm>
+                          <a:off x="0" y="0"/>
+                          <a:ext cx="781050" cy="895350"/>
+                        </a:xfrm>
+                        <a:prstGeom prst="straightConnector1">
+                          <a:avLst/>
+                        </a:prstGeom>
+                        <a:ln>
+                          <a:tailEnd type="triangle"/>
+                        </a:ln>
+                      </wps:spPr>
+                      <wps:style>
+                        <a:lnRef idx="1">
+                          <a:schemeClr val="accent1"/>
+                        </a:lnRef>
+                        <a:fillRef idx="0">
+                          <a:schemeClr val="accent1"/>
+                        </a:fillRef>
+                        <a:effectRef idx="0">
+                          <a:schemeClr val="accent1"/>
+                        </a:effectRef>
+                        <a:fontRef idx="minor">
+                          <a:schemeClr val="tx1"/>
+                        </a:fontRef>
+                      </wps:style>
+                      <wps:bodyPr/>
+                    </wps:wsp>
+                  </a:graphicData>
+                </a:graphic>
+              </wp:anchor>
+            </w:drawing>
+          </mc:Choice>
+          <mc:Fallback>
+            <w:pict>
+              <v:shapetype w14:anchorId="54921294" id="_x0000_t32" coordsize="21600,21600" o:spt="32" o:oned="t" path="m,l21600,21600e" filled="f">
+                <v:path arrowok="t" fillok="f" o:connecttype="none"/>
+                <o:lock v:ext="edit" shapetype="t"/>
+              </v:shapetype>
+              <v:shape id="Conector de Seta Reta 141" o:spid="_x0000_s1026" type="#_x0000_t32" style="position:absolute;margin-left:111.45pt;margin-top:29.65pt;width:61.5pt;height:70.5pt;z-index:251707392;visibility:visible;mso-wrap-style:square;mso-wrap-distance-left:9pt;mso-wrap-distance-top:0;mso-wrap-distance-right:9pt;mso-wrap-distance-bottom:0;mso-position-horizontal:absolute;mso-position-horizontal-relative:text;mso-position-vertical:absolute;mso-position-vertical-relative:text" o:gfxdata="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" strokecolor="#4472c4 [3204]" strokeweight=".5pt">
+                <v:stroke endarrow="block" joinstyle="miter"/>
+              </v:shape>
+            </w:pict>
+          </mc:Fallback>
+        </mc:AlternateContent>
+      </w:r>
+      <w:r>
+        <w:t xml:space="preserve">54 – Inserindo uma imagem de fundo no site, ao contrário do HTML introduzimos uma imagem de fundo pelo CSS e quando realizamos tal função, </w:t>
+      </w:r>
+      <w:r>
+        <w:rPr>
+          <w:u w:val="single"/>
+        </w:rPr>
+        <w:t>a natureza da imagem é ficar se repetindo no site.</w:t>
+      </w:r>
+    </w:p>
+    <w:p>
+      <w:r>
+        <w:rPr>
+          <w:b/>
+          <w:noProof/>
+        </w:rPr>
+        <mc:AlternateContent>
+          <mc:Choice Requires="wps">
+            <w:drawing>
+              <wp:anchor distT="0" distB="0" distL="114300" distR="114300" simplePos="0" relativeHeight="251706368" behindDoc="0" locked="0" layoutInCell="1" allowOverlap="1">
+                <wp:simplePos x="0" y="0"/>
+                <wp:positionH relativeFrom="margin">
+                  <wp:posOffset>2539364</wp:posOffset>
+                </wp:positionH>
+                <wp:positionV relativeFrom="paragraph">
+                  <wp:posOffset>218440</wp:posOffset>
+                </wp:positionV>
+                <wp:extent cx="1276350" cy="790575"/>
+                <wp:effectExtent l="38100" t="0" r="19050" b="47625"/>
+                <wp:wrapNone/>
+                <wp:docPr id="140" name="Conector de Seta Reta 140"/>
+                <wp:cNvGraphicFramePr/>
+                <a:graphic xmlns:a="http://schemas.openxmlformats.org/drawingml/2006/main">
+                  <a:graphicData uri="http://schemas.microsoft.com/office/word/2010/wordprocessingShape">
+                    <wps:wsp>
+                      <wps:cNvCnPr/>
+                      <wps:spPr>
+                        <a:xfrm flipH="1">
+                          <a:off x="0" y="0"/>
+                          <a:ext cx="1276350" cy="790575"/>
+                        </a:xfrm>
+                        <a:prstGeom prst="straightConnector1">
+                          <a:avLst/>
+                        </a:prstGeom>
+                        <a:ln>
+                          <a:tailEnd type="triangle"/>
+                        </a:ln>
+                      </wps:spPr>
+                      <wps:style>
+                        <a:lnRef idx="1">
+                          <a:schemeClr val="accent1"/>
+                        </a:lnRef>
+                        <a:fillRef idx="0">
+                          <a:schemeClr val="accent1"/>
+                        </a:fillRef>
+                        <a:effectRef idx="0">
+                          <a:schemeClr val="accent1"/>
+                        </a:effectRef>
+                        <a:fontRef idx="minor">
+                          <a:schemeClr val="tx1"/>
+                        </a:fontRef>
+                      </wps:style>
+                      <wps:bodyPr/>
+                    </wps:wsp>
+                  </a:graphicData>
+                </a:graphic>
+                <wp14:sizeRelH relativeFrom="margin">
+                  <wp14:pctWidth>0</wp14:pctWidth>
+                </wp14:sizeRelH>
+                <wp14:sizeRelV relativeFrom="margin">
+                  <wp14:pctHeight>0</wp14:pctHeight>
+                </wp14:sizeRelV>
+              </wp:anchor>
+            </w:drawing>
+          </mc:Choice>
+          <mc:Fallback>
+            <w:pict>
+              <v:shape w14:anchorId="350BFA60" id="Conector de Seta Reta 140" o:spid="_x0000_s1026" type="#_x0000_t32" style="position:absolute;margin-left:199.95pt;margin-top:17.2pt;width:100.5pt;height:62.25pt;flip:x;z-index:251706368;visibility:visible;mso-wrap-style:square;mso-width-percent:0;mso-height-percent:0;mso-wrap-distance-left:9pt;mso-wrap-distance-top:0;mso-wrap-distance-right:9pt;mso-wrap-distance-bottom:0;mso-position-horizontal:absolute;mso-position-horizontal-relative:margin;mso-position-vertical:absolute;mso-position-vertical-relative:text;mso-width-percent:0;mso-height-percent:0;mso-width-relative:margin;mso-height-relative:margin" o:gfxdata="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" strokecolor="#4472c4 [3204]" strokeweight=".5pt">
+                <v:stroke endarrow="block" joinstyle="miter"/>
+                <w10:wrap anchorx="margin"/>
+              </v:shape>
+            </w:pict>
+          </mc:Fallback>
+        </mc:AlternateContent>
+      </w:r>
+      <w:r>
+        <w:rPr>
+          <w:b/>
+        </w:rPr>
+        <w:t>Se não quisemos</w:t>
+      </w:r>
+      <w:r>
+        <w:t xml:space="preserve"> que isso aconteça precisamos adicionar o comando.</w:t>
+      </w:r>
+    </w:p>
+    <w:p>
+      <w:r>
+        <w:drawing>
+          <wp:inline distT="0" distB="0" distL="0" distR="0" wp14:anchorId="15DC4323" wp14:editId="5DA4FD37">
+            <wp:extent cx="3077004" cy="1028844"/>
+            <wp:effectExtent l="0" t="0" r="0" b="0"/>
+            <wp:docPr id="131" name="Imagem 131"/>
+            <wp:cNvGraphicFramePr>
+              <a:graphicFrameLocks xmlns:a="http://schemas.openxmlformats.org/drawingml/2006/main" noChangeAspect="1"/>
+            </wp:cNvGraphicFramePr>
+            <a:graphic xmlns:a="http://schemas.openxmlformats.org/drawingml/2006/main">
+              <a:graphicData uri="http://schemas.openxmlformats.org/drawingml/2006/picture">
+                <pic:pic xmlns:pic="http://schemas.openxmlformats.org/drawingml/2006/picture">
+                  <pic:nvPicPr>
+                    <pic:cNvPr id="1" name=""/>
+                    <pic:cNvPicPr/>
+                  </pic:nvPicPr>
+                  <pic:blipFill>
+                    <a:blip r:embed="rId102"/>
+                    <a:stretch>
+                      <a:fillRect/>
+                    </a:stretch>
+                  </pic:blipFill>
+                  <pic:spPr>
+                    <a:xfrm>
+                      <a:off x="0" y="0"/>
+                      <a:ext cx="3077004" cy="1028844"/>
+                    </a:xfrm>
+                    <a:prstGeom prst="rect">
+                      <a:avLst/>
+                    </a:prstGeom>
+                  </pic:spPr>
+                </pic:pic>
+              </a:graphicData>
+            </a:graphic>
+          </wp:inline>
+        </w:drawing>
+      </w:r>
+    </w:p>
+    <w:p>
+      <w:r>
+        <w:rPr>
+          <w:noProof/>
+        </w:rPr>
+        <mc:AlternateContent>
+          <mc:Choice Requires="wps">
+            <w:drawing>
+              <wp:anchor distT="0" distB="0" distL="114300" distR="114300" simplePos="0" relativeHeight="251708416" behindDoc="0" locked="0" layoutInCell="1" allowOverlap="1">
+                <wp:simplePos x="0" y="0"/>
+                <wp:positionH relativeFrom="column">
+                  <wp:posOffset>15240</wp:posOffset>
+                </wp:positionH>
+                <wp:positionV relativeFrom="paragraph">
+                  <wp:posOffset>331470</wp:posOffset>
+                </wp:positionV>
+                <wp:extent cx="381000" cy="1209675"/>
+                <wp:effectExtent l="0" t="0" r="76200" b="47625"/>
+                <wp:wrapNone/>
+                <wp:docPr id="143" name="Conector de Seta Reta 143"/>
+                <wp:cNvGraphicFramePr/>
+                <a:graphic xmlns:a="http://schemas.openxmlformats.org/drawingml/2006/main">
+                  <a:graphicData uri="http://schemas.microsoft.com/office/word/2010/wordprocessingShape">
+                    <wps:wsp>
+                      <wps:cNvCnPr/>
+                      <wps:spPr>
+                        <a:xfrm>
+                          <a:off x="0" y="0"/>
+                          <a:ext cx="381000" cy="1209675"/>
+                        </a:xfrm>
+                        <a:prstGeom prst="straightConnector1">
+                          <a:avLst/>
+                        </a:prstGeom>
+                        <a:ln>
+                          <a:tailEnd type="triangle"/>
+                        </a:ln>
+                      </wps:spPr>
+                      <wps:style>
+                        <a:lnRef idx="1">
+                          <a:schemeClr val="accent1"/>
+                        </a:lnRef>
+                        <a:fillRef idx="0">
+                          <a:schemeClr val="accent1"/>
+                        </a:fillRef>
+                        <a:effectRef idx="0">
+                          <a:schemeClr val="accent1"/>
+                        </a:effectRef>
+                        <a:fontRef idx="minor">
+                          <a:schemeClr val="tx1"/>
+                        </a:fontRef>
+                      </wps:style>
+                      <wps:bodyPr/>
+                    </wps:wsp>
+                  </a:graphicData>
+                </a:graphic>
+                <wp14:sizeRelH relativeFrom="margin">
+                  <wp14:pctWidth>0</wp14:pctWidth>
+                </wp14:sizeRelH>
+                <wp14:sizeRelV relativeFrom="margin">
+                  <wp14:pctHeight>0</wp14:pctHeight>
+                </wp14:sizeRelV>
+              </wp:anchor>
+            </w:drawing>
+          </mc:Choice>
+          <mc:Fallback>
+            <w:pict>
+              <v:shape w14:anchorId="5778BDC8" id="Conector de Seta Reta 143" o:spid="_x0000_s1026" type="#_x0000_t32" style="position:absolute;margin-left:1.2pt;margin-top:26.1pt;width:30pt;height:95.25pt;z-index:251708416;visibility:visible;mso-wrap-style:square;mso-width-percent:0;mso-height-percent:0;mso-wrap-distance-left:9pt;mso-wrap-distance-top:0;mso-wrap-distance-right:9pt;mso-wrap-distance-bottom:0;mso-position-horizontal:absolute;mso-position-horizontal-relative:text;mso-position-vertical:absolute;mso-position-vertical-relative:text;mso-width-percent:0;mso-height-percent:0;mso-width-relative:margin;mso-height-relative:margin" o:gfxdata="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" strokecolor="#4472c4 [3204]" strokeweight=".5pt">
+                <v:stroke endarrow="block" joinstyle="miter"/>
+              </v:shape>
+            </w:pict>
+          </mc:Fallback>
+        </mc:AlternateContent>
+      </w:r>
+      <w:r>
+        <w:t xml:space="preserve">55 – No </w:t>
+      </w:r>
+      <w:proofErr w:type="spellStart"/>
+      <w:r>
+        <w:t>footer</w:t>
+      </w:r>
+      <w:proofErr w:type="spellEnd"/>
+      <w:r>
+        <w:t xml:space="preserve"> após colocarmos uma imagem de fundo preta, se fez necessário mudar a cor da letra do parágrafo (White).</w:t>
+      </w:r>
+    </w:p>
+    <w:p>
+      <w:r>
+        <w:rPr>
+          <w:noProof/>
+        </w:rPr>
+        <mc:AlternateContent>
+          <mc:Choice Requires="wps">
+            <w:drawing>
+              <wp:anchor distT="0" distB="0" distL="114300" distR="114300" simplePos="0" relativeHeight="251709440" behindDoc="0" locked="0" layoutInCell="1" allowOverlap="1">
+                <wp:simplePos x="0" y="0"/>
+                <wp:positionH relativeFrom="column">
+                  <wp:posOffset>1558290</wp:posOffset>
+                </wp:positionH>
+                <wp:positionV relativeFrom="paragraph">
+                  <wp:posOffset>186055</wp:posOffset>
+                </wp:positionV>
+                <wp:extent cx="2266950" cy="1162050"/>
+                <wp:effectExtent l="38100" t="0" r="19050" b="57150"/>
+                <wp:wrapNone/>
+                <wp:docPr id="144" name="Conector de Seta Reta 144"/>
+                <wp:cNvGraphicFramePr/>
+                <a:graphic xmlns:a="http://schemas.openxmlformats.org/drawingml/2006/main">
+                  <a:graphicData uri="http://schemas.microsoft.com/office/word/2010/wordprocessingShape">
+                    <wps:wsp>
+                      <wps:cNvCnPr/>
+                      <wps:spPr>
+                        <a:xfrm flipH="1">
+                          <a:off x="0" y="0"/>
+                          <a:ext cx="2266950" cy="1162050"/>
+                        </a:xfrm>
+                        <a:prstGeom prst="straightConnector1">
+                          <a:avLst/>
+                        </a:prstGeom>
+                        <a:ln>
+                          <a:tailEnd type="triangle"/>
+                        </a:ln>
+                      </wps:spPr>
+                      <wps:style>
+                        <a:lnRef idx="1">
+                          <a:schemeClr val="accent1"/>
+                        </a:lnRef>
+                        <a:fillRef idx="0">
+                          <a:schemeClr val="accent1"/>
+                        </a:fillRef>
+                        <a:effectRef idx="0">
+                          <a:schemeClr val="accent1"/>
+                        </a:effectRef>
+                        <a:fontRef idx="minor">
+                          <a:schemeClr val="tx1"/>
+                        </a:fontRef>
+                      </wps:style>
+                      <wps:bodyPr/>
+                    </wps:wsp>
+                  </a:graphicData>
+                </a:graphic>
+                <wp14:sizeRelH relativeFrom="margin">
+                  <wp14:pctWidth>0</wp14:pctWidth>
+                </wp14:sizeRelH>
+                <wp14:sizeRelV relativeFrom="margin">
+                  <wp14:pctHeight>0</wp14:pctHeight>
+                </wp14:sizeRelV>
+              </wp:anchor>
+            </w:drawing>
+          </mc:Choice>
+          <mc:Fallback>
+            <w:pict>
+              <v:shape w14:anchorId="4B683A3E" id="Conector de Seta Reta 144" o:spid="_x0000_s1026" type="#_x0000_t32" style="position:absolute;margin-left:122.7pt;margin-top:14.65pt;width:178.5pt;height:91.5pt;flip:x;z-index:251709440;visibility:visible;mso-wrap-style:square;mso-width-percent:0;mso-height-percent:0;mso-wrap-distance-left:9pt;mso-wrap-distance-top:0;mso-wrap-distance-right:9pt;mso-wrap-distance-bottom:0;mso-position-horizontal:absolute;mso-position-horizontal-relative:text;mso-position-vertical:absolute;mso-position-vertical-relative:text;mso-width-percent:0;mso-height-percent:0;mso-width-relative:margin;mso-height-relative:margin" o:gfxdata="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" strokecolor="#4472c4 [3204]" strokeweight=".5pt">
+                <v:stroke endarrow="block" joinstyle="miter"/>
+              </v:shape>
+            </w:pict>
+          </mc:Fallback>
+        </mc:AlternateContent>
+      </w:r>
+      <w:r>
+        <w:t>Aumentamos o espeço interno tanto para cima como para baixo e diminuímos o tamanho da fonte.</w:t>
+      </w:r>
+    </w:p>
+    <w:p>
+      <w:r>
+        <w:drawing>
+          <wp:inline distT="0" distB="0" distL="0" distR="0" wp14:anchorId="5E991B67" wp14:editId="1EF04444">
+            <wp:extent cx="3086531" cy="1276528"/>
+            <wp:effectExtent l="0" t="0" r="0" b="0"/>
+            <wp:docPr id="142" name="Imagem 142"/>
+            <wp:cNvGraphicFramePr>
+              <a:graphicFrameLocks xmlns:a="http://schemas.openxmlformats.org/drawingml/2006/main" noChangeAspect="1"/>
+            </wp:cNvGraphicFramePr>
+            <a:graphic xmlns:a="http://schemas.openxmlformats.org/drawingml/2006/main">
+              <a:graphicData uri="http://schemas.openxmlformats.org/drawingml/2006/picture">
+                <pic:pic xmlns:pic="http://schemas.openxmlformats.org/drawingml/2006/picture">
+                  <pic:nvPicPr>
+                    <pic:cNvPr id="1" name=""/>
+                    <pic:cNvPicPr/>
+                  </pic:nvPicPr>
+                  <pic:blipFill>
+                    <a:blip r:embed="rId103"/>
+                    <a:stretch>
+                      <a:fillRect/>
+                    </a:stretch>
+                  </pic:blipFill>
+                  <pic:spPr>
+                    <a:xfrm>
+                      <a:off x="0" y="0"/>
+                      <a:ext cx="3086531" cy="1276528"/>
+                    </a:xfrm>
+                    <a:prstGeom prst="rect">
+                      <a:avLst/>
+                    </a:prstGeom>
+                  </pic:spPr>
+                </pic:pic>
+              </a:graphicData>
+            </a:graphic>
+          </wp:inline>
+        </w:drawing>
+      </w:r>
+    </w:p>
+    <w:p>
+      <w:r>
+        <w:t xml:space="preserve">56 </w:t>
+      </w:r>
+      <w:r>
+        <w:t>–</w:t>
+      </w:r>
+      <w:r>
+        <w:t xml:space="preserve"> </w:t>
+      </w:r>
+      <w:r>
+        <w:t>Criamos a página Contatos.HTML e Contatos.CSS, copiamos o cabeçalho (Header) da página produtos e colamos na página Contatos e repetimos o mesmo processo do CSS, com isso finalizando o menu que já estava pronto.</w:t>
+      </w:r>
+    </w:p>
+    <w:p>
+      <w:r>
+        <w:drawing>
+          <wp:inline distT="0" distB="0" distL="0" distR="0" wp14:anchorId="6ED23B50" wp14:editId="3B3BEB07">
+            <wp:extent cx="2514600" cy="1190858"/>
+            <wp:effectExtent l="0" t="0" r="0" b="9525"/>
+            <wp:docPr id="145" name="Imagem 145"/>
+            <wp:cNvGraphicFramePr>
+              <a:graphicFrameLocks xmlns:a="http://schemas.openxmlformats.org/drawingml/2006/main" noChangeAspect="1"/>
+            </wp:cNvGraphicFramePr>
+            <a:graphic xmlns:a="http://schemas.openxmlformats.org/drawingml/2006/main">
+              <a:graphicData uri="http://schemas.openxmlformats.org/drawingml/2006/picture">
+                <pic:pic xmlns:pic="http://schemas.openxmlformats.org/drawingml/2006/picture">
+                  <pic:nvPicPr>
+                    <pic:cNvPr id="1" name=""/>
+                    <pic:cNvPicPr/>
+                  </pic:nvPicPr>
+                  <pic:blipFill>
+                    <a:blip r:embed="rId104"/>
+                    <a:stretch>
+                      <a:fillRect/>
+                    </a:stretch>
+                  </pic:blipFill>
+                  <pic:spPr>
+                    <a:xfrm>
+                      <a:off x="0" y="0"/>
+                      <a:ext cx="2578980" cy="1221347"/>
+                    </a:xfrm>
+                    <a:prstGeom prst="rect">
+                      <a:avLst/>
+                    </a:prstGeom>
+                  </pic:spPr>
+                </pic:pic>
+              </a:graphicData>
+            </a:graphic>
+          </wp:inline>
+        </w:drawing>
+      </w:r>
+      <w:r>
+        <w:drawing>
+          <wp:inline distT="0" distB="0" distL="0" distR="0" wp14:anchorId="72E18608" wp14:editId="59F39D91">
+            <wp:extent cx="1268016" cy="3238500"/>
+            <wp:effectExtent l="0" t="0" r="8890" b="0"/>
+            <wp:docPr id="146" name="Imagem 146"/>
+            <wp:cNvGraphicFramePr>
+              <a:graphicFrameLocks xmlns:a="http://schemas.openxmlformats.org/drawingml/2006/main" noChangeAspect="1"/>
+            </wp:cNvGraphicFramePr>
+            <a:graphic xmlns:a="http://schemas.openxmlformats.org/drawingml/2006/main">
+              <a:graphicData uri="http://schemas.openxmlformats.org/drawingml/2006/picture">
+                <pic:pic xmlns:pic="http://schemas.openxmlformats.org/drawingml/2006/picture">
+                  <pic:nvPicPr>
+                    <pic:cNvPr id="1" name=""/>
+                    <pic:cNvPicPr/>
+                  </pic:nvPicPr>
+                  <pic:blipFill>
+                    <a:blip r:embed="rId105"/>
+                    <a:stretch>
+                      <a:fillRect/>
+                    </a:stretch>
+                  </pic:blipFill>
+                  <pic:spPr>
+                    <a:xfrm>
+                      <a:off x="0" y="0"/>
+                      <a:ext cx="1301016" cy="3322783"/>
+                    </a:xfrm>
+                    <a:prstGeom prst="rect">
+                      <a:avLst/>
+                    </a:prstGeom>
+                  </pic:spPr>
+                </pic:pic>
+              </a:graphicData>
+            </a:graphic>
+          </wp:inline>
+        </w:drawing>
+      </w:r>
+    </w:p>
+    <w:p/>
+    <w:p/>
+    <w:p>
+      <w:r>
+        <w:lastRenderedPageBreak/>
+        <w:t xml:space="preserve">57 - </w:t>
+      </w:r>
+      <w:bookmarkStart w:id="0" w:name="_GoBack"/>
+      <w:bookmarkEnd w:id="0"/>
     </w:p>
     <w:sectPr>
       <w:pgSz w:w="11906" w:h="16838"/>
@@ -9312,7 +9846,7 @@
 </file>
 
 <file path=customXml/itemProps1.xml><?xml version="1.0" encoding="utf-8"?>
-<ds:datastoreItem xmlns:ds="http://schemas.openxmlformats.org/officeDocument/2006/customXml" ds:itemID="{7087983F-3E08-45A8-A2AD-170384C2E013}">
+<ds:datastoreItem xmlns:ds="http://schemas.openxmlformats.org/officeDocument/2006/customXml" ds:itemID="{8FD698F6-FDD2-4D42-9927-769C9CCF0BDC}">
   <ds:schemaRefs>
     <ds:schemaRef ds:uri="http://schemas.openxmlformats.org/officeDocument/2006/bibliography"/>
   </ds:schemaRefs>

</xml_diff>

<commit_message>
atulização do dia 17/09/2026
</commit_message>
<xml_diff>
--- a/apostila/Projeto Space For Men.docx
+++ b/apostila/Projeto Space For Men.docx
@@ -7899,6 +7899,9 @@
     </w:p>
     <w:p>
       <w:r>
+        <w:rPr>
+          <w:noProof/>
+        </w:rPr>
         <w:drawing>
           <wp:inline distT="0" distB="0" distL="0" distR="0" wp14:anchorId="15DC4323" wp14:editId="5DA4FD37">
             <wp:extent cx="3077004" cy="1028844"/>
@@ -8100,6 +8103,9 @@
     </w:p>
     <w:p>
       <w:r>
+        <w:rPr>
+          <w:noProof/>
+        </w:rPr>
         <w:drawing>
           <wp:inline distT="0" distB="0" distL="0" distR="0" wp14:anchorId="5E991B67" wp14:editId="1EF04444">
             <wp:extent cx="3086531" cy="1276528"/>
@@ -8153,6 +8159,9 @@
     </w:p>
     <w:p>
       <w:r>
+        <w:rPr>
+          <w:noProof/>
+        </w:rPr>
         <w:drawing>
           <wp:inline distT="0" distB="0" distL="0" distR="0" wp14:anchorId="6ED23B50" wp14:editId="3B3BEB07">
             <wp:extent cx="2514600" cy="1190858"/>
@@ -8190,6 +8199,9 @@
         </w:drawing>
       </w:r>
       <w:r>
+        <w:rPr>
+          <w:noProof/>
+        </w:rPr>
         <w:drawing>
           <wp:inline distT="0" distB="0" distL="0" distR="0" wp14:anchorId="72E18608" wp14:editId="59F39D91">
             <wp:extent cx="1268016" cy="3238500"/>
@@ -8232,9 +8244,2406 @@
     <w:p>
       <w:r>
         <w:lastRenderedPageBreak/>
-        <w:t xml:space="preserve">57 - </w:t>
+        <w:t xml:space="preserve">57 </w:t>
+      </w:r>
+      <w:r>
+        <w:t>–</w:t>
+      </w:r>
+      <w:r>
+        <w:t xml:space="preserve"> </w:t>
+      </w:r>
+      <w:r>
+        <w:t>Na página contato.html</w:t>
+      </w:r>
+      <w:r>
+        <w:t xml:space="preserve"> inserimos </w:t>
+      </w:r>
+      <w:proofErr w:type="spellStart"/>
+      <w:r>
+        <w:t>main</w:t>
+      </w:r>
+      <w:proofErr w:type="spellEnd"/>
+      <w:r>
+        <w:t xml:space="preserve">, dentro dele adicionamos o </w:t>
+      </w:r>
+      <w:proofErr w:type="spellStart"/>
+      <w:r>
+        <w:t>form</w:t>
+      </w:r>
+      <w:proofErr w:type="spellEnd"/>
+      <w:r>
+        <w:t xml:space="preserve"> e começamos a trabalhar com </w:t>
+      </w:r>
+      <w:proofErr w:type="spellStart"/>
+      <w:r>
+        <w:t>label</w:t>
+      </w:r>
+      <w:proofErr w:type="spellEnd"/>
+      <w:r>
+        <w:t>(etiqueta) e input de texto.</w:t>
+      </w:r>
+    </w:p>
+    <w:p>
+      <w:r>
+        <w:drawing>
+          <wp:inline distT="0" distB="0" distL="0" distR="0" wp14:anchorId="3843220E" wp14:editId="0FDB262D">
+            <wp:extent cx="4363059" cy="1971950"/>
+            <wp:effectExtent l="0" t="0" r="0" b="9525"/>
+            <wp:docPr id="147" name="Imagem 147"/>
+            <wp:cNvGraphicFramePr>
+              <a:graphicFrameLocks xmlns:a="http://schemas.openxmlformats.org/drawingml/2006/main" noChangeAspect="1"/>
+            </wp:cNvGraphicFramePr>
+            <a:graphic xmlns:a="http://schemas.openxmlformats.org/drawingml/2006/main">
+              <a:graphicData uri="http://schemas.openxmlformats.org/drawingml/2006/picture">
+                <pic:pic xmlns:pic="http://schemas.openxmlformats.org/drawingml/2006/picture">
+                  <pic:nvPicPr>
+                    <pic:cNvPr id="1" name=""/>
+                    <pic:cNvPicPr/>
+                  </pic:nvPicPr>
+                  <pic:blipFill>
+                    <a:blip r:embed="rId106"/>
+                    <a:stretch>
+                      <a:fillRect/>
+                    </a:stretch>
+                  </pic:blipFill>
+                  <pic:spPr>
+                    <a:xfrm>
+                      <a:off x="0" y="0"/>
+                      <a:ext cx="4363059" cy="1971950"/>
+                    </a:xfrm>
+                    <a:prstGeom prst="rect">
+                      <a:avLst/>
+                    </a:prstGeom>
+                  </pic:spPr>
+                </pic:pic>
+              </a:graphicData>
+            </a:graphic>
+          </wp:inline>
+        </w:drawing>
+      </w:r>
+    </w:p>
+    <w:p>
+      <w:r>
+        <w:rPr>
+          <w:noProof/>
+        </w:rPr>
+        <mc:AlternateContent>
+          <mc:Choice Requires="wps">
+            <w:drawing>
+              <wp:anchor distT="0" distB="0" distL="114300" distR="114300" simplePos="0" relativeHeight="251711488" behindDoc="0" locked="0" layoutInCell="1" allowOverlap="1">
+                <wp:simplePos x="0" y="0"/>
+                <wp:positionH relativeFrom="column">
+                  <wp:posOffset>3091815</wp:posOffset>
+                </wp:positionH>
+                <wp:positionV relativeFrom="paragraph">
+                  <wp:posOffset>182245</wp:posOffset>
+                </wp:positionV>
+                <wp:extent cx="2124075" cy="904875"/>
+                <wp:effectExtent l="38100" t="0" r="28575" b="66675"/>
+                <wp:wrapNone/>
+                <wp:docPr id="150" name="Conector de Seta Reta 150"/>
+                <wp:cNvGraphicFramePr/>
+                <a:graphic xmlns:a="http://schemas.openxmlformats.org/drawingml/2006/main">
+                  <a:graphicData uri="http://schemas.microsoft.com/office/word/2010/wordprocessingShape">
+                    <wps:wsp>
+                      <wps:cNvCnPr/>
+                      <wps:spPr>
+                        <a:xfrm flipH="1">
+                          <a:off x="0" y="0"/>
+                          <a:ext cx="2124075" cy="904875"/>
+                        </a:xfrm>
+                        <a:prstGeom prst="straightConnector1">
+                          <a:avLst/>
+                        </a:prstGeom>
+                        <a:ln>
+                          <a:tailEnd type="triangle"/>
+                        </a:ln>
+                      </wps:spPr>
+                      <wps:style>
+                        <a:lnRef idx="1">
+                          <a:schemeClr val="accent1"/>
+                        </a:lnRef>
+                        <a:fillRef idx="0">
+                          <a:schemeClr val="accent1"/>
+                        </a:fillRef>
+                        <a:effectRef idx="0">
+                          <a:schemeClr val="accent1"/>
+                        </a:effectRef>
+                        <a:fontRef idx="minor">
+                          <a:schemeClr val="tx1"/>
+                        </a:fontRef>
+                      </wps:style>
+                      <wps:bodyPr/>
+                    </wps:wsp>
+                  </a:graphicData>
+                </a:graphic>
+              </wp:anchor>
+            </w:drawing>
+          </mc:Choice>
+          <mc:Fallback>
+            <w:pict>
+              <v:shapetype w14:anchorId="7A8AC1FA" id="_x0000_t32" coordsize="21600,21600" o:spt="32" o:oned="t" path="m,l21600,21600e" filled="f">
+                <v:path arrowok="t" fillok="f" o:connecttype="none"/>
+                <o:lock v:ext="edit" shapetype="t"/>
+              </v:shapetype>
+              <v:shape id="Conector de Seta Reta 150" o:spid="_x0000_s1026" type="#_x0000_t32" style="position:absolute;margin-left:243.45pt;margin-top:14.35pt;width:167.25pt;height:71.25pt;flip:x;z-index:251711488;visibility:visible;mso-wrap-style:square;mso-wrap-distance-left:9pt;mso-wrap-distance-top:0;mso-wrap-distance-right:9pt;mso-wrap-distance-bottom:0;mso-position-horizontal:absolute;mso-position-horizontal-relative:text;mso-position-vertical:absolute;mso-position-vertical-relative:text" o:gfxdata="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" strokecolor="#4472c4 [3204]" strokeweight=".5pt">
+                <v:stroke endarrow="block" joinstyle="miter"/>
+              </v:shape>
+            </w:pict>
+          </mc:Fallback>
+        </mc:AlternateContent>
+      </w:r>
+      <w:r>
+        <w:rPr>
+          <w:noProof/>
+        </w:rPr>
+        <mc:AlternateContent>
+          <mc:Choice Requires="wps">
+            <w:drawing>
+              <wp:anchor distT="0" distB="0" distL="114300" distR="114300" simplePos="0" relativeHeight="251710464" behindDoc="0" locked="0" layoutInCell="1" allowOverlap="1">
+                <wp:simplePos x="0" y="0"/>
+                <wp:positionH relativeFrom="column">
+                  <wp:posOffset>1805940</wp:posOffset>
+                </wp:positionH>
+                <wp:positionV relativeFrom="paragraph">
+                  <wp:posOffset>172720</wp:posOffset>
+                </wp:positionV>
+                <wp:extent cx="2295525" cy="676275"/>
+                <wp:effectExtent l="38100" t="0" r="28575" b="66675"/>
+                <wp:wrapNone/>
+                <wp:docPr id="149" name="Conector de Seta Reta 149"/>
+                <wp:cNvGraphicFramePr/>
+                <a:graphic xmlns:a="http://schemas.openxmlformats.org/drawingml/2006/main">
+                  <a:graphicData uri="http://schemas.microsoft.com/office/word/2010/wordprocessingShape">
+                    <wps:wsp>
+                      <wps:cNvCnPr/>
+                      <wps:spPr>
+                        <a:xfrm flipH="1">
+                          <a:off x="0" y="0"/>
+                          <a:ext cx="2295525" cy="676275"/>
+                        </a:xfrm>
+                        <a:prstGeom prst="straightConnector1">
+                          <a:avLst/>
+                        </a:prstGeom>
+                        <a:ln>
+                          <a:tailEnd type="triangle"/>
+                        </a:ln>
+                      </wps:spPr>
+                      <wps:style>
+                        <a:lnRef idx="1">
+                          <a:schemeClr val="accent1"/>
+                        </a:lnRef>
+                        <a:fillRef idx="0">
+                          <a:schemeClr val="accent1"/>
+                        </a:fillRef>
+                        <a:effectRef idx="0">
+                          <a:schemeClr val="accent1"/>
+                        </a:effectRef>
+                        <a:fontRef idx="minor">
+                          <a:schemeClr val="tx1"/>
+                        </a:fontRef>
+                      </wps:style>
+                      <wps:bodyPr/>
+                    </wps:wsp>
+                  </a:graphicData>
+                </a:graphic>
+              </wp:anchor>
+            </w:drawing>
+          </mc:Choice>
+          <mc:Fallback>
+            <w:pict>
+              <v:shape w14:anchorId="284878F6" id="Conector de Seta Reta 149" o:spid="_x0000_s1026" type="#_x0000_t32" style="position:absolute;margin-left:142.2pt;margin-top:13.6pt;width:180.75pt;height:53.25pt;flip:x;z-index:251710464;visibility:visible;mso-wrap-style:square;mso-wrap-distance-left:9pt;mso-wrap-distance-top:0;mso-wrap-distance-right:9pt;mso-wrap-distance-bottom:0;mso-position-horizontal:absolute;mso-position-horizontal-relative:text;mso-position-vertical:absolute;mso-position-vertical-relative:text" o:gfxdata="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" strokecolor="#4472c4 [3204]" strokeweight=".5pt">
+                <v:stroke endarrow="block" joinstyle="miter"/>
+              </v:shape>
+            </w:pict>
+          </mc:Fallback>
+        </mc:AlternateContent>
+      </w:r>
+      <w:r>
+        <w:t xml:space="preserve">58 – Para unir o </w:t>
+      </w:r>
+      <w:proofErr w:type="spellStart"/>
+      <w:r>
+        <w:t>label</w:t>
+      </w:r>
+      <w:proofErr w:type="spellEnd"/>
+      <w:r>
+        <w:t xml:space="preserve"> com input adicionamos o mesmo nome tanto no for da </w:t>
+      </w:r>
+      <w:proofErr w:type="spellStart"/>
+      <w:r>
+        <w:t>label</w:t>
+      </w:r>
+      <w:proofErr w:type="spellEnd"/>
+      <w:r>
+        <w:t xml:space="preserve"> como no id do input.</w:t>
+      </w:r>
+    </w:p>
+    <w:p>
+      <w:r>
+        <w:drawing>
+          <wp:inline distT="0" distB="0" distL="0" distR="0" wp14:anchorId="4FC4B5A2" wp14:editId="0FF68638">
+            <wp:extent cx="4363059" cy="1971950"/>
+            <wp:effectExtent l="0" t="0" r="0" b="9525"/>
+            <wp:docPr id="148" name="Imagem 148"/>
+            <wp:cNvGraphicFramePr>
+              <a:graphicFrameLocks xmlns:a="http://schemas.openxmlformats.org/drawingml/2006/main" noChangeAspect="1"/>
+            </wp:cNvGraphicFramePr>
+            <a:graphic xmlns:a="http://schemas.openxmlformats.org/drawingml/2006/main">
+              <a:graphicData uri="http://schemas.openxmlformats.org/drawingml/2006/picture">
+                <pic:pic xmlns:pic="http://schemas.openxmlformats.org/drawingml/2006/picture">
+                  <pic:nvPicPr>
+                    <pic:cNvPr id="1" name=""/>
+                    <pic:cNvPicPr/>
+                  </pic:nvPicPr>
+                  <pic:blipFill>
+                    <a:blip r:embed="rId106"/>
+                    <a:stretch>
+                      <a:fillRect/>
+                    </a:stretch>
+                  </pic:blipFill>
+                  <pic:spPr>
+                    <a:xfrm>
+                      <a:off x="0" y="0"/>
+                      <a:ext cx="4363059" cy="1971950"/>
+                    </a:xfrm>
+                    <a:prstGeom prst="rect">
+                      <a:avLst/>
+                    </a:prstGeom>
+                  </pic:spPr>
+                </pic:pic>
+              </a:graphicData>
+            </a:graphic>
+          </wp:inline>
+        </w:drawing>
+      </w:r>
+    </w:p>
+    <w:p>
+      <w:r>
+        <w:t xml:space="preserve">59 – Para centralizar o conteúdo dentro do </w:t>
+      </w:r>
+      <w:proofErr w:type="spellStart"/>
+      <w:r>
+        <w:t>main</w:t>
+      </w:r>
+      <w:proofErr w:type="spellEnd"/>
+      <w:r>
+        <w:t xml:space="preserve"> demos uma largura e utilizamos o </w:t>
+      </w:r>
+      <w:proofErr w:type="spellStart"/>
+      <w:r>
+        <w:t>margin</w:t>
+      </w:r>
+      <w:proofErr w:type="spellEnd"/>
+      <w:r>
+        <w:t>: 0 auto conforme imagem.</w:t>
+      </w:r>
+    </w:p>
+    <w:p>
+      <w:r>
+        <w:drawing>
+          <wp:inline distT="0" distB="0" distL="0" distR="0" wp14:anchorId="0EF30C22" wp14:editId="36F6F05C">
+            <wp:extent cx="1505160" cy="800212"/>
+            <wp:effectExtent l="0" t="0" r="0" b="0"/>
+            <wp:docPr id="151" name="Imagem 151"/>
+            <wp:cNvGraphicFramePr>
+              <a:graphicFrameLocks xmlns:a="http://schemas.openxmlformats.org/drawingml/2006/main" noChangeAspect="1"/>
+            </wp:cNvGraphicFramePr>
+            <a:graphic xmlns:a="http://schemas.openxmlformats.org/drawingml/2006/main">
+              <a:graphicData uri="http://schemas.openxmlformats.org/drawingml/2006/picture">
+                <pic:pic xmlns:pic="http://schemas.openxmlformats.org/drawingml/2006/picture">
+                  <pic:nvPicPr>
+                    <pic:cNvPr id="1" name=""/>
+                    <pic:cNvPicPr/>
+                  </pic:nvPicPr>
+                  <pic:blipFill>
+                    <a:blip r:embed="rId107"/>
+                    <a:stretch>
+                      <a:fillRect/>
+                    </a:stretch>
+                  </pic:blipFill>
+                  <pic:spPr>
+                    <a:xfrm>
+                      <a:off x="0" y="0"/>
+                      <a:ext cx="1505160" cy="800212"/>
+                    </a:xfrm>
+                    <a:prstGeom prst="rect">
+                      <a:avLst/>
+                    </a:prstGeom>
+                  </pic:spPr>
+                </pic:pic>
+              </a:graphicData>
+            </a:graphic>
+          </wp:inline>
+        </w:drawing>
+      </w:r>
+    </w:p>
+    <w:p>
+      <w:r>
+        <w:t>60 – Observamos que o nosso formulário estava apertado entre o cabeçalho e o rodapé inserimos uma altura tanto para cima como para baixo.</w:t>
+      </w:r>
+    </w:p>
+    <w:p>
+      <w:r>
+        <w:drawing>
+          <wp:inline distT="0" distB="0" distL="0" distR="0" wp14:anchorId="6DA089CE" wp14:editId="64A449DD">
+            <wp:extent cx="1571844" cy="676369"/>
+            <wp:effectExtent l="0" t="0" r="9525" b="9525"/>
+            <wp:docPr id="152" name="Imagem 152"/>
+            <wp:cNvGraphicFramePr>
+              <a:graphicFrameLocks xmlns:a="http://schemas.openxmlformats.org/drawingml/2006/main" noChangeAspect="1"/>
+            </wp:cNvGraphicFramePr>
+            <a:graphic xmlns:a="http://schemas.openxmlformats.org/drawingml/2006/main">
+              <a:graphicData uri="http://schemas.openxmlformats.org/drawingml/2006/picture">
+                <pic:pic xmlns:pic="http://schemas.openxmlformats.org/drawingml/2006/picture">
+                  <pic:nvPicPr>
+                    <pic:cNvPr id="1" name=""/>
+                    <pic:cNvPicPr/>
+                  </pic:nvPicPr>
+                  <pic:blipFill>
+                    <a:blip r:embed="rId108"/>
+                    <a:stretch>
+                      <a:fillRect/>
+                    </a:stretch>
+                  </pic:blipFill>
+                  <pic:spPr>
+                    <a:xfrm>
+                      <a:off x="0" y="0"/>
+                      <a:ext cx="1571844" cy="676369"/>
+                    </a:xfrm>
+                    <a:prstGeom prst="rect">
+                      <a:avLst/>
+                    </a:prstGeom>
+                  </pic:spPr>
+                </pic:pic>
+              </a:graphicData>
+            </a:graphic>
+          </wp:inline>
+        </w:drawing>
+      </w:r>
+      <w:r>
+        <w:drawing>
+          <wp:inline distT="0" distB="0" distL="0" distR="0" wp14:anchorId="4028E5F7" wp14:editId="4BF92E37">
+            <wp:extent cx="1628775" cy="1870266"/>
+            <wp:effectExtent l="0" t="0" r="0" b="0"/>
+            <wp:docPr id="153" name="Imagem 153"/>
+            <wp:cNvGraphicFramePr>
+              <a:graphicFrameLocks xmlns:a="http://schemas.openxmlformats.org/drawingml/2006/main" noChangeAspect="1"/>
+            </wp:cNvGraphicFramePr>
+            <a:graphic xmlns:a="http://schemas.openxmlformats.org/drawingml/2006/main">
+              <a:graphicData uri="http://schemas.openxmlformats.org/drawingml/2006/picture">
+                <pic:pic xmlns:pic="http://schemas.openxmlformats.org/drawingml/2006/picture">
+                  <pic:nvPicPr>
+                    <pic:cNvPr id="1" name=""/>
+                    <pic:cNvPicPr/>
+                  </pic:nvPicPr>
+                  <pic:blipFill>
+                    <a:blip r:embed="rId109"/>
+                    <a:stretch>
+                      <a:fillRect/>
+                    </a:stretch>
+                  </pic:blipFill>
+                  <pic:spPr>
+                    <a:xfrm>
+                      <a:off x="0" y="0"/>
+                      <a:ext cx="1659899" cy="1906005"/>
+                    </a:xfrm>
+                    <a:prstGeom prst="rect">
+                      <a:avLst/>
+                    </a:prstGeom>
+                  </pic:spPr>
+                </pic:pic>
+              </a:graphicData>
+            </a:graphic>
+          </wp:inline>
+        </w:drawing>
+      </w:r>
+    </w:p>
+    <w:p>
+      <w:r>
+        <w:rPr>
+          <w:noProof/>
+        </w:rPr>
+        <w:lastRenderedPageBreak/>
+        <mc:AlternateContent>
+          <mc:Choice Requires="wps">
+            <w:drawing>
+              <wp:anchor distT="0" distB="0" distL="114300" distR="114300" simplePos="0" relativeHeight="251712512" behindDoc="0" locked="0" layoutInCell="1" allowOverlap="1">
+                <wp:simplePos x="0" y="0"/>
+                <wp:positionH relativeFrom="column">
+                  <wp:posOffset>1367790</wp:posOffset>
+                </wp:positionH>
+                <wp:positionV relativeFrom="paragraph">
+                  <wp:posOffset>671830</wp:posOffset>
+                </wp:positionV>
+                <wp:extent cx="447675" cy="381000"/>
+                <wp:effectExtent l="38100" t="0" r="28575" b="57150"/>
+                <wp:wrapNone/>
+                <wp:docPr id="155" name="Conector de Seta Reta 155"/>
+                <wp:cNvGraphicFramePr/>
+                <a:graphic xmlns:a="http://schemas.openxmlformats.org/drawingml/2006/main">
+                  <a:graphicData uri="http://schemas.microsoft.com/office/word/2010/wordprocessingShape">
+                    <wps:wsp>
+                      <wps:cNvCnPr/>
+                      <wps:spPr>
+                        <a:xfrm flipH="1">
+                          <a:off x="0" y="0"/>
+                          <a:ext cx="447675" cy="381000"/>
+                        </a:xfrm>
+                        <a:prstGeom prst="straightConnector1">
+                          <a:avLst/>
+                        </a:prstGeom>
+                        <a:ln>
+                          <a:tailEnd type="triangle"/>
+                        </a:ln>
+                      </wps:spPr>
+                      <wps:style>
+                        <a:lnRef idx="1">
+                          <a:schemeClr val="accent1"/>
+                        </a:lnRef>
+                        <a:fillRef idx="0">
+                          <a:schemeClr val="accent1"/>
+                        </a:fillRef>
+                        <a:effectRef idx="0">
+                          <a:schemeClr val="accent1"/>
+                        </a:effectRef>
+                        <a:fontRef idx="minor">
+                          <a:schemeClr val="tx1"/>
+                        </a:fontRef>
+                      </wps:style>
+                      <wps:bodyPr/>
+                    </wps:wsp>
+                  </a:graphicData>
+                </a:graphic>
+              </wp:anchor>
+            </w:drawing>
+          </mc:Choice>
+          <mc:Fallback>
+            <w:pict>
+              <v:shape w14:anchorId="553FCDF1" id="Conector de Seta Reta 155" o:spid="_x0000_s1026" type="#_x0000_t32" style="position:absolute;margin-left:107.7pt;margin-top:52.9pt;width:35.25pt;height:30pt;flip:x;z-index:251712512;visibility:visible;mso-wrap-style:square;mso-wrap-distance-left:9pt;mso-wrap-distance-top:0;mso-wrap-distance-right:9pt;mso-wrap-distance-bottom:0;mso-position-horizontal:absolute;mso-position-horizontal-relative:text;mso-position-vertical:absolute;mso-position-vertical-relative:text" o:gfxdata="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" strokecolor="#4472c4 [3204]" strokeweight=".5pt">
+                <v:stroke endarrow="block" joinstyle="miter"/>
+              </v:shape>
+            </w:pict>
+          </mc:Fallback>
+        </mc:AlternateContent>
+      </w:r>
+      <w:r>
+        <w:t xml:space="preserve">61 – Podemos avaliar que o nosso formulário tem um tipo de comportamento mesmo colocando um elemento em baixo do outro no </w:t>
+      </w:r>
+      <w:proofErr w:type="spellStart"/>
+      <w:r>
+        <w:t>html</w:t>
+      </w:r>
+      <w:proofErr w:type="spellEnd"/>
+      <w:r>
+        <w:t xml:space="preserve"> ao </w:t>
+      </w:r>
+      <w:proofErr w:type="spellStart"/>
+      <w:r>
+        <w:t>renderizar</w:t>
+      </w:r>
+      <w:proofErr w:type="spellEnd"/>
+      <w:r>
+        <w:t xml:space="preserve"> a página os elementos (</w:t>
+      </w:r>
+      <w:proofErr w:type="spellStart"/>
+      <w:r>
+        <w:t>label</w:t>
+      </w:r>
+      <w:proofErr w:type="spellEnd"/>
+      <w:r>
+        <w:t xml:space="preserve"> e input) ficam um ao lado do outro. Para mudar essa situação mudamos a natureza do </w:t>
+      </w:r>
+      <w:proofErr w:type="spellStart"/>
+      <w:r>
+        <w:t>label</w:t>
+      </w:r>
+      <w:proofErr w:type="spellEnd"/>
+      <w:r>
+        <w:t xml:space="preserve"> e input conforme código abaixo.</w:t>
+      </w:r>
+    </w:p>
+    <w:p>
+      <w:r>
+        <w:rPr>
+          <w:noProof/>
+        </w:rPr>
+        <mc:AlternateContent>
+          <mc:Choice Requires="wps">
+            <w:drawing>
+              <wp:anchor distT="0" distB="0" distL="114300" distR="114300" simplePos="0" relativeHeight="251713536" behindDoc="0" locked="0" layoutInCell="1" allowOverlap="1">
+                <wp:simplePos x="0" y="0"/>
+                <wp:positionH relativeFrom="column">
+                  <wp:posOffset>1310640</wp:posOffset>
+                </wp:positionH>
+                <wp:positionV relativeFrom="paragraph">
+                  <wp:posOffset>843915</wp:posOffset>
+                </wp:positionV>
+                <wp:extent cx="762000" cy="466725"/>
+                <wp:effectExtent l="38100" t="0" r="19050" b="47625"/>
+                <wp:wrapNone/>
+                <wp:docPr id="156" name="Conector de Seta Reta 156"/>
+                <wp:cNvGraphicFramePr/>
+                <a:graphic xmlns:a="http://schemas.openxmlformats.org/drawingml/2006/main">
+                  <a:graphicData uri="http://schemas.microsoft.com/office/word/2010/wordprocessingShape">
+                    <wps:wsp>
+                      <wps:cNvCnPr/>
+                      <wps:spPr>
+                        <a:xfrm flipH="1">
+                          <a:off x="0" y="0"/>
+                          <a:ext cx="762000" cy="466725"/>
+                        </a:xfrm>
+                        <a:prstGeom prst="straightConnector1">
+                          <a:avLst/>
+                        </a:prstGeom>
+                        <a:ln>
+                          <a:tailEnd type="triangle"/>
+                        </a:ln>
+                      </wps:spPr>
+                      <wps:style>
+                        <a:lnRef idx="1">
+                          <a:schemeClr val="accent1"/>
+                        </a:lnRef>
+                        <a:fillRef idx="0">
+                          <a:schemeClr val="accent1"/>
+                        </a:fillRef>
+                        <a:effectRef idx="0">
+                          <a:schemeClr val="accent1"/>
+                        </a:effectRef>
+                        <a:fontRef idx="minor">
+                          <a:schemeClr val="tx1"/>
+                        </a:fontRef>
+                      </wps:style>
+                      <wps:bodyPr/>
+                    </wps:wsp>
+                  </a:graphicData>
+                </a:graphic>
+              </wp:anchor>
+            </w:drawing>
+          </mc:Choice>
+          <mc:Fallback>
+            <w:pict>
+              <v:shape w14:anchorId="6D2C0CB6" id="Conector de Seta Reta 156" o:spid="_x0000_s1026" type="#_x0000_t32" style="position:absolute;margin-left:103.2pt;margin-top:66.45pt;width:60pt;height:36.75pt;flip:x;z-index:251713536;visibility:visible;mso-wrap-style:square;mso-wrap-distance-left:9pt;mso-wrap-distance-top:0;mso-wrap-distance-right:9pt;mso-wrap-distance-bottom:0;mso-position-horizontal:absolute;mso-position-horizontal-relative:text;mso-position-vertical:absolute;mso-position-vertical-relative:text" o:gfxdata="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" strokecolor="#4472c4 [3204]" strokeweight=".5pt">
+                <v:stroke endarrow="block" joinstyle="miter"/>
+              </v:shape>
+            </w:pict>
+          </mc:Fallback>
+        </mc:AlternateContent>
+      </w:r>
+      <w:r>
+        <w:drawing>
+          <wp:inline distT="0" distB="0" distL="0" distR="0" wp14:anchorId="139589AF" wp14:editId="588606F0">
+            <wp:extent cx="1895740" cy="2019582"/>
+            <wp:effectExtent l="0" t="0" r="9525" b="0"/>
+            <wp:docPr id="154" name="Imagem 154"/>
+            <wp:cNvGraphicFramePr>
+              <a:graphicFrameLocks xmlns:a="http://schemas.openxmlformats.org/drawingml/2006/main" noChangeAspect="1"/>
+            </wp:cNvGraphicFramePr>
+            <a:graphic xmlns:a="http://schemas.openxmlformats.org/drawingml/2006/main">
+              <a:graphicData uri="http://schemas.openxmlformats.org/drawingml/2006/picture">
+                <pic:pic xmlns:pic="http://schemas.openxmlformats.org/drawingml/2006/picture">
+                  <pic:nvPicPr>
+                    <pic:cNvPr id="1" name=""/>
+                    <pic:cNvPicPr/>
+                  </pic:nvPicPr>
+                  <pic:blipFill>
+                    <a:blip r:embed="rId110"/>
+                    <a:stretch>
+                      <a:fillRect/>
+                    </a:stretch>
+                  </pic:blipFill>
+                  <pic:spPr>
+                    <a:xfrm>
+                      <a:off x="0" y="0"/>
+                      <a:ext cx="1895740" cy="2019582"/>
+                    </a:xfrm>
+                    <a:prstGeom prst="rect">
+                      <a:avLst/>
+                    </a:prstGeom>
+                  </pic:spPr>
+                </pic:pic>
+              </a:graphicData>
+            </a:graphic>
+          </wp:inline>
+        </w:drawing>
+      </w:r>
+      <w:r>
+        <w:drawing>
+          <wp:inline distT="0" distB="0" distL="0" distR="0" wp14:anchorId="568BB2CF" wp14:editId="61EEEF38">
+            <wp:extent cx="2514951" cy="1686160"/>
+            <wp:effectExtent l="0" t="0" r="0" b="9525"/>
+            <wp:docPr id="157" name="Imagem 157"/>
+            <wp:cNvGraphicFramePr>
+              <a:graphicFrameLocks xmlns:a="http://schemas.openxmlformats.org/drawingml/2006/main" noChangeAspect="1"/>
+            </wp:cNvGraphicFramePr>
+            <a:graphic xmlns:a="http://schemas.openxmlformats.org/drawingml/2006/main">
+              <a:graphicData uri="http://schemas.openxmlformats.org/drawingml/2006/picture">
+                <pic:pic xmlns:pic="http://schemas.openxmlformats.org/drawingml/2006/picture">
+                  <pic:nvPicPr>
+                    <pic:cNvPr id="1" name=""/>
+                    <pic:cNvPicPr/>
+                  </pic:nvPicPr>
+                  <pic:blipFill>
+                    <a:blip r:embed="rId111"/>
+                    <a:stretch>
+                      <a:fillRect/>
+                    </a:stretch>
+                  </pic:blipFill>
+                  <pic:spPr>
+                    <a:xfrm>
+                      <a:off x="0" y="0"/>
+                      <a:ext cx="2514951" cy="1686160"/>
+                    </a:xfrm>
+                    <a:prstGeom prst="rect">
+                      <a:avLst/>
+                    </a:prstGeom>
+                  </pic:spPr>
+                </pic:pic>
+              </a:graphicData>
+            </a:graphic>
+          </wp:inline>
+        </w:drawing>
+      </w:r>
+    </w:p>
+    <w:p>
+      <w:r>
+        <w:t xml:space="preserve">62 – Demos um espaço para lado de baixo da </w:t>
+      </w:r>
+      <w:proofErr w:type="spellStart"/>
+      <w:r>
+        <w:t>label</w:t>
+      </w:r>
+      <w:proofErr w:type="spellEnd"/>
+      <w:r>
+        <w:t xml:space="preserve"> de margin:20px e aumentamos o tamanho da fonte, o input também acrescentamos um espaço do lado de baixo e aumentamos o espaço interno tanto na parte de cima, baixo, direita e esquerda.</w:t>
+      </w:r>
+    </w:p>
+    <w:p>
+      <w:r>
+        <w:rPr>
+          <w:noProof/>
+        </w:rPr>
+        <mc:AlternateContent>
+          <mc:Choice Requires="wps">
+            <w:drawing>
+              <wp:anchor distT="0" distB="0" distL="114300" distR="114300" simplePos="0" relativeHeight="251717632" behindDoc="0" locked="0" layoutInCell="1" allowOverlap="1">
+                <wp:simplePos x="0" y="0"/>
+                <wp:positionH relativeFrom="column">
+                  <wp:posOffset>1653540</wp:posOffset>
+                </wp:positionH>
+                <wp:positionV relativeFrom="paragraph">
+                  <wp:posOffset>1465580</wp:posOffset>
+                </wp:positionV>
+                <wp:extent cx="123825" cy="219075"/>
+                <wp:effectExtent l="38100" t="0" r="28575" b="47625"/>
+                <wp:wrapNone/>
+                <wp:docPr id="162" name="Conector de Seta Reta 162"/>
+                <wp:cNvGraphicFramePr/>
+                <a:graphic xmlns:a="http://schemas.openxmlformats.org/drawingml/2006/main">
+                  <a:graphicData uri="http://schemas.microsoft.com/office/word/2010/wordprocessingShape">
+                    <wps:wsp>
+                      <wps:cNvCnPr/>
+                      <wps:spPr>
+                        <a:xfrm flipH="1">
+                          <a:off x="0" y="0"/>
+                          <a:ext cx="123825" cy="219075"/>
+                        </a:xfrm>
+                        <a:prstGeom prst="straightConnector1">
+                          <a:avLst/>
+                        </a:prstGeom>
+                        <a:ln>
+                          <a:tailEnd type="triangle"/>
+                        </a:ln>
+                      </wps:spPr>
+                      <wps:style>
+                        <a:lnRef idx="1">
+                          <a:schemeClr val="accent1"/>
+                        </a:lnRef>
+                        <a:fillRef idx="0">
+                          <a:schemeClr val="accent1"/>
+                        </a:fillRef>
+                        <a:effectRef idx="0">
+                          <a:schemeClr val="accent1"/>
+                        </a:effectRef>
+                        <a:fontRef idx="minor">
+                          <a:schemeClr val="tx1"/>
+                        </a:fontRef>
+                      </wps:style>
+                      <wps:bodyPr/>
+                    </wps:wsp>
+                  </a:graphicData>
+                </a:graphic>
+              </wp:anchor>
+            </w:drawing>
+          </mc:Choice>
+          <mc:Fallback>
+            <w:pict>
+              <v:shape w14:anchorId="5D855BC9" id="Conector de Seta Reta 162" o:spid="_x0000_s1026" type="#_x0000_t32" style="position:absolute;margin-left:130.2pt;margin-top:115.4pt;width:9.75pt;height:17.25pt;flip:x;z-index:251717632;visibility:visible;mso-wrap-style:square;mso-wrap-distance-left:9pt;mso-wrap-distance-top:0;mso-wrap-distance-right:9pt;mso-wrap-distance-bottom:0;mso-position-horizontal:absolute;mso-position-horizontal-relative:text;mso-position-vertical:absolute;mso-position-vertical-relative:text" o:gfxdata="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" strokecolor="#4472c4 [3204]" strokeweight=".5pt">
+                <v:stroke endarrow="block" joinstyle="miter"/>
+              </v:shape>
+            </w:pict>
+          </mc:Fallback>
+        </mc:AlternateContent>
+      </w:r>
+      <w:r>
+        <w:rPr>
+          <w:noProof/>
+        </w:rPr>
+        <mc:AlternateContent>
+          <mc:Choice Requires="wps">
+            <w:drawing>
+              <wp:anchor distT="0" distB="0" distL="114300" distR="114300" simplePos="0" relativeHeight="251716608" behindDoc="0" locked="0" layoutInCell="1" allowOverlap="1">
+                <wp:simplePos x="0" y="0"/>
+                <wp:positionH relativeFrom="column">
+                  <wp:posOffset>1520190</wp:posOffset>
+                </wp:positionH>
+                <wp:positionV relativeFrom="paragraph">
+                  <wp:posOffset>1160780</wp:posOffset>
+                </wp:positionV>
+                <wp:extent cx="219075" cy="361950"/>
+                <wp:effectExtent l="38100" t="0" r="28575" b="57150"/>
+                <wp:wrapNone/>
+                <wp:docPr id="161" name="Conector de Seta Reta 161"/>
+                <wp:cNvGraphicFramePr/>
+                <a:graphic xmlns:a="http://schemas.openxmlformats.org/drawingml/2006/main">
+                  <a:graphicData uri="http://schemas.microsoft.com/office/word/2010/wordprocessingShape">
+                    <wps:wsp>
+                      <wps:cNvCnPr/>
+                      <wps:spPr>
+                        <a:xfrm flipH="1">
+                          <a:off x="0" y="0"/>
+                          <a:ext cx="219075" cy="361950"/>
+                        </a:xfrm>
+                        <a:prstGeom prst="straightConnector1">
+                          <a:avLst/>
+                        </a:prstGeom>
+                        <a:ln>
+                          <a:tailEnd type="triangle"/>
+                        </a:ln>
+                      </wps:spPr>
+                      <wps:style>
+                        <a:lnRef idx="1">
+                          <a:schemeClr val="accent1"/>
+                        </a:lnRef>
+                        <a:fillRef idx="0">
+                          <a:schemeClr val="accent1"/>
+                        </a:fillRef>
+                        <a:effectRef idx="0">
+                          <a:schemeClr val="accent1"/>
+                        </a:effectRef>
+                        <a:fontRef idx="minor">
+                          <a:schemeClr val="tx1"/>
+                        </a:fontRef>
+                      </wps:style>
+                      <wps:bodyPr/>
+                    </wps:wsp>
+                  </a:graphicData>
+                </a:graphic>
+              </wp:anchor>
+            </w:drawing>
+          </mc:Choice>
+          <mc:Fallback>
+            <w:pict>
+              <v:shape w14:anchorId="3B0363D1" id="Conector de Seta Reta 161" o:spid="_x0000_s1026" type="#_x0000_t32" style="position:absolute;margin-left:119.7pt;margin-top:91.4pt;width:17.25pt;height:28.5pt;flip:x;z-index:251716608;visibility:visible;mso-wrap-style:square;mso-wrap-distance-left:9pt;mso-wrap-distance-top:0;mso-wrap-distance-right:9pt;mso-wrap-distance-bottom:0;mso-position-horizontal:absolute;mso-position-horizontal-relative:text;mso-position-vertical:absolute;mso-position-vertical-relative:text" o:gfxdata="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" strokecolor="#4472c4 [3204]" strokeweight=".5pt">
+                <v:stroke endarrow="block" joinstyle="miter"/>
+              </v:shape>
+            </w:pict>
+          </mc:Fallback>
+        </mc:AlternateContent>
+      </w:r>
+      <w:r>
+        <w:rPr>
+          <w:noProof/>
+        </w:rPr>
+        <mc:AlternateContent>
+          <mc:Choice Requires="wps">
+            <w:drawing>
+              <wp:anchor distT="0" distB="0" distL="114300" distR="114300" simplePos="0" relativeHeight="251715584" behindDoc="0" locked="0" layoutInCell="1" allowOverlap="1">
+                <wp:simplePos x="0" y="0"/>
+                <wp:positionH relativeFrom="column">
+                  <wp:posOffset>1520190</wp:posOffset>
+                </wp:positionH>
+                <wp:positionV relativeFrom="paragraph">
+                  <wp:posOffset>84455</wp:posOffset>
+                </wp:positionV>
+                <wp:extent cx="504825" cy="581025"/>
+                <wp:effectExtent l="38100" t="0" r="28575" b="47625"/>
+                <wp:wrapNone/>
+                <wp:docPr id="160" name="Conector de Seta Reta 160"/>
+                <wp:cNvGraphicFramePr/>
+                <a:graphic xmlns:a="http://schemas.openxmlformats.org/drawingml/2006/main">
+                  <a:graphicData uri="http://schemas.microsoft.com/office/word/2010/wordprocessingShape">
+                    <wps:wsp>
+                      <wps:cNvCnPr/>
+                      <wps:spPr>
+                        <a:xfrm flipH="1">
+                          <a:off x="0" y="0"/>
+                          <a:ext cx="504825" cy="581025"/>
+                        </a:xfrm>
+                        <a:prstGeom prst="straightConnector1">
+                          <a:avLst/>
+                        </a:prstGeom>
+                        <a:ln>
+                          <a:tailEnd type="triangle"/>
+                        </a:ln>
+                      </wps:spPr>
+                      <wps:style>
+                        <a:lnRef idx="1">
+                          <a:schemeClr val="accent1"/>
+                        </a:lnRef>
+                        <a:fillRef idx="0">
+                          <a:schemeClr val="accent1"/>
+                        </a:fillRef>
+                        <a:effectRef idx="0">
+                          <a:schemeClr val="accent1"/>
+                        </a:effectRef>
+                        <a:fontRef idx="minor">
+                          <a:schemeClr val="tx1"/>
+                        </a:fontRef>
+                      </wps:style>
+                      <wps:bodyPr/>
+                    </wps:wsp>
+                  </a:graphicData>
+                </a:graphic>
+              </wp:anchor>
+            </w:drawing>
+          </mc:Choice>
+          <mc:Fallback>
+            <w:pict>
+              <v:shape w14:anchorId="5CCA9472" id="Conector de Seta Reta 160" o:spid="_x0000_s1026" type="#_x0000_t32" style="position:absolute;margin-left:119.7pt;margin-top:6.65pt;width:39.75pt;height:45.75pt;flip:x;z-index:251715584;visibility:visible;mso-wrap-style:square;mso-wrap-distance-left:9pt;mso-wrap-distance-top:0;mso-wrap-distance-right:9pt;mso-wrap-distance-bottom:0;mso-position-horizontal:absolute;mso-position-horizontal-relative:text;mso-position-vertical:absolute;mso-position-vertical-relative:text" o:gfxdata="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" strokecolor="#4472c4 [3204]" strokeweight=".5pt">
+                <v:stroke endarrow="block" joinstyle="miter"/>
+              </v:shape>
+            </w:pict>
+          </mc:Fallback>
+        </mc:AlternateContent>
+      </w:r>
+      <w:r>
+        <w:rPr>
+          <w:noProof/>
+        </w:rPr>
+        <mc:AlternateContent>
+          <mc:Choice Requires="wps">
+            <w:drawing>
+              <wp:anchor distT="0" distB="0" distL="114300" distR="114300" simplePos="0" relativeHeight="251714560" behindDoc="0" locked="0" layoutInCell="1" allowOverlap="1">
+                <wp:simplePos x="0" y="0"/>
+                <wp:positionH relativeFrom="column">
+                  <wp:posOffset>1872615</wp:posOffset>
+                </wp:positionH>
+                <wp:positionV relativeFrom="paragraph">
+                  <wp:posOffset>-1270</wp:posOffset>
+                </wp:positionV>
+                <wp:extent cx="600075" cy="447675"/>
+                <wp:effectExtent l="38100" t="0" r="28575" b="47625"/>
+                <wp:wrapNone/>
+                <wp:docPr id="159" name="Conector de Seta Reta 159"/>
+                <wp:cNvGraphicFramePr/>
+                <a:graphic xmlns:a="http://schemas.openxmlformats.org/drawingml/2006/main">
+                  <a:graphicData uri="http://schemas.microsoft.com/office/word/2010/wordprocessingShape">
+                    <wps:wsp>
+                      <wps:cNvCnPr/>
+                      <wps:spPr>
+                        <a:xfrm flipH="1">
+                          <a:off x="0" y="0"/>
+                          <a:ext cx="600075" cy="447675"/>
+                        </a:xfrm>
+                        <a:prstGeom prst="straightConnector1">
+                          <a:avLst/>
+                        </a:prstGeom>
+                        <a:ln>
+                          <a:tailEnd type="triangle"/>
+                        </a:ln>
+                      </wps:spPr>
+                      <wps:style>
+                        <a:lnRef idx="1">
+                          <a:schemeClr val="accent1"/>
+                        </a:lnRef>
+                        <a:fillRef idx="0">
+                          <a:schemeClr val="accent1"/>
+                        </a:fillRef>
+                        <a:effectRef idx="0">
+                          <a:schemeClr val="accent1"/>
+                        </a:effectRef>
+                        <a:fontRef idx="minor">
+                          <a:schemeClr val="tx1"/>
+                        </a:fontRef>
+                      </wps:style>
+                      <wps:bodyPr/>
+                    </wps:wsp>
+                  </a:graphicData>
+                </a:graphic>
+              </wp:anchor>
+            </w:drawing>
+          </mc:Choice>
+          <mc:Fallback>
+            <w:pict>
+              <v:shape w14:anchorId="465F65D1" id="Conector de Seta Reta 159" o:spid="_x0000_s1026" type="#_x0000_t32" style="position:absolute;margin-left:147.45pt;margin-top:-.1pt;width:47.25pt;height:35.25pt;flip:x;z-index:251714560;visibility:visible;mso-wrap-style:square;mso-wrap-distance-left:9pt;mso-wrap-distance-top:0;mso-wrap-distance-right:9pt;mso-wrap-distance-bottom:0;mso-position-horizontal:absolute;mso-position-horizontal-relative:text;mso-position-vertical:absolute;mso-position-vertical-relative:text" o:gfxdata="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" strokecolor="#4472c4 [3204]" strokeweight=".5pt">
+                <v:stroke endarrow="block" joinstyle="miter"/>
+              </v:shape>
+            </w:pict>
+          </mc:Fallback>
+        </mc:AlternateContent>
+      </w:r>
+      <w:r>
+        <w:drawing>
+          <wp:inline distT="0" distB="0" distL="0" distR="0" wp14:anchorId="2986F551" wp14:editId="73B40732">
+            <wp:extent cx="1914792" cy="2305372"/>
+            <wp:effectExtent l="0" t="0" r="9525" b="0"/>
+            <wp:docPr id="158" name="Imagem 158"/>
+            <wp:cNvGraphicFramePr>
+              <a:graphicFrameLocks xmlns:a="http://schemas.openxmlformats.org/drawingml/2006/main" noChangeAspect="1"/>
+            </wp:cNvGraphicFramePr>
+            <a:graphic xmlns:a="http://schemas.openxmlformats.org/drawingml/2006/main">
+              <a:graphicData uri="http://schemas.openxmlformats.org/drawingml/2006/picture">
+                <pic:pic xmlns:pic="http://schemas.openxmlformats.org/drawingml/2006/picture">
+                  <pic:nvPicPr>
+                    <pic:cNvPr id="1" name=""/>
+                    <pic:cNvPicPr/>
+                  </pic:nvPicPr>
+                  <pic:blipFill>
+                    <a:blip r:embed="rId112"/>
+                    <a:stretch>
+                      <a:fillRect/>
+                    </a:stretch>
+                  </pic:blipFill>
+                  <pic:spPr>
+                    <a:xfrm>
+                      <a:off x="0" y="0"/>
+                      <a:ext cx="1914792" cy="2305372"/>
+                    </a:xfrm>
+                    <a:prstGeom prst="rect">
+                      <a:avLst/>
+                    </a:prstGeom>
+                  </pic:spPr>
+                </pic:pic>
+              </a:graphicData>
+            </a:graphic>
+          </wp:inline>
+        </w:drawing>
+      </w:r>
+      <w:r>
+        <w:drawing>
+          <wp:inline distT="0" distB="0" distL="0" distR="0" wp14:anchorId="5CF10D97" wp14:editId="468B06A2">
+            <wp:extent cx="3302499" cy="2114550"/>
+            <wp:effectExtent l="0" t="0" r="0" b="0"/>
+            <wp:docPr id="163" name="Imagem 163"/>
+            <wp:cNvGraphicFramePr>
+              <a:graphicFrameLocks xmlns:a="http://schemas.openxmlformats.org/drawingml/2006/main" noChangeAspect="1"/>
+            </wp:cNvGraphicFramePr>
+            <a:graphic xmlns:a="http://schemas.openxmlformats.org/drawingml/2006/main">
+              <a:graphicData uri="http://schemas.openxmlformats.org/drawingml/2006/picture">
+                <pic:pic xmlns:pic="http://schemas.openxmlformats.org/drawingml/2006/picture">
+                  <pic:nvPicPr>
+                    <pic:cNvPr id="1" name=""/>
+                    <pic:cNvPicPr/>
+                  </pic:nvPicPr>
+                  <pic:blipFill>
+                    <a:blip r:embed="rId113"/>
+                    <a:stretch>
+                      <a:fillRect/>
+                    </a:stretch>
+                  </pic:blipFill>
+                  <pic:spPr>
+                    <a:xfrm>
+                      <a:off x="0" y="0"/>
+                      <a:ext cx="3310037" cy="2119377"/>
+                    </a:xfrm>
+                    <a:prstGeom prst="rect">
+                      <a:avLst/>
+                    </a:prstGeom>
+                  </pic:spPr>
+                </pic:pic>
+              </a:graphicData>
+            </a:graphic>
+          </wp:inline>
+        </w:drawing>
+      </w:r>
+    </w:p>
+    <w:p>
+      <w:r>
+        <w:rPr>
+          <w:noProof/>
+        </w:rPr>
+        <mc:AlternateContent>
+          <mc:Choice Requires="wps">
+            <w:drawing>
+              <wp:anchor distT="0" distB="0" distL="114300" distR="114300" simplePos="0" relativeHeight="251718656" behindDoc="0" locked="0" layoutInCell="1" allowOverlap="1">
+                <wp:simplePos x="0" y="0"/>
+                <wp:positionH relativeFrom="column">
+                  <wp:posOffset>1177290</wp:posOffset>
+                </wp:positionH>
+                <wp:positionV relativeFrom="paragraph">
+                  <wp:posOffset>188594</wp:posOffset>
+                </wp:positionV>
+                <wp:extent cx="1676400" cy="942975"/>
+                <wp:effectExtent l="38100" t="0" r="19050" b="47625"/>
+                <wp:wrapNone/>
+                <wp:docPr id="165" name="Conector de Seta Reta 165"/>
+                <wp:cNvGraphicFramePr/>
+                <a:graphic xmlns:a="http://schemas.openxmlformats.org/drawingml/2006/main">
+                  <a:graphicData uri="http://schemas.microsoft.com/office/word/2010/wordprocessingShape">
+                    <wps:wsp>
+                      <wps:cNvCnPr/>
+                      <wps:spPr>
+                        <a:xfrm flipH="1">
+                          <a:off x="0" y="0"/>
+                          <a:ext cx="1676400" cy="942975"/>
+                        </a:xfrm>
+                        <a:prstGeom prst="straightConnector1">
+                          <a:avLst/>
+                        </a:prstGeom>
+                        <a:ln>
+                          <a:tailEnd type="triangle"/>
+                        </a:ln>
+                      </wps:spPr>
+                      <wps:style>
+                        <a:lnRef idx="1">
+                          <a:schemeClr val="accent1"/>
+                        </a:lnRef>
+                        <a:fillRef idx="0">
+                          <a:schemeClr val="accent1"/>
+                        </a:fillRef>
+                        <a:effectRef idx="0">
+                          <a:schemeClr val="accent1"/>
+                        </a:effectRef>
+                        <a:fontRef idx="minor">
+                          <a:schemeClr val="tx1"/>
+                        </a:fontRef>
+                      </wps:style>
+                      <wps:bodyPr/>
+                    </wps:wsp>
+                  </a:graphicData>
+                </a:graphic>
+              </wp:anchor>
+            </w:drawing>
+          </mc:Choice>
+          <mc:Fallback>
+            <w:pict>
+              <v:shape w14:anchorId="78EBC654" id="Conector de Seta Reta 165" o:spid="_x0000_s1026" type="#_x0000_t32" style="position:absolute;margin-left:92.7pt;margin-top:14.85pt;width:132pt;height:74.25pt;flip:x;z-index:251718656;visibility:visible;mso-wrap-style:square;mso-wrap-distance-left:9pt;mso-wrap-distance-top:0;mso-wrap-distance-right:9pt;mso-wrap-distance-bottom:0;mso-position-horizontal:absolute;mso-position-horizontal-relative:text;mso-position-vertical:absolute;mso-position-vertical-relative:text" o:gfxdata="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" strokecolor="#4472c4 [3204]" strokeweight=".5pt">
+                <v:stroke endarrow="block" joinstyle="miter"/>
+              </v:shape>
+            </w:pict>
+          </mc:Fallback>
+        </mc:AlternateContent>
+      </w:r>
+      <w:r>
+        <w:t xml:space="preserve">63 – Incluímos uma porcentagem de 50% para cada </w:t>
+      </w:r>
+      <w:proofErr w:type="spellStart"/>
+      <w:r>
+        <w:t>unput</w:t>
+      </w:r>
+      <w:proofErr w:type="spellEnd"/>
+      <w:r>
+        <w:t xml:space="preserve"> do nosso formulário.</w:t>
+      </w:r>
+    </w:p>
+    <w:p>
+      <w:r>
+        <w:drawing>
+          <wp:inline distT="0" distB="0" distL="0" distR="0" wp14:anchorId="68F79E15" wp14:editId="6CB9BFA4">
+            <wp:extent cx="1790950" cy="1228896"/>
+            <wp:effectExtent l="0" t="0" r="0" b="0"/>
+            <wp:docPr id="164" name="Imagem 164"/>
+            <wp:cNvGraphicFramePr>
+              <a:graphicFrameLocks xmlns:a="http://schemas.openxmlformats.org/drawingml/2006/main" noChangeAspect="1"/>
+            </wp:cNvGraphicFramePr>
+            <a:graphic xmlns:a="http://schemas.openxmlformats.org/drawingml/2006/main">
+              <a:graphicData uri="http://schemas.openxmlformats.org/drawingml/2006/picture">
+                <pic:pic xmlns:pic="http://schemas.openxmlformats.org/drawingml/2006/picture">
+                  <pic:nvPicPr>
+                    <pic:cNvPr id="1" name=""/>
+                    <pic:cNvPicPr/>
+                  </pic:nvPicPr>
+                  <pic:blipFill>
+                    <a:blip r:embed="rId114"/>
+                    <a:stretch>
+                      <a:fillRect/>
+                    </a:stretch>
+                  </pic:blipFill>
+                  <pic:spPr>
+                    <a:xfrm>
+                      <a:off x="0" y="0"/>
+                      <a:ext cx="1790950" cy="1228896"/>
+                    </a:xfrm>
+                    <a:prstGeom prst="rect">
+                      <a:avLst/>
+                    </a:prstGeom>
+                  </pic:spPr>
+                </pic:pic>
+              </a:graphicData>
+            </a:graphic>
+          </wp:inline>
+        </w:drawing>
+      </w:r>
+      <w:r>
+        <w:drawing>
+          <wp:inline distT="0" distB="0" distL="0" distR="0" wp14:anchorId="6859453B" wp14:editId="43C1D95A">
+            <wp:extent cx="2609850" cy="1671056"/>
+            <wp:effectExtent l="0" t="0" r="0" b="5715"/>
+            <wp:docPr id="166" name="Imagem 166"/>
+            <wp:cNvGraphicFramePr>
+              <a:graphicFrameLocks xmlns:a="http://schemas.openxmlformats.org/drawingml/2006/main" noChangeAspect="1"/>
+            </wp:cNvGraphicFramePr>
+            <a:graphic xmlns:a="http://schemas.openxmlformats.org/drawingml/2006/main">
+              <a:graphicData uri="http://schemas.openxmlformats.org/drawingml/2006/picture">
+                <pic:pic xmlns:pic="http://schemas.openxmlformats.org/drawingml/2006/picture">
+                  <pic:nvPicPr>
+                    <pic:cNvPr id="1" name=""/>
+                    <pic:cNvPicPr/>
+                  </pic:nvPicPr>
+                  <pic:blipFill>
+                    <a:blip r:embed="rId113"/>
+                    <a:stretch>
+                      <a:fillRect/>
+                    </a:stretch>
+                  </pic:blipFill>
+                  <pic:spPr>
+                    <a:xfrm>
+                      <a:off x="0" y="0"/>
+                      <a:ext cx="2648540" cy="1695828"/>
+                    </a:xfrm>
+                    <a:prstGeom prst="rect">
+                      <a:avLst/>
+                    </a:prstGeom>
+                  </pic:spPr>
+                </pic:pic>
+              </a:graphicData>
+            </a:graphic>
+          </wp:inline>
+        </w:drawing>
+      </w:r>
+    </w:p>
+    <w:p/>
+    <w:p/>
+    <w:p>
+      <w:r>
+        <w:lastRenderedPageBreak/>
+        <w:t xml:space="preserve">64 – Inserimos </w:t>
+      </w:r>
+      <w:r>
+        <w:t xml:space="preserve">um </w:t>
+      </w:r>
+      <w:proofErr w:type="spellStart"/>
+      <w:proofErr w:type="gramStart"/>
+      <w:r>
+        <w:t>textarea</w:t>
+      </w:r>
+      <w:proofErr w:type="spellEnd"/>
+      <w:r>
+        <w:t>(</w:t>
+      </w:r>
+      <w:proofErr w:type="gramEnd"/>
+      <w:r>
+        <w:t>inputs de mensagem) em baixo do input telefone e aumentamos o tamanho da coluna para ficar alinhado com outros inputs.</w:t>
+      </w:r>
+    </w:p>
+    <w:p>
+      <w:r>
+        <w:rPr>
+          <w:noProof/>
+        </w:rPr>
+        <mc:AlternateContent>
+          <mc:Choice Requires="wps">
+            <w:drawing>
+              <wp:anchor distT="0" distB="0" distL="114300" distR="114300" simplePos="0" relativeHeight="251720704" behindDoc="0" locked="0" layoutInCell="1" allowOverlap="1">
+                <wp:simplePos x="0" y="0"/>
+                <wp:positionH relativeFrom="column">
+                  <wp:posOffset>2329815</wp:posOffset>
+                </wp:positionH>
+                <wp:positionV relativeFrom="paragraph">
+                  <wp:posOffset>1583054</wp:posOffset>
+                </wp:positionV>
+                <wp:extent cx="1590675" cy="2333625"/>
+                <wp:effectExtent l="38100" t="0" r="28575" b="47625"/>
+                <wp:wrapNone/>
+                <wp:docPr id="170" name="Conector de Seta Reta 170"/>
+                <wp:cNvGraphicFramePr/>
+                <a:graphic xmlns:a="http://schemas.openxmlformats.org/drawingml/2006/main">
+                  <a:graphicData uri="http://schemas.microsoft.com/office/word/2010/wordprocessingShape">
+                    <wps:wsp>
+                      <wps:cNvCnPr/>
+                      <wps:spPr>
+                        <a:xfrm flipH="1">
+                          <a:off x="0" y="0"/>
+                          <a:ext cx="1590675" cy="2333625"/>
+                        </a:xfrm>
+                        <a:prstGeom prst="straightConnector1">
+                          <a:avLst/>
+                        </a:prstGeom>
+                        <a:ln>
+                          <a:tailEnd type="triangle"/>
+                        </a:ln>
+                      </wps:spPr>
+                      <wps:style>
+                        <a:lnRef idx="1">
+                          <a:schemeClr val="accent1"/>
+                        </a:lnRef>
+                        <a:fillRef idx="0">
+                          <a:schemeClr val="accent1"/>
+                        </a:fillRef>
+                        <a:effectRef idx="0">
+                          <a:schemeClr val="accent1"/>
+                        </a:effectRef>
+                        <a:fontRef idx="minor">
+                          <a:schemeClr val="tx1"/>
+                        </a:fontRef>
+                      </wps:style>
+                      <wps:bodyPr/>
+                    </wps:wsp>
+                  </a:graphicData>
+                </a:graphic>
+              </wp:anchor>
+            </w:drawing>
+          </mc:Choice>
+          <mc:Fallback>
+            <w:pict>
+              <v:shape w14:anchorId="234F9E4F" id="Conector de Seta Reta 170" o:spid="_x0000_s1026" type="#_x0000_t32" style="position:absolute;margin-left:183.45pt;margin-top:124.65pt;width:125.25pt;height:183.75pt;flip:x;z-index:251720704;visibility:visible;mso-wrap-style:square;mso-wrap-distance-left:9pt;mso-wrap-distance-top:0;mso-wrap-distance-right:9pt;mso-wrap-distance-bottom:0;mso-position-horizontal:absolute;mso-position-horizontal-relative:text;mso-position-vertical:absolute;mso-position-vertical-relative:text" o:gfxdata="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" strokecolor="#4472c4 [3204]" strokeweight=".5pt">
+                <v:stroke endarrow="block" joinstyle="miter"/>
+              </v:shape>
+            </w:pict>
+          </mc:Fallback>
+        </mc:AlternateContent>
+      </w:r>
+      <w:r>
+        <w:rPr>
+          <w:noProof/>
+        </w:rPr>
+        <mc:AlternateContent>
+          <mc:Choice Requires="wps">
+            <w:drawing>
+              <wp:anchor distT="0" distB="0" distL="114300" distR="114300" simplePos="0" relativeHeight="251719680" behindDoc="0" locked="0" layoutInCell="1" allowOverlap="1">
+                <wp:simplePos x="0" y="0"/>
+                <wp:positionH relativeFrom="column">
+                  <wp:posOffset>1320165</wp:posOffset>
+                </wp:positionH>
+                <wp:positionV relativeFrom="paragraph">
+                  <wp:posOffset>592455</wp:posOffset>
+                </wp:positionV>
+                <wp:extent cx="3162300" cy="857250"/>
+                <wp:effectExtent l="38100" t="0" r="19050" b="76200"/>
+                <wp:wrapNone/>
+                <wp:docPr id="168" name="Conector de Seta Reta 168"/>
+                <wp:cNvGraphicFramePr/>
+                <a:graphic xmlns:a="http://schemas.openxmlformats.org/drawingml/2006/main">
+                  <a:graphicData uri="http://schemas.microsoft.com/office/word/2010/wordprocessingShape">
+                    <wps:wsp>
+                      <wps:cNvCnPr/>
+                      <wps:spPr>
+                        <a:xfrm flipH="1">
+                          <a:off x="0" y="0"/>
+                          <a:ext cx="3162300" cy="857250"/>
+                        </a:xfrm>
+                        <a:prstGeom prst="straightConnector1">
+                          <a:avLst/>
+                        </a:prstGeom>
+                        <a:ln>
+                          <a:tailEnd type="triangle"/>
+                        </a:ln>
+                      </wps:spPr>
+                      <wps:style>
+                        <a:lnRef idx="1">
+                          <a:schemeClr val="accent1"/>
+                        </a:lnRef>
+                        <a:fillRef idx="0">
+                          <a:schemeClr val="accent1"/>
+                        </a:fillRef>
+                        <a:effectRef idx="0">
+                          <a:schemeClr val="accent1"/>
+                        </a:effectRef>
+                        <a:fontRef idx="minor">
+                          <a:schemeClr val="tx1"/>
+                        </a:fontRef>
+                      </wps:style>
+                      <wps:bodyPr/>
+                    </wps:wsp>
+                  </a:graphicData>
+                </a:graphic>
+                <wp14:sizeRelH relativeFrom="margin">
+                  <wp14:pctWidth>0</wp14:pctWidth>
+                </wp14:sizeRelH>
+                <wp14:sizeRelV relativeFrom="margin">
+                  <wp14:pctHeight>0</wp14:pctHeight>
+                </wp14:sizeRelV>
+              </wp:anchor>
+            </w:drawing>
+          </mc:Choice>
+          <mc:Fallback>
+            <w:pict>
+              <v:shape w14:anchorId="6DD33314" id="Conector de Seta Reta 168" o:spid="_x0000_s1026" type="#_x0000_t32" style="position:absolute;margin-left:103.95pt;margin-top:46.65pt;width:249pt;height:67.5pt;flip:x;z-index:251719680;visibility:visible;mso-wrap-style:square;mso-width-percent:0;mso-height-percent:0;mso-wrap-distance-left:9pt;mso-wrap-distance-top:0;mso-wrap-distance-right:9pt;mso-wrap-distance-bottom:0;mso-position-horizontal:absolute;mso-position-horizontal-relative:text;mso-position-vertical:absolute;mso-position-vertical-relative:text;mso-width-percent:0;mso-height-percent:0;mso-width-relative:margin;mso-height-relative:margin" o:gfxdata="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" strokecolor="#4472c4 [3204]" strokeweight=".5pt">
+                <v:stroke endarrow="block" joinstyle="miter"/>
+              </v:shape>
+            </w:pict>
+          </mc:Fallback>
+        </mc:AlternateContent>
+      </w:r>
+      <w:r>
+        <w:drawing>
+          <wp:inline distT="0" distB="0" distL="0" distR="0" wp14:anchorId="063960DC" wp14:editId="2351BF16">
+            <wp:extent cx="4801270" cy="2114845"/>
+            <wp:effectExtent l="0" t="0" r="0" b="0"/>
+            <wp:docPr id="167" name="Imagem 167"/>
+            <wp:cNvGraphicFramePr>
+              <a:graphicFrameLocks xmlns:a="http://schemas.openxmlformats.org/drawingml/2006/main" noChangeAspect="1"/>
+            </wp:cNvGraphicFramePr>
+            <a:graphic xmlns:a="http://schemas.openxmlformats.org/drawingml/2006/main">
+              <a:graphicData uri="http://schemas.openxmlformats.org/drawingml/2006/picture">
+                <pic:pic xmlns:pic="http://schemas.openxmlformats.org/drawingml/2006/picture">
+                  <pic:nvPicPr>
+                    <pic:cNvPr id="1" name=""/>
+                    <pic:cNvPicPr/>
+                  </pic:nvPicPr>
+                  <pic:blipFill>
+                    <a:blip r:embed="rId115"/>
+                    <a:stretch>
+                      <a:fillRect/>
+                    </a:stretch>
+                  </pic:blipFill>
+                  <pic:spPr>
+                    <a:xfrm>
+                      <a:off x="0" y="0"/>
+                      <a:ext cx="4801270" cy="2114845"/>
+                    </a:xfrm>
+                    <a:prstGeom prst="rect">
+                      <a:avLst/>
+                    </a:prstGeom>
+                  </pic:spPr>
+                </pic:pic>
+              </a:graphicData>
+            </a:graphic>
+          </wp:inline>
+        </w:drawing>
+      </w:r>
+      <w:r>
+        <w:drawing>
+          <wp:inline distT="0" distB="0" distL="0" distR="0" wp14:anchorId="51BAC13C" wp14:editId="57E8BA21">
+            <wp:extent cx="4067743" cy="3591426"/>
+            <wp:effectExtent l="0" t="0" r="9525" b="9525"/>
+            <wp:docPr id="169" name="Imagem 169"/>
+            <wp:cNvGraphicFramePr>
+              <a:graphicFrameLocks xmlns:a="http://schemas.openxmlformats.org/drawingml/2006/main" noChangeAspect="1"/>
+            </wp:cNvGraphicFramePr>
+            <a:graphic xmlns:a="http://schemas.openxmlformats.org/drawingml/2006/main">
+              <a:graphicData uri="http://schemas.openxmlformats.org/drawingml/2006/picture">
+                <pic:pic xmlns:pic="http://schemas.openxmlformats.org/drawingml/2006/picture">
+                  <pic:nvPicPr>
+                    <pic:cNvPr id="1" name=""/>
+                    <pic:cNvPicPr/>
+                  </pic:nvPicPr>
+                  <pic:blipFill>
+                    <a:blip r:embed="rId116"/>
+                    <a:stretch>
+                      <a:fillRect/>
+                    </a:stretch>
+                  </pic:blipFill>
+                  <pic:spPr>
+                    <a:xfrm>
+                      <a:off x="0" y="0"/>
+                      <a:ext cx="4067743" cy="3591426"/>
+                    </a:xfrm>
+                    <a:prstGeom prst="rect">
+                      <a:avLst/>
+                    </a:prstGeom>
+                  </pic:spPr>
+                </pic:pic>
+              </a:graphicData>
+            </a:graphic>
+          </wp:inline>
+        </w:drawing>
+      </w:r>
+    </w:p>
+    <w:p/>
+    <w:p/>
+    <w:p/>
+    <w:p/>
+    <w:p/>
+    <w:p/>
+    <w:p/>
+    <w:p/>
+    <w:p>
+      <w:r>
+        <w:lastRenderedPageBreak/>
+        <w:t xml:space="preserve">65 </w:t>
+      </w:r>
+      <w:r>
+        <w:t>–</w:t>
+      </w:r>
+      <w:r>
+        <w:t xml:space="preserve"> </w:t>
+      </w:r>
+      <w:r>
+        <w:t xml:space="preserve">Trabalhando com </w:t>
+      </w:r>
+      <w:proofErr w:type="spellStart"/>
+      <w:r>
+        <w:t>unput</w:t>
+      </w:r>
+      <w:proofErr w:type="spellEnd"/>
+      <w:r>
+        <w:t xml:space="preserve"> radio em nosso formulário inserimos os </w:t>
+      </w:r>
+      <w:proofErr w:type="spellStart"/>
+      <w:r>
+        <w:t>labels</w:t>
+      </w:r>
+      <w:proofErr w:type="spellEnd"/>
+      <w:r>
+        <w:t xml:space="preserve"> e os inputs radio conforme código abaixo e transformamos que somente 1 opção pode ser escolhida, utilizando o mesmo nome na palavra </w:t>
+      </w:r>
+      <w:proofErr w:type="spellStart"/>
+      <w:r>
+        <w:t>name</w:t>
+      </w:r>
+      <w:proofErr w:type="spellEnd"/>
+      <w:r>
+        <w:t xml:space="preserve"> do código.</w:t>
+      </w:r>
+    </w:p>
+    <w:p>
+      <w:r>
+        <w:rPr>
+          <w:noProof/>
+        </w:rPr>
+        <mc:AlternateContent>
+          <mc:Choice Requires="wps">
+            <w:drawing>
+              <wp:anchor distT="0" distB="0" distL="114300" distR="114300" simplePos="0" relativeHeight="251723776" behindDoc="0" locked="0" layoutInCell="1" allowOverlap="1">
+                <wp:simplePos x="0" y="0"/>
+                <wp:positionH relativeFrom="column">
+                  <wp:posOffset>1891665</wp:posOffset>
+                </wp:positionH>
+                <wp:positionV relativeFrom="paragraph">
+                  <wp:posOffset>791210</wp:posOffset>
+                </wp:positionV>
+                <wp:extent cx="1771650" cy="142875"/>
+                <wp:effectExtent l="38100" t="0" r="19050" b="85725"/>
+                <wp:wrapNone/>
+                <wp:docPr id="174" name="Conector de Seta Reta 174"/>
+                <wp:cNvGraphicFramePr/>
+                <a:graphic xmlns:a="http://schemas.openxmlformats.org/drawingml/2006/main">
+                  <a:graphicData uri="http://schemas.microsoft.com/office/word/2010/wordprocessingShape">
+                    <wps:wsp>
+                      <wps:cNvCnPr/>
+                      <wps:spPr>
+                        <a:xfrm flipH="1">
+                          <a:off x="0" y="0"/>
+                          <a:ext cx="1771650" cy="142875"/>
+                        </a:xfrm>
+                        <a:prstGeom prst="straightConnector1">
+                          <a:avLst/>
+                        </a:prstGeom>
+                        <a:ln>
+                          <a:tailEnd type="triangle"/>
+                        </a:ln>
+                      </wps:spPr>
+                      <wps:style>
+                        <a:lnRef idx="1">
+                          <a:schemeClr val="accent1"/>
+                        </a:lnRef>
+                        <a:fillRef idx="0">
+                          <a:schemeClr val="accent1"/>
+                        </a:fillRef>
+                        <a:effectRef idx="0">
+                          <a:schemeClr val="accent1"/>
+                        </a:effectRef>
+                        <a:fontRef idx="minor">
+                          <a:schemeClr val="tx1"/>
+                        </a:fontRef>
+                      </wps:style>
+                      <wps:bodyPr/>
+                    </wps:wsp>
+                  </a:graphicData>
+                </a:graphic>
+              </wp:anchor>
+            </w:drawing>
+          </mc:Choice>
+          <mc:Fallback>
+            <w:pict>
+              <v:shape w14:anchorId="3ACA0542" id="Conector de Seta Reta 174" o:spid="_x0000_s1026" type="#_x0000_t32" style="position:absolute;margin-left:148.95pt;margin-top:62.3pt;width:139.5pt;height:11.25pt;flip:x;z-index:251723776;visibility:visible;mso-wrap-style:square;mso-wrap-distance-left:9pt;mso-wrap-distance-top:0;mso-wrap-distance-right:9pt;mso-wrap-distance-bottom:0;mso-position-horizontal:absolute;mso-position-horizontal-relative:text;mso-position-vertical:absolute;mso-position-vertical-relative:text" o:gfxdata="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" strokecolor="#4472c4 [3204]" strokeweight=".5pt">
+                <v:stroke endarrow="block" joinstyle="miter"/>
+              </v:shape>
+            </w:pict>
+          </mc:Fallback>
+        </mc:AlternateContent>
+      </w:r>
+      <w:r>
+        <w:rPr>
+          <w:noProof/>
+        </w:rPr>
+        <mc:AlternateContent>
+          <mc:Choice Requires="wps">
+            <w:drawing>
+              <wp:anchor distT="0" distB="0" distL="114300" distR="114300" simplePos="0" relativeHeight="251722752" behindDoc="0" locked="0" layoutInCell="1" allowOverlap="1">
+                <wp:simplePos x="0" y="0"/>
+                <wp:positionH relativeFrom="column">
+                  <wp:posOffset>1920240</wp:posOffset>
+                </wp:positionH>
+                <wp:positionV relativeFrom="paragraph">
+                  <wp:posOffset>429260</wp:posOffset>
+                </wp:positionV>
+                <wp:extent cx="1847850" cy="123825"/>
+                <wp:effectExtent l="38100" t="0" r="19050" b="85725"/>
+                <wp:wrapNone/>
+                <wp:docPr id="173" name="Conector de Seta Reta 173"/>
+                <wp:cNvGraphicFramePr/>
+                <a:graphic xmlns:a="http://schemas.openxmlformats.org/drawingml/2006/main">
+                  <a:graphicData uri="http://schemas.microsoft.com/office/word/2010/wordprocessingShape">
+                    <wps:wsp>
+                      <wps:cNvCnPr/>
+                      <wps:spPr>
+                        <a:xfrm flipH="1">
+                          <a:off x="0" y="0"/>
+                          <a:ext cx="1847850" cy="123825"/>
+                        </a:xfrm>
+                        <a:prstGeom prst="straightConnector1">
+                          <a:avLst/>
+                        </a:prstGeom>
+                        <a:ln>
+                          <a:tailEnd type="triangle"/>
+                        </a:ln>
+                      </wps:spPr>
+                      <wps:style>
+                        <a:lnRef idx="1">
+                          <a:schemeClr val="accent1"/>
+                        </a:lnRef>
+                        <a:fillRef idx="0">
+                          <a:schemeClr val="accent1"/>
+                        </a:fillRef>
+                        <a:effectRef idx="0">
+                          <a:schemeClr val="accent1"/>
+                        </a:effectRef>
+                        <a:fontRef idx="minor">
+                          <a:schemeClr val="tx1"/>
+                        </a:fontRef>
+                      </wps:style>
+                      <wps:bodyPr/>
+                    </wps:wsp>
+                  </a:graphicData>
+                </a:graphic>
+              </wp:anchor>
+            </w:drawing>
+          </mc:Choice>
+          <mc:Fallback>
+            <w:pict>
+              <v:shape w14:anchorId="69C4B218" id="Conector de Seta Reta 173" o:spid="_x0000_s1026" type="#_x0000_t32" style="position:absolute;margin-left:151.2pt;margin-top:33.8pt;width:145.5pt;height:9.75pt;flip:x;z-index:251722752;visibility:visible;mso-wrap-style:square;mso-wrap-distance-left:9pt;mso-wrap-distance-top:0;mso-wrap-distance-right:9pt;mso-wrap-distance-bottom:0;mso-position-horizontal:absolute;mso-position-horizontal-relative:text;mso-position-vertical:absolute;mso-position-vertical-relative:text" o:gfxdata="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" strokecolor="#4472c4 [3204]" strokeweight=".5pt">
+                <v:stroke endarrow="block" joinstyle="miter"/>
+              </v:shape>
+            </w:pict>
+          </mc:Fallback>
+        </mc:AlternateContent>
+      </w:r>
+      <w:r>
+        <w:rPr>
+          <w:noProof/>
+        </w:rPr>
+        <mc:AlternateContent>
+          <mc:Choice Requires="wps">
+            <w:drawing>
+              <wp:anchor distT="0" distB="0" distL="114300" distR="114300" simplePos="0" relativeHeight="251721728" behindDoc="0" locked="0" layoutInCell="1" allowOverlap="1">
+                <wp:simplePos x="0" y="0"/>
+                <wp:positionH relativeFrom="column">
+                  <wp:posOffset>1901190</wp:posOffset>
+                </wp:positionH>
+                <wp:positionV relativeFrom="paragraph">
+                  <wp:posOffset>57785</wp:posOffset>
+                </wp:positionV>
+                <wp:extent cx="1428750" cy="152400"/>
+                <wp:effectExtent l="38100" t="0" r="19050" b="95250"/>
+                <wp:wrapNone/>
+                <wp:docPr id="172" name="Conector de Seta Reta 172"/>
+                <wp:cNvGraphicFramePr/>
+                <a:graphic xmlns:a="http://schemas.openxmlformats.org/drawingml/2006/main">
+                  <a:graphicData uri="http://schemas.microsoft.com/office/word/2010/wordprocessingShape">
+                    <wps:wsp>
+                      <wps:cNvCnPr/>
+                      <wps:spPr>
+                        <a:xfrm flipH="1">
+                          <a:off x="0" y="0"/>
+                          <a:ext cx="1428750" cy="152400"/>
+                        </a:xfrm>
+                        <a:prstGeom prst="straightConnector1">
+                          <a:avLst/>
+                        </a:prstGeom>
+                        <a:ln>
+                          <a:tailEnd type="triangle"/>
+                        </a:ln>
+                      </wps:spPr>
+                      <wps:style>
+                        <a:lnRef idx="1">
+                          <a:schemeClr val="accent1"/>
+                        </a:lnRef>
+                        <a:fillRef idx="0">
+                          <a:schemeClr val="accent1"/>
+                        </a:fillRef>
+                        <a:effectRef idx="0">
+                          <a:schemeClr val="accent1"/>
+                        </a:effectRef>
+                        <a:fontRef idx="minor">
+                          <a:schemeClr val="tx1"/>
+                        </a:fontRef>
+                      </wps:style>
+                      <wps:bodyPr/>
+                    </wps:wsp>
+                  </a:graphicData>
+                </a:graphic>
+              </wp:anchor>
+            </w:drawing>
+          </mc:Choice>
+          <mc:Fallback>
+            <w:pict>
+              <v:shape w14:anchorId="754311D2" id="Conector de Seta Reta 172" o:spid="_x0000_s1026" type="#_x0000_t32" style="position:absolute;margin-left:149.7pt;margin-top:4.55pt;width:112.5pt;height:12pt;flip:x;z-index:251721728;visibility:visible;mso-wrap-style:square;mso-wrap-distance-left:9pt;mso-wrap-distance-top:0;mso-wrap-distance-right:9pt;mso-wrap-distance-bottom:0;mso-position-horizontal:absolute;mso-position-horizontal-relative:text;mso-position-vertical:absolute;mso-position-vertical-relative:text" o:gfxdata="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" strokecolor="#4472c4 [3204]" strokeweight=".5pt">
+                <v:stroke endarrow="block" joinstyle="miter"/>
+              </v:shape>
+            </w:pict>
+          </mc:Fallback>
+        </mc:AlternateContent>
+      </w:r>
+      <w:r>
+        <w:drawing>
+          <wp:inline distT="0" distB="0" distL="0" distR="0" wp14:anchorId="15EAF111" wp14:editId="27E145E8">
+            <wp:extent cx="4391638" cy="1276528"/>
+            <wp:effectExtent l="0" t="0" r="9525" b="0"/>
+            <wp:docPr id="171" name="Imagem 171"/>
+            <wp:cNvGraphicFramePr>
+              <a:graphicFrameLocks xmlns:a="http://schemas.openxmlformats.org/drawingml/2006/main" noChangeAspect="1"/>
+            </wp:cNvGraphicFramePr>
+            <a:graphic xmlns:a="http://schemas.openxmlformats.org/drawingml/2006/main">
+              <a:graphicData uri="http://schemas.openxmlformats.org/drawingml/2006/picture">
+                <pic:pic xmlns:pic="http://schemas.openxmlformats.org/drawingml/2006/picture">
+                  <pic:nvPicPr>
+                    <pic:cNvPr id="1" name=""/>
+                    <pic:cNvPicPr/>
+                  </pic:nvPicPr>
+                  <pic:blipFill>
+                    <a:blip r:embed="rId117"/>
+                    <a:stretch>
+                      <a:fillRect/>
+                    </a:stretch>
+                  </pic:blipFill>
+                  <pic:spPr>
+                    <a:xfrm>
+                      <a:off x="0" y="0"/>
+                      <a:ext cx="4391638" cy="1276528"/>
+                    </a:xfrm>
+                    <a:prstGeom prst="rect">
+                      <a:avLst/>
+                    </a:prstGeom>
+                  </pic:spPr>
+                </pic:pic>
+              </a:graphicData>
+            </a:graphic>
+          </wp:inline>
+        </w:drawing>
+      </w:r>
+      <w:r>
+        <w:drawing>
+          <wp:inline distT="0" distB="0" distL="0" distR="0" wp14:anchorId="5C55923F" wp14:editId="5E0A9497">
+            <wp:extent cx="3829584" cy="1076475"/>
+            <wp:effectExtent l="0" t="0" r="0" b="9525"/>
+            <wp:docPr id="175" name="Imagem 175"/>
+            <wp:cNvGraphicFramePr>
+              <a:graphicFrameLocks xmlns:a="http://schemas.openxmlformats.org/drawingml/2006/main" noChangeAspect="1"/>
+            </wp:cNvGraphicFramePr>
+            <a:graphic xmlns:a="http://schemas.openxmlformats.org/drawingml/2006/main">
+              <a:graphicData uri="http://schemas.openxmlformats.org/drawingml/2006/picture">
+                <pic:pic xmlns:pic="http://schemas.openxmlformats.org/drawingml/2006/picture">
+                  <pic:nvPicPr>
+                    <pic:cNvPr id="1" name=""/>
+                    <pic:cNvPicPr/>
+                  </pic:nvPicPr>
+                  <pic:blipFill>
+                    <a:blip r:embed="rId118"/>
+                    <a:stretch>
+                      <a:fillRect/>
+                    </a:stretch>
+                  </pic:blipFill>
+                  <pic:spPr>
+                    <a:xfrm>
+                      <a:off x="0" y="0"/>
+                      <a:ext cx="3829584" cy="1076475"/>
+                    </a:xfrm>
+                    <a:prstGeom prst="rect">
+                      <a:avLst/>
+                    </a:prstGeom>
+                  </pic:spPr>
+                </pic:pic>
+              </a:graphicData>
+            </a:graphic>
+          </wp:inline>
+        </w:drawing>
+      </w:r>
+    </w:p>
+    <w:p>
+      <w:r>
+        <w:rPr>
+          <w:noProof/>
+        </w:rPr>
+        <mc:AlternateContent>
+          <mc:Choice Requires="wps">
+            <w:drawing>
+              <wp:anchor distT="0" distB="0" distL="114300" distR="114300" simplePos="0" relativeHeight="251724800" behindDoc="0" locked="0" layoutInCell="1" allowOverlap="1">
+                <wp:simplePos x="0" y="0"/>
+                <wp:positionH relativeFrom="column">
+                  <wp:posOffset>310515</wp:posOffset>
+                </wp:positionH>
+                <wp:positionV relativeFrom="paragraph">
+                  <wp:posOffset>165735</wp:posOffset>
+                </wp:positionV>
+                <wp:extent cx="304800" cy="142875"/>
+                <wp:effectExtent l="0" t="0" r="76200" b="66675"/>
+                <wp:wrapNone/>
+                <wp:docPr id="177" name="Conector de Seta Reta 177"/>
+                <wp:cNvGraphicFramePr/>
+                <a:graphic xmlns:a="http://schemas.openxmlformats.org/drawingml/2006/main">
+                  <a:graphicData uri="http://schemas.microsoft.com/office/word/2010/wordprocessingShape">
+                    <wps:wsp>
+                      <wps:cNvCnPr/>
+                      <wps:spPr>
+                        <a:xfrm>
+                          <a:off x="0" y="0"/>
+                          <a:ext cx="304800" cy="142875"/>
+                        </a:xfrm>
+                        <a:prstGeom prst="straightConnector1">
+                          <a:avLst/>
+                        </a:prstGeom>
+                        <a:ln>
+                          <a:tailEnd type="triangle"/>
+                        </a:ln>
+                      </wps:spPr>
+                      <wps:style>
+                        <a:lnRef idx="1">
+                          <a:schemeClr val="accent1"/>
+                        </a:lnRef>
+                        <a:fillRef idx="0">
+                          <a:schemeClr val="accent1"/>
+                        </a:fillRef>
+                        <a:effectRef idx="0">
+                          <a:schemeClr val="accent1"/>
+                        </a:effectRef>
+                        <a:fontRef idx="minor">
+                          <a:schemeClr val="tx1"/>
+                        </a:fontRef>
+                      </wps:style>
+                      <wps:bodyPr/>
+                    </wps:wsp>
+                  </a:graphicData>
+                </a:graphic>
+              </wp:anchor>
+            </w:drawing>
+          </mc:Choice>
+          <mc:Fallback>
+            <w:pict>
+              <v:shape w14:anchorId="76A7E17F" id="Conector de Seta Reta 177" o:spid="_x0000_s1026" type="#_x0000_t32" style="position:absolute;margin-left:24.45pt;margin-top:13.05pt;width:24pt;height:11.25pt;z-index:251724800;visibility:visible;mso-wrap-style:square;mso-wrap-distance-left:9pt;mso-wrap-distance-top:0;mso-wrap-distance-right:9pt;mso-wrap-distance-bottom:0;mso-position-horizontal:absolute;mso-position-horizontal-relative:text;mso-position-vertical:absolute;mso-position-vertical-relative:text" o:gfxdata="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" strokecolor="#4472c4 [3204]" strokeweight=".5pt">
+                <v:stroke endarrow="block" joinstyle="miter"/>
+              </v:shape>
+            </w:pict>
+          </mc:Fallback>
+        </mc:AlternateContent>
+      </w:r>
+      <w:r>
+        <w:t xml:space="preserve">66 – Inserimos um parágrafo em cima da </w:t>
+      </w:r>
+      <w:proofErr w:type="spellStart"/>
+      <w:r>
+        <w:t>label</w:t>
+      </w:r>
+      <w:proofErr w:type="spellEnd"/>
+      <w:r>
+        <w:t xml:space="preserve"> radio-box telefone.</w:t>
+      </w:r>
+    </w:p>
+    <w:p>
+      <w:r>
+        <w:drawing>
+          <wp:inline distT="0" distB="0" distL="0" distR="0" wp14:anchorId="68C894FD" wp14:editId="12BEED14">
+            <wp:extent cx="3886742" cy="562053"/>
+            <wp:effectExtent l="0" t="0" r="0" b="9525"/>
+            <wp:docPr id="176" name="Imagem 176"/>
+            <wp:cNvGraphicFramePr>
+              <a:graphicFrameLocks xmlns:a="http://schemas.openxmlformats.org/drawingml/2006/main" noChangeAspect="1"/>
+            </wp:cNvGraphicFramePr>
+            <a:graphic xmlns:a="http://schemas.openxmlformats.org/drawingml/2006/main">
+              <a:graphicData uri="http://schemas.openxmlformats.org/drawingml/2006/picture">
+                <pic:pic xmlns:pic="http://schemas.openxmlformats.org/drawingml/2006/picture">
+                  <pic:nvPicPr>
+                    <pic:cNvPr id="1" name=""/>
+                    <pic:cNvPicPr/>
+                  </pic:nvPicPr>
+                  <pic:blipFill>
+                    <a:blip r:embed="rId119"/>
+                    <a:stretch>
+                      <a:fillRect/>
+                    </a:stretch>
+                  </pic:blipFill>
+                  <pic:spPr>
+                    <a:xfrm>
+                      <a:off x="0" y="0"/>
+                      <a:ext cx="3886742" cy="562053"/>
+                    </a:xfrm>
+                    <a:prstGeom prst="rect">
+                      <a:avLst/>
+                    </a:prstGeom>
+                  </pic:spPr>
+                </pic:pic>
+              </a:graphicData>
+            </a:graphic>
+          </wp:inline>
+        </w:drawing>
+      </w:r>
+    </w:p>
+    <w:p>
+      <w:r>
+        <w:t xml:space="preserve">67 </w:t>
+      </w:r>
+      <w:r>
+        <w:t>–</w:t>
+      </w:r>
+      <w:r>
+        <w:t xml:space="preserve"> </w:t>
+      </w:r>
+      <w:r>
+        <w:t xml:space="preserve">Adicionamos uma </w:t>
+      </w:r>
+      <w:proofErr w:type="spellStart"/>
+      <w:r>
+        <w:t>div</w:t>
+      </w:r>
+      <w:proofErr w:type="spellEnd"/>
+      <w:r>
+        <w:t xml:space="preserve"> envolvendo o parágrafo de como prefere o nosso contato e as </w:t>
+      </w:r>
+      <w:proofErr w:type="spellStart"/>
+      <w:r>
+        <w:t>label</w:t>
+      </w:r>
+      <w:proofErr w:type="spellEnd"/>
+      <w:r>
+        <w:t xml:space="preserve"> e inputs </w:t>
+      </w:r>
+      <w:proofErr w:type="spellStart"/>
+      <w:r>
+        <w:t>radio</w:t>
+      </w:r>
+      <w:proofErr w:type="spellEnd"/>
+      <w:r>
+        <w:t>.</w:t>
+      </w:r>
+    </w:p>
+    <w:p>
+      <w:r>
+        <w:drawing>
+          <wp:inline distT="0" distB="0" distL="0" distR="0" wp14:anchorId="56C18199" wp14:editId="7F309C25">
+            <wp:extent cx="4458322" cy="1676634"/>
+            <wp:effectExtent l="0" t="0" r="0" b="0"/>
+            <wp:docPr id="178" name="Imagem 178"/>
+            <wp:cNvGraphicFramePr>
+              <a:graphicFrameLocks xmlns:a="http://schemas.openxmlformats.org/drawingml/2006/main" noChangeAspect="1"/>
+            </wp:cNvGraphicFramePr>
+            <a:graphic xmlns:a="http://schemas.openxmlformats.org/drawingml/2006/main">
+              <a:graphicData uri="http://schemas.openxmlformats.org/drawingml/2006/picture">
+                <pic:pic xmlns:pic="http://schemas.openxmlformats.org/drawingml/2006/picture">
+                  <pic:nvPicPr>
+                    <pic:cNvPr id="1" name=""/>
+                    <pic:cNvPicPr/>
+                  </pic:nvPicPr>
+                  <pic:blipFill>
+                    <a:blip r:embed="rId120"/>
+                    <a:stretch>
+                      <a:fillRect/>
+                    </a:stretch>
+                  </pic:blipFill>
+                  <pic:spPr>
+                    <a:xfrm>
+                      <a:off x="0" y="0"/>
+                      <a:ext cx="4458322" cy="1676634"/>
+                    </a:xfrm>
+                    <a:prstGeom prst="rect">
+                      <a:avLst/>
+                    </a:prstGeom>
+                  </pic:spPr>
+                </pic:pic>
+              </a:graphicData>
+            </a:graphic>
+          </wp:inline>
+        </w:drawing>
+      </w:r>
+    </w:p>
+    <w:p>
+      <w:r>
+        <w:t xml:space="preserve">68 – Posterior adicionamos um </w:t>
+      </w:r>
+      <w:proofErr w:type="spellStart"/>
+      <w:r>
+        <w:t>label</w:t>
+      </w:r>
+      <w:proofErr w:type="spellEnd"/>
+      <w:r>
+        <w:t xml:space="preserve"> com o input </w:t>
+      </w:r>
+      <w:proofErr w:type="spellStart"/>
+      <w:r>
+        <w:t>checkbox</w:t>
+      </w:r>
+      <w:proofErr w:type="spellEnd"/>
+      <w:r>
+        <w:t>.</w:t>
+      </w:r>
+    </w:p>
+    <w:p>
+      <w:r>
+        <w:drawing>
+          <wp:inline distT="0" distB="0" distL="0" distR="0" wp14:anchorId="09F4441F" wp14:editId="5976A2D0">
+            <wp:extent cx="5400040" cy="318770"/>
+            <wp:effectExtent l="0" t="0" r="0" b="5080"/>
+            <wp:docPr id="179" name="Imagem 179"/>
+            <wp:cNvGraphicFramePr>
+              <a:graphicFrameLocks xmlns:a="http://schemas.openxmlformats.org/drawingml/2006/main" noChangeAspect="1"/>
+            </wp:cNvGraphicFramePr>
+            <a:graphic xmlns:a="http://schemas.openxmlformats.org/drawingml/2006/main">
+              <a:graphicData uri="http://schemas.openxmlformats.org/drawingml/2006/picture">
+                <pic:pic xmlns:pic="http://schemas.openxmlformats.org/drawingml/2006/picture">
+                  <pic:nvPicPr>
+                    <pic:cNvPr id="1" name=""/>
+                    <pic:cNvPicPr/>
+                  </pic:nvPicPr>
+                  <pic:blipFill>
+                    <a:blip r:embed="rId121"/>
+                    <a:stretch>
+                      <a:fillRect/>
+                    </a:stretch>
+                  </pic:blipFill>
+                  <pic:spPr>
+                    <a:xfrm>
+                      <a:off x="0" y="0"/>
+                      <a:ext cx="5400040" cy="318770"/>
+                    </a:xfrm>
+                    <a:prstGeom prst="rect">
+                      <a:avLst/>
+                    </a:prstGeom>
+                  </pic:spPr>
+                </pic:pic>
+              </a:graphicData>
+            </a:graphic>
+          </wp:inline>
+        </w:drawing>
+      </w:r>
+      <w:r>
+        <w:drawing>
+          <wp:inline distT="0" distB="0" distL="0" distR="0" wp14:anchorId="2E2774B3" wp14:editId="3AB4B84A">
+            <wp:extent cx="4572638" cy="428685"/>
+            <wp:effectExtent l="0" t="0" r="0" b="9525"/>
+            <wp:docPr id="180" name="Imagem 180"/>
+            <wp:cNvGraphicFramePr>
+              <a:graphicFrameLocks xmlns:a="http://schemas.openxmlformats.org/drawingml/2006/main" noChangeAspect="1"/>
+            </wp:cNvGraphicFramePr>
+            <a:graphic xmlns:a="http://schemas.openxmlformats.org/drawingml/2006/main">
+              <a:graphicData uri="http://schemas.openxmlformats.org/drawingml/2006/picture">
+                <pic:pic xmlns:pic="http://schemas.openxmlformats.org/drawingml/2006/picture">
+                  <pic:nvPicPr>
+                    <pic:cNvPr id="1" name=""/>
+                    <pic:cNvPicPr/>
+                  </pic:nvPicPr>
+                  <pic:blipFill>
+                    <a:blip r:embed="rId122"/>
+                    <a:stretch>
+                      <a:fillRect/>
+                    </a:stretch>
+                  </pic:blipFill>
+                  <pic:spPr>
+                    <a:xfrm>
+                      <a:off x="0" y="0"/>
+                      <a:ext cx="4572638" cy="428685"/>
+                    </a:xfrm>
+                    <a:prstGeom prst="rect">
+                      <a:avLst/>
+                    </a:prstGeom>
+                  </pic:spPr>
+                </pic:pic>
+              </a:graphicData>
+            </a:graphic>
+          </wp:inline>
+        </w:drawing>
+      </w:r>
+    </w:p>
+    <w:p/>
+    <w:p/>
+    <w:p/>
+    <w:p/>
+    <w:p>
+      <w:r>
+        <w:rPr>
+          <w:noProof/>
+        </w:rPr>
+        <w:lastRenderedPageBreak/>
+        <mc:AlternateContent>
+          <mc:Choice Requires="wps">
+            <w:drawing>
+              <wp:anchor distT="0" distB="0" distL="114300" distR="114300" simplePos="0" relativeHeight="251726848" behindDoc="0" locked="0" layoutInCell="1" allowOverlap="1">
+                <wp:simplePos x="0" y="0"/>
+                <wp:positionH relativeFrom="column">
+                  <wp:posOffset>4215765</wp:posOffset>
+                </wp:positionH>
+                <wp:positionV relativeFrom="paragraph">
+                  <wp:posOffset>261621</wp:posOffset>
+                </wp:positionV>
+                <wp:extent cx="304800" cy="438150"/>
+                <wp:effectExtent l="38100" t="0" r="19050" b="57150"/>
+                <wp:wrapNone/>
+                <wp:docPr id="183" name="Conector de Seta Reta 183"/>
+                <wp:cNvGraphicFramePr/>
+                <a:graphic xmlns:a="http://schemas.openxmlformats.org/drawingml/2006/main">
+                  <a:graphicData uri="http://schemas.microsoft.com/office/word/2010/wordprocessingShape">
+                    <wps:wsp>
+                      <wps:cNvCnPr/>
+                      <wps:spPr>
+                        <a:xfrm flipH="1">
+                          <a:off x="0" y="0"/>
+                          <a:ext cx="304800" cy="438150"/>
+                        </a:xfrm>
+                        <a:prstGeom prst="straightConnector1">
+                          <a:avLst/>
+                        </a:prstGeom>
+                        <a:ln>
+                          <a:tailEnd type="triangle"/>
+                        </a:ln>
+                      </wps:spPr>
+                      <wps:style>
+                        <a:lnRef idx="1">
+                          <a:schemeClr val="accent1"/>
+                        </a:lnRef>
+                        <a:fillRef idx="0">
+                          <a:schemeClr val="accent1"/>
+                        </a:fillRef>
+                        <a:effectRef idx="0">
+                          <a:schemeClr val="accent1"/>
+                        </a:effectRef>
+                        <a:fontRef idx="minor">
+                          <a:schemeClr val="tx1"/>
+                        </a:fontRef>
+                      </wps:style>
+                      <wps:bodyPr/>
+                    </wps:wsp>
+                  </a:graphicData>
+                </a:graphic>
+                <wp14:sizeRelH relativeFrom="margin">
+                  <wp14:pctWidth>0</wp14:pctWidth>
+                </wp14:sizeRelH>
+                <wp14:sizeRelV relativeFrom="margin">
+                  <wp14:pctHeight>0</wp14:pctHeight>
+                </wp14:sizeRelV>
+              </wp:anchor>
+            </w:drawing>
+          </mc:Choice>
+          <mc:Fallback>
+            <w:pict>
+              <v:shape w14:anchorId="0C3F0154" id="Conector de Seta Reta 183" o:spid="_x0000_s1026" type="#_x0000_t32" style="position:absolute;margin-left:331.95pt;margin-top:20.6pt;width:24pt;height:34.5pt;flip:x;z-index:251726848;visibility:visible;mso-wrap-style:square;mso-width-percent:0;mso-height-percent:0;mso-wrap-distance-left:9pt;mso-wrap-distance-top:0;mso-wrap-distance-right:9pt;mso-wrap-distance-bottom:0;mso-position-horizontal:absolute;mso-position-horizontal-relative:text;mso-position-vertical:absolute;mso-position-vertical-relative:text;mso-width-percent:0;mso-height-percent:0;mso-width-relative:margin;mso-height-relative:margin" o:gfxdata="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" strokecolor="#4472c4 [3204]" strokeweight=".5pt">
+                <v:stroke endarrow="block" joinstyle="miter"/>
+              </v:shape>
+            </w:pict>
+          </mc:Fallback>
+        </mc:AlternateContent>
+      </w:r>
+      <w:r>
+        <w:rPr>
+          <w:noProof/>
+        </w:rPr>
+        <mc:AlternateContent>
+          <mc:Choice Requires="wps">
+            <w:drawing>
+              <wp:anchor distT="0" distB="0" distL="114300" distR="114300" simplePos="0" relativeHeight="251725824" behindDoc="0" locked="0" layoutInCell="1" allowOverlap="1">
+                <wp:simplePos x="0" y="0"/>
+                <wp:positionH relativeFrom="column">
+                  <wp:posOffset>1739265</wp:posOffset>
+                </wp:positionH>
+                <wp:positionV relativeFrom="paragraph">
+                  <wp:posOffset>385445</wp:posOffset>
+                </wp:positionV>
+                <wp:extent cx="952500" cy="342900"/>
+                <wp:effectExtent l="38100" t="0" r="19050" b="76200"/>
+                <wp:wrapNone/>
+                <wp:docPr id="182" name="Conector de Seta Reta 182"/>
+                <wp:cNvGraphicFramePr/>
+                <a:graphic xmlns:a="http://schemas.openxmlformats.org/drawingml/2006/main">
+                  <a:graphicData uri="http://schemas.microsoft.com/office/word/2010/wordprocessingShape">
+                    <wps:wsp>
+                      <wps:cNvCnPr/>
+                      <wps:spPr>
+                        <a:xfrm flipH="1">
+                          <a:off x="0" y="0"/>
+                          <a:ext cx="952500" cy="342900"/>
+                        </a:xfrm>
+                        <a:prstGeom prst="straightConnector1">
+                          <a:avLst/>
+                        </a:prstGeom>
+                        <a:ln>
+                          <a:tailEnd type="triangle"/>
+                        </a:ln>
+                      </wps:spPr>
+                      <wps:style>
+                        <a:lnRef idx="1">
+                          <a:schemeClr val="accent1"/>
+                        </a:lnRef>
+                        <a:fillRef idx="0">
+                          <a:schemeClr val="accent1"/>
+                        </a:fillRef>
+                        <a:effectRef idx="0">
+                          <a:schemeClr val="accent1"/>
+                        </a:effectRef>
+                        <a:fontRef idx="minor">
+                          <a:schemeClr val="tx1"/>
+                        </a:fontRef>
+                      </wps:style>
+                      <wps:bodyPr/>
+                    </wps:wsp>
+                  </a:graphicData>
+                </a:graphic>
+              </wp:anchor>
+            </w:drawing>
+          </mc:Choice>
+          <mc:Fallback>
+            <w:pict>
+              <v:shape w14:anchorId="7D89B802" id="Conector de Seta Reta 182" o:spid="_x0000_s1026" type="#_x0000_t32" style="position:absolute;margin-left:136.95pt;margin-top:30.35pt;width:75pt;height:27pt;flip:x;z-index:251725824;visibility:visible;mso-wrap-style:square;mso-wrap-distance-left:9pt;mso-wrap-distance-top:0;mso-wrap-distance-right:9pt;mso-wrap-distance-bottom:0;mso-position-horizontal:absolute;mso-position-horizontal-relative:text;mso-position-vertical:absolute;mso-position-vertical-relative:text" o:gfxdata="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" strokecolor="#4472c4 [3204]" strokeweight=".5pt">
+                <v:stroke endarrow="block" joinstyle="miter"/>
+              </v:shape>
+            </w:pict>
+          </mc:Fallback>
+        </mc:AlternateContent>
+      </w:r>
+      <w:r>
+        <w:t xml:space="preserve">69 – Para colocar os inputs radio-box e </w:t>
+      </w:r>
+      <w:proofErr w:type="spellStart"/>
+      <w:r>
+        <w:t>checkbox</w:t>
+      </w:r>
+      <w:proofErr w:type="spellEnd"/>
+      <w:r>
+        <w:t xml:space="preserve"> ao lado da </w:t>
+      </w:r>
+      <w:proofErr w:type="spellStart"/>
+      <w:r>
+        <w:t>label</w:t>
+      </w:r>
+      <w:proofErr w:type="spellEnd"/>
+      <w:r>
+        <w:t xml:space="preserve"> precisamos adicionar os inputs dentro da </w:t>
+      </w:r>
+      <w:proofErr w:type="spellStart"/>
+      <w:r>
+        <w:t>label</w:t>
+      </w:r>
+      <w:proofErr w:type="spellEnd"/>
+      <w:r>
+        <w:t xml:space="preserve"> conforme imagem abaixo.</w:t>
+      </w:r>
+    </w:p>
+    <w:p>
+      <w:r>
+        <w:drawing>
+          <wp:inline distT="0" distB="0" distL="0" distR="0" wp14:anchorId="09EF9B44" wp14:editId="0F15A5E1">
+            <wp:extent cx="5400040" cy="758825"/>
+            <wp:effectExtent l="0" t="0" r="0" b="3175"/>
+            <wp:docPr id="181" name="Imagem 181"/>
+            <wp:cNvGraphicFramePr>
+              <a:graphicFrameLocks xmlns:a="http://schemas.openxmlformats.org/drawingml/2006/main" noChangeAspect="1"/>
+            </wp:cNvGraphicFramePr>
+            <a:graphic xmlns:a="http://schemas.openxmlformats.org/drawingml/2006/main">
+              <a:graphicData uri="http://schemas.openxmlformats.org/drawingml/2006/picture">
+                <pic:pic xmlns:pic="http://schemas.openxmlformats.org/drawingml/2006/picture">
+                  <pic:nvPicPr>
+                    <pic:cNvPr id="1" name=""/>
+                    <pic:cNvPicPr/>
+                  </pic:nvPicPr>
+                  <pic:blipFill>
+                    <a:blip r:embed="rId123"/>
+                    <a:stretch>
+                      <a:fillRect/>
+                    </a:stretch>
+                  </pic:blipFill>
+                  <pic:spPr>
+                    <a:xfrm>
+                      <a:off x="0" y="0"/>
+                      <a:ext cx="5400040" cy="758825"/>
+                    </a:xfrm>
+                    <a:prstGeom prst="rect">
+                      <a:avLst/>
+                    </a:prstGeom>
+                  </pic:spPr>
+                </pic:pic>
+              </a:graphicData>
+            </a:graphic>
+          </wp:inline>
+        </w:drawing>
+      </w:r>
+      <w:r>
+        <w:drawing>
+          <wp:inline distT="0" distB="0" distL="0" distR="0" wp14:anchorId="5F56C16E" wp14:editId="48826019">
+            <wp:extent cx="4086795" cy="1190791"/>
+            <wp:effectExtent l="0" t="0" r="9525" b="9525"/>
+            <wp:docPr id="184" name="Imagem 184"/>
+            <wp:cNvGraphicFramePr>
+              <a:graphicFrameLocks xmlns:a="http://schemas.openxmlformats.org/drawingml/2006/main" noChangeAspect="1"/>
+            </wp:cNvGraphicFramePr>
+            <a:graphic xmlns:a="http://schemas.openxmlformats.org/drawingml/2006/main">
+              <a:graphicData uri="http://schemas.openxmlformats.org/drawingml/2006/picture">
+                <pic:pic xmlns:pic="http://schemas.openxmlformats.org/drawingml/2006/picture">
+                  <pic:nvPicPr>
+                    <pic:cNvPr id="1" name=""/>
+                    <pic:cNvPicPr/>
+                  </pic:nvPicPr>
+                  <pic:blipFill>
+                    <a:blip r:embed="rId124"/>
+                    <a:stretch>
+                      <a:fillRect/>
+                    </a:stretch>
+                  </pic:blipFill>
+                  <pic:spPr>
+                    <a:xfrm>
+                      <a:off x="0" y="0"/>
+                      <a:ext cx="4086795" cy="1190791"/>
+                    </a:xfrm>
+                    <a:prstGeom prst="rect">
+                      <a:avLst/>
+                    </a:prstGeom>
+                  </pic:spPr>
+                </pic:pic>
+              </a:graphicData>
+            </a:graphic>
+          </wp:inline>
+        </w:drawing>
+      </w:r>
+    </w:p>
+    <w:p>
+      <w:r>
+        <w:t xml:space="preserve">70 – Notamos que em nosso caso o </w:t>
+      </w:r>
+      <w:proofErr w:type="spellStart"/>
+      <w:r>
+        <w:t>form</w:t>
+      </w:r>
+      <w:proofErr w:type="spellEnd"/>
+      <w:r>
+        <w:t xml:space="preserve"> inputs estava configurado como display: </w:t>
+      </w:r>
+      <w:proofErr w:type="spellStart"/>
+      <w:r>
+        <w:t>block</w:t>
+      </w:r>
+      <w:proofErr w:type="spellEnd"/>
+      <w:r>
+        <w:t xml:space="preserve"> impedindo que as </w:t>
+      </w:r>
+      <w:proofErr w:type="spellStart"/>
+      <w:r>
+        <w:t>label</w:t>
+      </w:r>
+      <w:proofErr w:type="spellEnd"/>
+      <w:r>
+        <w:t xml:space="preserve"> e os inputs de ficaram ao lado do outro. Para resolver ess</w:t>
+      </w:r>
+      <w:r>
+        <w:t xml:space="preserve">a situação mudamos onde antigamente era </w:t>
+      </w:r>
+      <w:proofErr w:type="spellStart"/>
+      <w:r>
+        <w:t>form</w:t>
+      </w:r>
+      <w:proofErr w:type="spellEnd"/>
+      <w:r>
+        <w:t xml:space="preserve"> inputs trocamos para uma </w:t>
+      </w:r>
+      <w:proofErr w:type="spellStart"/>
+      <w:r>
+        <w:t>class</w:t>
+      </w:r>
+      <w:proofErr w:type="spellEnd"/>
+      <w:r>
+        <w:t xml:space="preserve"> inputs-</w:t>
+      </w:r>
+      <w:proofErr w:type="spellStart"/>
+      <w:r>
+        <w:t>padrao</w:t>
+      </w:r>
+      <w:proofErr w:type="spellEnd"/>
+      <w:r>
+        <w:t xml:space="preserve"> e acionamos nos inputs os quis queríamos que ficassem a baixo do outro.</w:t>
+      </w:r>
+    </w:p>
+    <w:p>
+      <w:r>
+        <w:drawing>
+          <wp:inline distT="0" distB="0" distL="0" distR="0" wp14:anchorId="113112A9" wp14:editId="5A0089A6">
+            <wp:extent cx="1971950" cy="1095528"/>
+            <wp:effectExtent l="0" t="0" r="9525" b="9525"/>
+            <wp:docPr id="185" name="Imagem 185"/>
+            <wp:cNvGraphicFramePr>
+              <a:graphicFrameLocks xmlns:a="http://schemas.openxmlformats.org/drawingml/2006/main" noChangeAspect="1"/>
+            </wp:cNvGraphicFramePr>
+            <a:graphic xmlns:a="http://schemas.openxmlformats.org/drawingml/2006/main">
+              <a:graphicData uri="http://schemas.openxmlformats.org/drawingml/2006/picture">
+                <pic:pic xmlns:pic="http://schemas.openxmlformats.org/drawingml/2006/picture">
+                  <pic:nvPicPr>
+                    <pic:cNvPr id="1" name=""/>
+                    <pic:cNvPicPr/>
+                  </pic:nvPicPr>
+                  <pic:blipFill>
+                    <a:blip r:embed="rId125"/>
+                    <a:stretch>
+                      <a:fillRect/>
+                    </a:stretch>
+                  </pic:blipFill>
+                  <pic:spPr>
+                    <a:xfrm>
+                      <a:off x="0" y="0"/>
+                      <a:ext cx="1971950" cy="1095528"/>
+                    </a:xfrm>
+                    <a:prstGeom prst="rect">
+                      <a:avLst/>
+                    </a:prstGeom>
+                  </pic:spPr>
+                </pic:pic>
+              </a:graphicData>
+            </a:graphic>
+          </wp:inline>
+        </w:drawing>
       </w:r>
       <w:bookmarkStart w:id="0" w:name="_GoBack"/>
+      <w:r>
+        <w:drawing>
+          <wp:inline distT="0" distB="0" distL="0" distR="0" wp14:anchorId="56BCCFE9" wp14:editId="2D22771F">
+            <wp:extent cx="4231281" cy="1162050"/>
+            <wp:effectExtent l="0" t="0" r="0" b="0"/>
+            <wp:docPr id="186" name="Imagem 186"/>
+            <wp:cNvGraphicFramePr>
+              <a:graphicFrameLocks xmlns:a="http://schemas.openxmlformats.org/drawingml/2006/main" noChangeAspect="1"/>
+            </wp:cNvGraphicFramePr>
+            <a:graphic xmlns:a="http://schemas.openxmlformats.org/drawingml/2006/main">
+              <a:graphicData uri="http://schemas.openxmlformats.org/drawingml/2006/picture">
+                <pic:pic xmlns:pic="http://schemas.openxmlformats.org/drawingml/2006/picture">
+                  <pic:nvPicPr>
+                    <pic:cNvPr id="1" name=""/>
+                    <pic:cNvPicPr/>
+                  </pic:nvPicPr>
+                  <pic:blipFill>
+                    <a:blip r:embed="rId126"/>
+                    <a:stretch>
+                      <a:fillRect/>
+                    </a:stretch>
+                  </pic:blipFill>
+                  <pic:spPr>
+                    <a:xfrm>
+                      <a:off x="0" y="0"/>
+                      <a:ext cx="4238264" cy="1163968"/>
+                    </a:xfrm>
+                    <a:prstGeom prst="rect">
+                      <a:avLst/>
+                    </a:prstGeom>
+                  </pic:spPr>
+                </pic:pic>
+              </a:graphicData>
+            </a:graphic>
+          </wp:inline>
+        </w:drawing>
+      </w:r>
       <w:bookmarkEnd w:id="0"/>
     </w:p>
     <w:sectPr>
@@ -9846,7 +12255,7 @@
 </file>
 
 <file path=customXml/itemProps1.xml><?xml version="1.0" encoding="utf-8"?>
-<ds:datastoreItem xmlns:ds="http://schemas.openxmlformats.org/officeDocument/2006/customXml" ds:itemID="{8FD698F6-FDD2-4D42-9927-769C9CCF0BDC}">
+<ds:datastoreItem xmlns:ds="http://schemas.openxmlformats.org/officeDocument/2006/customXml" ds:itemID="{31C32E5D-A17E-4893-A8CE-674CC54B6116}">
   <ds:schemaRefs>
     <ds:schemaRef ds:uri="http://schemas.openxmlformats.org/officeDocument/2006/bibliography"/>
   </ds:schemaRefs>

</xml_diff>

<commit_message>
atualização do dia 21/09/2026
</commit_message>
<xml_diff>
--- a/apostila/Projeto Space For Men.docx
+++ b/apostila/Projeto Space For Men.docx
@@ -5,8 +5,24 @@
     <w:p>
       <w:pPr>
         <w:jc w:val="center"/>
+        <w:rPr>
+          <w:rFonts w:ascii="Berlin Sans FB Demi" w:hAnsi="Berlin Sans FB Demi"/>
+          <w:b/>
+          <w:color w:val="FF0000"/>
+          <w:sz w:val="44"/>
+          <w:szCs w:val="44"/>
+          <w:u w:val="single"/>
+        </w:rPr>
       </w:pPr>
       <w:r>
+        <w:rPr>
+          <w:rFonts w:ascii="Berlin Sans FB Demi" w:hAnsi="Berlin Sans FB Demi"/>
+          <w:b/>
+          <w:color w:val="FF0000"/>
+          <w:sz w:val="44"/>
+          <w:szCs w:val="44"/>
+          <w:u w:val="single"/>
+        </w:rPr>
         <w:t>Projeto Space For Men</w:t>
       </w:r>
     </w:p>
@@ -8285,6 +8301,9 @@
     </w:p>
     <w:p>
       <w:r>
+        <w:rPr>
+          <w:noProof/>
+        </w:rPr>
         <w:drawing>
           <wp:inline distT="0" distB="0" distL="0" distR="0" wp14:anchorId="3843220E" wp14:editId="0FDB262D">
             <wp:extent cx="4363059" cy="1971950"/>
@@ -8481,6 +8500,9 @@
     </w:p>
     <w:p>
       <w:r>
+        <w:rPr>
+          <w:noProof/>
+        </w:rPr>
         <w:drawing>
           <wp:inline distT="0" distB="0" distL="0" distR="0" wp14:anchorId="4FC4B5A2" wp14:editId="0FF68638">
             <wp:extent cx="4363059" cy="1971950"/>
@@ -8541,6 +8563,9 @@
     </w:p>
     <w:p>
       <w:r>
+        <w:rPr>
+          <w:noProof/>
+        </w:rPr>
         <w:drawing>
           <wp:inline distT="0" distB="0" distL="0" distR="0" wp14:anchorId="0EF30C22" wp14:editId="36F6F05C">
             <wp:extent cx="1505160" cy="800212"/>
@@ -8585,6 +8610,9 @@
     </w:p>
     <w:p>
       <w:r>
+        <w:rPr>
+          <w:noProof/>
+        </w:rPr>
         <w:drawing>
           <wp:inline distT="0" distB="0" distL="0" distR="0" wp14:anchorId="6DA089CE" wp14:editId="64A449DD">
             <wp:extent cx="1571844" cy="676369"/>
@@ -8622,6 +8650,9 @@
         </w:drawing>
       </w:r>
       <w:r>
+        <w:rPr>
+          <w:noProof/>
+        </w:rPr>
         <w:drawing>
           <wp:inline distT="0" distB="0" distL="0" distR="0" wp14:anchorId="4028E5F7" wp14:editId="4BF92E37">
             <wp:extent cx="1628775" cy="1870266"/>
@@ -8831,6 +8862,9 @@
         </mc:AlternateContent>
       </w:r>
       <w:r>
+        <w:rPr>
+          <w:noProof/>
+        </w:rPr>
         <w:drawing>
           <wp:inline distT="0" distB="0" distL="0" distR="0" wp14:anchorId="139589AF" wp14:editId="588606F0">
             <wp:extent cx="1895740" cy="2019582"/>
@@ -8868,6 +8902,9 @@
         </w:drawing>
       </w:r>
       <w:r>
+        <w:rPr>
+          <w:noProof/>
+        </w:rPr>
         <w:drawing>
           <wp:inline distT="0" distB="0" distL="0" distR="0" wp14:anchorId="568BB2CF" wp14:editId="61EEEF38">
             <wp:extent cx="2514951" cy="1686160"/>
@@ -9184,6 +9221,9 @@
         </mc:AlternateContent>
       </w:r>
       <w:r>
+        <w:rPr>
+          <w:noProof/>
+        </w:rPr>
         <w:drawing>
           <wp:inline distT="0" distB="0" distL="0" distR="0" wp14:anchorId="2986F551" wp14:editId="73B40732">
             <wp:extent cx="1914792" cy="2305372"/>
@@ -9221,6 +9261,9 @@
         </w:drawing>
       </w:r>
       <w:r>
+        <w:rPr>
+          <w:noProof/>
+        </w:rPr>
         <w:drawing>
           <wp:inline distT="0" distB="0" distL="0" distR="0" wp14:anchorId="5CF10D97" wp14:editId="468B06A2">
             <wp:extent cx="3302499" cy="2114550"/>
@@ -9339,6 +9382,9 @@
     </w:p>
     <w:p>
       <w:r>
+        <w:rPr>
+          <w:noProof/>
+        </w:rPr>
         <w:drawing>
           <wp:inline distT="0" distB="0" distL="0" distR="0" wp14:anchorId="68F79E15" wp14:editId="6CB9BFA4">
             <wp:extent cx="1790950" cy="1228896"/>
@@ -9376,6 +9422,9 @@
         </w:drawing>
       </w:r>
       <w:r>
+        <w:rPr>
+          <w:noProof/>
+        </w:rPr>
         <w:drawing>
           <wp:inline distT="0" distB="0" distL="0" distR="0" wp14:anchorId="6859453B" wp14:editId="43C1D95A">
             <wp:extent cx="2609850" cy="1671056"/>
@@ -9577,6 +9626,9 @@
         </mc:AlternateContent>
       </w:r>
       <w:r>
+        <w:rPr>
+          <w:noProof/>
+        </w:rPr>
         <w:drawing>
           <wp:inline distT="0" distB="0" distL="0" distR="0" wp14:anchorId="063960DC" wp14:editId="2351BF16">
             <wp:extent cx="4801270" cy="2114845"/>
@@ -9614,6 +9666,9 @@
         </w:drawing>
       </w:r>
       <w:r>
+        <w:rPr>
+          <w:noProof/>
+        </w:rPr>
         <w:drawing>
           <wp:inline distT="0" distB="0" distL="0" distR="0" wp14:anchorId="51BAC13C" wp14:editId="57E8BA21">
             <wp:extent cx="4067743" cy="3591426"/>
@@ -9898,6 +9953,9 @@
         </mc:AlternateContent>
       </w:r>
       <w:r>
+        <w:rPr>
+          <w:noProof/>
+        </w:rPr>
         <w:drawing>
           <wp:inline distT="0" distB="0" distL="0" distR="0" wp14:anchorId="15EAF111" wp14:editId="27E145E8">
             <wp:extent cx="4391638" cy="1276528"/>
@@ -9935,6 +9993,9 @@
         </w:drawing>
       </w:r>
       <w:r>
+        <w:rPr>
+          <w:noProof/>
+        </w:rPr>
         <w:drawing>
           <wp:inline distT="0" distB="0" distL="0" distR="0" wp14:anchorId="5C55923F" wp14:editId="5E0A9497">
             <wp:extent cx="3829584" cy="1076475"/>
@@ -10053,6 +10114,9 @@
     </w:p>
     <w:p>
       <w:r>
+        <w:rPr>
+          <w:noProof/>
+        </w:rPr>
         <w:drawing>
           <wp:inline distT="0" distB="0" distL="0" distR="0" wp14:anchorId="68C894FD" wp14:editId="12BEED14">
             <wp:extent cx="3886742" cy="562053"/>
@@ -10130,6 +10194,9 @@
     </w:p>
     <w:p>
       <w:r>
+        <w:rPr>
+          <w:noProof/>
+        </w:rPr>
         <w:drawing>
           <wp:inline distT="0" distB="0" distL="0" distR="0" wp14:anchorId="56C18199" wp14:editId="7F309C25">
             <wp:extent cx="4458322" cy="1676634"/>
@@ -10190,6 +10257,9 @@
     </w:p>
     <w:p>
       <w:r>
+        <w:rPr>
+          <w:noProof/>
+        </w:rPr>
         <w:drawing>
           <wp:inline distT="0" distB="0" distL="0" distR="0" wp14:anchorId="09F4441F" wp14:editId="5976A2D0">
             <wp:extent cx="5400040" cy="318770"/>
@@ -10227,6 +10297,9 @@
         </w:drawing>
       </w:r>
       <w:r>
+        <w:rPr>
+          <w:noProof/>
+        </w:rPr>
         <w:drawing>
           <wp:inline distT="0" distB="0" distL="0" distR="0" wp14:anchorId="2E2774B3" wp14:editId="3AB4B84A">
             <wp:extent cx="4572638" cy="428685"/>
@@ -10438,6 +10511,9 @@
     </w:p>
     <w:p>
       <w:r>
+        <w:rPr>
+          <w:noProof/>
+        </w:rPr>
         <w:drawing>
           <wp:inline distT="0" distB="0" distL="0" distR="0" wp14:anchorId="09EF9B44" wp14:editId="0F15A5E1">
             <wp:extent cx="5400040" cy="758825"/>
@@ -10475,6 +10551,9 @@
         </w:drawing>
       </w:r>
       <w:r>
+        <w:rPr>
+          <w:noProof/>
+        </w:rPr>
         <w:drawing>
           <wp:inline distT="0" distB="0" distL="0" distR="0" wp14:anchorId="5F56C16E" wp14:editId="48826019">
             <wp:extent cx="4086795" cy="1190791"/>
@@ -10570,6 +10649,9 @@
     </w:p>
     <w:p>
       <w:r>
+        <w:rPr>
+          <w:noProof/>
+        </w:rPr>
         <w:drawing>
           <wp:inline distT="0" distB="0" distL="0" distR="0" wp14:anchorId="113112A9" wp14:editId="5A0089A6">
             <wp:extent cx="1971950" cy="1095528"/>
@@ -10606,8 +10688,10 @@
           </wp:inline>
         </w:drawing>
       </w:r>
-      <w:bookmarkStart w:id="0" w:name="_GoBack"/>
-      <w:r>
+      <w:r>
+        <w:rPr>
+          <w:noProof/>
+        </w:rPr>
         <w:drawing>
           <wp:inline distT="0" distB="0" distL="0" distR="0" wp14:anchorId="56BCCFE9" wp14:editId="2D22771F">
             <wp:extent cx="4231281" cy="1162050"/>
@@ -10644,7 +10728,981 @@
           </wp:inline>
         </w:drawing>
       </w:r>
+    </w:p>
+    <w:p>
+      <w:r>
+        <w:t xml:space="preserve">71 – Adicionamos uma </w:t>
+      </w:r>
+      <w:proofErr w:type="spellStart"/>
+      <w:r>
+        <w:t>class</w:t>
+      </w:r>
+      <w:proofErr w:type="spellEnd"/>
+      <w:r>
+        <w:t xml:space="preserve"> na </w:t>
+      </w:r>
+      <w:proofErr w:type="spellStart"/>
+      <w:r>
+        <w:t>label</w:t>
+      </w:r>
+      <w:proofErr w:type="spellEnd"/>
+      <w:r>
+        <w:t xml:space="preserve"> </w:t>
+      </w:r>
+      <w:proofErr w:type="spellStart"/>
+      <w:r>
+        <w:t>chackbox</w:t>
+      </w:r>
+      <w:proofErr w:type="spellEnd"/>
+      <w:r>
+        <w:t xml:space="preserve"> para dar um espaço tanto para cima como para baixo.</w:t>
+      </w:r>
+    </w:p>
+    <w:p>
+      <w:r>
+        <w:drawing>
+          <wp:inline distT="0" distB="0" distL="0" distR="0" wp14:anchorId="14DC4F32" wp14:editId="35C1B9AE">
+            <wp:extent cx="5400040" cy="123825"/>
+            <wp:effectExtent l="0" t="0" r="0" b="9525"/>
+            <wp:docPr id="187" name="Imagem 187"/>
+            <wp:cNvGraphicFramePr>
+              <a:graphicFrameLocks xmlns:a="http://schemas.openxmlformats.org/drawingml/2006/main" noChangeAspect="1"/>
+            </wp:cNvGraphicFramePr>
+            <a:graphic xmlns:a="http://schemas.openxmlformats.org/drawingml/2006/main">
+              <a:graphicData uri="http://schemas.openxmlformats.org/drawingml/2006/picture">
+                <pic:pic xmlns:pic="http://schemas.openxmlformats.org/drawingml/2006/picture">
+                  <pic:nvPicPr>
+                    <pic:cNvPr id="1" name=""/>
+                    <pic:cNvPicPr/>
+                  </pic:nvPicPr>
+                  <pic:blipFill>
+                    <a:blip r:embed="rId127"/>
+                    <a:stretch>
+                      <a:fillRect/>
+                    </a:stretch>
+                  </pic:blipFill>
+                  <pic:spPr>
+                    <a:xfrm>
+                      <a:off x="0" y="0"/>
+                      <a:ext cx="5400040" cy="123825"/>
+                    </a:xfrm>
+                    <a:prstGeom prst="rect">
+                      <a:avLst/>
+                    </a:prstGeom>
+                  </pic:spPr>
+                </pic:pic>
+              </a:graphicData>
+            </a:graphic>
+          </wp:inline>
+        </w:drawing>
+      </w:r>
+      <w:r>
+        <w:drawing>
+          <wp:inline distT="0" distB="0" distL="0" distR="0" wp14:anchorId="2DAA7599" wp14:editId="79892941">
+            <wp:extent cx="1438476" cy="571580"/>
+            <wp:effectExtent l="0" t="0" r="9525" b="0"/>
+            <wp:docPr id="188" name="Imagem 188"/>
+            <wp:cNvGraphicFramePr>
+              <a:graphicFrameLocks xmlns:a="http://schemas.openxmlformats.org/drawingml/2006/main" noChangeAspect="1"/>
+            </wp:cNvGraphicFramePr>
+            <a:graphic xmlns:a="http://schemas.openxmlformats.org/drawingml/2006/main">
+              <a:graphicData uri="http://schemas.openxmlformats.org/drawingml/2006/picture">
+                <pic:pic xmlns:pic="http://schemas.openxmlformats.org/drawingml/2006/picture">
+                  <pic:nvPicPr>
+                    <pic:cNvPr id="1" name=""/>
+                    <pic:cNvPicPr/>
+                  </pic:nvPicPr>
+                  <pic:blipFill>
+                    <a:blip r:embed="rId128"/>
+                    <a:stretch>
+                      <a:fillRect/>
+                    </a:stretch>
+                  </pic:blipFill>
+                  <pic:spPr>
+                    <a:xfrm>
+                      <a:off x="0" y="0"/>
+                      <a:ext cx="1438476" cy="571580"/>
+                    </a:xfrm>
+                    <a:prstGeom prst="rect">
+                      <a:avLst/>
+                    </a:prstGeom>
+                  </pic:spPr>
+                </pic:pic>
+              </a:graphicData>
+            </a:graphic>
+          </wp:inline>
+        </w:drawing>
+      </w:r>
+      <w:r>
+        <w:drawing>
+          <wp:inline distT="0" distB="0" distL="0" distR="0" wp14:anchorId="77AC3880" wp14:editId="07C586CA">
+            <wp:extent cx="4143953" cy="1219370"/>
+            <wp:effectExtent l="0" t="0" r="9525" b="0"/>
+            <wp:docPr id="189" name="Imagem 189"/>
+            <wp:cNvGraphicFramePr>
+              <a:graphicFrameLocks xmlns:a="http://schemas.openxmlformats.org/drawingml/2006/main" noChangeAspect="1"/>
+            </wp:cNvGraphicFramePr>
+            <a:graphic xmlns:a="http://schemas.openxmlformats.org/drawingml/2006/main">
+              <a:graphicData uri="http://schemas.openxmlformats.org/drawingml/2006/picture">
+                <pic:pic xmlns:pic="http://schemas.openxmlformats.org/drawingml/2006/picture">
+                  <pic:nvPicPr>
+                    <pic:cNvPr id="1" name=""/>
+                    <pic:cNvPicPr/>
+                  </pic:nvPicPr>
+                  <pic:blipFill>
+                    <a:blip r:embed="rId129"/>
+                    <a:stretch>
+                      <a:fillRect/>
+                    </a:stretch>
+                  </pic:blipFill>
+                  <pic:spPr>
+                    <a:xfrm>
+                      <a:off x="0" y="0"/>
+                      <a:ext cx="4143953" cy="1219370"/>
+                    </a:xfrm>
+                    <a:prstGeom prst="rect">
+                      <a:avLst/>
+                    </a:prstGeom>
+                  </pic:spPr>
+                </pic:pic>
+              </a:graphicData>
+            </a:graphic>
+          </wp:inline>
+        </w:drawing>
+      </w:r>
+    </w:p>
+    <w:p/>
+    <w:p>
+      <w:r>
+        <w:lastRenderedPageBreak/>
+        <w:t xml:space="preserve">72 </w:t>
+      </w:r>
+      <w:r>
+        <w:t>–</w:t>
+      </w:r>
+      <w:r>
+        <w:t xml:space="preserve"> </w:t>
+      </w:r>
+      <w:r>
+        <w:t>Inserimos parágrafo fazendo uma pergunta qual a preferência de horário e adicionamos o “</w:t>
+      </w:r>
+      <w:proofErr w:type="spellStart"/>
+      <w:r>
+        <w:t>Select</w:t>
+      </w:r>
+      <w:proofErr w:type="spellEnd"/>
+      <w:r>
+        <w:t>” com o “</w:t>
+      </w:r>
+      <w:proofErr w:type="spellStart"/>
+      <w:r>
+        <w:t>Option</w:t>
+      </w:r>
+      <w:proofErr w:type="spellEnd"/>
+      <w:r>
+        <w:t>” no HTML conforme código.</w:t>
+      </w:r>
+    </w:p>
+    <w:p>
+      <w:r>
+        <w:drawing>
+          <wp:inline distT="0" distB="0" distL="0" distR="0" wp14:anchorId="28BBFC49" wp14:editId="1823BDD3">
+            <wp:extent cx="3096057" cy="1057423"/>
+            <wp:effectExtent l="0" t="0" r="0" b="9525"/>
+            <wp:docPr id="190" name="Imagem 190"/>
+            <wp:cNvGraphicFramePr>
+              <a:graphicFrameLocks xmlns:a="http://schemas.openxmlformats.org/drawingml/2006/main" noChangeAspect="1"/>
+            </wp:cNvGraphicFramePr>
+            <a:graphic xmlns:a="http://schemas.openxmlformats.org/drawingml/2006/main">
+              <a:graphicData uri="http://schemas.openxmlformats.org/drawingml/2006/picture">
+                <pic:pic xmlns:pic="http://schemas.openxmlformats.org/drawingml/2006/picture">
+                  <pic:nvPicPr>
+                    <pic:cNvPr id="1" name=""/>
+                    <pic:cNvPicPr/>
+                  </pic:nvPicPr>
+                  <pic:blipFill>
+                    <a:blip r:embed="rId130"/>
+                    <a:stretch>
+                      <a:fillRect/>
+                    </a:stretch>
+                  </pic:blipFill>
+                  <pic:spPr>
+                    <a:xfrm>
+                      <a:off x="0" y="0"/>
+                      <a:ext cx="3096057" cy="1057423"/>
+                    </a:xfrm>
+                    <a:prstGeom prst="rect">
+                      <a:avLst/>
+                    </a:prstGeom>
+                  </pic:spPr>
+                </pic:pic>
+              </a:graphicData>
+            </a:graphic>
+          </wp:inline>
+        </w:drawing>
+      </w:r>
+    </w:p>
+    <w:p>
+      <w:r>
+        <w:t xml:space="preserve">73 – Entramos no site (Mobile inputs </w:t>
+      </w:r>
+      <w:proofErr w:type="spellStart"/>
+      <w:r>
+        <w:t>types</w:t>
+      </w:r>
+      <w:proofErr w:type="spellEnd"/>
+      <w:r>
+        <w:t>) para verificar os tipos de inputs para dispositivos mobile e alteramos em nosso formulário alguns tipos para ficar compatível com os dispositivos de celulares.</w:t>
+      </w:r>
+    </w:p>
+    <w:p>
+      <w:r>
+        <w:drawing>
+          <wp:inline distT="0" distB="0" distL="0" distR="0" wp14:anchorId="1CB68AE4" wp14:editId="12F608CC">
+            <wp:extent cx="5400040" cy="1017270"/>
+            <wp:effectExtent l="0" t="0" r="0" b="0"/>
+            <wp:docPr id="192" name="Imagem 192"/>
+            <wp:cNvGraphicFramePr>
+              <a:graphicFrameLocks xmlns:a="http://schemas.openxmlformats.org/drawingml/2006/main" noChangeAspect="1"/>
+            </wp:cNvGraphicFramePr>
+            <a:graphic xmlns:a="http://schemas.openxmlformats.org/drawingml/2006/main">
+              <a:graphicData uri="http://schemas.openxmlformats.org/drawingml/2006/picture">
+                <pic:pic xmlns:pic="http://schemas.openxmlformats.org/drawingml/2006/picture">
+                  <pic:nvPicPr>
+                    <pic:cNvPr id="1" name=""/>
+                    <pic:cNvPicPr/>
+                  </pic:nvPicPr>
+                  <pic:blipFill>
+                    <a:blip r:embed="rId131"/>
+                    <a:stretch>
+                      <a:fillRect/>
+                    </a:stretch>
+                  </pic:blipFill>
+                  <pic:spPr>
+                    <a:xfrm>
+                      <a:off x="0" y="0"/>
+                      <a:ext cx="5400040" cy="1017270"/>
+                    </a:xfrm>
+                    <a:prstGeom prst="rect">
+                      <a:avLst/>
+                    </a:prstGeom>
+                  </pic:spPr>
+                </pic:pic>
+              </a:graphicData>
+            </a:graphic>
+          </wp:inline>
+        </w:drawing>
+      </w:r>
+    </w:p>
+    <w:p>
+      <w:r>
+        <w:rPr>
+          <w:noProof/>
+        </w:rPr>
+        <mc:AlternateContent>
+          <mc:Choice Requires="wps">
+            <w:drawing>
+              <wp:anchor distT="0" distB="0" distL="114300" distR="114300" simplePos="0" relativeHeight="251728896" behindDoc="0" locked="0" layoutInCell="1" allowOverlap="1">
+                <wp:simplePos x="0" y="0"/>
+                <wp:positionH relativeFrom="column">
+                  <wp:posOffset>1377315</wp:posOffset>
+                </wp:positionH>
+                <wp:positionV relativeFrom="paragraph">
+                  <wp:posOffset>529590</wp:posOffset>
+                </wp:positionV>
+                <wp:extent cx="1133475" cy="76200"/>
+                <wp:effectExtent l="38100" t="0" r="28575" b="95250"/>
+                <wp:wrapNone/>
+                <wp:docPr id="194" name="Conector de Seta Reta 194"/>
+                <wp:cNvGraphicFramePr/>
+                <a:graphic xmlns:a="http://schemas.openxmlformats.org/drawingml/2006/main">
+                  <a:graphicData uri="http://schemas.microsoft.com/office/word/2010/wordprocessingShape">
+                    <wps:wsp>
+                      <wps:cNvCnPr/>
+                      <wps:spPr>
+                        <a:xfrm flipH="1">
+                          <a:off x="0" y="0"/>
+                          <a:ext cx="1133475" cy="76200"/>
+                        </a:xfrm>
+                        <a:prstGeom prst="straightConnector1">
+                          <a:avLst/>
+                        </a:prstGeom>
+                        <a:ln>
+                          <a:tailEnd type="triangle"/>
+                        </a:ln>
+                      </wps:spPr>
+                      <wps:style>
+                        <a:lnRef idx="1">
+                          <a:schemeClr val="accent1"/>
+                        </a:lnRef>
+                        <a:fillRef idx="0">
+                          <a:schemeClr val="accent1"/>
+                        </a:fillRef>
+                        <a:effectRef idx="0">
+                          <a:schemeClr val="accent1"/>
+                        </a:effectRef>
+                        <a:fontRef idx="minor">
+                          <a:schemeClr val="tx1"/>
+                        </a:fontRef>
+                      </wps:style>
+                      <wps:bodyPr/>
+                    </wps:wsp>
+                  </a:graphicData>
+                </a:graphic>
+              </wp:anchor>
+            </w:drawing>
+          </mc:Choice>
+          <mc:Fallback>
+            <w:pict>
+              <v:shapetype w14:anchorId="7850B463" id="_x0000_t32" coordsize="21600,21600" o:spt="32" o:oned="t" path="m,l21600,21600e" filled="f">
+                <v:path arrowok="t" fillok="f" o:connecttype="none"/>
+                <o:lock v:ext="edit" shapetype="t"/>
+              </v:shapetype>
+              <v:shape id="Conector de Seta Reta 194" o:spid="_x0000_s1026" type="#_x0000_t32" style="position:absolute;margin-left:108.45pt;margin-top:41.7pt;width:89.25pt;height:6pt;flip:x;z-index:251728896;visibility:visible;mso-wrap-style:square;mso-wrap-distance-left:9pt;mso-wrap-distance-top:0;mso-wrap-distance-right:9pt;mso-wrap-distance-bottom:0;mso-position-horizontal:absolute;mso-position-horizontal-relative:text;mso-position-vertical:absolute;mso-position-vertical-relative:text" o:gfxdata="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" strokecolor="#4472c4 [3204]" strokeweight=".5pt">
+                <v:stroke endarrow="block" joinstyle="miter"/>
+              </v:shape>
+            </w:pict>
+          </mc:Fallback>
+        </mc:AlternateContent>
+      </w:r>
+      <w:r>
+        <w:rPr>
+          <w:noProof/>
+        </w:rPr>
+        <mc:AlternateContent>
+          <mc:Choice Requires="wps">
+            <w:drawing>
+              <wp:anchor distT="0" distB="0" distL="114300" distR="114300" simplePos="0" relativeHeight="251727872" behindDoc="0" locked="0" layoutInCell="1" allowOverlap="1">
+                <wp:simplePos x="0" y="0"/>
+                <wp:positionH relativeFrom="column">
+                  <wp:posOffset>1405890</wp:posOffset>
+                </wp:positionH>
+                <wp:positionV relativeFrom="paragraph">
+                  <wp:posOffset>310515</wp:posOffset>
+                </wp:positionV>
+                <wp:extent cx="561975" cy="104775"/>
+                <wp:effectExtent l="19050" t="57150" r="28575" b="28575"/>
+                <wp:wrapNone/>
+                <wp:docPr id="193" name="Conector de Seta Reta 193"/>
+                <wp:cNvGraphicFramePr/>
+                <a:graphic xmlns:a="http://schemas.openxmlformats.org/drawingml/2006/main">
+                  <a:graphicData uri="http://schemas.microsoft.com/office/word/2010/wordprocessingShape">
+                    <wps:wsp>
+                      <wps:cNvCnPr/>
+                      <wps:spPr>
+                        <a:xfrm flipH="1" flipV="1">
+                          <a:off x="0" y="0"/>
+                          <a:ext cx="561975" cy="104775"/>
+                        </a:xfrm>
+                        <a:prstGeom prst="straightConnector1">
+                          <a:avLst/>
+                        </a:prstGeom>
+                        <a:ln>
+                          <a:tailEnd type="triangle"/>
+                        </a:ln>
+                      </wps:spPr>
+                      <wps:style>
+                        <a:lnRef idx="1">
+                          <a:schemeClr val="accent1"/>
+                        </a:lnRef>
+                        <a:fillRef idx="0">
+                          <a:schemeClr val="accent1"/>
+                        </a:fillRef>
+                        <a:effectRef idx="0">
+                          <a:schemeClr val="accent1"/>
+                        </a:effectRef>
+                        <a:fontRef idx="minor">
+                          <a:schemeClr val="tx1"/>
+                        </a:fontRef>
+                      </wps:style>
+                      <wps:bodyPr/>
+                    </wps:wsp>
+                  </a:graphicData>
+                </a:graphic>
+              </wp:anchor>
+            </w:drawing>
+          </mc:Choice>
+          <mc:Fallback>
+            <w:pict>
+              <v:shape w14:anchorId="5B3752E5" id="Conector de Seta Reta 193" o:spid="_x0000_s1026" type="#_x0000_t32" style="position:absolute;margin-left:110.7pt;margin-top:24.45pt;width:44.25pt;height:8.25pt;flip:x y;z-index:251727872;visibility:visible;mso-wrap-style:square;mso-wrap-distance-left:9pt;mso-wrap-distance-top:0;mso-wrap-distance-right:9pt;mso-wrap-distance-bottom:0;mso-position-horizontal:absolute;mso-position-horizontal-relative:text;mso-position-vertical:absolute;mso-position-vertical-relative:text" o:gfxdata="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" strokecolor="#4472c4 [3204]" strokeweight=".5pt">
+                <v:stroke endarrow="block" joinstyle="miter"/>
+              </v:shape>
+            </w:pict>
+          </mc:Fallback>
+        </mc:AlternateContent>
+      </w:r>
+      <w:r>
+        <w:drawing>
+          <wp:inline distT="0" distB="0" distL="0" distR="0" wp14:anchorId="0A94BC1A" wp14:editId="57292B72">
+            <wp:extent cx="4029637" cy="762106"/>
+            <wp:effectExtent l="0" t="0" r="9525" b="0"/>
+            <wp:docPr id="191" name="Imagem 191"/>
+            <wp:cNvGraphicFramePr>
+              <a:graphicFrameLocks xmlns:a="http://schemas.openxmlformats.org/drawingml/2006/main" noChangeAspect="1"/>
+            </wp:cNvGraphicFramePr>
+            <a:graphic xmlns:a="http://schemas.openxmlformats.org/drawingml/2006/main">
+              <a:graphicData uri="http://schemas.openxmlformats.org/drawingml/2006/picture">
+                <pic:pic xmlns:pic="http://schemas.openxmlformats.org/drawingml/2006/picture">
+                  <pic:nvPicPr>
+                    <pic:cNvPr id="1" name=""/>
+                    <pic:cNvPicPr/>
+                  </pic:nvPicPr>
+                  <pic:blipFill>
+                    <a:blip r:embed="rId132"/>
+                    <a:stretch>
+                      <a:fillRect/>
+                    </a:stretch>
+                  </pic:blipFill>
+                  <pic:spPr>
+                    <a:xfrm>
+                      <a:off x="0" y="0"/>
+                      <a:ext cx="4029637" cy="762106"/>
+                    </a:xfrm>
+                    <a:prstGeom prst="rect">
+                      <a:avLst/>
+                    </a:prstGeom>
+                  </pic:spPr>
+                </pic:pic>
+              </a:graphicData>
+            </a:graphic>
+          </wp:inline>
+        </w:drawing>
+      </w:r>
+    </w:p>
+    <w:p>
+      <w:r>
+        <w:t>74 – Quando queremos que alguns campos sejam obrigatórios no formulário, usamos o “</w:t>
+      </w:r>
+      <w:proofErr w:type="spellStart"/>
+      <w:r>
+        <w:t>required</w:t>
+      </w:r>
+      <w:proofErr w:type="spellEnd"/>
+      <w:r>
+        <w:t>” no input</w:t>
+      </w:r>
+      <w:r>
+        <w:t>. (OBS.: se usamos o tipo de inputs correto, por exemplo o e-mail, se não estiver correto a grafia ele também não envia).</w:t>
+      </w:r>
+    </w:p>
+    <w:p>
+      <w:r>
+        <w:drawing>
+          <wp:inline distT="0" distB="0" distL="0" distR="0" wp14:anchorId="4893AAEB" wp14:editId="4154B829">
+            <wp:extent cx="5020376" cy="1066949"/>
+            <wp:effectExtent l="0" t="0" r="8890" b="0"/>
+            <wp:docPr id="195" name="Imagem 195"/>
+            <wp:cNvGraphicFramePr>
+              <a:graphicFrameLocks xmlns:a="http://schemas.openxmlformats.org/drawingml/2006/main" noChangeAspect="1"/>
+            </wp:cNvGraphicFramePr>
+            <a:graphic xmlns:a="http://schemas.openxmlformats.org/drawingml/2006/main">
+              <a:graphicData uri="http://schemas.openxmlformats.org/drawingml/2006/picture">
+                <pic:pic xmlns:pic="http://schemas.openxmlformats.org/drawingml/2006/picture">
+                  <pic:nvPicPr>
+                    <pic:cNvPr id="1" name=""/>
+                    <pic:cNvPicPr/>
+                  </pic:nvPicPr>
+                  <pic:blipFill>
+                    <a:blip r:embed="rId133"/>
+                    <a:stretch>
+                      <a:fillRect/>
+                    </a:stretch>
+                  </pic:blipFill>
+                  <pic:spPr>
+                    <a:xfrm>
+                      <a:off x="0" y="0"/>
+                      <a:ext cx="5020376" cy="1066949"/>
+                    </a:xfrm>
+                    <a:prstGeom prst="rect">
+                      <a:avLst/>
+                    </a:prstGeom>
+                  </pic:spPr>
+                </pic:pic>
+              </a:graphicData>
+            </a:graphic>
+          </wp:inline>
+        </w:drawing>
+      </w:r>
+    </w:p>
+    <w:p>
+      <w:pPr>
+        <w:rPr>
+          <w:noProof/>
+        </w:rPr>
+      </w:pPr>
+      <w:r>
+        <w:t xml:space="preserve">75 </w:t>
+      </w:r>
+      <w:r>
+        <w:t>–</w:t>
+      </w:r>
+      <w:r>
+        <w:t xml:space="preserve"> </w:t>
+      </w:r>
+      <w:r>
+        <w:t xml:space="preserve">Utilizamos o </w:t>
+      </w:r>
+      <w:proofErr w:type="spellStart"/>
+      <w:r>
+        <w:t>Placeholder</w:t>
+      </w:r>
+      <w:proofErr w:type="spellEnd"/>
+      <w:r>
+        <w:t xml:space="preserve"> para deixar exemplo dentro dos inputs como deve ser preenchido.</w:t>
+      </w:r>
+      <w:r>
+        <w:rPr>
+          <w:noProof/>
+        </w:rPr>
+        <w:t xml:space="preserve"> </w:t>
+      </w:r>
+      <w:r>
+        <w:drawing>
+          <wp:inline distT="0" distB="0" distL="0" distR="0" wp14:anchorId="05BC600E" wp14:editId="657E53FA">
+            <wp:extent cx="5400040" cy="396240"/>
+            <wp:effectExtent l="0" t="0" r="0" b="3810"/>
+            <wp:docPr id="196" name="Imagem 196"/>
+            <wp:cNvGraphicFramePr>
+              <a:graphicFrameLocks xmlns:a="http://schemas.openxmlformats.org/drawingml/2006/main" noChangeAspect="1"/>
+            </wp:cNvGraphicFramePr>
+            <a:graphic xmlns:a="http://schemas.openxmlformats.org/drawingml/2006/main">
+              <a:graphicData uri="http://schemas.openxmlformats.org/drawingml/2006/picture">
+                <pic:pic xmlns:pic="http://schemas.openxmlformats.org/drawingml/2006/picture">
+                  <pic:nvPicPr>
+                    <pic:cNvPr id="1" name=""/>
+                    <pic:cNvPicPr/>
+                  </pic:nvPicPr>
+                  <pic:blipFill>
+                    <a:blip r:embed="rId134"/>
+                    <a:stretch>
+                      <a:fillRect/>
+                    </a:stretch>
+                  </pic:blipFill>
+                  <pic:spPr>
+                    <a:xfrm>
+                      <a:off x="0" y="0"/>
+                      <a:ext cx="5400040" cy="396240"/>
+                    </a:xfrm>
+                    <a:prstGeom prst="rect">
+                      <a:avLst/>
+                    </a:prstGeom>
+                  </pic:spPr>
+                </pic:pic>
+              </a:graphicData>
+            </a:graphic>
+          </wp:inline>
+        </w:drawing>
+      </w:r>
+    </w:p>
+    <w:p>
+      <w:r>
+        <w:drawing>
+          <wp:inline distT="0" distB="0" distL="0" distR="0" wp14:anchorId="5463D473" wp14:editId="4D38EBD6">
+            <wp:extent cx="4982270" cy="1428949"/>
+            <wp:effectExtent l="0" t="0" r="8890" b="0"/>
+            <wp:docPr id="197" name="Imagem 197"/>
+            <wp:cNvGraphicFramePr>
+              <a:graphicFrameLocks xmlns:a="http://schemas.openxmlformats.org/drawingml/2006/main" noChangeAspect="1"/>
+            </wp:cNvGraphicFramePr>
+            <a:graphic xmlns:a="http://schemas.openxmlformats.org/drawingml/2006/main">
+              <a:graphicData uri="http://schemas.openxmlformats.org/drawingml/2006/picture">
+                <pic:pic xmlns:pic="http://schemas.openxmlformats.org/drawingml/2006/picture">
+                  <pic:nvPicPr>
+                    <pic:cNvPr id="1" name=""/>
+                    <pic:cNvPicPr/>
+                  </pic:nvPicPr>
+                  <pic:blipFill>
+                    <a:blip r:embed="rId135"/>
+                    <a:stretch>
+                      <a:fillRect/>
+                    </a:stretch>
+                  </pic:blipFill>
+                  <pic:spPr>
+                    <a:xfrm>
+                      <a:off x="0" y="0"/>
+                      <a:ext cx="4982270" cy="1428949"/>
+                    </a:xfrm>
+                    <a:prstGeom prst="rect">
+                      <a:avLst/>
+                    </a:prstGeom>
+                  </pic:spPr>
+                </pic:pic>
+              </a:graphicData>
+            </a:graphic>
+          </wp:inline>
+        </w:drawing>
+      </w:r>
+    </w:p>
+    <w:p>
+      <w:r>
+        <w:lastRenderedPageBreak/>
+        <w:t xml:space="preserve">76 – Trocamos as </w:t>
+      </w:r>
+      <w:proofErr w:type="spellStart"/>
+      <w:r>
+        <w:t>div</w:t>
+      </w:r>
+      <w:proofErr w:type="spellEnd"/>
+      <w:r>
+        <w:t xml:space="preserve"> do formulário por </w:t>
+      </w:r>
+      <w:proofErr w:type="spellStart"/>
+      <w:r>
+        <w:t>fildset</w:t>
+      </w:r>
+      <w:proofErr w:type="spellEnd"/>
+      <w:r>
+        <w:t xml:space="preserve"> (conjunto de campos) e os parágrafos por </w:t>
+      </w:r>
+      <w:proofErr w:type="spellStart"/>
+      <w:r>
+        <w:t>legend</w:t>
+      </w:r>
+      <w:proofErr w:type="spellEnd"/>
+      <w:r>
+        <w:t xml:space="preserve"> sendo uma melhor forme de trabalhar quando estamos tratando de formulário e no </w:t>
+      </w:r>
+      <w:proofErr w:type="spellStart"/>
+      <w:r>
+        <w:t>css</w:t>
+      </w:r>
+      <w:proofErr w:type="spellEnd"/>
+      <w:r>
+        <w:t xml:space="preserve"> as </w:t>
+      </w:r>
+      <w:proofErr w:type="spellStart"/>
+      <w:r>
+        <w:t>legend</w:t>
+      </w:r>
+      <w:proofErr w:type="spellEnd"/>
+      <w:r>
+        <w:t xml:space="preserve"> ficam as mesmas configurações das </w:t>
+      </w:r>
+      <w:proofErr w:type="spellStart"/>
+      <w:r>
+        <w:t>labels</w:t>
+      </w:r>
+      <w:proofErr w:type="spellEnd"/>
+      <w:r>
+        <w:t>.</w:t>
+      </w:r>
+    </w:p>
+    <w:p>
+      <w:r>
+        <w:drawing>
+          <wp:inline distT="0" distB="0" distL="0" distR="0" wp14:anchorId="259A9DD5" wp14:editId="2D3562AA">
+            <wp:extent cx="5400040" cy="1790700"/>
+            <wp:effectExtent l="0" t="0" r="0" b="0"/>
+            <wp:docPr id="198" name="Imagem 198"/>
+            <wp:cNvGraphicFramePr>
+              <a:graphicFrameLocks xmlns:a="http://schemas.openxmlformats.org/drawingml/2006/main" noChangeAspect="1"/>
+            </wp:cNvGraphicFramePr>
+            <a:graphic xmlns:a="http://schemas.openxmlformats.org/drawingml/2006/main">
+              <a:graphicData uri="http://schemas.openxmlformats.org/drawingml/2006/picture">
+                <pic:pic xmlns:pic="http://schemas.openxmlformats.org/drawingml/2006/picture">
+                  <pic:nvPicPr>
+                    <pic:cNvPr id="1" name=""/>
+                    <pic:cNvPicPr/>
+                  </pic:nvPicPr>
+                  <pic:blipFill>
+                    <a:blip r:embed="rId136"/>
+                    <a:stretch>
+                      <a:fillRect/>
+                    </a:stretch>
+                  </pic:blipFill>
+                  <pic:spPr>
+                    <a:xfrm>
+                      <a:off x="0" y="0"/>
+                      <a:ext cx="5400040" cy="1790700"/>
+                    </a:xfrm>
+                    <a:prstGeom prst="rect">
+                      <a:avLst/>
+                    </a:prstGeom>
+                  </pic:spPr>
+                </pic:pic>
+              </a:graphicData>
+            </a:graphic>
+          </wp:inline>
+        </w:drawing>
+      </w:r>
+      <w:r>
+        <w:drawing>
+          <wp:inline distT="0" distB="0" distL="0" distR="0" wp14:anchorId="4FED1150" wp14:editId="08B7B2C2">
+            <wp:extent cx="2029108" cy="924054"/>
+            <wp:effectExtent l="0" t="0" r="9525" b="9525"/>
+            <wp:docPr id="200" name="Imagem 200"/>
+            <wp:cNvGraphicFramePr>
+              <a:graphicFrameLocks xmlns:a="http://schemas.openxmlformats.org/drawingml/2006/main" noChangeAspect="1"/>
+            </wp:cNvGraphicFramePr>
+            <a:graphic xmlns:a="http://schemas.openxmlformats.org/drawingml/2006/main">
+              <a:graphicData uri="http://schemas.openxmlformats.org/drawingml/2006/picture">
+                <pic:pic xmlns:pic="http://schemas.openxmlformats.org/drawingml/2006/picture">
+                  <pic:nvPicPr>
+                    <pic:cNvPr id="1" name=""/>
+                    <pic:cNvPicPr/>
+                  </pic:nvPicPr>
+                  <pic:blipFill>
+                    <a:blip r:embed="rId137"/>
+                    <a:stretch>
+                      <a:fillRect/>
+                    </a:stretch>
+                  </pic:blipFill>
+                  <pic:spPr>
+                    <a:xfrm>
+                      <a:off x="0" y="0"/>
+                      <a:ext cx="2029108" cy="924054"/>
+                    </a:xfrm>
+                    <a:prstGeom prst="rect">
+                      <a:avLst/>
+                    </a:prstGeom>
+                  </pic:spPr>
+                </pic:pic>
+              </a:graphicData>
+            </a:graphic>
+          </wp:inline>
+        </w:drawing>
+      </w:r>
+    </w:p>
+    <w:p>
+      <w:r>
+        <w:t xml:space="preserve">77 </w:t>
+      </w:r>
+      <w:r>
+        <w:t>–</w:t>
+      </w:r>
+      <w:r>
+        <w:t xml:space="preserve"> </w:t>
+      </w:r>
+      <w:r>
+        <w:t xml:space="preserve">No </w:t>
+      </w:r>
+      <w:proofErr w:type="spellStart"/>
+      <w:r>
+        <w:t>html</w:t>
+      </w:r>
+      <w:proofErr w:type="spellEnd"/>
+      <w:r>
+        <w:t xml:space="preserve"> inserimos uma </w:t>
+      </w:r>
+      <w:proofErr w:type="spellStart"/>
+      <w:r>
+        <w:t>class</w:t>
+      </w:r>
+      <w:proofErr w:type="spellEnd"/>
+      <w:r>
+        <w:t xml:space="preserve"> enviar no botão e no </w:t>
+      </w:r>
+      <w:proofErr w:type="spellStart"/>
+      <w:r>
+        <w:t>css</w:t>
+      </w:r>
+      <w:proofErr w:type="spellEnd"/>
+      <w:r>
+        <w:t xml:space="preserve"> aumentamos a largura e o espaço interno tanto para cima como para baixo.</w:t>
+      </w:r>
+    </w:p>
+    <w:p>
+      <w:r>
+        <w:drawing>
+          <wp:inline distT="0" distB="0" distL="0" distR="0" wp14:anchorId="70A2DEFD" wp14:editId="41F45BFA">
+            <wp:extent cx="3801005" cy="219106"/>
+            <wp:effectExtent l="0" t="0" r="0" b="9525"/>
+            <wp:docPr id="201" name="Imagem 201"/>
+            <wp:cNvGraphicFramePr>
+              <a:graphicFrameLocks xmlns:a="http://schemas.openxmlformats.org/drawingml/2006/main" noChangeAspect="1"/>
+            </wp:cNvGraphicFramePr>
+            <a:graphic xmlns:a="http://schemas.openxmlformats.org/drawingml/2006/main">
+              <a:graphicData uri="http://schemas.openxmlformats.org/drawingml/2006/picture">
+                <pic:pic xmlns:pic="http://schemas.openxmlformats.org/drawingml/2006/picture">
+                  <pic:nvPicPr>
+                    <pic:cNvPr id="1" name=""/>
+                    <pic:cNvPicPr/>
+                  </pic:nvPicPr>
+                  <pic:blipFill>
+                    <a:blip r:embed="rId138"/>
+                    <a:stretch>
+                      <a:fillRect/>
+                    </a:stretch>
+                  </pic:blipFill>
+                  <pic:spPr>
+                    <a:xfrm>
+                      <a:off x="0" y="0"/>
+                      <a:ext cx="3801005" cy="219106"/>
+                    </a:xfrm>
+                    <a:prstGeom prst="rect">
+                      <a:avLst/>
+                    </a:prstGeom>
+                  </pic:spPr>
+                </pic:pic>
+              </a:graphicData>
+            </a:graphic>
+          </wp:inline>
+        </w:drawing>
+      </w:r>
+      <w:r>
+        <w:drawing>
+          <wp:inline distT="0" distB="0" distL="0" distR="0" wp14:anchorId="22EB527E" wp14:editId="7D7BC392">
+            <wp:extent cx="1600423" cy="685896"/>
+            <wp:effectExtent l="0" t="0" r="0" b="0"/>
+            <wp:docPr id="202" name="Imagem 202"/>
+            <wp:cNvGraphicFramePr>
+              <a:graphicFrameLocks xmlns:a="http://schemas.openxmlformats.org/drawingml/2006/main" noChangeAspect="1"/>
+            </wp:cNvGraphicFramePr>
+            <a:graphic xmlns:a="http://schemas.openxmlformats.org/drawingml/2006/main">
+              <a:graphicData uri="http://schemas.openxmlformats.org/drawingml/2006/picture">
+                <pic:pic xmlns:pic="http://schemas.openxmlformats.org/drawingml/2006/picture">
+                  <pic:nvPicPr>
+                    <pic:cNvPr id="1" name=""/>
+                    <pic:cNvPicPr/>
+                  </pic:nvPicPr>
+                  <pic:blipFill>
+                    <a:blip r:embed="rId139"/>
+                    <a:stretch>
+                      <a:fillRect/>
+                    </a:stretch>
+                  </pic:blipFill>
+                  <pic:spPr>
+                    <a:xfrm>
+                      <a:off x="0" y="0"/>
+                      <a:ext cx="1600423" cy="685896"/>
+                    </a:xfrm>
+                    <a:prstGeom prst="rect">
+                      <a:avLst/>
+                    </a:prstGeom>
+                  </pic:spPr>
+                </pic:pic>
+              </a:graphicData>
+            </a:graphic>
+          </wp:inline>
+        </w:drawing>
+      </w:r>
+    </w:p>
+    <w:p>
+      <w:r>
+        <w:t xml:space="preserve">78 </w:t>
+      </w:r>
+      <w:r>
+        <w:t>–</w:t>
+      </w:r>
+      <w:r>
+        <w:t xml:space="preserve"> </w:t>
+      </w:r>
+      <w:r>
+        <w:t>Ainda trabalhando com o botão enviar fizemos:</w:t>
+      </w:r>
+    </w:p>
+    <w:p>
+      <w:pPr>
+        <w:pStyle w:val="PargrafodaLista"/>
+        <w:numPr>
+          <w:ilvl w:val="0"/>
+          <w:numId w:val="9"/>
+        </w:numPr>
+      </w:pPr>
+      <w:r>
+        <w:t>Colocamos uma cor de fundo</w:t>
+      </w:r>
+    </w:p>
+    <w:p>
+      <w:pPr>
+        <w:pStyle w:val="PargrafodaLista"/>
+        <w:numPr>
+          <w:ilvl w:val="0"/>
+          <w:numId w:val="9"/>
+        </w:numPr>
+      </w:pPr>
+      <w:r>
+        <w:t>Mudamos a cor da letra para branco</w:t>
+      </w:r>
+    </w:p>
+    <w:p>
+      <w:pPr>
+        <w:pStyle w:val="PargrafodaLista"/>
+        <w:numPr>
+          <w:ilvl w:val="0"/>
+          <w:numId w:val="9"/>
+        </w:numPr>
+      </w:pPr>
+      <w:r>
+        <w:t>Deixamos o texto mais encorpado e negrito</w:t>
+      </w:r>
+    </w:p>
+    <w:p>
+      <w:pPr>
+        <w:pStyle w:val="PargrafodaLista"/>
+        <w:numPr>
+          <w:ilvl w:val="0"/>
+          <w:numId w:val="9"/>
+        </w:numPr>
+      </w:pPr>
+      <w:r>
+        <w:t>Aumentamos o tamanho da fonte</w:t>
+      </w:r>
+    </w:p>
+    <w:p>
+      <w:pPr>
+        <w:pStyle w:val="PargrafodaLista"/>
+        <w:numPr>
+          <w:ilvl w:val="0"/>
+          <w:numId w:val="9"/>
+        </w:numPr>
+      </w:pPr>
+      <w:r>
+        <w:t>Tiramos a borda do botão</w:t>
+      </w:r>
+    </w:p>
+    <w:p>
+      <w:pPr>
+        <w:pStyle w:val="PargrafodaLista"/>
+        <w:numPr>
+          <w:ilvl w:val="0"/>
+          <w:numId w:val="9"/>
+        </w:numPr>
+      </w:pPr>
+      <w:r>
+        <w:t>E arredondamos os cantos</w:t>
+      </w:r>
+      <w:bookmarkStart w:id="0" w:name="_GoBack"/>
       <w:bookmarkEnd w:id="0"/>
+    </w:p>
+    <w:p>
+      <w:r>
+        <w:drawing>
+          <wp:inline distT="0" distB="0" distL="0" distR="0" wp14:anchorId="4BBCF9A8" wp14:editId="3A521281">
+            <wp:extent cx="2333951" cy="1857634"/>
+            <wp:effectExtent l="0" t="0" r="9525" b="9525"/>
+            <wp:docPr id="203" name="Imagem 203"/>
+            <wp:cNvGraphicFramePr>
+              <a:graphicFrameLocks xmlns:a="http://schemas.openxmlformats.org/drawingml/2006/main" noChangeAspect="1"/>
+            </wp:cNvGraphicFramePr>
+            <a:graphic xmlns:a="http://schemas.openxmlformats.org/drawingml/2006/main">
+              <a:graphicData uri="http://schemas.openxmlformats.org/drawingml/2006/picture">
+                <pic:pic xmlns:pic="http://schemas.openxmlformats.org/drawingml/2006/picture">
+                  <pic:nvPicPr>
+                    <pic:cNvPr id="1" name=""/>
+                    <pic:cNvPicPr/>
+                  </pic:nvPicPr>
+                  <pic:blipFill>
+                    <a:blip r:embed="rId140"/>
+                    <a:stretch>
+                      <a:fillRect/>
+                    </a:stretch>
+                  </pic:blipFill>
+                  <pic:spPr>
+                    <a:xfrm>
+                      <a:off x="0" y="0"/>
+                      <a:ext cx="2333951" cy="1857634"/>
+                    </a:xfrm>
+                    <a:prstGeom prst="rect">
+                      <a:avLst/>
+                    </a:prstGeom>
+                  </pic:spPr>
+                </pic:pic>
+              </a:graphicData>
+            </a:graphic>
+          </wp:inline>
+        </w:drawing>
+      </w:r>
     </w:p>
     <w:sectPr>
       <w:pgSz w:w="11906" w:h="16838"/>
@@ -11466,6 +12524,119 @@
       </w:pPr>
     </w:lvl>
   </w:abstractNum>
+  <w:abstractNum w:abstractNumId="8" w15:restartNumberingAfterBreak="0">
+    <w:nsid w:val="799B0927"/>
+    <w:multiLevelType w:val="hybridMultilevel"/>
+    <w:tmpl w:val="B6183382"/>
+    <w:lvl w:ilvl="0" w:tplc="04160001">
+      <w:start w:val="1"/>
+      <w:numFmt w:val="bullet"/>
+      <w:lvlText w:val=""/>
+      <w:lvlJc w:val="left"/>
+      <w:pPr>
+        <w:ind w:left="720" w:hanging="360"/>
+      </w:pPr>
+      <w:rPr>
+        <w:rFonts w:ascii="Symbol" w:hAnsi="Symbol" w:hint="default"/>
+      </w:rPr>
+    </w:lvl>
+    <w:lvl w:ilvl="1" w:tplc="04160003" w:tentative="1">
+      <w:start w:val="1"/>
+      <w:numFmt w:val="bullet"/>
+      <w:lvlText w:val="o"/>
+      <w:lvlJc w:val="left"/>
+      <w:pPr>
+        <w:ind w:left="1440" w:hanging="360"/>
+      </w:pPr>
+      <w:rPr>
+        <w:rFonts w:ascii="Courier New" w:hAnsi="Courier New" w:cs="Courier New" w:hint="default"/>
+      </w:rPr>
+    </w:lvl>
+    <w:lvl w:ilvl="2" w:tplc="04160005" w:tentative="1">
+      <w:start w:val="1"/>
+      <w:numFmt w:val="bullet"/>
+      <w:lvlText w:val=""/>
+      <w:lvlJc w:val="left"/>
+      <w:pPr>
+        <w:ind w:left="2160" w:hanging="360"/>
+      </w:pPr>
+      <w:rPr>
+        <w:rFonts w:ascii="Wingdings" w:hAnsi="Wingdings" w:hint="default"/>
+      </w:rPr>
+    </w:lvl>
+    <w:lvl w:ilvl="3" w:tplc="04160001" w:tentative="1">
+      <w:start w:val="1"/>
+      <w:numFmt w:val="bullet"/>
+      <w:lvlText w:val=""/>
+      <w:lvlJc w:val="left"/>
+      <w:pPr>
+        <w:ind w:left="2880" w:hanging="360"/>
+      </w:pPr>
+      <w:rPr>
+        <w:rFonts w:ascii="Symbol" w:hAnsi="Symbol" w:hint="default"/>
+      </w:rPr>
+    </w:lvl>
+    <w:lvl w:ilvl="4" w:tplc="04160003" w:tentative="1">
+      <w:start w:val="1"/>
+      <w:numFmt w:val="bullet"/>
+      <w:lvlText w:val="o"/>
+      <w:lvlJc w:val="left"/>
+      <w:pPr>
+        <w:ind w:left="3600" w:hanging="360"/>
+      </w:pPr>
+      <w:rPr>
+        <w:rFonts w:ascii="Courier New" w:hAnsi="Courier New" w:cs="Courier New" w:hint="default"/>
+      </w:rPr>
+    </w:lvl>
+    <w:lvl w:ilvl="5" w:tplc="04160005" w:tentative="1">
+      <w:start w:val="1"/>
+      <w:numFmt w:val="bullet"/>
+      <w:lvlText w:val=""/>
+      <w:lvlJc w:val="left"/>
+      <w:pPr>
+        <w:ind w:left="4320" w:hanging="360"/>
+      </w:pPr>
+      <w:rPr>
+        <w:rFonts w:ascii="Wingdings" w:hAnsi="Wingdings" w:hint="default"/>
+      </w:rPr>
+    </w:lvl>
+    <w:lvl w:ilvl="6" w:tplc="04160001" w:tentative="1">
+      <w:start w:val="1"/>
+      <w:numFmt w:val="bullet"/>
+      <w:lvlText w:val=""/>
+      <w:lvlJc w:val="left"/>
+      <w:pPr>
+        <w:ind w:left="5040" w:hanging="360"/>
+      </w:pPr>
+      <w:rPr>
+        <w:rFonts w:ascii="Symbol" w:hAnsi="Symbol" w:hint="default"/>
+      </w:rPr>
+    </w:lvl>
+    <w:lvl w:ilvl="7" w:tplc="04160003" w:tentative="1">
+      <w:start w:val="1"/>
+      <w:numFmt w:val="bullet"/>
+      <w:lvlText w:val="o"/>
+      <w:lvlJc w:val="left"/>
+      <w:pPr>
+        <w:ind w:left="5760" w:hanging="360"/>
+      </w:pPr>
+      <w:rPr>
+        <w:rFonts w:ascii="Courier New" w:hAnsi="Courier New" w:cs="Courier New" w:hint="default"/>
+      </w:rPr>
+    </w:lvl>
+    <w:lvl w:ilvl="8" w:tplc="04160005" w:tentative="1">
+      <w:start w:val="1"/>
+      <w:numFmt w:val="bullet"/>
+      <w:lvlText w:val=""/>
+      <w:lvlJc w:val="left"/>
+      <w:pPr>
+        <w:ind w:left="6480" w:hanging="360"/>
+      </w:pPr>
+      <w:rPr>
+        <w:rFonts w:ascii="Wingdings" w:hAnsi="Wingdings" w:hint="default"/>
+      </w:rPr>
+    </w:lvl>
+  </w:abstractNum>
   <w:num w:numId="1">
     <w:abstractNumId w:val="2"/>
   </w:num>
@@ -11489,6 +12660,9 @@
   </w:num>
   <w:num w:numId="8">
     <w:abstractNumId w:val="1"/>
+  </w:num>
+  <w:num w:numId="9">
+    <w:abstractNumId w:val="8"/>
   </w:num>
 </w:numbering>
 </file>
@@ -12255,7 +13429,7 @@
 </file>
 
 <file path=customXml/itemProps1.xml><?xml version="1.0" encoding="utf-8"?>
-<ds:datastoreItem xmlns:ds="http://schemas.openxmlformats.org/officeDocument/2006/customXml" ds:itemID="{31C32E5D-A17E-4893-A8CE-674CC54B6116}">
+<ds:datastoreItem xmlns:ds="http://schemas.openxmlformats.org/officeDocument/2006/customXml" ds:itemID="{BE2AE5DB-2545-4A7B-AFAF-CA1D0F2DF607}">
   <ds:schemaRefs>
     <ds:schemaRef ds:uri="http://schemas.openxmlformats.org/officeDocument/2006/bibliography"/>
   </ds:schemaRefs>

</xml_diff>

<commit_message>
atualização do dia 24/09/2026
</commit_message>
<xml_diff>
--- a/apostila/Projeto Space For Men.docx
+++ b/apostila/Projeto Space For Men.docx
@@ -23,8 +23,21 @@
           <w:szCs w:val="44"/>
           <w:u w:val="single"/>
         </w:rPr>
-        <w:t>Projeto Space For Men</w:t>
-      </w:r>
+        <w:t xml:space="preserve">Projeto Space For </w:t>
+      </w:r>
+      <w:proofErr w:type="spellStart"/>
+      <w:r>
+        <w:rPr>
+          <w:rFonts w:ascii="Berlin Sans FB Demi" w:hAnsi="Berlin Sans FB Demi"/>
+          <w:b/>
+          <w:color w:val="FF0000"/>
+          <w:sz w:val="44"/>
+          <w:szCs w:val="44"/>
+          <w:u w:val="single"/>
+        </w:rPr>
+        <w:t>Men</w:t>
+      </w:r>
+      <w:proofErr w:type="spellEnd"/>
     </w:p>
     <w:p>
       <w:pPr>
@@ -10760,6 +10773,9 @@
     </w:p>
     <w:p>
       <w:r>
+        <w:rPr>
+          <w:noProof/>
+        </w:rPr>
         <w:drawing>
           <wp:inline distT="0" distB="0" distL="0" distR="0" wp14:anchorId="14DC4F32" wp14:editId="35C1B9AE">
             <wp:extent cx="5400040" cy="123825"/>
@@ -10797,6 +10813,9 @@
         </w:drawing>
       </w:r>
       <w:r>
+        <w:rPr>
+          <w:noProof/>
+        </w:rPr>
         <w:drawing>
           <wp:inline distT="0" distB="0" distL="0" distR="0" wp14:anchorId="2DAA7599" wp14:editId="79892941">
             <wp:extent cx="1438476" cy="571580"/>
@@ -10834,6 +10853,9 @@
         </w:drawing>
       </w:r>
       <w:r>
+        <w:rPr>
+          <w:noProof/>
+        </w:rPr>
         <w:drawing>
           <wp:inline distT="0" distB="0" distL="0" distR="0" wp14:anchorId="77AC3880" wp14:editId="07C586CA">
             <wp:extent cx="4143953" cy="1219370"/>
@@ -10905,6 +10927,9 @@
     </w:p>
     <w:p>
       <w:r>
+        <w:rPr>
+          <w:noProof/>
+        </w:rPr>
         <w:drawing>
           <wp:inline distT="0" distB="0" distL="0" distR="0" wp14:anchorId="28BBFC49" wp14:editId="1823BDD3">
             <wp:extent cx="3096057" cy="1057423"/>
@@ -10957,6 +10982,9 @@
     </w:p>
     <w:p>
       <w:r>
+        <w:rPr>
+          <w:noProof/>
+        </w:rPr>
         <w:drawing>
           <wp:inline distT="0" distB="0" distL="0" distR="0" wp14:anchorId="1CB68AE4" wp14:editId="12F608CC">
             <wp:extent cx="5400040" cy="1017270"/>
@@ -11132,6 +11160,9 @@
         </mc:AlternateContent>
       </w:r>
       <w:r>
+        <w:rPr>
+          <w:noProof/>
+        </w:rPr>
         <w:drawing>
           <wp:inline distT="0" distB="0" distL="0" distR="0" wp14:anchorId="0A94BC1A" wp14:editId="57292B72">
             <wp:extent cx="4029637" cy="762106"/>
@@ -11187,6 +11218,9 @@
     </w:p>
     <w:p>
       <w:r>
+        <w:rPr>
+          <w:noProof/>
+        </w:rPr>
         <w:drawing>
           <wp:inline distT="0" distB="0" distL="0" distR="0" wp14:anchorId="4893AAEB" wp14:editId="4154B829">
             <wp:extent cx="5020376" cy="1066949"/>
@@ -11257,6 +11291,9 @@
         <w:t xml:space="preserve"> </w:t>
       </w:r>
       <w:r>
+        <w:rPr>
+          <w:noProof/>
+        </w:rPr>
         <w:drawing>
           <wp:inline distT="0" distB="0" distL="0" distR="0" wp14:anchorId="05BC600E" wp14:editId="657E53FA">
             <wp:extent cx="5400040" cy="396240"/>
@@ -11296,6 +11333,9 @@
     </w:p>
     <w:p>
       <w:r>
+        <w:rPr>
+          <w:noProof/>
+        </w:rPr>
         <w:drawing>
           <wp:inline distT="0" distB="0" distL="0" distR="0" wp14:anchorId="5463D473" wp14:editId="4D38EBD6">
             <wp:extent cx="4982270" cy="1428949"/>
@@ -11389,6 +11429,9 @@
     </w:p>
     <w:p>
       <w:r>
+        <w:rPr>
+          <w:noProof/>
+        </w:rPr>
         <w:drawing>
           <wp:inline distT="0" distB="0" distL="0" distR="0" wp14:anchorId="259A9DD5" wp14:editId="2D3562AA">
             <wp:extent cx="5400040" cy="1790700"/>
@@ -11426,6 +11469,9 @@
         </w:drawing>
       </w:r>
       <w:r>
+        <w:rPr>
+          <w:noProof/>
+        </w:rPr>
         <w:drawing>
           <wp:inline distT="0" distB="0" distL="0" distR="0" wp14:anchorId="4FED1150" wp14:editId="08B7B2C2">
             <wp:extent cx="2029108" cy="924054"/>
@@ -11503,6 +11549,9 @@
     </w:p>
     <w:p>
       <w:r>
+        <w:rPr>
+          <w:noProof/>
+        </w:rPr>
         <w:drawing>
           <wp:inline distT="0" distB="0" distL="0" distR="0" wp14:anchorId="70A2DEFD" wp14:editId="41F45BFA">
             <wp:extent cx="3801005" cy="219106"/>
@@ -11540,6 +11589,9 @@
         </w:drawing>
       </w:r>
       <w:r>
+        <w:rPr>
+          <w:noProof/>
+        </w:rPr>
         <w:drawing>
           <wp:inline distT="0" distB="0" distL="0" distR="0" wp14:anchorId="22EB527E" wp14:editId="7D7BC392">
             <wp:extent cx="1600423" cy="685896"/>
@@ -11662,11 +11714,12 @@
       <w:r>
         <w:t>E arredondamos os cantos</w:t>
       </w:r>
-      <w:bookmarkStart w:id="0" w:name="_GoBack"/>
-      <w:bookmarkEnd w:id="0"/>
-    </w:p>
-    <w:p>
-      <w:r>
+    </w:p>
+    <w:p>
+      <w:r>
+        <w:rPr>
+          <w:noProof/>
+        </w:rPr>
         <w:drawing>
           <wp:inline distT="0" distB="0" distL="0" distR="0" wp14:anchorId="4BBCF9A8" wp14:editId="3A521281">
             <wp:extent cx="2333951" cy="1857634"/>
@@ -11692,6 +11745,1170 @@
                     <a:xfrm>
                       <a:off x="0" y="0"/>
                       <a:ext cx="2333951" cy="1857634"/>
+                    </a:xfrm>
+                    <a:prstGeom prst="rect">
+                      <a:avLst/>
+                    </a:prstGeom>
+                  </pic:spPr>
+                </pic:pic>
+              </a:graphicData>
+            </a:graphic>
+          </wp:inline>
+        </w:drawing>
+      </w:r>
+    </w:p>
+    <w:p/>
+    <w:p>
+      <w:r>
+        <w:lastRenderedPageBreak/>
+        <w:t xml:space="preserve">79 – Trabalhando com </w:t>
+      </w:r>
+      <w:proofErr w:type="spellStart"/>
+      <w:r>
+        <w:t>hover</w:t>
+      </w:r>
+      <w:proofErr w:type="spellEnd"/>
+      <w:r>
+        <w:t xml:space="preserve"> no botão enviar mudamos a cor de fundo ao passar o mouse utilizando background-color, e também criamos uma animação com </w:t>
+      </w:r>
+      <w:proofErr w:type="spellStart"/>
+      <w:r>
+        <w:t>transform</w:t>
+      </w:r>
+      <w:proofErr w:type="spellEnd"/>
+      <w:r>
+        <w:t xml:space="preserve"> </w:t>
+      </w:r>
+      <w:proofErr w:type="spellStart"/>
+      <w:r>
+        <w:t>rotate</w:t>
+      </w:r>
+      <w:proofErr w:type="spellEnd"/>
+      <w:r>
+        <w:t xml:space="preserve"> e </w:t>
+      </w:r>
+      <w:proofErr w:type="spellStart"/>
+      <w:r>
+        <w:t>scale</w:t>
+      </w:r>
+      <w:proofErr w:type="spellEnd"/>
+      <w:r>
+        <w:t xml:space="preserve"> que ao passar o mouse ele realiza uma rotação e o </w:t>
+      </w:r>
+      <w:proofErr w:type="spellStart"/>
+      <w:r>
+        <w:t>scale</w:t>
+      </w:r>
+      <w:proofErr w:type="spellEnd"/>
+      <w:r>
+        <w:t xml:space="preserve"> aumenta o tamanho do botão.</w:t>
+      </w:r>
+    </w:p>
+    <w:p>
+      <w:r>
+        <w:t xml:space="preserve">Obs.: Não podemos deixar de esquecer de colocar uma </w:t>
+      </w:r>
+      <w:proofErr w:type="spellStart"/>
+      <w:r>
+        <w:t>transition</w:t>
+      </w:r>
+      <w:proofErr w:type="spellEnd"/>
+      <w:r>
+        <w:t xml:space="preserve"> na </w:t>
+      </w:r>
+      <w:proofErr w:type="spellStart"/>
+      <w:r>
+        <w:t>class</w:t>
+      </w:r>
+      <w:proofErr w:type="spellEnd"/>
+      <w:r>
+        <w:t xml:space="preserve"> enviar para controlar o tempo da animação.</w:t>
+      </w:r>
+    </w:p>
+    <w:p>
+      <w:r>
+        <w:drawing>
+          <wp:inline distT="0" distB="0" distL="0" distR="0" wp14:anchorId="5A52687D" wp14:editId="602FE129">
+            <wp:extent cx="2981741" cy="2886478"/>
+            <wp:effectExtent l="0" t="0" r="9525" b="9525"/>
+            <wp:docPr id="199" name="Imagem 199"/>
+            <wp:cNvGraphicFramePr>
+              <a:graphicFrameLocks xmlns:a="http://schemas.openxmlformats.org/drawingml/2006/main" noChangeAspect="1"/>
+            </wp:cNvGraphicFramePr>
+            <a:graphic xmlns:a="http://schemas.openxmlformats.org/drawingml/2006/main">
+              <a:graphicData uri="http://schemas.openxmlformats.org/drawingml/2006/picture">
+                <pic:pic xmlns:pic="http://schemas.openxmlformats.org/drawingml/2006/picture">
+                  <pic:nvPicPr>
+                    <pic:cNvPr id="1" name=""/>
+                    <pic:cNvPicPr/>
+                  </pic:nvPicPr>
+                  <pic:blipFill>
+                    <a:blip r:embed="rId141"/>
+                    <a:stretch>
+                      <a:fillRect/>
+                    </a:stretch>
+                  </pic:blipFill>
+                  <pic:spPr>
+                    <a:xfrm>
+                      <a:off x="0" y="0"/>
+                      <a:ext cx="2981741" cy="2886478"/>
+                    </a:xfrm>
+                    <a:prstGeom prst="rect">
+                      <a:avLst/>
+                    </a:prstGeom>
+                  </pic:spPr>
+                </pic:pic>
+              </a:graphicData>
+            </a:graphic>
+          </wp:inline>
+        </w:drawing>
+      </w:r>
+    </w:p>
+    <w:p>
+      <w:r>
+        <w:t xml:space="preserve">80 – Na página de contato adicionamos uma tabela </w:t>
+      </w:r>
+      <w:r>
+        <w:t xml:space="preserve">onde iniciamos utilizando as </w:t>
+      </w:r>
+      <w:proofErr w:type="spellStart"/>
+      <w:r>
+        <w:t>tags</w:t>
+      </w:r>
+      <w:proofErr w:type="spellEnd"/>
+      <w:r>
+        <w:t xml:space="preserve"> TR -&gt; linha de tabela e as </w:t>
+      </w:r>
+      <w:proofErr w:type="spellStart"/>
+      <w:r>
+        <w:t>tags</w:t>
+      </w:r>
+      <w:proofErr w:type="spellEnd"/>
+      <w:r>
+        <w:t xml:space="preserve"> TD -&gt; dados da tabela conforme código abaixo:</w:t>
+      </w:r>
+    </w:p>
+    <w:p>
+      <w:r>
+        <w:drawing>
+          <wp:inline distT="0" distB="0" distL="0" distR="0" wp14:anchorId="3867A2AD" wp14:editId="6E9A9B76">
+            <wp:extent cx="2562583" cy="3962953"/>
+            <wp:effectExtent l="0" t="0" r="9525" b="0"/>
+            <wp:docPr id="204" name="Imagem 204"/>
+            <wp:cNvGraphicFramePr>
+              <a:graphicFrameLocks xmlns:a="http://schemas.openxmlformats.org/drawingml/2006/main" noChangeAspect="1"/>
+            </wp:cNvGraphicFramePr>
+            <a:graphic xmlns:a="http://schemas.openxmlformats.org/drawingml/2006/main">
+              <a:graphicData uri="http://schemas.openxmlformats.org/drawingml/2006/picture">
+                <pic:pic xmlns:pic="http://schemas.openxmlformats.org/drawingml/2006/picture">
+                  <pic:nvPicPr>
+                    <pic:cNvPr id="1" name=""/>
+                    <pic:cNvPicPr/>
+                  </pic:nvPicPr>
+                  <pic:blipFill>
+                    <a:blip r:embed="rId142"/>
+                    <a:stretch>
+                      <a:fillRect/>
+                    </a:stretch>
+                  </pic:blipFill>
+                  <pic:spPr>
+                    <a:xfrm>
+                      <a:off x="0" y="0"/>
+                      <a:ext cx="2562583" cy="3962953"/>
+                    </a:xfrm>
+                    <a:prstGeom prst="rect">
+                      <a:avLst/>
+                    </a:prstGeom>
+                  </pic:spPr>
+                </pic:pic>
+              </a:graphicData>
+            </a:graphic>
+          </wp:inline>
+        </w:drawing>
+      </w:r>
+    </w:p>
+    <w:p/>
+    <w:p>
+      <w:r>
+        <w:lastRenderedPageBreak/>
+        <w:t xml:space="preserve">81 – Na tabela adicionamos o </w:t>
+      </w:r>
+      <w:proofErr w:type="spellStart"/>
+      <w:r>
+        <w:t>thead</w:t>
+      </w:r>
+      <w:proofErr w:type="spellEnd"/>
+      <w:r>
+        <w:t xml:space="preserve"> -&gt; o cabeçalho da tabela e TH -&gt; dados do cabeçalho e </w:t>
+      </w:r>
+      <w:proofErr w:type="spellStart"/>
+      <w:r>
+        <w:t>tbody</w:t>
+      </w:r>
+      <w:proofErr w:type="spellEnd"/>
+      <w:r>
+        <w:t xml:space="preserve"> -&gt; o corpo da tabela.</w:t>
+      </w:r>
+    </w:p>
+    <w:p>
+      <w:r>
+        <w:drawing>
+          <wp:inline distT="0" distB="0" distL="0" distR="0" wp14:anchorId="275DF60C" wp14:editId="72E0011D">
+            <wp:extent cx="2562583" cy="3962953"/>
+            <wp:effectExtent l="0" t="0" r="9525" b="0"/>
+            <wp:docPr id="205" name="Imagem 205"/>
+            <wp:cNvGraphicFramePr>
+              <a:graphicFrameLocks xmlns:a="http://schemas.openxmlformats.org/drawingml/2006/main" noChangeAspect="1"/>
+            </wp:cNvGraphicFramePr>
+            <a:graphic xmlns:a="http://schemas.openxmlformats.org/drawingml/2006/main">
+              <a:graphicData uri="http://schemas.openxmlformats.org/drawingml/2006/picture">
+                <pic:pic xmlns:pic="http://schemas.openxmlformats.org/drawingml/2006/picture">
+                  <pic:nvPicPr>
+                    <pic:cNvPr id="1" name=""/>
+                    <pic:cNvPicPr/>
+                  </pic:nvPicPr>
+                  <pic:blipFill>
+                    <a:blip r:embed="rId142"/>
+                    <a:stretch>
+                      <a:fillRect/>
+                    </a:stretch>
+                  </pic:blipFill>
+                  <pic:spPr>
+                    <a:xfrm>
+                      <a:off x="0" y="0"/>
+                      <a:ext cx="2562583" cy="3962953"/>
+                    </a:xfrm>
+                    <a:prstGeom prst="rect">
+                      <a:avLst/>
+                    </a:prstGeom>
+                  </pic:spPr>
+                </pic:pic>
+              </a:graphicData>
+            </a:graphic>
+          </wp:inline>
+        </w:drawing>
+      </w:r>
+    </w:p>
+    <w:p>
+      <w:r>
+        <w:t>82 – Adicionamos uma cor de fundo no cabeçalho da tabela, mudamos a cor da letra para branco e encorpamos o texto.</w:t>
+      </w:r>
+    </w:p>
+    <w:p>
+      <w:r>
+        <w:t xml:space="preserve">No </w:t>
+      </w:r>
+      <w:proofErr w:type="spellStart"/>
+      <w:r>
+        <w:t>td</w:t>
+      </w:r>
+      <w:proofErr w:type="spellEnd"/>
+      <w:r>
+        <w:t xml:space="preserve">, </w:t>
+      </w:r>
+      <w:proofErr w:type="spellStart"/>
+      <w:r>
+        <w:t>th</w:t>
+      </w:r>
+      <w:proofErr w:type="spellEnd"/>
+      <w:r>
+        <w:t xml:space="preserve"> -&gt; inserimos uma borda solida e aumentamos o espaço interno tanto para cima como para baixo e do lado direito e esquerdo.</w:t>
+      </w:r>
+    </w:p>
+    <w:p>
+      <w:r>
+        <w:drawing>
+          <wp:inline distT="0" distB="0" distL="0" distR="0" wp14:anchorId="0E03960E" wp14:editId="68A866B6">
+            <wp:extent cx="2495898" cy="1895740"/>
+            <wp:effectExtent l="0" t="0" r="0" b="9525"/>
+            <wp:docPr id="206" name="Imagem 206"/>
+            <wp:cNvGraphicFramePr>
+              <a:graphicFrameLocks xmlns:a="http://schemas.openxmlformats.org/drawingml/2006/main" noChangeAspect="1"/>
+            </wp:cNvGraphicFramePr>
+            <a:graphic xmlns:a="http://schemas.openxmlformats.org/drawingml/2006/main">
+              <a:graphicData uri="http://schemas.openxmlformats.org/drawingml/2006/picture">
+                <pic:pic xmlns:pic="http://schemas.openxmlformats.org/drawingml/2006/picture">
+                  <pic:nvPicPr>
+                    <pic:cNvPr id="1" name=""/>
+                    <pic:cNvPicPr/>
+                  </pic:nvPicPr>
+                  <pic:blipFill>
+                    <a:blip r:embed="rId143"/>
+                    <a:stretch>
+                      <a:fillRect/>
+                    </a:stretch>
+                  </pic:blipFill>
+                  <pic:spPr>
+                    <a:xfrm>
+                      <a:off x="0" y="0"/>
+                      <a:ext cx="2495898" cy="1895740"/>
+                    </a:xfrm>
+                    <a:prstGeom prst="rect">
+                      <a:avLst/>
+                    </a:prstGeom>
+                  </pic:spPr>
+                </pic:pic>
+              </a:graphicData>
+            </a:graphic>
+          </wp:inline>
+        </w:drawing>
+      </w:r>
+    </w:p>
+    <w:p/>
+    <w:p/>
+    <w:p/>
+    <w:p/>
+    <w:p/>
+    <w:p>
+      <w:r>
+        <w:lastRenderedPageBreak/>
+        <w:t>8</w:t>
+      </w:r>
+      <w:r>
+        <w:t>3</w:t>
+      </w:r>
+      <w:r>
+        <w:t xml:space="preserve"> – Trabalhando com a página do home copiamos o </w:t>
+      </w:r>
+      <w:proofErr w:type="spellStart"/>
+      <w:r>
+        <w:t>html</w:t>
+      </w:r>
+      <w:proofErr w:type="spellEnd"/>
+      <w:r>
+        <w:t xml:space="preserve"> do header que é o nosso menu que já se encontrava  pronto na outra página e o </w:t>
+      </w:r>
+      <w:proofErr w:type="spellStart"/>
+      <w:r>
+        <w:t>css</w:t>
+      </w:r>
+      <w:proofErr w:type="spellEnd"/>
+      <w:r>
+        <w:t xml:space="preserve"> da configuração do mesmo e colocamos na nossa página do home e no style.css e repetimos o mesmo processo com o </w:t>
+      </w:r>
+      <w:proofErr w:type="spellStart"/>
+      <w:r>
+        <w:t>footer</w:t>
+      </w:r>
+      <w:proofErr w:type="spellEnd"/>
+      <w:r>
+        <w:t>, com isso já ficou pronto o menu e nosso rodapé da página.</w:t>
+      </w:r>
+    </w:p>
+    <w:p>
+      <w:r>
+        <w:drawing>
+          <wp:inline distT="0" distB="0" distL="0" distR="0" wp14:anchorId="560E36C4" wp14:editId="1A2EACA6">
+            <wp:extent cx="4534533" cy="2133898"/>
+            <wp:effectExtent l="0" t="0" r="0" b="0"/>
+            <wp:docPr id="207" name="Imagem 207"/>
+            <wp:cNvGraphicFramePr>
+              <a:graphicFrameLocks xmlns:a="http://schemas.openxmlformats.org/drawingml/2006/main" noChangeAspect="1"/>
+            </wp:cNvGraphicFramePr>
+            <a:graphic xmlns:a="http://schemas.openxmlformats.org/drawingml/2006/main">
+              <a:graphicData uri="http://schemas.openxmlformats.org/drawingml/2006/picture">
+                <pic:pic xmlns:pic="http://schemas.openxmlformats.org/drawingml/2006/picture">
+                  <pic:nvPicPr>
+                    <pic:cNvPr id="1" name=""/>
+                    <pic:cNvPicPr/>
+                  </pic:nvPicPr>
+                  <pic:blipFill>
+                    <a:blip r:embed="rId144"/>
+                    <a:stretch>
+                      <a:fillRect/>
+                    </a:stretch>
+                  </pic:blipFill>
+                  <pic:spPr>
+                    <a:xfrm>
+                      <a:off x="0" y="0"/>
+                      <a:ext cx="4534533" cy="2133898"/>
+                    </a:xfrm>
+                    <a:prstGeom prst="rect">
+                      <a:avLst/>
+                    </a:prstGeom>
+                  </pic:spPr>
+                </pic:pic>
+              </a:graphicData>
+            </a:graphic>
+          </wp:inline>
+        </w:drawing>
+      </w:r>
+      <w:r>
+        <w:drawing>
+          <wp:inline distT="0" distB="0" distL="0" distR="0" wp14:anchorId="3C84F4AF" wp14:editId="7B01CDB3">
+            <wp:extent cx="4667901" cy="724001"/>
+            <wp:effectExtent l="0" t="0" r="0" b="0"/>
+            <wp:docPr id="208" name="Imagem 208"/>
+            <wp:cNvGraphicFramePr>
+              <a:graphicFrameLocks xmlns:a="http://schemas.openxmlformats.org/drawingml/2006/main" noChangeAspect="1"/>
+            </wp:cNvGraphicFramePr>
+            <a:graphic xmlns:a="http://schemas.openxmlformats.org/drawingml/2006/main">
+              <a:graphicData uri="http://schemas.openxmlformats.org/drawingml/2006/picture">
+                <pic:pic xmlns:pic="http://schemas.openxmlformats.org/drawingml/2006/picture">
+                  <pic:nvPicPr>
+                    <pic:cNvPr id="1" name=""/>
+                    <pic:cNvPicPr/>
+                  </pic:nvPicPr>
+                  <pic:blipFill>
+                    <a:blip r:embed="rId145"/>
+                    <a:stretch>
+                      <a:fillRect/>
+                    </a:stretch>
+                  </pic:blipFill>
+                  <pic:spPr>
+                    <a:xfrm>
+                      <a:off x="0" y="0"/>
+                      <a:ext cx="4667901" cy="724001"/>
+                    </a:xfrm>
+                    <a:prstGeom prst="rect">
+                      <a:avLst/>
+                    </a:prstGeom>
+                  </pic:spPr>
+                </pic:pic>
+              </a:graphicData>
+            </a:graphic>
+          </wp:inline>
+        </w:drawing>
+      </w:r>
+    </w:p>
+    <w:p>
+      <w:r>
+        <w:t xml:space="preserve">84 </w:t>
+      </w:r>
+      <w:r>
+        <w:t>–</w:t>
+      </w:r>
+      <w:r>
+        <w:t xml:space="preserve"> </w:t>
+      </w:r>
+      <w:r>
+        <w:t xml:space="preserve">Aumentamos a largura da imagem do banner para ocupar 100% de espaço na página e demos uma largura para o </w:t>
+      </w:r>
+      <w:proofErr w:type="spellStart"/>
+      <w:r>
+        <w:t>main</w:t>
+      </w:r>
+      <w:proofErr w:type="spellEnd"/>
+      <w:r>
+        <w:t xml:space="preserve"> e centralizamos o conteúdo dentro dele.</w:t>
+      </w:r>
+    </w:p>
+    <w:p>
+      <w:r>
+        <w:drawing>
+          <wp:inline distT="0" distB="0" distL="0" distR="0" wp14:anchorId="78AC6397" wp14:editId="22A7C594">
+            <wp:extent cx="1314633" cy="1448002"/>
+            <wp:effectExtent l="0" t="0" r="0" b="0"/>
+            <wp:docPr id="209" name="Imagem 209"/>
+            <wp:cNvGraphicFramePr>
+              <a:graphicFrameLocks xmlns:a="http://schemas.openxmlformats.org/drawingml/2006/main" noChangeAspect="1"/>
+            </wp:cNvGraphicFramePr>
+            <a:graphic xmlns:a="http://schemas.openxmlformats.org/drawingml/2006/main">
+              <a:graphicData uri="http://schemas.openxmlformats.org/drawingml/2006/picture">
+                <pic:pic xmlns:pic="http://schemas.openxmlformats.org/drawingml/2006/picture">
+                  <pic:nvPicPr>
+                    <pic:cNvPr id="1" name=""/>
+                    <pic:cNvPicPr/>
+                  </pic:nvPicPr>
+                  <pic:blipFill>
+                    <a:blip r:embed="rId146"/>
+                    <a:stretch>
+                      <a:fillRect/>
+                    </a:stretch>
+                  </pic:blipFill>
+                  <pic:spPr>
+                    <a:xfrm>
+                      <a:off x="0" y="0"/>
+                      <a:ext cx="1314633" cy="1448002"/>
+                    </a:xfrm>
+                    <a:prstGeom prst="rect">
+                      <a:avLst/>
+                    </a:prstGeom>
+                  </pic:spPr>
+                </pic:pic>
+              </a:graphicData>
+            </a:graphic>
+          </wp:inline>
+        </w:drawing>
+      </w:r>
+    </w:p>
+    <w:p>
+      <w:r>
+        <w:t xml:space="preserve">85 – Na página do index.html trocamos as </w:t>
+      </w:r>
+      <w:proofErr w:type="spellStart"/>
+      <w:r>
+        <w:t>divs</w:t>
+      </w:r>
+      <w:proofErr w:type="spellEnd"/>
+      <w:r>
+        <w:t xml:space="preserve"> por </w:t>
+      </w:r>
+      <w:proofErr w:type="spellStart"/>
+      <w:r>
+        <w:t>section</w:t>
+      </w:r>
+      <w:proofErr w:type="spellEnd"/>
+      <w:r>
+        <w:t xml:space="preserve"> a diferença entre </w:t>
+      </w:r>
+      <w:proofErr w:type="spellStart"/>
+      <w:r>
+        <w:t>div</w:t>
+      </w:r>
+      <w:proofErr w:type="spellEnd"/>
+      <w:r>
+        <w:t xml:space="preserve"> e </w:t>
+      </w:r>
+      <w:proofErr w:type="spellStart"/>
+      <w:r>
+        <w:t>section</w:t>
+      </w:r>
+      <w:proofErr w:type="spellEnd"/>
+      <w:r>
+        <w:t xml:space="preserve"> é que </w:t>
+      </w:r>
+      <w:proofErr w:type="spellStart"/>
+      <w:r>
+        <w:t>div</w:t>
+      </w:r>
+      <w:proofErr w:type="spellEnd"/>
+      <w:r>
+        <w:t xml:space="preserve"> geralmente é usada para conteúdo visual dentro dela, e não necessariamente são correspondentes ao mesmo assunto.</w:t>
+      </w:r>
+    </w:p>
+    <w:p>
+      <w:r>
+        <w:t xml:space="preserve">Ao contrário da </w:t>
+      </w:r>
+      <w:proofErr w:type="spellStart"/>
+      <w:r>
+        <w:t>div</w:t>
+      </w:r>
+      <w:proofErr w:type="spellEnd"/>
+      <w:r>
+        <w:t xml:space="preserve">, se </w:t>
+      </w:r>
+      <w:proofErr w:type="spellStart"/>
+      <w:r>
+        <w:t>section</w:t>
+      </w:r>
+      <w:proofErr w:type="spellEnd"/>
+      <w:r>
+        <w:t xml:space="preserve"> cria uma divisão na página em que o conteúdo interno está relacionado a um único tema, ou seja, ao mesmo assunto, então por tal motivo, trocamos a </w:t>
+      </w:r>
+      <w:proofErr w:type="spellStart"/>
+      <w:r>
+        <w:t>div</w:t>
+      </w:r>
+      <w:proofErr w:type="spellEnd"/>
+      <w:r>
+        <w:t xml:space="preserve"> principal por </w:t>
+      </w:r>
+      <w:proofErr w:type="spellStart"/>
+      <w:r>
+        <w:t>section</w:t>
+      </w:r>
+      <w:proofErr w:type="spellEnd"/>
+      <w:r>
+        <w:t xml:space="preserve"> e a </w:t>
+      </w:r>
+      <w:proofErr w:type="spellStart"/>
+      <w:r>
+        <w:t>div</w:t>
+      </w:r>
+      <w:proofErr w:type="spellEnd"/>
+      <w:r>
+        <w:t xml:space="preserve"> benefícios.</w:t>
+      </w:r>
+    </w:p>
+    <w:p>
+      <w:r>
+        <w:drawing>
+          <wp:inline distT="0" distB="0" distL="0" distR="0" wp14:anchorId="74CDF1A2" wp14:editId="111EBF1D">
+            <wp:extent cx="1971950" cy="171474"/>
+            <wp:effectExtent l="0" t="0" r="0" b="0"/>
+            <wp:docPr id="210" name="Imagem 210"/>
+            <wp:cNvGraphicFramePr>
+              <a:graphicFrameLocks xmlns:a="http://schemas.openxmlformats.org/drawingml/2006/main" noChangeAspect="1"/>
+            </wp:cNvGraphicFramePr>
+            <a:graphic xmlns:a="http://schemas.openxmlformats.org/drawingml/2006/main">
+              <a:graphicData uri="http://schemas.openxmlformats.org/drawingml/2006/picture">
+                <pic:pic xmlns:pic="http://schemas.openxmlformats.org/drawingml/2006/picture">
+                  <pic:nvPicPr>
+                    <pic:cNvPr id="1" name=""/>
+                    <pic:cNvPicPr/>
+                  </pic:nvPicPr>
+                  <pic:blipFill>
+                    <a:blip r:embed="rId147"/>
+                    <a:stretch>
+                      <a:fillRect/>
+                    </a:stretch>
+                  </pic:blipFill>
+                  <pic:spPr>
+                    <a:xfrm>
+                      <a:off x="0" y="0"/>
+                      <a:ext cx="1971950" cy="171474"/>
+                    </a:xfrm>
+                    <a:prstGeom prst="rect">
+                      <a:avLst/>
+                    </a:prstGeom>
+                  </pic:spPr>
+                </pic:pic>
+              </a:graphicData>
+            </a:graphic>
+          </wp:inline>
+        </w:drawing>
+      </w:r>
+    </w:p>
+    <w:p>
+      <w:r>
+        <w:drawing>
+          <wp:inline distT="0" distB="0" distL="0" distR="0" wp14:anchorId="61D32DA5" wp14:editId="48DD8ED7">
+            <wp:extent cx="2048161" cy="152421"/>
+            <wp:effectExtent l="0" t="0" r="9525" b="0"/>
+            <wp:docPr id="211" name="Imagem 211"/>
+            <wp:cNvGraphicFramePr>
+              <a:graphicFrameLocks xmlns:a="http://schemas.openxmlformats.org/drawingml/2006/main" noChangeAspect="1"/>
+            </wp:cNvGraphicFramePr>
+            <a:graphic xmlns:a="http://schemas.openxmlformats.org/drawingml/2006/main">
+              <a:graphicData uri="http://schemas.openxmlformats.org/drawingml/2006/picture">
+                <pic:pic xmlns:pic="http://schemas.openxmlformats.org/drawingml/2006/picture">
+                  <pic:nvPicPr>
+                    <pic:cNvPr id="1" name=""/>
+                    <pic:cNvPicPr/>
+                  </pic:nvPicPr>
+                  <pic:blipFill>
+                    <a:blip r:embed="rId148"/>
+                    <a:stretch>
+                      <a:fillRect/>
+                    </a:stretch>
+                  </pic:blipFill>
+                  <pic:spPr>
+                    <a:xfrm>
+                      <a:off x="0" y="0"/>
+                      <a:ext cx="2048161" cy="152421"/>
+                    </a:xfrm>
+                    <a:prstGeom prst="rect">
+                      <a:avLst/>
+                    </a:prstGeom>
+                  </pic:spPr>
+                </pic:pic>
+              </a:graphicData>
+            </a:graphic>
+          </wp:inline>
+        </w:drawing>
+      </w:r>
+    </w:p>
+    <w:p/>
+    <w:p/>
+    <w:p/>
+    <w:p>
+      <w:r>
+        <w:lastRenderedPageBreak/>
+        <w:t xml:space="preserve">86 </w:t>
+      </w:r>
+      <w:r>
+        <w:t>–</w:t>
+      </w:r>
+      <w:r>
+        <w:t xml:space="preserve"> </w:t>
+      </w:r>
+      <w:r>
+        <w:t xml:space="preserve">Adicionamos a </w:t>
+      </w:r>
+      <w:proofErr w:type="spellStart"/>
+      <w:r>
+        <w:t>class</w:t>
+      </w:r>
+      <w:proofErr w:type="spellEnd"/>
+      <w:r>
+        <w:t xml:space="preserve"> </w:t>
+      </w:r>
+      <w:proofErr w:type="spellStart"/>
+      <w:r>
+        <w:t>titulo</w:t>
+      </w:r>
+      <w:proofErr w:type="spellEnd"/>
+      <w:r>
+        <w:t xml:space="preserve">-principal no h2 e h3 da nossa página centralizando os subtítulos e aumentando o tamanho da fonte (em) que significa por exemplo 1em é igual a medida padrão do navegador </w:t>
+      </w:r>
+      <w:r>
+        <w:t>e 2</w:t>
+      </w:r>
+      <w:r>
+        <w:t>em é o dobro da medida padrão e assim por diante ao utilizarmos.</w:t>
+      </w:r>
+    </w:p>
+    <w:p>
+      <w:r>
+        <w:t xml:space="preserve">E para finalizar colocamos um espaço externo para baixo de 1em proximamente 16px com </w:t>
+      </w:r>
+      <w:proofErr w:type="spellStart"/>
+      <w:r>
+        <w:t>margin</w:t>
+      </w:r>
+      <w:proofErr w:type="spellEnd"/>
+      <w:r>
+        <w:t>: 0 0 1em.</w:t>
+      </w:r>
+    </w:p>
+    <w:p>
+      <w:r>
+        <w:t xml:space="preserve"> </w:t>
+      </w:r>
+      <w:r>
+        <w:drawing>
+          <wp:inline distT="0" distB="0" distL="0" distR="0" wp14:anchorId="736D5944" wp14:editId="45066935">
+            <wp:extent cx="1752845" cy="1009791"/>
+            <wp:effectExtent l="0" t="0" r="0" b="0"/>
+            <wp:docPr id="212" name="Imagem 212"/>
+            <wp:cNvGraphicFramePr>
+              <a:graphicFrameLocks xmlns:a="http://schemas.openxmlformats.org/drawingml/2006/main" noChangeAspect="1"/>
+            </wp:cNvGraphicFramePr>
+            <a:graphic xmlns:a="http://schemas.openxmlformats.org/drawingml/2006/main">
+              <a:graphicData uri="http://schemas.openxmlformats.org/drawingml/2006/picture">
+                <pic:pic xmlns:pic="http://schemas.openxmlformats.org/drawingml/2006/picture">
+                  <pic:nvPicPr>
+                    <pic:cNvPr id="1" name=""/>
+                    <pic:cNvPicPr/>
+                  </pic:nvPicPr>
+                  <pic:blipFill>
+                    <a:blip r:embed="rId149"/>
+                    <a:stretch>
+                      <a:fillRect/>
+                    </a:stretch>
+                  </pic:blipFill>
+                  <pic:spPr>
+                    <a:xfrm>
+                      <a:off x="0" y="0"/>
+                      <a:ext cx="1752845" cy="1009791"/>
+                    </a:xfrm>
+                    <a:prstGeom prst="rect">
+                      <a:avLst/>
+                    </a:prstGeom>
+                  </pic:spPr>
+                </pic:pic>
+              </a:graphicData>
+            </a:graphic>
+          </wp:inline>
+        </w:drawing>
+      </w:r>
+    </w:p>
+    <w:p>
+      <w:r>
+        <w:t xml:space="preserve">87 </w:t>
+      </w:r>
+      <w:r>
+        <w:t>– Para colocar um espaço entre os parágrafos da nossa seção principal, utilizamos o seguinte código:</w:t>
+      </w:r>
+    </w:p>
+    <w:p>
+      <w:r>
+        <w:drawing>
+          <wp:inline distT="0" distB="0" distL="0" distR="0" wp14:anchorId="788F789F" wp14:editId="2CEC35D9">
+            <wp:extent cx="1524213" cy="543001"/>
+            <wp:effectExtent l="0" t="0" r="0" b="9525"/>
+            <wp:docPr id="213" name="Imagem 213"/>
+            <wp:cNvGraphicFramePr>
+              <a:graphicFrameLocks xmlns:a="http://schemas.openxmlformats.org/drawingml/2006/main" noChangeAspect="1"/>
+            </wp:cNvGraphicFramePr>
+            <a:graphic xmlns:a="http://schemas.openxmlformats.org/drawingml/2006/main">
+              <a:graphicData uri="http://schemas.openxmlformats.org/drawingml/2006/picture">
+                <pic:pic xmlns:pic="http://schemas.openxmlformats.org/drawingml/2006/picture">
+                  <pic:nvPicPr>
+                    <pic:cNvPr id="1" name=""/>
+                    <pic:cNvPicPr/>
+                  </pic:nvPicPr>
+                  <pic:blipFill>
+                    <a:blip r:embed="rId150"/>
+                    <a:stretch>
+                      <a:fillRect/>
+                    </a:stretch>
+                  </pic:blipFill>
+                  <pic:spPr>
+                    <a:xfrm>
+                      <a:off x="0" y="0"/>
+                      <a:ext cx="1524213" cy="543001"/>
+                    </a:xfrm>
+                    <a:prstGeom prst="rect">
+                      <a:avLst/>
+                    </a:prstGeom>
+                  </pic:spPr>
+                </pic:pic>
+              </a:graphicData>
+            </a:graphic>
+          </wp:inline>
+        </w:drawing>
+      </w:r>
+    </w:p>
+    <w:p>
+      <w:r>
+        <w:t>88 – Utilizando o CSS como referência para aplicar as propriedades usamos os seguintes códigos:</w:t>
+      </w:r>
+    </w:p>
+    <w:p>
+      <w:pPr>
+        <w:pStyle w:val="PargrafodaLista"/>
+        <w:numPr>
+          <w:ilvl w:val="0"/>
+          <w:numId w:val="10"/>
+        </w:numPr>
+      </w:pPr>
+      <w:r>
+        <w:t xml:space="preserve">Encorpamos o texto deixando em negrito </w:t>
+      </w:r>
+      <w:proofErr w:type="gramStart"/>
+      <w:r>
+        <w:t>(.principal</w:t>
+      </w:r>
+      <w:proofErr w:type="gramEnd"/>
+      <w:r>
+        <w:t xml:space="preserve"> Strong)</w:t>
+      </w:r>
+    </w:p>
+    <w:p>
+      <w:pPr>
+        <w:pStyle w:val="PargrafodaLista"/>
+        <w:numPr>
+          <w:ilvl w:val="0"/>
+          <w:numId w:val="10"/>
+        </w:numPr>
+      </w:pPr>
+      <w:r>
+        <w:t xml:space="preserve">Deixamos o texto em </w:t>
+      </w:r>
+      <w:proofErr w:type="spellStart"/>
+      <w:r>
+        <w:t>italic</w:t>
+      </w:r>
+      <w:proofErr w:type="spellEnd"/>
+      <w:r>
+        <w:t xml:space="preserve"> </w:t>
+      </w:r>
+      <w:proofErr w:type="gramStart"/>
+      <w:r>
+        <w:t>(.principal</w:t>
+      </w:r>
+      <w:proofErr w:type="gramEnd"/>
+      <w:r>
+        <w:t xml:space="preserve"> em)</w:t>
+      </w:r>
+    </w:p>
+    <w:p>
+      <w:r>
+        <w:drawing>
+          <wp:inline distT="0" distB="0" distL="0" distR="0" wp14:anchorId="0FF305EC" wp14:editId="7EE96DDA">
+            <wp:extent cx="1781424" cy="1314633"/>
+            <wp:effectExtent l="0" t="0" r="9525" b="0"/>
+            <wp:docPr id="214" name="Imagem 214"/>
+            <wp:cNvGraphicFramePr>
+              <a:graphicFrameLocks xmlns:a="http://schemas.openxmlformats.org/drawingml/2006/main" noChangeAspect="1"/>
+            </wp:cNvGraphicFramePr>
+            <a:graphic xmlns:a="http://schemas.openxmlformats.org/drawingml/2006/main">
+              <a:graphicData uri="http://schemas.openxmlformats.org/drawingml/2006/picture">
+                <pic:pic xmlns:pic="http://schemas.openxmlformats.org/drawingml/2006/picture">
+                  <pic:nvPicPr>
+                    <pic:cNvPr id="1" name=""/>
+                    <pic:cNvPicPr/>
+                  </pic:nvPicPr>
+                  <pic:blipFill>
+                    <a:blip r:embed="rId151"/>
+                    <a:stretch>
+                      <a:fillRect/>
+                    </a:stretch>
+                  </pic:blipFill>
+                  <pic:spPr>
+                    <a:xfrm>
+                      <a:off x="0" y="0"/>
+                      <a:ext cx="1781424" cy="1314633"/>
+                    </a:xfrm>
+                    <a:prstGeom prst="rect">
+                      <a:avLst/>
+                    </a:prstGeom>
+                  </pic:spPr>
+                </pic:pic>
+              </a:graphicData>
+            </a:graphic>
+          </wp:inline>
+        </w:drawing>
+      </w:r>
+    </w:p>
+    <w:p>
+      <w:r>
+        <w:rPr>
+          <w:noProof/>
+        </w:rPr>
+        <mc:AlternateContent>
+          <mc:Choice Requires="wps">
+            <w:drawing>
+              <wp:anchor distT="0" distB="0" distL="114300" distR="114300" simplePos="0" relativeHeight="251729920" behindDoc="0" locked="0" layoutInCell="1" allowOverlap="1">
+                <wp:simplePos x="0" y="0"/>
+                <wp:positionH relativeFrom="column">
+                  <wp:posOffset>158114</wp:posOffset>
+                </wp:positionH>
+                <wp:positionV relativeFrom="paragraph">
+                  <wp:posOffset>160655</wp:posOffset>
+                </wp:positionV>
+                <wp:extent cx="1419225" cy="790575"/>
+                <wp:effectExtent l="0" t="0" r="66675" b="47625"/>
+                <wp:wrapNone/>
+                <wp:docPr id="217" name="Conector de Seta Reta 217"/>
+                <wp:cNvGraphicFramePr/>
+                <a:graphic xmlns:a="http://schemas.openxmlformats.org/drawingml/2006/main">
+                  <a:graphicData uri="http://schemas.microsoft.com/office/word/2010/wordprocessingShape">
+                    <wps:wsp>
+                      <wps:cNvCnPr/>
+                      <wps:spPr>
+                        <a:xfrm>
+                          <a:off x="0" y="0"/>
+                          <a:ext cx="1419225" cy="790575"/>
+                        </a:xfrm>
+                        <a:prstGeom prst="straightConnector1">
+                          <a:avLst/>
+                        </a:prstGeom>
+                        <a:ln>
+                          <a:tailEnd type="triangle"/>
+                        </a:ln>
+                      </wps:spPr>
+                      <wps:style>
+                        <a:lnRef idx="1">
+                          <a:schemeClr val="accent1"/>
+                        </a:lnRef>
+                        <a:fillRef idx="0">
+                          <a:schemeClr val="accent1"/>
+                        </a:fillRef>
+                        <a:effectRef idx="0">
+                          <a:schemeClr val="accent1"/>
+                        </a:effectRef>
+                        <a:fontRef idx="minor">
+                          <a:schemeClr val="tx1"/>
+                        </a:fontRef>
+                      </wps:style>
+                      <wps:bodyPr/>
+                    </wps:wsp>
+                  </a:graphicData>
+                </a:graphic>
+              </wp:anchor>
+            </w:drawing>
+          </mc:Choice>
+          <mc:Fallback>
+            <w:pict>
+              <v:shapetype w14:anchorId="50182E8A" id="_x0000_t32" coordsize="21600,21600" o:spt="32" o:oned="t" path="m,l21600,21600e" filled="f">
+                <v:path arrowok="t" fillok="f" o:connecttype="none"/>
+                <o:lock v:ext="edit" shapetype="t"/>
+              </v:shapetype>
+              <v:shape id="Conector de Seta Reta 217" o:spid="_x0000_s1026" type="#_x0000_t32" style="position:absolute;margin-left:12.45pt;margin-top:12.65pt;width:111.75pt;height:62.25pt;z-index:251729920;visibility:visible;mso-wrap-style:square;mso-wrap-distance-left:9pt;mso-wrap-distance-top:0;mso-wrap-distance-right:9pt;mso-wrap-distance-bottom:0;mso-position-horizontal:absolute;mso-position-horizontal-relative:text;mso-position-vertical:absolute;mso-position-vertical-relative:text" o:gfxdata="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" strokecolor="#4472c4 [3204]" strokeweight=".5pt">
+                <v:stroke endarrow="block" joinstyle="miter"/>
+              </v:shape>
+            </w:pict>
+          </mc:Fallback>
+        </mc:AlternateContent>
+      </w:r>
+      <w:r>
+        <w:drawing>
+          <wp:inline distT="0" distB="0" distL="0" distR="0" wp14:anchorId="6F561B6A" wp14:editId="2C9CEF58">
+            <wp:extent cx="5400040" cy="1524635"/>
+            <wp:effectExtent l="0" t="0" r="0" b="0"/>
+            <wp:docPr id="216" name="Imagem 216"/>
+            <wp:cNvGraphicFramePr>
+              <a:graphicFrameLocks xmlns:a="http://schemas.openxmlformats.org/drawingml/2006/main" noChangeAspect="1"/>
+            </wp:cNvGraphicFramePr>
+            <a:graphic xmlns:a="http://schemas.openxmlformats.org/drawingml/2006/main">
+              <a:graphicData uri="http://schemas.openxmlformats.org/drawingml/2006/picture">
+                <pic:pic xmlns:pic="http://schemas.openxmlformats.org/drawingml/2006/picture">
+                  <pic:nvPicPr>
+                    <pic:cNvPr id="1" name=""/>
+                    <pic:cNvPicPr/>
+                  </pic:nvPicPr>
+                  <pic:blipFill>
+                    <a:blip r:embed="rId152"/>
+                    <a:stretch>
+                      <a:fillRect/>
+                    </a:stretch>
+                  </pic:blipFill>
+                  <pic:spPr>
+                    <a:xfrm>
+                      <a:off x="0" y="0"/>
+                      <a:ext cx="5400040" cy="1524635"/>
+                    </a:xfrm>
+                    <a:prstGeom prst="rect">
+                      <a:avLst/>
+                    </a:prstGeom>
+                  </pic:spPr>
+                </pic:pic>
+              </a:graphicData>
+            </a:graphic>
+          </wp:inline>
+        </w:drawing>
+      </w:r>
+    </w:p>
+    <w:p>
+      <w:r>
+        <w:drawing>
+          <wp:inline distT="0" distB="0" distL="0" distR="0" wp14:anchorId="19F77EA4" wp14:editId="73D52527">
+            <wp:extent cx="4420217" cy="200053"/>
+            <wp:effectExtent l="0" t="0" r="0" b="9525"/>
+            <wp:docPr id="215" name="Imagem 215"/>
+            <wp:cNvGraphicFramePr>
+              <a:graphicFrameLocks xmlns:a="http://schemas.openxmlformats.org/drawingml/2006/main" noChangeAspect="1"/>
+            </wp:cNvGraphicFramePr>
+            <a:graphic xmlns:a="http://schemas.openxmlformats.org/drawingml/2006/main">
+              <a:graphicData uri="http://schemas.openxmlformats.org/drawingml/2006/picture">
+                <pic:pic xmlns:pic="http://schemas.openxmlformats.org/drawingml/2006/picture">
+                  <pic:nvPicPr>
+                    <pic:cNvPr id="1" name=""/>
+                    <pic:cNvPicPr/>
+                  </pic:nvPicPr>
+                  <pic:blipFill>
+                    <a:blip r:embed="rId153"/>
+                    <a:stretch>
+                      <a:fillRect/>
+                    </a:stretch>
+                  </pic:blipFill>
+                  <pic:spPr>
+                    <a:xfrm>
+                      <a:off x="0" y="0"/>
+                      <a:ext cx="4420217" cy="200053"/>
+                    </a:xfrm>
+                    <a:prstGeom prst="rect">
+                      <a:avLst/>
+                    </a:prstGeom>
+                  </pic:spPr>
+                </pic:pic>
+              </a:graphicData>
+            </a:graphic>
+          </wp:inline>
+        </w:drawing>
+      </w:r>
+    </w:p>
+    <w:p>
+      <w:r>
+        <w:t>89 – Diminuímos o tamanho da imagem benefícios utilizando o seguinte comando:</w:t>
+      </w:r>
+    </w:p>
+    <w:p>
+      <w:r>
+        <w:drawing>
+          <wp:inline distT="0" distB="0" distL="0" distR="0" wp14:anchorId="7F1C6F4E" wp14:editId="6C8ABA95">
+            <wp:extent cx="1486107" cy="581106"/>
+            <wp:effectExtent l="0" t="0" r="0" b="9525"/>
+            <wp:docPr id="218" name="Imagem 218"/>
+            <wp:cNvGraphicFramePr>
+              <a:graphicFrameLocks xmlns:a="http://schemas.openxmlformats.org/drawingml/2006/main" noChangeAspect="1"/>
+            </wp:cNvGraphicFramePr>
+            <a:graphic xmlns:a="http://schemas.openxmlformats.org/drawingml/2006/main">
+              <a:graphicData uri="http://schemas.openxmlformats.org/drawingml/2006/picture">
+                <pic:pic xmlns:pic="http://schemas.openxmlformats.org/drawingml/2006/picture">
+                  <pic:nvPicPr>
+                    <pic:cNvPr id="1" name=""/>
+                    <pic:cNvPicPr/>
+                  </pic:nvPicPr>
+                  <pic:blipFill>
+                    <a:blip r:embed="rId154"/>
+                    <a:stretch>
+                      <a:fillRect/>
+                    </a:stretch>
+                  </pic:blipFill>
+                  <pic:spPr>
+                    <a:xfrm>
+                      <a:off x="0" y="0"/>
+                      <a:ext cx="1486107" cy="581106"/>
+                    </a:xfrm>
+                    <a:prstGeom prst="rect">
+                      <a:avLst/>
+                    </a:prstGeom>
+                  </pic:spPr>
+                </pic:pic>
+              </a:graphicData>
+            </a:graphic>
+          </wp:inline>
+        </w:drawing>
+      </w:r>
+    </w:p>
+    <w:p>
+      <w:r>
+        <w:lastRenderedPageBreak/>
+        <w:t xml:space="preserve">90 – </w:t>
+      </w:r>
+      <w:bookmarkStart w:id="0" w:name="_GoBack"/>
+      <w:bookmarkEnd w:id="0"/>
+      <w:r>
+        <w:t xml:space="preserve">Inserimos uma imagem na </w:t>
+      </w:r>
+      <w:proofErr w:type="spellStart"/>
+      <w:r>
+        <w:t>section</w:t>
+      </w:r>
+      <w:proofErr w:type="spellEnd"/>
+      <w:r>
+        <w:t xml:space="preserve"> principal logo a baixo do h2 e diminuímos o tamanho dela.</w:t>
+      </w:r>
+    </w:p>
+    <w:p>
+      <w:r>
+        <w:drawing>
+          <wp:inline distT="0" distB="0" distL="0" distR="0" wp14:anchorId="657C2D56" wp14:editId="453EB1A9">
+            <wp:extent cx="5400040" cy="508000"/>
+            <wp:effectExtent l="0" t="0" r="0" b="6350"/>
+            <wp:docPr id="219" name="Imagem 219"/>
+            <wp:cNvGraphicFramePr>
+              <a:graphicFrameLocks xmlns:a="http://schemas.openxmlformats.org/drawingml/2006/main" noChangeAspect="1"/>
+            </wp:cNvGraphicFramePr>
+            <a:graphic xmlns:a="http://schemas.openxmlformats.org/drawingml/2006/main">
+              <a:graphicData uri="http://schemas.openxmlformats.org/drawingml/2006/picture">
+                <pic:pic xmlns:pic="http://schemas.openxmlformats.org/drawingml/2006/picture">
+                  <pic:nvPicPr>
+                    <pic:cNvPr id="1" name=""/>
+                    <pic:cNvPicPr/>
+                  </pic:nvPicPr>
+                  <pic:blipFill>
+                    <a:blip r:embed="rId155"/>
+                    <a:stretch>
+                      <a:fillRect/>
+                    </a:stretch>
+                  </pic:blipFill>
+                  <pic:spPr>
+                    <a:xfrm>
+                      <a:off x="0" y="0"/>
+                      <a:ext cx="5400040" cy="508000"/>
+                    </a:xfrm>
+                    <a:prstGeom prst="rect">
+                      <a:avLst/>
+                    </a:prstGeom>
+                  </pic:spPr>
+                </pic:pic>
+              </a:graphicData>
+            </a:graphic>
+          </wp:inline>
+        </w:drawing>
+      </w:r>
+      <w:r>
+        <w:drawing>
+          <wp:inline distT="0" distB="0" distL="0" distR="0" wp14:anchorId="115A3510" wp14:editId="15C0FCE5">
+            <wp:extent cx="1314633" cy="581106"/>
+            <wp:effectExtent l="0" t="0" r="0" b="9525"/>
+            <wp:docPr id="220" name="Imagem 220"/>
+            <wp:cNvGraphicFramePr>
+              <a:graphicFrameLocks xmlns:a="http://schemas.openxmlformats.org/drawingml/2006/main" noChangeAspect="1"/>
+            </wp:cNvGraphicFramePr>
+            <a:graphic xmlns:a="http://schemas.openxmlformats.org/drawingml/2006/main">
+              <a:graphicData uri="http://schemas.openxmlformats.org/drawingml/2006/picture">
+                <pic:pic xmlns:pic="http://schemas.openxmlformats.org/drawingml/2006/picture">
+                  <pic:nvPicPr>
+                    <pic:cNvPr id="1" name=""/>
+                    <pic:cNvPicPr/>
+                  </pic:nvPicPr>
+                  <pic:blipFill>
+                    <a:blip r:embed="rId156"/>
+                    <a:stretch>
+                      <a:fillRect/>
+                    </a:stretch>
+                  </pic:blipFill>
+                  <pic:spPr>
+                    <a:xfrm>
+                      <a:off x="0" y="0"/>
+                      <a:ext cx="1314633" cy="581106"/>
                     </a:xfrm>
                     <a:prstGeom prst="rect">
                       <a:avLst/>
@@ -12436,6 +13653,119 @@
     </w:lvl>
   </w:abstractNum>
   <w:abstractNum w:abstractNumId="7" w15:restartNumberingAfterBreak="0">
+    <w:nsid w:val="5C270E84"/>
+    <w:multiLevelType w:val="hybridMultilevel"/>
+    <w:tmpl w:val="17C43648"/>
+    <w:lvl w:ilvl="0" w:tplc="04160001">
+      <w:start w:val="1"/>
+      <w:numFmt w:val="bullet"/>
+      <w:lvlText w:val=""/>
+      <w:lvlJc w:val="left"/>
+      <w:pPr>
+        <w:ind w:left="720" w:hanging="360"/>
+      </w:pPr>
+      <w:rPr>
+        <w:rFonts w:ascii="Symbol" w:hAnsi="Symbol" w:hint="default"/>
+      </w:rPr>
+    </w:lvl>
+    <w:lvl w:ilvl="1" w:tplc="04160003" w:tentative="1">
+      <w:start w:val="1"/>
+      <w:numFmt w:val="bullet"/>
+      <w:lvlText w:val="o"/>
+      <w:lvlJc w:val="left"/>
+      <w:pPr>
+        <w:ind w:left="1440" w:hanging="360"/>
+      </w:pPr>
+      <w:rPr>
+        <w:rFonts w:ascii="Courier New" w:hAnsi="Courier New" w:cs="Courier New" w:hint="default"/>
+      </w:rPr>
+    </w:lvl>
+    <w:lvl w:ilvl="2" w:tplc="04160005" w:tentative="1">
+      <w:start w:val="1"/>
+      <w:numFmt w:val="bullet"/>
+      <w:lvlText w:val=""/>
+      <w:lvlJc w:val="left"/>
+      <w:pPr>
+        <w:ind w:left="2160" w:hanging="360"/>
+      </w:pPr>
+      <w:rPr>
+        <w:rFonts w:ascii="Wingdings" w:hAnsi="Wingdings" w:hint="default"/>
+      </w:rPr>
+    </w:lvl>
+    <w:lvl w:ilvl="3" w:tplc="04160001" w:tentative="1">
+      <w:start w:val="1"/>
+      <w:numFmt w:val="bullet"/>
+      <w:lvlText w:val=""/>
+      <w:lvlJc w:val="left"/>
+      <w:pPr>
+        <w:ind w:left="2880" w:hanging="360"/>
+      </w:pPr>
+      <w:rPr>
+        <w:rFonts w:ascii="Symbol" w:hAnsi="Symbol" w:hint="default"/>
+      </w:rPr>
+    </w:lvl>
+    <w:lvl w:ilvl="4" w:tplc="04160003" w:tentative="1">
+      <w:start w:val="1"/>
+      <w:numFmt w:val="bullet"/>
+      <w:lvlText w:val="o"/>
+      <w:lvlJc w:val="left"/>
+      <w:pPr>
+        <w:ind w:left="3600" w:hanging="360"/>
+      </w:pPr>
+      <w:rPr>
+        <w:rFonts w:ascii="Courier New" w:hAnsi="Courier New" w:cs="Courier New" w:hint="default"/>
+      </w:rPr>
+    </w:lvl>
+    <w:lvl w:ilvl="5" w:tplc="04160005" w:tentative="1">
+      <w:start w:val="1"/>
+      <w:numFmt w:val="bullet"/>
+      <w:lvlText w:val=""/>
+      <w:lvlJc w:val="left"/>
+      <w:pPr>
+        <w:ind w:left="4320" w:hanging="360"/>
+      </w:pPr>
+      <w:rPr>
+        <w:rFonts w:ascii="Wingdings" w:hAnsi="Wingdings" w:hint="default"/>
+      </w:rPr>
+    </w:lvl>
+    <w:lvl w:ilvl="6" w:tplc="04160001" w:tentative="1">
+      <w:start w:val="1"/>
+      <w:numFmt w:val="bullet"/>
+      <w:lvlText w:val=""/>
+      <w:lvlJc w:val="left"/>
+      <w:pPr>
+        <w:ind w:left="5040" w:hanging="360"/>
+      </w:pPr>
+      <w:rPr>
+        <w:rFonts w:ascii="Symbol" w:hAnsi="Symbol" w:hint="default"/>
+      </w:rPr>
+    </w:lvl>
+    <w:lvl w:ilvl="7" w:tplc="04160003" w:tentative="1">
+      <w:start w:val="1"/>
+      <w:numFmt w:val="bullet"/>
+      <w:lvlText w:val="o"/>
+      <w:lvlJc w:val="left"/>
+      <w:pPr>
+        <w:ind w:left="5760" w:hanging="360"/>
+      </w:pPr>
+      <w:rPr>
+        <w:rFonts w:ascii="Courier New" w:hAnsi="Courier New" w:cs="Courier New" w:hint="default"/>
+      </w:rPr>
+    </w:lvl>
+    <w:lvl w:ilvl="8" w:tplc="04160005" w:tentative="1">
+      <w:start w:val="1"/>
+      <w:numFmt w:val="bullet"/>
+      <w:lvlText w:val=""/>
+      <w:lvlJc w:val="left"/>
+      <w:pPr>
+        <w:ind w:left="6480" w:hanging="360"/>
+      </w:pPr>
+      <w:rPr>
+        <w:rFonts w:ascii="Wingdings" w:hAnsi="Wingdings" w:hint="default"/>
+      </w:rPr>
+    </w:lvl>
+  </w:abstractNum>
+  <w:abstractNum w:abstractNumId="8" w15:restartNumberingAfterBreak="0">
     <w:nsid w:val="5D2C3BB7"/>
     <w:multiLevelType w:val="hybridMultilevel"/>
     <w:tmpl w:val="152225AA"/>
@@ -12524,7 +13854,7 @@
       </w:pPr>
     </w:lvl>
   </w:abstractNum>
-  <w:abstractNum w:abstractNumId="8" w15:restartNumberingAfterBreak="0">
+  <w:abstractNum w:abstractNumId="9" w15:restartNumberingAfterBreak="0">
     <w:nsid w:val="799B0927"/>
     <w:multiLevelType w:val="hybridMultilevel"/>
     <w:tmpl w:val="B6183382"/>
@@ -12641,7 +13971,7 @@
     <w:abstractNumId w:val="2"/>
   </w:num>
   <w:num w:numId="2">
-    <w:abstractNumId w:val="7"/>
+    <w:abstractNumId w:val="8"/>
   </w:num>
   <w:num w:numId="3">
     <w:abstractNumId w:val="4"/>
@@ -12662,7 +13992,10 @@
     <w:abstractNumId w:val="1"/>
   </w:num>
   <w:num w:numId="9">
-    <w:abstractNumId w:val="8"/>
+    <w:abstractNumId w:val="9"/>
+  </w:num>
+  <w:num w:numId="10">
+    <w:abstractNumId w:val="7"/>
   </w:num>
 </w:numbering>
 </file>
@@ -13429,7 +14762,7 @@
 </file>
 
 <file path=customXml/itemProps1.xml><?xml version="1.0" encoding="utf-8"?>
-<ds:datastoreItem xmlns:ds="http://schemas.openxmlformats.org/officeDocument/2006/customXml" ds:itemID="{BE2AE5DB-2545-4A7B-AFAF-CA1D0F2DF607}">
+<ds:datastoreItem xmlns:ds="http://schemas.openxmlformats.org/officeDocument/2006/customXml" ds:itemID="{729F7B7E-7896-43EB-8C09-2FA1D6B9E33F}">
   <ds:schemaRefs>
     <ds:schemaRef ds:uri="http://schemas.openxmlformats.org/officeDocument/2006/bibliography"/>
   </ds:schemaRefs>

</xml_diff>

<commit_message>
atualização do dia 01/10/26
</commit_message>
<xml_diff>
--- a/apostila/Projeto Space For Men.docx
+++ b/apostila/Projeto Space For Men.docx
@@ -12987,6 +12987,9 @@
     </w:p>
     <w:p>
       <w:r>
+        <w:rPr>
+          <w:noProof/>
+        </w:rPr>
         <w:drawing>
           <wp:inline distT="0" distB="0" distL="0" distR="0" wp14:anchorId="14499F77" wp14:editId="657DDD7C">
             <wp:extent cx="1295581" cy="743054"/>
@@ -13024,6 +13027,9 @@
         </w:drawing>
       </w:r>
       <w:r>
+        <w:rPr>
+          <w:noProof/>
+        </w:rPr>
         <w:drawing>
           <wp:inline distT="0" distB="0" distL="0" distR="0" wp14:anchorId="1C139206" wp14:editId="3821180A">
             <wp:extent cx="5400040" cy="943610"/>
@@ -13154,6 +13160,9 @@
     </w:p>
     <w:p>
       <w:r>
+        <w:rPr>
+          <w:noProof/>
+        </w:rPr>
         <w:drawing>
           <wp:inline distT="0" distB="0" distL="0" distR="0" wp14:anchorId="6D24BAAF" wp14:editId="4EA50A35">
             <wp:extent cx="2019582" cy="1095528"/>
@@ -13198,6 +13207,9 @@
     </w:p>
     <w:p>
       <w:r>
+        <w:rPr>
+          <w:noProof/>
+        </w:rPr>
         <w:drawing>
           <wp:inline distT="0" distB="0" distL="0" distR="0" wp14:anchorId="20725765" wp14:editId="5BD59E87">
             <wp:extent cx="5400040" cy="1251585"/>
@@ -13235,6 +13247,9 @@
         </w:drawing>
       </w:r>
       <w:r>
+        <w:rPr>
+          <w:noProof/>
+        </w:rPr>
         <w:drawing>
           <wp:inline distT="0" distB="0" distL="0" distR="0" wp14:anchorId="417EFAF0" wp14:editId="4048AF1D">
             <wp:extent cx="1933845" cy="924054"/>
@@ -13296,181 +13311,1530 @@
           <w:rPr>
             <w:rStyle w:val="Hyperlink"/>
           </w:rPr>
-          <w:t>http</w:t>
+          <w:t>http://fonts.google.com</w:t>
+        </w:r>
+      </w:hyperlink>
+      <w:r>
+        <w:t xml:space="preserve"> para escolher a fonte que </w:t>
+      </w:r>
+      <w:r>
+        <w:t>desejamos, então copiamos o código que é gerado para colar no HTML e o CSS.</w:t>
+      </w:r>
+    </w:p>
+    <w:p>
+      <w:r>
+        <w:t xml:space="preserve">Lembrando que o no HTML precisamos colar dentro do </w:t>
+      </w:r>
+      <w:proofErr w:type="spellStart"/>
+      <w:r>
+        <w:t>head</w:t>
+      </w:r>
+      <w:proofErr w:type="spellEnd"/>
+      <w:r>
+        <w:t xml:space="preserve"> e no CSS colocamos onde queremos aplicar a fonte.</w:t>
+      </w:r>
+    </w:p>
+    <w:p>
+      <w:r>
+        <w:rPr>
+          <w:noProof/>
+        </w:rPr>
+        <w:drawing>
+          <wp:inline distT="0" distB="0" distL="0" distR="0" wp14:anchorId="4D5EDD3C" wp14:editId="61B7786C">
+            <wp:extent cx="4419600" cy="3300668"/>
+            <wp:effectExtent l="0" t="0" r="0" b="0"/>
+            <wp:docPr id="227" name="Imagem 227"/>
+            <wp:cNvGraphicFramePr>
+              <a:graphicFrameLocks xmlns:a="http://schemas.openxmlformats.org/drawingml/2006/main" noChangeAspect="1"/>
+            </wp:cNvGraphicFramePr>
+            <a:graphic xmlns:a="http://schemas.openxmlformats.org/drawingml/2006/main">
+              <a:graphicData uri="http://schemas.openxmlformats.org/drawingml/2006/picture">
+                <pic:pic xmlns:pic="http://schemas.openxmlformats.org/drawingml/2006/picture">
+                  <pic:nvPicPr>
+                    <pic:cNvPr id="1" name=""/>
+                    <pic:cNvPicPr/>
+                  </pic:nvPicPr>
+                  <pic:blipFill>
+                    <a:blip r:embed="rId163"/>
+                    <a:stretch>
+                      <a:fillRect/>
+                    </a:stretch>
+                  </pic:blipFill>
+                  <pic:spPr>
+                    <a:xfrm>
+                      <a:off x="0" y="0"/>
+                      <a:ext cx="4486720" cy="3350795"/>
+                    </a:xfrm>
+                    <a:prstGeom prst="rect">
+                      <a:avLst/>
+                    </a:prstGeom>
+                  </pic:spPr>
+                </pic:pic>
+              </a:graphicData>
+            </a:graphic>
+          </wp:inline>
+        </w:drawing>
+      </w:r>
+    </w:p>
+    <w:p>
+      <w:r>
+        <w:t xml:space="preserve">95 </w:t>
+      </w:r>
+      <w:r>
+        <w:t xml:space="preserve">– Para inserir o mapa no site, acessamos o Google Maps, digitamos na barra de pesquisa o estabelecimento desejado, no nosso caso a Barbearia </w:t>
+      </w:r>
+      <w:proofErr w:type="spellStart"/>
+      <w:r>
+        <w:t>Spece</w:t>
+      </w:r>
+      <w:proofErr w:type="spellEnd"/>
+      <w:r>
+        <w:t xml:space="preserve"> for </w:t>
+      </w:r>
+      <w:proofErr w:type="spellStart"/>
+      <w:r>
+        <w:t>Men</w:t>
+      </w:r>
+      <w:proofErr w:type="spellEnd"/>
+      <w:r>
+        <w:t>, no campo parecido com 3 traços, terá a seguinte opção “Compartilhar ou incorporar mapa”, acessamos e copiamos o link do HTML.</w:t>
+      </w:r>
+    </w:p>
+    <w:p>
+      <w:pPr>
+        <w:rPr>
+          <w:noProof/>
+        </w:rPr>
+      </w:pPr>
+      <w:r>
+        <w:rPr>
+          <w:noProof/>
+        </w:rPr>
+        <w:t xml:space="preserve"> </w:t>
+      </w:r>
+      <w:r>
+        <w:rPr>
+          <w:noProof/>
+        </w:rPr>
+        <w:drawing>
+          <wp:inline distT="0" distB="0" distL="0" distR="0" wp14:anchorId="367FE739" wp14:editId="1B836982">
+            <wp:extent cx="2677129" cy="2209800"/>
+            <wp:effectExtent l="0" t="0" r="9525" b="0"/>
+            <wp:docPr id="228" name="Imagem 228"/>
+            <wp:cNvGraphicFramePr>
+              <a:graphicFrameLocks xmlns:a="http://schemas.openxmlformats.org/drawingml/2006/main" noChangeAspect="1"/>
+            </wp:cNvGraphicFramePr>
+            <a:graphic xmlns:a="http://schemas.openxmlformats.org/drawingml/2006/main">
+              <a:graphicData uri="http://schemas.openxmlformats.org/drawingml/2006/picture">
+                <pic:pic xmlns:pic="http://schemas.openxmlformats.org/drawingml/2006/picture">
+                  <pic:nvPicPr>
+                    <pic:cNvPr id="1" name=""/>
+                    <pic:cNvPicPr/>
+                  </pic:nvPicPr>
+                  <pic:blipFill>
+                    <a:blip r:embed="rId164"/>
+                    <a:stretch>
+                      <a:fillRect/>
+                    </a:stretch>
+                  </pic:blipFill>
+                  <pic:spPr>
+                    <a:xfrm>
+                      <a:off x="0" y="0"/>
+                      <a:ext cx="2701418" cy="2229849"/>
+                    </a:xfrm>
+                    <a:prstGeom prst="rect">
+                      <a:avLst/>
+                    </a:prstGeom>
+                  </pic:spPr>
+                </pic:pic>
+              </a:graphicData>
+            </a:graphic>
+          </wp:inline>
+        </w:drawing>
+      </w:r>
+    </w:p>
+    <w:p>
+      <w:pPr>
+        <w:rPr>
+          <w:noProof/>
+        </w:rPr>
+      </w:pPr>
+    </w:p>
+    <w:p>
+      <w:pPr>
+        <w:rPr>
+          <w:noProof/>
+        </w:rPr>
+      </w:pPr>
+      <w:r>
+        <w:rPr>
+          <w:noProof/>
+        </w:rPr>
+        <w:lastRenderedPageBreak/>
+        <w:t>96 – Paramelhorar a visualização do nosso mapa no site colocamos para que ele ocupe 100% de largura e 300px de altura do iframe.</w:t>
+      </w:r>
+    </w:p>
+    <w:p>
+      <w:r>
+        <w:drawing>
+          <wp:inline distT="0" distB="0" distL="0" distR="0" wp14:anchorId="6C6A77D8" wp14:editId="14606F1B">
+            <wp:extent cx="5400040" cy="547370"/>
+            <wp:effectExtent l="0" t="0" r="0" b="5080"/>
+            <wp:docPr id="229" name="Imagem 229"/>
+            <wp:cNvGraphicFramePr>
+              <a:graphicFrameLocks xmlns:a="http://schemas.openxmlformats.org/drawingml/2006/main" noChangeAspect="1"/>
+            </wp:cNvGraphicFramePr>
+            <a:graphic xmlns:a="http://schemas.openxmlformats.org/drawingml/2006/main">
+              <a:graphicData uri="http://schemas.openxmlformats.org/drawingml/2006/picture">
+                <pic:pic xmlns:pic="http://schemas.openxmlformats.org/drawingml/2006/picture">
+                  <pic:nvPicPr>
+                    <pic:cNvPr id="1" name=""/>
+                    <pic:cNvPicPr/>
+                  </pic:nvPicPr>
+                  <pic:blipFill>
+                    <a:blip r:embed="rId165"/>
+                    <a:stretch>
+                      <a:fillRect/>
+                    </a:stretch>
+                  </pic:blipFill>
+                  <pic:spPr>
+                    <a:xfrm>
+                      <a:off x="0" y="0"/>
+                      <a:ext cx="5400040" cy="547370"/>
+                    </a:xfrm>
+                    <a:prstGeom prst="rect">
+                      <a:avLst/>
+                    </a:prstGeom>
+                  </pic:spPr>
+                </pic:pic>
+              </a:graphicData>
+            </a:graphic>
+          </wp:inline>
+        </w:drawing>
+      </w:r>
+    </w:p>
+    <w:p>
+      <w:r>
+        <w:t>97- Para deixar a nossa seção mapa de uma forma mais estilizada vamos dar um espaço interno para cima e para baixo de 3em e 0 dos lados.</w:t>
+      </w:r>
+    </w:p>
+    <w:p>
+      <w:r>
+        <w:drawing>
+          <wp:inline distT="0" distB="0" distL="0" distR="0" wp14:anchorId="29C93B6F" wp14:editId="370ABB19">
+            <wp:extent cx="1543265" cy="609685"/>
+            <wp:effectExtent l="0" t="0" r="0" b="0"/>
+            <wp:docPr id="230" name="Imagem 230"/>
+            <wp:cNvGraphicFramePr>
+              <a:graphicFrameLocks xmlns:a="http://schemas.openxmlformats.org/drawingml/2006/main" noChangeAspect="1"/>
+            </wp:cNvGraphicFramePr>
+            <a:graphic xmlns:a="http://schemas.openxmlformats.org/drawingml/2006/main">
+              <a:graphicData uri="http://schemas.openxmlformats.org/drawingml/2006/picture">
+                <pic:pic xmlns:pic="http://schemas.openxmlformats.org/drawingml/2006/picture">
+                  <pic:nvPicPr>
+                    <pic:cNvPr id="1" name=""/>
+                    <pic:cNvPicPr/>
+                  </pic:nvPicPr>
+                  <pic:blipFill>
+                    <a:blip r:embed="rId166"/>
+                    <a:stretch>
+                      <a:fillRect/>
+                    </a:stretch>
+                  </pic:blipFill>
+                  <pic:spPr>
+                    <a:xfrm>
+                      <a:off x="0" y="0"/>
+                      <a:ext cx="1543265" cy="609685"/>
+                    </a:xfrm>
+                    <a:prstGeom prst="rect">
+                      <a:avLst/>
+                    </a:prstGeom>
+                  </pic:spPr>
+                </pic:pic>
+              </a:graphicData>
+            </a:graphic>
+          </wp:inline>
+        </w:drawing>
+      </w:r>
+    </w:p>
+    <w:p>
+      <w:r>
+        <w:t>98 – Demos um espaço para baixo no parágrafo da seção mapa e centralizamos o texto.</w:t>
+      </w:r>
+    </w:p>
+    <w:p>
+      <w:r>
+        <w:drawing>
+          <wp:inline distT="0" distB="0" distL="0" distR="0" wp14:anchorId="03CB68E8" wp14:editId="46A87A79">
+            <wp:extent cx="1857634" cy="914528"/>
+            <wp:effectExtent l="0" t="0" r="0" b="0"/>
+            <wp:docPr id="233" name="Imagem 233"/>
+            <wp:cNvGraphicFramePr>
+              <a:graphicFrameLocks xmlns:a="http://schemas.openxmlformats.org/drawingml/2006/main" noChangeAspect="1"/>
+            </wp:cNvGraphicFramePr>
+            <a:graphic xmlns:a="http://schemas.openxmlformats.org/drawingml/2006/main">
+              <a:graphicData uri="http://schemas.openxmlformats.org/drawingml/2006/picture">
+                <pic:pic xmlns:pic="http://schemas.openxmlformats.org/drawingml/2006/picture">
+                  <pic:nvPicPr>
+                    <pic:cNvPr id="1" name=""/>
+                    <pic:cNvPicPr/>
+                  </pic:nvPicPr>
+                  <pic:blipFill>
+                    <a:blip r:embed="rId167"/>
+                    <a:stretch>
+                      <a:fillRect/>
+                    </a:stretch>
+                  </pic:blipFill>
+                  <pic:spPr>
+                    <a:xfrm>
+                      <a:off x="0" y="0"/>
+                      <a:ext cx="1857634" cy="914528"/>
+                    </a:xfrm>
+                    <a:prstGeom prst="rect">
+                      <a:avLst/>
+                    </a:prstGeom>
+                  </pic:spPr>
+                </pic:pic>
+              </a:graphicData>
+            </a:graphic>
+          </wp:inline>
+        </w:drawing>
+      </w:r>
+    </w:p>
+    <w:p>
+      <w:r>
+        <w:t xml:space="preserve">99 – Já que estamos mexendo com </w:t>
+      </w:r>
+      <w:proofErr w:type="spellStart"/>
+      <w:r>
+        <w:t>iframe</w:t>
+      </w:r>
+      <w:proofErr w:type="spellEnd"/>
+      <w:r>
+        <w:t xml:space="preserve"> vamos aprender a</w:t>
+      </w:r>
+      <w:r>
+        <w:t xml:space="preserve"> incorporar</w:t>
+      </w:r>
+      <w:r>
+        <w:t xml:space="preserve"> um vídeo do </w:t>
+      </w:r>
+      <w:proofErr w:type="spellStart"/>
+      <w:r>
+        <w:t>youtube</w:t>
+      </w:r>
+      <w:proofErr w:type="spellEnd"/>
+      <w:r>
+        <w:t>.</w:t>
+      </w:r>
+    </w:p>
+    <w:p>
+      <w:r>
+        <w:t xml:space="preserve">Vamos entrar no </w:t>
+      </w:r>
+      <w:proofErr w:type="spellStart"/>
+      <w:r>
+        <w:t>youtube</w:t>
+      </w:r>
+      <w:proofErr w:type="spellEnd"/>
+      <w:r>
+        <w:t xml:space="preserve"> no seguinte endereço: </w:t>
+      </w:r>
+      <w:r>
+        <w:t>https://www.youtube.com/results?search_query=scissor%2Bcut%2Bshort%2Bback</w:t>
+      </w:r>
+    </w:p>
+    <w:p>
+      <w:r>
+        <w:t xml:space="preserve">Na página do </w:t>
+      </w:r>
+      <w:proofErr w:type="spellStart"/>
+      <w:r>
+        <w:t>youtube</w:t>
+      </w:r>
+      <w:proofErr w:type="spellEnd"/>
+      <w:r>
+        <w:t xml:space="preserve"> vai aparecer um campo chamado “compartilhar” ao clicar nesse campo vai aparecer o ícone de </w:t>
+      </w:r>
+      <w:proofErr w:type="spellStart"/>
+      <w:r>
+        <w:t>tag</w:t>
+      </w:r>
+      <w:proofErr w:type="spellEnd"/>
+      <w:r>
+        <w:t xml:space="preserve"> “&lt;&gt;” (incorporar) para copiar o link e colar na página.</w:t>
+      </w:r>
+    </w:p>
+    <w:p>
+      <w:r>
+        <w:drawing>
+          <wp:inline distT="0" distB="0" distL="0" distR="0" wp14:anchorId="23270EF0" wp14:editId="01DEA6E2">
+            <wp:extent cx="4324954" cy="2333951"/>
+            <wp:effectExtent l="0" t="0" r="0" b="9525"/>
+            <wp:docPr id="232" name="Imagem 232"/>
+            <wp:cNvGraphicFramePr>
+              <a:graphicFrameLocks xmlns:a="http://schemas.openxmlformats.org/drawingml/2006/main" noChangeAspect="1"/>
+            </wp:cNvGraphicFramePr>
+            <a:graphic xmlns:a="http://schemas.openxmlformats.org/drawingml/2006/main">
+              <a:graphicData uri="http://schemas.openxmlformats.org/drawingml/2006/picture">
+                <pic:pic xmlns:pic="http://schemas.openxmlformats.org/drawingml/2006/picture">
+                  <pic:nvPicPr>
+                    <pic:cNvPr id="1" name=""/>
+                    <pic:cNvPicPr/>
+                  </pic:nvPicPr>
+                  <pic:blipFill>
+                    <a:blip r:embed="rId168"/>
+                    <a:stretch>
+                      <a:fillRect/>
+                    </a:stretch>
+                  </pic:blipFill>
+                  <pic:spPr>
+                    <a:xfrm>
+                      <a:off x="0" y="0"/>
+                      <a:ext cx="4324954" cy="2333951"/>
+                    </a:xfrm>
+                    <a:prstGeom prst="rect">
+                      <a:avLst/>
+                    </a:prstGeom>
+                  </pic:spPr>
+                </pic:pic>
+              </a:graphicData>
+            </a:graphic>
+          </wp:inline>
+        </w:drawing>
+      </w:r>
+    </w:p>
+    <w:p>
+      <w:r>
+        <w:t xml:space="preserve">100 – Para trabalhar com o vídeo no </w:t>
+      </w:r>
+      <w:proofErr w:type="spellStart"/>
+      <w:r>
+        <w:t>css</w:t>
+      </w:r>
+      <w:proofErr w:type="spellEnd"/>
+      <w:r>
+        <w:t xml:space="preserve">, adicionamos uma </w:t>
+      </w:r>
+      <w:proofErr w:type="spellStart"/>
+      <w:r>
+        <w:t>div</w:t>
+      </w:r>
+      <w:proofErr w:type="spellEnd"/>
+      <w:r>
+        <w:t xml:space="preserve"> com a </w:t>
+      </w:r>
+      <w:proofErr w:type="spellStart"/>
+      <w:r>
+        <w:t>class</w:t>
+      </w:r>
+      <w:proofErr w:type="spellEnd"/>
+      <w:r>
+        <w:t xml:space="preserve"> vídeo </w:t>
+      </w:r>
+      <w:r>
+        <w:t>entorno do link.</w:t>
+      </w:r>
+    </w:p>
+    <w:p>
+      <w:r>
+        <w:drawing>
+          <wp:inline distT="0" distB="0" distL="0" distR="0" wp14:anchorId="02BCE2AE" wp14:editId="4C942A02">
+            <wp:extent cx="5400040" cy="661670"/>
+            <wp:effectExtent l="0" t="0" r="0" b="5080"/>
+            <wp:docPr id="234" name="Imagem 234"/>
+            <wp:cNvGraphicFramePr>
+              <a:graphicFrameLocks xmlns:a="http://schemas.openxmlformats.org/drawingml/2006/main" noChangeAspect="1"/>
+            </wp:cNvGraphicFramePr>
+            <a:graphic xmlns:a="http://schemas.openxmlformats.org/drawingml/2006/main">
+              <a:graphicData uri="http://schemas.openxmlformats.org/drawingml/2006/picture">
+                <pic:pic xmlns:pic="http://schemas.openxmlformats.org/drawingml/2006/picture">
+                  <pic:nvPicPr>
+                    <pic:cNvPr id="1" name=""/>
+                    <pic:cNvPicPr/>
+                  </pic:nvPicPr>
+                  <pic:blipFill>
+                    <a:blip r:embed="rId169"/>
+                    <a:stretch>
+                      <a:fillRect/>
+                    </a:stretch>
+                  </pic:blipFill>
+                  <pic:spPr>
+                    <a:xfrm>
+                      <a:off x="0" y="0"/>
+                      <a:ext cx="5400040" cy="661670"/>
+                    </a:xfrm>
+                    <a:prstGeom prst="rect">
+                      <a:avLst/>
+                    </a:prstGeom>
+                  </pic:spPr>
+                </pic:pic>
+              </a:graphicData>
+            </a:graphic>
+          </wp:inline>
+        </w:drawing>
+      </w:r>
+    </w:p>
+    <w:p/>
+    <w:p>
+      <w:r>
+        <w:lastRenderedPageBreak/>
+        <w:t xml:space="preserve">101 – No </w:t>
+      </w:r>
+      <w:proofErr w:type="spellStart"/>
+      <w:r>
+        <w:t>css</w:t>
+      </w:r>
+      <w:proofErr w:type="spellEnd"/>
+      <w:r>
+        <w:t xml:space="preserve"> da </w:t>
+      </w:r>
+      <w:proofErr w:type="spellStart"/>
+      <w:r>
+        <w:t>class</w:t>
+      </w:r>
+      <w:proofErr w:type="spellEnd"/>
+      <w:r>
+        <w:t xml:space="preserve"> vídeo vamos colocar uma largura para vídeo 560px e vamos dar um espaço externo para cima e para baixo de 1em auto.</w:t>
+      </w:r>
+    </w:p>
+    <w:p>
+      <w:r>
+        <w:drawing>
+          <wp:inline distT="0" distB="0" distL="0" distR="0" wp14:anchorId="124DED83" wp14:editId="0043296F">
+            <wp:extent cx="1733792" cy="800212"/>
+            <wp:effectExtent l="0" t="0" r="0" b="0"/>
+            <wp:docPr id="235" name="Imagem 235"/>
+            <wp:cNvGraphicFramePr>
+              <a:graphicFrameLocks xmlns:a="http://schemas.openxmlformats.org/drawingml/2006/main" noChangeAspect="1"/>
+            </wp:cNvGraphicFramePr>
+            <a:graphic xmlns:a="http://schemas.openxmlformats.org/drawingml/2006/main">
+              <a:graphicData uri="http://schemas.openxmlformats.org/drawingml/2006/picture">
+                <pic:pic xmlns:pic="http://schemas.openxmlformats.org/drawingml/2006/picture">
+                  <pic:nvPicPr>
+                    <pic:cNvPr id="1" name=""/>
+                    <pic:cNvPicPr/>
+                  </pic:nvPicPr>
+                  <pic:blipFill>
+                    <a:blip r:embed="rId170"/>
+                    <a:stretch>
+                      <a:fillRect/>
+                    </a:stretch>
+                  </pic:blipFill>
+                  <pic:spPr>
+                    <a:xfrm>
+                      <a:off x="0" y="0"/>
+                      <a:ext cx="1733792" cy="800212"/>
+                    </a:xfrm>
+                    <a:prstGeom prst="rect">
+                      <a:avLst/>
+                    </a:prstGeom>
+                  </pic:spPr>
+                </pic:pic>
+              </a:graphicData>
+            </a:graphic>
+          </wp:inline>
+        </w:drawing>
+      </w:r>
+    </w:p>
+    <w:p>
+      <w:r>
+        <w:t xml:space="preserve">102 – Criamos uma </w:t>
+      </w:r>
+      <w:proofErr w:type="spellStart"/>
+      <w:r>
+        <w:t>div</w:t>
+      </w:r>
+      <w:proofErr w:type="spellEnd"/>
+      <w:r>
+        <w:t xml:space="preserve"> com a </w:t>
+      </w:r>
+      <w:proofErr w:type="spellStart"/>
+      <w:r>
+        <w:t>class</w:t>
+      </w:r>
+      <w:proofErr w:type="spellEnd"/>
+      <w:r>
+        <w:t xml:space="preserve"> chamada conteúdo-</w:t>
+      </w:r>
+      <w:proofErr w:type="spellStart"/>
+      <w:r>
+        <w:t>beneficios</w:t>
+      </w:r>
+      <w:proofErr w:type="spellEnd"/>
+      <w:r>
+        <w:t xml:space="preserve"> que envolve a lista e a imagem benefícios para trabalhar com o espaço entre elas.</w:t>
+      </w:r>
+    </w:p>
+    <w:p>
+      <w:r>
+        <w:rPr>
+          <w:noProof/>
+        </w:rPr>
+        <mc:AlternateContent>
+          <mc:Choice Requires="wps">
+            <w:drawing>
+              <wp:anchor distT="0" distB="0" distL="114300" distR="114300" simplePos="0" relativeHeight="251731968" behindDoc="0" locked="0" layoutInCell="1" allowOverlap="1">
+                <wp:simplePos x="0" y="0"/>
+                <wp:positionH relativeFrom="column">
+                  <wp:posOffset>2491739</wp:posOffset>
+                </wp:positionH>
+                <wp:positionV relativeFrom="paragraph">
+                  <wp:posOffset>93345</wp:posOffset>
+                </wp:positionV>
+                <wp:extent cx="1104900" cy="514350"/>
+                <wp:effectExtent l="38100" t="0" r="19050" b="57150"/>
+                <wp:wrapNone/>
+                <wp:docPr id="238" name="Conector de Seta Reta 238"/>
+                <wp:cNvGraphicFramePr/>
+                <a:graphic xmlns:a="http://schemas.openxmlformats.org/drawingml/2006/main">
+                  <a:graphicData uri="http://schemas.microsoft.com/office/word/2010/wordprocessingShape">
+                    <wps:wsp>
+                      <wps:cNvCnPr/>
+                      <wps:spPr>
+                        <a:xfrm flipH="1">
+                          <a:off x="0" y="0"/>
+                          <a:ext cx="1104900" cy="514350"/>
+                        </a:xfrm>
+                        <a:prstGeom prst="straightConnector1">
+                          <a:avLst/>
+                        </a:prstGeom>
+                        <a:ln>
+                          <a:tailEnd type="triangle"/>
+                        </a:ln>
+                      </wps:spPr>
+                      <wps:style>
+                        <a:lnRef idx="1">
+                          <a:schemeClr val="accent1"/>
+                        </a:lnRef>
+                        <a:fillRef idx="0">
+                          <a:schemeClr val="accent1"/>
+                        </a:fillRef>
+                        <a:effectRef idx="0">
+                          <a:schemeClr val="accent1"/>
+                        </a:effectRef>
+                        <a:fontRef idx="minor">
+                          <a:schemeClr val="tx1"/>
+                        </a:fontRef>
+                      </wps:style>
+                      <wps:bodyPr/>
+                    </wps:wsp>
+                  </a:graphicData>
+                </a:graphic>
+                <wp14:sizeRelH relativeFrom="margin">
+                  <wp14:pctWidth>0</wp14:pctWidth>
+                </wp14:sizeRelH>
+                <wp14:sizeRelV relativeFrom="margin">
+                  <wp14:pctHeight>0</wp14:pctHeight>
+                </wp14:sizeRelV>
+              </wp:anchor>
+            </w:drawing>
+          </mc:Choice>
+          <mc:Fallback>
+            <w:pict>
+              <v:shapetype w14:anchorId="7701E639" id="_x0000_t32" coordsize="21600,21600" o:spt="32" o:oned="t" path="m,l21600,21600e" filled="f">
+                <v:path arrowok="t" fillok="f" o:connecttype="none"/>
+                <o:lock v:ext="edit" shapetype="t"/>
+              </v:shapetype>
+              <v:shape id="Conector de Seta Reta 238" o:spid="_x0000_s1026" type="#_x0000_t32" style="position:absolute;margin-left:196.2pt;margin-top:7.35pt;width:87pt;height:40.5pt;flip:x;z-index:251731968;visibility:visible;mso-wrap-style:square;mso-width-percent:0;mso-height-percent:0;mso-wrap-distance-left:9pt;mso-wrap-distance-top:0;mso-wrap-distance-right:9pt;mso-wrap-distance-bottom:0;mso-position-horizontal:absolute;mso-position-horizontal-relative:text;mso-position-vertical:absolute;mso-position-vertical-relative:text;mso-width-percent:0;mso-height-percent:0;mso-width-relative:margin;mso-height-relative:margin" o:gfxdata="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" strokecolor="#4472c4 [3204]" strokeweight=".5pt">
+                <v:stroke endarrow="block" joinstyle="miter"/>
+              </v:shape>
+            </w:pict>
+          </mc:Fallback>
+        </mc:AlternateContent>
+      </w:r>
+      <w:r>
+        <w:rPr>
+          <w:noProof/>
+        </w:rPr>
+        <w:t xml:space="preserve"> </w:t>
+      </w:r>
+      <w:r>
+        <w:drawing>
+          <wp:inline distT="0" distB="0" distL="0" distR="0" wp14:anchorId="749B7AD2" wp14:editId="4C935815">
+            <wp:extent cx="5400040" cy="1595120"/>
+            <wp:effectExtent l="0" t="0" r="0" b="5080"/>
+            <wp:docPr id="239" name="Imagem 239"/>
+            <wp:cNvGraphicFramePr>
+              <a:graphicFrameLocks xmlns:a="http://schemas.openxmlformats.org/drawingml/2006/main" noChangeAspect="1"/>
+            </wp:cNvGraphicFramePr>
+            <a:graphic xmlns:a="http://schemas.openxmlformats.org/drawingml/2006/main">
+              <a:graphicData uri="http://schemas.openxmlformats.org/drawingml/2006/picture">
+                <pic:pic xmlns:pic="http://schemas.openxmlformats.org/drawingml/2006/picture">
+                  <pic:nvPicPr>
+                    <pic:cNvPr id="1" name=""/>
+                    <pic:cNvPicPr/>
+                  </pic:nvPicPr>
+                  <pic:blipFill>
+                    <a:blip r:embed="rId171"/>
+                    <a:stretch>
+                      <a:fillRect/>
+                    </a:stretch>
+                  </pic:blipFill>
+                  <pic:spPr>
+                    <a:xfrm>
+                      <a:off x="0" y="0"/>
+                      <a:ext cx="5400040" cy="1595120"/>
+                    </a:xfrm>
+                    <a:prstGeom prst="rect">
+                      <a:avLst/>
+                    </a:prstGeom>
+                  </pic:spPr>
+                </pic:pic>
+              </a:graphicData>
+            </a:graphic>
+          </wp:inline>
+        </w:drawing>
+      </w:r>
+    </w:p>
+    <w:p>
+      <w:r>
+        <w:t xml:space="preserve">103 – Adicionamos um </w:t>
+      </w:r>
+      <w:proofErr w:type="spellStart"/>
+      <w:r>
+        <w:t>class</w:t>
+      </w:r>
+      <w:proofErr w:type="spellEnd"/>
+      <w:r>
+        <w:t xml:space="preserve"> para lista que está dentro da seção benefícios.</w:t>
+      </w:r>
+    </w:p>
+    <w:p>
+      <w:r>
+        <w:rPr>
+          <w:noProof/>
+        </w:rPr>
+        <mc:AlternateContent>
+          <mc:Choice Requires="wps">
+            <w:drawing>
+              <wp:anchor distT="0" distB="0" distL="114300" distR="114300" simplePos="0" relativeHeight="251732992" behindDoc="0" locked="0" layoutInCell="1" allowOverlap="1">
+                <wp:simplePos x="0" y="0"/>
+                <wp:positionH relativeFrom="column">
+                  <wp:posOffset>167640</wp:posOffset>
+                </wp:positionH>
+                <wp:positionV relativeFrom="paragraph">
+                  <wp:posOffset>185420</wp:posOffset>
+                </wp:positionV>
+                <wp:extent cx="171450" cy="352425"/>
+                <wp:effectExtent l="0" t="0" r="57150" b="47625"/>
+                <wp:wrapNone/>
+                <wp:docPr id="240" name="Conector de Seta Reta 240"/>
+                <wp:cNvGraphicFramePr/>
+                <a:graphic xmlns:a="http://schemas.openxmlformats.org/drawingml/2006/main">
+                  <a:graphicData uri="http://schemas.microsoft.com/office/word/2010/wordprocessingShape">
+                    <wps:wsp>
+                      <wps:cNvCnPr/>
+                      <wps:spPr>
+                        <a:xfrm>
+                          <a:off x="0" y="0"/>
+                          <a:ext cx="171450" cy="352425"/>
+                        </a:xfrm>
+                        <a:prstGeom prst="straightConnector1">
+                          <a:avLst/>
+                        </a:prstGeom>
+                        <a:ln>
+                          <a:tailEnd type="triangle"/>
+                        </a:ln>
+                      </wps:spPr>
+                      <wps:style>
+                        <a:lnRef idx="1">
+                          <a:schemeClr val="accent1"/>
+                        </a:lnRef>
+                        <a:fillRef idx="0">
+                          <a:schemeClr val="accent1"/>
+                        </a:fillRef>
+                        <a:effectRef idx="0">
+                          <a:schemeClr val="accent1"/>
+                        </a:effectRef>
+                        <a:fontRef idx="minor">
+                          <a:schemeClr val="tx1"/>
+                        </a:fontRef>
+                      </wps:style>
+                      <wps:bodyPr/>
+                    </wps:wsp>
+                  </a:graphicData>
+                </a:graphic>
+              </wp:anchor>
+            </w:drawing>
+          </mc:Choice>
+          <mc:Fallback>
+            <w:pict>
+              <v:shape w14:anchorId="6316106D" id="Conector de Seta Reta 240" o:spid="_x0000_s1026" type="#_x0000_t32" style="position:absolute;margin-left:13.2pt;margin-top:14.6pt;width:13.5pt;height:27.75pt;z-index:251732992;visibility:visible;mso-wrap-style:square;mso-wrap-distance-left:9pt;mso-wrap-distance-top:0;mso-wrap-distance-right:9pt;mso-wrap-distance-bottom:0;mso-position-horizontal:absolute;mso-position-horizontal-relative:text;mso-position-vertical:absolute;mso-position-vertical-relative:text" o:gfxdata="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" strokecolor="#4472c4 [3204]" strokeweight=".5pt">
+                <v:stroke endarrow="block" joinstyle="miter"/>
+              </v:shape>
+            </w:pict>
+          </mc:Fallback>
+        </mc:AlternateContent>
+      </w:r>
+      <w:r>
+        <w:drawing>
+          <wp:inline distT="0" distB="0" distL="0" distR="0" wp14:anchorId="08D3A409" wp14:editId="3F859016">
+            <wp:extent cx="5400040" cy="1595120"/>
+            <wp:effectExtent l="0" t="0" r="0" b="5080"/>
+            <wp:docPr id="237" name="Imagem 237"/>
+            <wp:cNvGraphicFramePr>
+              <a:graphicFrameLocks xmlns:a="http://schemas.openxmlformats.org/drawingml/2006/main" noChangeAspect="1"/>
+            </wp:cNvGraphicFramePr>
+            <a:graphic xmlns:a="http://schemas.openxmlformats.org/drawingml/2006/main">
+              <a:graphicData uri="http://schemas.openxmlformats.org/drawingml/2006/picture">
+                <pic:pic xmlns:pic="http://schemas.openxmlformats.org/drawingml/2006/picture">
+                  <pic:nvPicPr>
+                    <pic:cNvPr id="1" name=""/>
+                    <pic:cNvPicPr/>
+                  </pic:nvPicPr>
+                  <pic:blipFill>
+                    <a:blip r:embed="rId171"/>
+                    <a:stretch>
+                      <a:fillRect/>
+                    </a:stretch>
+                  </pic:blipFill>
+                  <pic:spPr>
+                    <a:xfrm>
+                      <a:off x="0" y="0"/>
+                      <a:ext cx="5400040" cy="1595120"/>
+                    </a:xfrm>
+                    <a:prstGeom prst="rect">
+                      <a:avLst/>
+                    </a:prstGeom>
+                  </pic:spPr>
+                </pic:pic>
+              </a:graphicData>
+            </a:graphic>
+          </wp:inline>
+        </w:drawing>
+      </w:r>
+    </w:p>
+    <w:p/>
+    <w:p/>
+    <w:p/>
+    <w:p/>
+    <w:p/>
+    <w:p/>
+    <w:p/>
+    <w:p/>
+    <w:p/>
+    <w:p/>
+    <w:p>
+      <w:r>
+        <w:lastRenderedPageBreak/>
+        <w:t xml:space="preserve">104 – Após colocar a </w:t>
+      </w:r>
+      <w:proofErr w:type="spellStart"/>
+      <w:r>
+        <w:t>class</w:t>
+      </w:r>
+      <w:proofErr w:type="spellEnd"/>
+      <w:r>
+        <w:t xml:space="preserve"> na lista definimos a largura para 40% com intuito de colocar a lista ao lado da imagem benefícios</w:t>
+      </w:r>
+      <w:r>
+        <w:t xml:space="preserve"> depois mudamos a natureza da lista para ficar </w:t>
+      </w:r>
+      <w:proofErr w:type="spellStart"/>
+      <w:r>
+        <w:t>inline-block</w:t>
+      </w:r>
+      <w:proofErr w:type="spellEnd"/>
+      <w:r>
+        <w:t>, notamos que quanto estamos trabalhando com 100% de espaço:</w:t>
+      </w:r>
+    </w:p>
+    <w:p>
+      <w:pPr>
+        <w:pStyle w:val="PargrafodaLista"/>
+        <w:numPr>
+          <w:ilvl w:val="0"/>
+          <w:numId w:val="11"/>
+        </w:numPr>
+      </w:pPr>
+      <w:r>
+        <w:t>Lista com 40% de largura</w:t>
+      </w:r>
+    </w:p>
+    <w:p>
+      <w:pPr>
+        <w:pStyle w:val="PargrafodaLista"/>
+        <w:numPr>
+          <w:ilvl w:val="0"/>
+          <w:numId w:val="11"/>
+        </w:numPr>
+      </w:pPr>
+      <w:r>
+        <w:t>A imagem com 60% de largura</w:t>
+      </w:r>
+    </w:p>
+    <w:p>
+      <w:r>
+        <w:t xml:space="preserve">Se faz necessário não deixar espaço no </w:t>
+      </w:r>
+      <w:proofErr w:type="spellStart"/>
+      <w:r>
+        <w:t>html</w:t>
+      </w:r>
+      <w:proofErr w:type="spellEnd"/>
+      <w:r>
+        <w:t xml:space="preserve"> entre a lista e a imagem.</w:t>
+      </w:r>
+    </w:p>
+    <w:p>
+      <w:r>
+        <w:drawing>
+          <wp:inline distT="0" distB="0" distL="0" distR="0" wp14:anchorId="0F0AE737" wp14:editId="0C03D72E">
+            <wp:extent cx="2029108" cy="885949"/>
+            <wp:effectExtent l="0" t="0" r="0" b="9525"/>
+            <wp:docPr id="241" name="Imagem 241"/>
+            <wp:cNvGraphicFramePr>
+              <a:graphicFrameLocks xmlns:a="http://schemas.openxmlformats.org/drawingml/2006/main" noChangeAspect="1"/>
+            </wp:cNvGraphicFramePr>
+            <a:graphic xmlns:a="http://schemas.openxmlformats.org/drawingml/2006/main">
+              <a:graphicData uri="http://schemas.openxmlformats.org/drawingml/2006/picture">
+                <pic:pic xmlns:pic="http://schemas.openxmlformats.org/drawingml/2006/picture">
+                  <pic:nvPicPr>
+                    <pic:cNvPr id="1" name=""/>
+                    <pic:cNvPicPr/>
+                  </pic:nvPicPr>
+                  <pic:blipFill>
+                    <a:blip r:embed="rId172"/>
+                    <a:stretch>
+                      <a:fillRect/>
+                    </a:stretch>
+                  </pic:blipFill>
+                  <pic:spPr>
+                    <a:xfrm>
+                      <a:off x="0" y="0"/>
+                      <a:ext cx="2029108" cy="885949"/>
+                    </a:xfrm>
+                    <a:prstGeom prst="rect">
+                      <a:avLst/>
+                    </a:prstGeom>
+                  </pic:spPr>
+                </pic:pic>
+              </a:graphicData>
+            </a:graphic>
+          </wp:inline>
+        </w:drawing>
+      </w:r>
+    </w:p>
+    <w:p>
+      <w:r>
+        <w:rPr>
+          <w:noProof/>
+        </w:rPr>
+        <mc:AlternateContent>
+          <mc:Choice Requires="wps">
+            <w:drawing>
+              <wp:anchor distT="0" distB="0" distL="114300" distR="114300" simplePos="0" relativeHeight="251734016" behindDoc="0" locked="0" layoutInCell="1" allowOverlap="1">
+                <wp:simplePos x="0" y="0"/>
+                <wp:positionH relativeFrom="column">
+                  <wp:posOffset>72390</wp:posOffset>
+                </wp:positionH>
+                <wp:positionV relativeFrom="paragraph">
+                  <wp:posOffset>751840</wp:posOffset>
+                </wp:positionV>
+                <wp:extent cx="600075" cy="409575"/>
+                <wp:effectExtent l="0" t="0" r="66675" b="47625"/>
+                <wp:wrapNone/>
+                <wp:docPr id="243" name="Conector de Seta Reta 243"/>
+                <wp:cNvGraphicFramePr/>
+                <a:graphic xmlns:a="http://schemas.openxmlformats.org/drawingml/2006/main">
+                  <a:graphicData uri="http://schemas.microsoft.com/office/word/2010/wordprocessingShape">
+                    <wps:wsp>
+                      <wps:cNvCnPr/>
+                      <wps:spPr>
+                        <a:xfrm>
+                          <a:off x="0" y="0"/>
+                          <a:ext cx="600075" cy="409575"/>
+                        </a:xfrm>
+                        <a:prstGeom prst="straightConnector1">
+                          <a:avLst/>
+                        </a:prstGeom>
+                        <a:ln>
+                          <a:tailEnd type="triangle"/>
+                        </a:ln>
+                      </wps:spPr>
+                      <wps:style>
+                        <a:lnRef idx="1">
+                          <a:schemeClr val="accent1"/>
+                        </a:lnRef>
+                        <a:fillRef idx="0">
+                          <a:schemeClr val="accent1"/>
+                        </a:fillRef>
+                        <a:effectRef idx="0">
+                          <a:schemeClr val="accent1"/>
+                        </a:effectRef>
+                        <a:fontRef idx="minor">
+                          <a:schemeClr val="tx1"/>
+                        </a:fontRef>
+                      </wps:style>
+                      <wps:bodyPr/>
+                    </wps:wsp>
+                  </a:graphicData>
+                </a:graphic>
+              </wp:anchor>
+            </w:drawing>
+          </mc:Choice>
+          <mc:Fallback>
+            <w:pict>
+              <v:shape w14:anchorId="30D93348" id="Conector de Seta Reta 243" o:spid="_x0000_s1026" type="#_x0000_t32" style="position:absolute;margin-left:5.7pt;margin-top:59.2pt;width:47.25pt;height:32.25pt;z-index:251734016;visibility:visible;mso-wrap-style:square;mso-wrap-distance-left:9pt;mso-wrap-distance-top:0;mso-wrap-distance-right:9pt;mso-wrap-distance-bottom:0;mso-position-horizontal:absolute;mso-position-horizontal-relative:text;mso-position-vertical:absolute;mso-position-vertical-relative:text" o:gfxdata="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" strokecolor="#4472c4 [3204]" strokeweight=".5pt">
+                <v:stroke endarrow="block" joinstyle="miter"/>
+              </v:shape>
+            </w:pict>
+          </mc:Fallback>
+        </mc:AlternateContent>
+      </w:r>
+      <w:r>
+        <w:drawing>
+          <wp:inline distT="0" distB="0" distL="0" distR="0" wp14:anchorId="724FA7B4" wp14:editId="74E1A8F0">
+            <wp:extent cx="5400040" cy="1595120"/>
+            <wp:effectExtent l="0" t="0" r="0" b="5080"/>
+            <wp:docPr id="242" name="Imagem 242"/>
+            <wp:cNvGraphicFramePr>
+              <a:graphicFrameLocks xmlns:a="http://schemas.openxmlformats.org/drawingml/2006/main" noChangeAspect="1"/>
+            </wp:cNvGraphicFramePr>
+            <a:graphic xmlns:a="http://schemas.openxmlformats.org/drawingml/2006/main">
+              <a:graphicData uri="http://schemas.openxmlformats.org/drawingml/2006/picture">
+                <pic:pic xmlns:pic="http://schemas.openxmlformats.org/drawingml/2006/picture">
+                  <pic:nvPicPr>
+                    <pic:cNvPr id="1" name=""/>
+                    <pic:cNvPicPr/>
+                  </pic:nvPicPr>
+                  <pic:blipFill>
+                    <a:blip r:embed="rId171"/>
+                    <a:stretch>
+                      <a:fillRect/>
+                    </a:stretch>
+                  </pic:blipFill>
+                  <pic:spPr>
+                    <a:xfrm>
+                      <a:off x="0" y="0"/>
+                      <a:ext cx="5400040" cy="1595120"/>
+                    </a:xfrm>
+                    <a:prstGeom prst="rect">
+                      <a:avLst/>
+                    </a:prstGeom>
+                  </pic:spPr>
+                </pic:pic>
+              </a:graphicData>
+            </a:graphic>
+          </wp:inline>
+        </w:drawing>
+      </w:r>
+    </w:p>
+    <w:p>
+      <w:r>
+        <w:t xml:space="preserve">105 – Alinhamos a lista no topo da imagem utilizando vertical </w:t>
+      </w:r>
+      <w:proofErr w:type="spellStart"/>
+      <w:r>
+        <w:t>align</w:t>
+      </w:r>
+      <w:proofErr w:type="spellEnd"/>
+      <w:r>
+        <w:t xml:space="preserve">: top, incluímos mais dois itens a lista no </w:t>
+      </w:r>
+      <w:proofErr w:type="spellStart"/>
+      <w:r>
+        <w:t>html</w:t>
+      </w:r>
+      <w:proofErr w:type="spellEnd"/>
+      <w:r>
+        <w:t xml:space="preserve"> e colocamos um espaço entre os itens da lista.</w:t>
+      </w:r>
+    </w:p>
+    <w:p>
+      <w:r>
+        <w:drawing>
+          <wp:inline distT="0" distB="0" distL="0" distR="0" wp14:anchorId="66C85C49" wp14:editId="7B45C679">
+            <wp:extent cx="2057687" cy="1705213"/>
+            <wp:effectExtent l="0" t="0" r="0" b="9525"/>
+            <wp:docPr id="244" name="Imagem 244"/>
+            <wp:cNvGraphicFramePr>
+              <a:graphicFrameLocks xmlns:a="http://schemas.openxmlformats.org/drawingml/2006/main" noChangeAspect="1"/>
+            </wp:cNvGraphicFramePr>
+            <a:graphic xmlns:a="http://schemas.openxmlformats.org/drawingml/2006/main">
+              <a:graphicData uri="http://schemas.openxmlformats.org/drawingml/2006/picture">
+                <pic:pic xmlns:pic="http://schemas.openxmlformats.org/drawingml/2006/picture">
+                  <pic:nvPicPr>
+                    <pic:cNvPr id="1" name=""/>
+                    <pic:cNvPicPr/>
+                  </pic:nvPicPr>
+                  <pic:blipFill>
+                    <a:blip r:embed="rId173"/>
+                    <a:stretch>
+                      <a:fillRect/>
+                    </a:stretch>
+                  </pic:blipFill>
+                  <pic:spPr>
+                    <a:xfrm>
+                      <a:off x="0" y="0"/>
+                      <a:ext cx="2057687" cy="1705213"/>
+                    </a:xfrm>
+                    <a:prstGeom prst="rect">
+                      <a:avLst/>
+                    </a:prstGeom>
+                  </pic:spPr>
+                </pic:pic>
+              </a:graphicData>
+            </a:graphic>
+          </wp:inline>
+        </w:drawing>
+      </w:r>
+      <w:r>
+        <w:drawing>
+          <wp:inline distT="0" distB="0" distL="0" distR="0" wp14:anchorId="4E3DE118" wp14:editId="28BF82CE">
+            <wp:extent cx="3305175" cy="1517333"/>
+            <wp:effectExtent l="0" t="0" r="0" b="6985"/>
+            <wp:docPr id="245" name="Imagem 245"/>
+            <wp:cNvGraphicFramePr>
+              <a:graphicFrameLocks xmlns:a="http://schemas.openxmlformats.org/drawingml/2006/main" noChangeAspect="1"/>
+            </wp:cNvGraphicFramePr>
+            <a:graphic xmlns:a="http://schemas.openxmlformats.org/drawingml/2006/main">
+              <a:graphicData uri="http://schemas.openxmlformats.org/drawingml/2006/picture">
+                <pic:pic xmlns:pic="http://schemas.openxmlformats.org/drawingml/2006/picture">
+                  <pic:nvPicPr>
+                    <pic:cNvPr id="1" name=""/>
+                    <pic:cNvPicPr/>
+                  </pic:nvPicPr>
+                  <pic:blipFill>
+                    <a:blip r:embed="rId174"/>
+                    <a:stretch>
+                      <a:fillRect/>
+                    </a:stretch>
+                  </pic:blipFill>
+                  <pic:spPr>
+                    <a:xfrm>
+                      <a:off x="0" y="0"/>
+                      <a:ext cx="3364230" cy="1544444"/>
+                    </a:xfrm>
+                    <a:prstGeom prst="rect">
+                      <a:avLst/>
+                    </a:prstGeom>
+                  </pic:spPr>
+                </pic:pic>
+              </a:graphicData>
+            </a:graphic>
+          </wp:inline>
+        </w:drawing>
+      </w:r>
+    </w:p>
+    <w:p>
+      <w:r>
+        <w:t xml:space="preserve">106 – Na lista queremos que o primeiro item ficasse encorpado e negrito para isso utilizamos o </w:t>
+      </w:r>
+      <w:proofErr w:type="spellStart"/>
+      <w:r>
+        <w:t>first-child</w:t>
+      </w:r>
+      <w:proofErr w:type="spellEnd"/>
+      <w:r>
+        <w:t xml:space="preserve"> que significa “o primeiro filho” conforme código abaixo:</w:t>
+      </w:r>
+    </w:p>
+    <w:p>
+      <w:r>
+        <w:drawing>
+          <wp:inline distT="0" distB="0" distL="0" distR="0" wp14:anchorId="2C2A7F83" wp14:editId="2F5FC104">
+            <wp:extent cx="1762371" cy="543001"/>
+            <wp:effectExtent l="0" t="0" r="0" b="9525"/>
+            <wp:docPr id="246" name="Imagem 246"/>
+            <wp:cNvGraphicFramePr>
+              <a:graphicFrameLocks xmlns:a="http://schemas.openxmlformats.org/drawingml/2006/main" noChangeAspect="1"/>
+            </wp:cNvGraphicFramePr>
+            <a:graphic xmlns:a="http://schemas.openxmlformats.org/drawingml/2006/main">
+              <a:graphicData uri="http://schemas.openxmlformats.org/drawingml/2006/picture">
+                <pic:pic xmlns:pic="http://schemas.openxmlformats.org/drawingml/2006/picture">
+                  <pic:nvPicPr>
+                    <pic:cNvPr id="1" name=""/>
+                    <pic:cNvPicPr/>
+                  </pic:nvPicPr>
+                  <pic:blipFill>
+                    <a:blip r:embed="rId175"/>
+                    <a:stretch>
+                      <a:fillRect/>
+                    </a:stretch>
+                  </pic:blipFill>
+                  <pic:spPr>
+                    <a:xfrm>
+                      <a:off x="0" y="0"/>
+                      <a:ext cx="1762371" cy="543001"/>
+                    </a:xfrm>
+                    <a:prstGeom prst="rect">
+                      <a:avLst/>
+                    </a:prstGeom>
+                  </pic:spPr>
+                </pic:pic>
+              </a:graphicData>
+            </a:graphic>
+          </wp:inline>
+        </w:drawing>
+      </w:r>
+      <w:r>
+        <w:drawing>
+          <wp:inline distT="0" distB="0" distL="0" distR="0" wp14:anchorId="793B8221" wp14:editId="330FD037">
+            <wp:extent cx="2438740" cy="1247949"/>
+            <wp:effectExtent l="0" t="0" r="0" b="9525"/>
+            <wp:docPr id="247" name="Imagem 247"/>
+            <wp:cNvGraphicFramePr>
+              <a:graphicFrameLocks xmlns:a="http://schemas.openxmlformats.org/drawingml/2006/main" noChangeAspect="1"/>
+            </wp:cNvGraphicFramePr>
+            <a:graphic xmlns:a="http://schemas.openxmlformats.org/drawingml/2006/main">
+              <a:graphicData uri="http://schemas.openxmlformats.org/drawingml/2006/picture">
+                <pic:pic xmlns:pic="http://schemas.openxmlformats.org/drawingml/2006/picture">
+                  <pic:nvPicPr>
+                    <pic:cNvPr id="1" name=""/>
+                    <pic:cNvPicPr/>
+                  </pic:nvPicPr>
+                  <pic:blipFill>
+                    <a:blip r:embed="rId176"/>
+                    <a:stretch>
+                      <a:fillRect/>
+                    </a:stretch>
+                  </pic:blipFill>
+                  <pic:spPr>
+                    <a:xfrm>
+                      <a:off x="0" y="0"/>
+                      <a:ext cx="2438740" cy="1247949"/>
+                    </a:xfrm>
+                    <a:prstGeom prst="rect">
+                      <a:avLst/>
+                    </a:prstGeom>
+                  </pic:spPr>
+                </pic:pic>
+              </a:graphicData>
+            </a:graphic>
+          </wp:inline>
+        </w:drawing>
+      </w:r>
+    </w:p>
+    <w:p/>
+    <w:p/>
+    <w:p>
+      <w:r>
+        <w:lastRenderedPageBreak/>
+        <w:t>107 – Adicionando ícones de estrela “</w:t>
+      </w:r>
+      <w:r>
+        <w:rPr>
+          <w:rFonts w:ascii="Segoe UI Symbol" w:hAnsi="Segoe UI Symbol" w:cs="Segoe UI Symbol"/>
+          <w:shd w:val="clear" w:color="auto" w:fill="FFFFFF"/>
+        </w:rPr>
+        <w:t>★</w:t>
+      </w:r>
+      <w:r>
+        <w:rPr>
+          <w:rFonts w:ascii="Segoe UI Symbol" w:hAnsi="Segoe UI Symbol" w:cs="Segoe UI Symbol"/>
+          <w:shd w:val="clear" w:color="auto" w:fill="FFFFFF"/>
+        </w:rPr>
+        <w:t>”</w:t>
+      </w:r>
+      <w:r>
+        <w:t xml:space="preserve"> na nossa lista benefícios: </w:t>
+      </w:r>
+    </w:p>
+    <w:p>
+      <w:r>
+        <w:t>Acessamos o site que contenha o ícone de estrela negra</w:t>
+      </w:r>
+    </w:p>
+    <w:p>
+      <w:hyperlink r:id="rId177" w:history="1">
+        <w:r>
+          <w:rPr>
+            <w:rStyle w:val="Hyperlink"/>
+          </w:rPr>
+          <w:t xml:space="preserve">Star </w:t>
+        </w:r>
+        <w:proofErr w:type="spellStart"/>
+        <w:r>
+          <w:rPr>
+            <w:rStyle w:val="Hyperlink"/>
+          </w:rPr>
+          <w:t>Symbol</w:t>
+        </w:r>
+        <w:proofErr w:type="spellEnd"/>
+        <w:r>
+          <w:rPr>
+            <w:rStyle w:val="Hyperlink"/>
+          </w:rPr>
+          <w:t xml:space="preserve"> (</w:t>
+        </w:r>
+        <w:r>
+          <w:rPr>
+            <w:rStyle w:val="Hyperlink"/>
+            <w:rFonts w:ascii="Segoe UI Symbol" w:hAnsi="Segoe UI Symbol" w:cs="Segoe UI Symbol"/>
+          </w:rPr>
+          <w:t>★</w:t>
         </w:r>
         <w:r>
           <w:rPr>
             <w:rStyle w:val="Hyperlink"/>
           </w:rPr>
-          <w:t>:</w:t>
+          <w:t xml:space="preserve">, </w:t>
+        </w:r>
+        <w:r>
+          <w:rPr>
+            <w:rStyle w:val="Hyperlink"/>
+            <w:rFonts w:ascii="Segoe UI Symbol" w:hAnsi="Segoe UI Symbol" w:cs="Segoe UI Symbol"/>
+          </w:rPr>
+          <w:t>☆</w:t>
         </w:r>
         <w:r>
           <w:rPr>
             <w:rStyle w:val="Hyperlink"/>
           </w:rPr>
-          <w:t>//fo</w:t>
+          <w:t xml:space="preserve">, </w:t>
+        </w:r>
+        <w:r>
+          <w:rPr>
+            <w:rStyle w:val="Hyperlink"/>
+            <w:rFonts w:ascii="Segoe UI Symbol" w:hAnsi="Segoe UI Symbol" w:cs="Segoe UI Symbol"/>
+          </w:rPr>
+          <w:t>⚝</w:t>
         </w:r>
         <w:r>
           <w:rPr>
             <w:rStyle w:val="Hyperlink"/>
           </w:rPr>
-          <w:t>n</w:t>
+          <w:t xml:space="preserve">) - </w:t>
         </w:r>
+        <w:proofErr w:type="spellStart"/>
         <w:r>
           <w:rPr>
             <w:rStyle w:val="Hyperlink"/>
           </w:rPr>
-          <w:t>ts.google.com</w:t>
+          <w:t>Copy</w:t>
+        </w:r>
+        <w:proofErr w:type="spellEnd"/>
+        <w:r>
+          <w:rPr>
+            <w:rStyle w:val="Hyperlink"/>
+          </w:rPr>
+          <w:t xml:space="preserve"> </w:t>
+        </w:r>
+        <w:proofErr w:type="spellStart"/>
+        <w:r>
+          <w:rPr>
+            <w:rStyle w:val="Hyperlink"/>
+          </w:rPr>
+          <w:t>and</w:t>
+        </w:r>
+        <w:proofErr w:type="spellEnd"/>
+        <w:r>
+          <w:rPr>
+            <w:rStyle w:val="Hyperlink"/>
+          </w:rPr>
+          <w:t xml:space="preserve"> Paste </w:t>
+        </w:r>
+        <w:proofErr w:type="spellStart"/>
+        <w:r>
+          <w:rPr>
+            <w:rStyle w:val="Hyperlink"/>
+          </w:rPr>
+          <w:t>Text</w:t>
+        </w:r>
+        <w:proofErr w:type="spellEnd"/>
+        <w:r>
+          <w:rPr>
+            <w:rStyle w:val="Hyperlink"/>
+          </w:rPr>
+          <w:t xml:space="preserve"> </w:t>
+        </w:r>
+        <w:proofErr w:type="spellStart"/>
+        <w:r>
+          <w:rPr>
+            <w:rStyle w:val="Hyperlink"/>
+          </w:rPr>
+          <w:t>Symbols</w:t>
+        </w:r>
+        <w:proofErr w:type="spellEnd"/>
+        <w:r>
+          <w:rPr>
+            <w:rStyle w:val="Hyperlink"/>
+          </w:rPr>
+          <w:t xml:space="preserve"> - Symbolsdb.com</w:t>
         </w:r>
       </w:hyperlink>
-      <w:r>
-        <w:t xml:space="preserve"> para escolher a fonte que </w:t>
-      </w:r>
-      <w:r>
-        <w:t>desejamos, então</w:t>
-      </w:r>
-      <w:r>
-        <w:t xml:space="preserve"> copiamos o código que é gerado para colar no HTML e o CSS.</w:t>
-      </w:r>
-    </w:p>
-    <w:p>
-      <w:r>
-        <w:t xml:space="preserve">Lembrando que o no HTML precisamos colar dentro do </w:t>
+    </w:p>
+    <w:p>
+      <w:r>
+        <w:t>Copiamos o símbolo e colocamos em nosso código conforme imagem a baixo</w:t>
+      </w:r>
+    </w:p>
+    <w:p>
+      <w:r>
+        <w:drawing>
+          <wp:inline distT="0" distB="0" distL="0" distR="0" wp14:anchorId="432D707C" wp14:editId="7B4A90A0">
+            <wp:extent cx="1533739" cy="571580"/>
+            <wp:effectExtent l="0" t="0" r="0" b="0"/>
+            <wp:docPr id="248" name="Imagem 248"/>
+            <wp:cNvGraphicFramePr>
+              <a:graphicFrameLocks xmlns:a="http://schemas.openxmlformats.org/drawingml/2006/main" noChangeAspect="1"/>
+            </wp:cNvGraphicFramePr>
+            <a:graphic xmlns:a="http://schemas.openxmlformats.org/drawingml/2006/main">
+              <a:graphicData uri="http://schemas.openxmlformats.org/drawingml/2006/picture">
+                <pic:pic xmlns:pic="http://schemas.openxmlformats.org/drawingml/2006/picture">
+                  <pic:nvPicPr>
+                    <pic:cNvPr id="1" name=""/>
+                    <pic:cNvPicPr/>
+                  </pic:nvPicPr>
+                  <pic:blipFill>
+                    <a:blip r:embed="rId178"/>
+                    <a:stretch>
+                      <a:fillRect/>
+                    </a:stretch>
+                  </pic:blipFill>
+                  <pic:spPr>
+                    <a:xfrm>
+                      <a:off x="0" y="0"/>
+                      <a:ext cx="1533739" cy="571580"/>
+                    </a:xfrm>
+                    <a:prstGeom prst="rect">
+                      <a:avLst/>
+                    </a:prstGeom>
+                  </pic:spPr>
+                </pic:pic>
+              </a:graphicData>
+            </a:graphic>
+          </wp:inline>
+        </w:drawing>
+      </w:r>
+      <w:r>
+        <w:drawing>
+          <wp:inline distT="0" distB="0" distL="0" distR="0" wp14:anchorId="42BB377B" wp14:editId="103FCE29">
+            <wp:extent cx="2324424" cy="1190791"/>
+            <wp:effectExtent l="0" t="0" r="0" b="9525"/>
+            <wp:docPr id="249" name="Imagem 249"/>
+            <wp:cNvGraphicFramePr>
+              <a:graphicFrameLocks xmlns:a="http://schemas.openxmlformats.org/drawingml/2006/main" noChangeAspect="1"/>
+            </wp:cNvGraphicFramePr>
+            <a:graphic xmlns:a="http://schemas.openxmlformats.org/drawingml/2006/main">
+              <a:graphicData uri="http://schemas.openxmlformats.org/drawingml/2006/picture">
+                <pic:pic xmlns:pic="http://schemas.openxmlformats.org/drawingml/2006/picture">
+                  <pic:nvPicPr>
+                    <pic:cNvPr id="1" name=""/>
+                    <pic:cNvPicPr/>
+                  </pic:nvPicPr>
+                  <pic:blipFill>
+                    <a:blip r:embed="rId179"/>
+                    <a:stretch>
+                      <a:fillRect/>
+                    </a:stretch>
+                  </pic:blipFill>
+                  <pic:spPr>
+                    <a:xfrm>
+                      <a:off x="0" y="0"/>
+                      <a:ext cx="2324424" cy="1190791"/>
+                    </a:xfrm>
+                    <a:prstGeom prst="rect">
+                      <a:avLst/>
+                    </a:prstGeom>
+                  </pic:spPr>
+                </pic:pic>
+              </a:graphicData>
+            </a:graphic>
+          </wp:inline>
+        </w:drawing>
+      </w:r>
+    </w:p>
+    <w:p>
+      <w:r>
+        <w:t>108 – Aumentamos o espaço interno da seção benefícios para cima e para baixo.</w:t>
+      </w:r>
+    </w:p>
+    <w:p>
+      <w:r>
+        <w:drawing>
+          <wp:inline distT="0" distB="0" distL="0" distR="0" wp14:anchorId="639F058C" wp14:editId="554D5782">
+            <wp:extent cx="1524213" cy="552527"/>
+            <wp:effectExtent l="0" t="0" r="0" b="0"/>
+            <wp:docPr id="250" name="Imagem 250"/>
+            <wp:cNvGraphicFramePr>
+              <a:graphicFrameLocks xmlns:a="http://schemas.openxmlformats.org/drawingml/2006/main" noChangeAspect="1"/>
+            </wp:cNvGraphicFramePr>
+            <a:graphic xmlns:a="http://schemas.openxmlformats.org/drawingml/2006/main">
+              <a:graphicData uri="http://schemas.openxmlformats.org/drawingml/2006/picture">
+                <pic:pic xmlns:pic="http://schemas.openxmlformats.org/drawingml/2006/picture">
+                  <pic:nvPicPr>
+                    <pic:cNvPr id="1" name=""/>
+                    <pic:cNvPicPr/>
+                  </pic:nvPicPr>
+                  <pic:blipFill>
+                    <a:blip r:embed="rId180"/>
+                    <a:stretch>
+                      <a:fillRect/>
+                    </a:stretch>
+                  </pic:blipFill>
+                  <pic:spPr>
+                    <a:xfrm>
+                      <a:off x="0" y="0"/>
+                      <a:ext cx="1524213" cy="552527"/>
+                    </a:xfrm>
+                    <a:prstGeom prst="rect">
+                      <a:avLst/>
+                    </a:prstGeom>
+                  </pic:spPr>
+                </pic:pic>
+              </a:graphicData>
+            </a:graphic>
+          </wp:inline>
+        </w:drawing>
+      </w:r>
+    </w:p>
+    <w:p>
+      <w:r>
+        <w:t xml:space="preserve">109 – Na </w:t>
       </w:r>
       <w:proofErr w:type="spellStart"/>
       <w:r>
-        <w:t>head</w:t>
+        <w:t>div</w:t>
       </w:r>
       <w:proofErr w:type="spellEnd"/>
       <w:r>
-        <w:t xml:space="preserve"> e no CSS colocamos onde queremos aplicar a fonte.</w:t>
-      </w:r>
-    </w:p>
-    <w:p>
-      <w:r>
-        <w:drawing>
-          <wp:inline distT="0" distB="0" distL="0" distR="0" wp14:anchorId="4D5EDD3C" wp14:editId="61B7786C">
-            <wp:extent cx="4419600" cy="3300668"/>
-            <wp:effectExtent l="0" t="0" r="0" b="0"/>
-            <wp:docPr id="227" name="Imagem 227"/>
-            <wp:cNvGraphicFramePr>
-              <a:graphicFrameLocks xmlns:a="http://schemas.openxmlformats.org/drawingml/2006/main" noChangeAspect="1"/>
-            </wp:cNvGraphicFramePr>
-            <a:graphic xmlns:a="http://schemas.openxmlformats.org/drawingml/2006/main">
-              <a:graphicData uri="http://schemas.openxmlformats.org/drawingml/2006/picture">
-                <pic:pic xmlns:pic="http://schemas.openxmlformats.org/drawingml/2006/picture">
-                  <pic:nvPicPr>
-                    <pic:cNvPr id="1" name=""/>
-                    <pic:cNvPicPr/>
-                  </pic:nvPicPr>
-                  <pic:blipFill>
-                    <a:blip r:embed="rId163"/>
-                    <a:stretch>
-                      <a:fillRect/>
-                    </a:stretch>
-                  </pic:blipFill>
-                  <pic:spPr>
-                    <a:xfrm>
-                      <a:off x="0" y="0"/>
-                      <a:ext cx="4486720" cy="3350795"/>
-                    </a:xfrm>
-                    <a:prstGeom prst="rect">
-                      <a:avLst/>
-                    </a:prstGeom>
-                  </pic:spPr>
-                </pic:pic>
-              </a:graphicData>
-            </a:graphic>
-          </wp:inline>
-        </w:drawing>
-      </w:r>
-    </w:p>
-    <w:p>
-      <w:r>
-        <w:t xml:space="preserve">95 </w:t>
-      </w:r>
-      <w:r>
-        <w:t xml:space="preserve">– Para inserir o mapa no site, acessamos o Google Maps, digitamos na barra de pesquisa o estabelecimento desejado, no nosso caso a Barbearia </w:t>
-      </w:r>
-      <w:proofErr w:type="spellStart"/>
-      <w:r>
-        <w:t>Spece</w:t>
-      </w:r>
-      <w:proofErr w:type="spellEnd"/>
-      <w:r>
-        <w:t xml:space="preserve"> for </w:t>
-      </w:r>
-      <w:proofErr w:type="spellStart"/>
-      <w:r>
-        <w:t>Men</w:t>
-      </w:r>
-      <w:proofErr w:type="spellEnd"/>
-      <w:r>
-        <w:t>, no campo parecido com 3 traços, terá a seguinte opção “</w:t>
-      </w:r>
-      <w:r>
-        <w:t>Compartilhar ou incorporar mapa</w:t>
-      </w:r>
-      <w:r>
-        <w:t>”, acessamos e copiamos o link do HTML</w:t>
+        <w:t xml:space="preserve"> que contem a lista e a imagem benefícios demos uma largura e centralizamos o item (a lista e a imagem) conforme código.</w:t>
+      </w:r>
+    </w:p>
+    <w:p>
+      <w:r>
+        <w:drawing>
+          <wp:inline distT="0" distB="0" distL="0" distR="0" wp14:anchorId="6A8B2707" wp14:editId="5A8C70FA">
+            <wp:extent cx="1933845" cy="771633"/>
+            <wp:effectExtent l="0" t="0" r="0" b="9525"/>
+            <wp:docPr id="251" name="Imagem 251"/>
+            <wp:cNvGraphicFramePr>
+              <a:graphicFrameLocks xmlns:a="http://schemas.openxmlformats.org/drawingml/2006/main" noChangeAspect="1"/>
+            </wp:cNvGraphicFramePr>
+            <a:graphic xmlns:a="http://schemas.openxmlformats.org/drawingml/2006/main">
+              <a:graphicData uri="http://schemas.openxmlformats.org/drawingml/2006/picture">
+                <pic:pic xmlns:pic="http://schemas.openxmlformats.org/drawingml/2006/picture">
+                  <pic:nvPicPr>
+                    <pic:cNvPr id="1" name=""/>
+                    <pic:cNvPicPr/>
+                  </pic:nvPicPr>
+                  <pic:blipFill>
+                    <a:blip r:embed="rId181"/>
+                    <a:stretch>
+                      <a:fillRect/>
+                    </a:stretch>
+                  </pic:blipFill>
+                  <pic:spPr>
+                    <a:xfrm>
+                      <a:off x="0" y="0"/>
+                      <a:ext cx="1933845" cy="771633"/>
+                    </a:xfrm>
+                    <a:prstGeom prst="rect">
+                      <a:avLst/>
+                    </a:prstGeom>
+                  </pic:spPr>
+                </pic:pic>
+              </a:graphicData>
+            </a:graphic>
+          </wp:inline>
+        </w:drawing>
       </w:r>
       <w:bookmarkStart w:id="0" w:name="_GoBack"/>
       <w:bookmarkEnd w:id="0"/>
-      <w:r>
-        <w:t>.</w:t>
-      </w:r>
-    </w:p>
-    <w:p>
-      <w:pPr>
-        <w:rPr>
-          <w:noProof/>
-        </w:rPr>
-      </w:pPr>
-      <w:r>
-        <w:rPr>
-          <w:noProof/>
-        </w:rPr>
-        <w:t xml:space="preserve"> </w:t>
-      </w:r>
-      <w:r>
-        <w:drawing>
-          <wp:inline distT="0" distB="0" distL="0" distR="0" wp14:anchorId="367FE739" wp14:editId="1B836982">
-            <wp:extent cx="2677129" cy="2209800"/>
-            <wp:effectExtent l="0" t="0" r="9525" b="0"/>
-            <wp:docPr id="228" name="Imagem 228"/>
-            <wp:cNvGraphicFramePr>
-              <a:graphicFrameLocks xmlns:a="http://schemas.openxmlformats.org/drawingml/2006/main" noChangeAspect="1"/>
-            </wp:cNvGraphicFramePr>
-            <a:graphic xmlns:a="http://schemas.openxmlformats.org/drawingml/2006/main">
-              <a:graphicData uri="http://schemas.openxmlformats.org/drawingml/2006/picture">
-                <pic:pic xmlns:pic="http://schemas.openxmlformats.org/drawingml/2006/picture">
-                  <pic:nvPicPr>
-                    <pic:cNvPr id="1" name=""/>
-                    <pic:cNvPicPr/>
-                  </pic:nvPicPr>
-                  <pic:blipFill>
-                    <a:blip r:embed="rId164"/>
-                    <a:stretch>
-                      <a:fillRect/>
-                    </a:stretch>
-                  </pic:blipFill>
-                  <pic:spPr>
-                    <a:xfrm>
-                      <a:off x="0" y="0"/>
-                      <a:ext cx="2701418" cy="2229849"/>
-                    </a:xfrm>
-                    <a:prstGeom prst="rect">
-                      <a:avLst/>
-                    </a:prstGeom>
-                  </pic:spPr>
-                </pic:pic>
-              </a:graphicData>
-            </a:graphic>
-          </wp:inline>
-        </w:drawing>
-      </w:r>
-    </w:p>
-    <w:p/>
+    </w:p>
     <w:sectPr>
       <w:pgSz w:w="11906" w:h="16838"/>
       <w:pgMar w:top="1417" w:right="1701" w:bottom="1417" w:left="1701" w:header="708" w:footer="708" w:gutter="0"/>
@@ -14090,6 +15454,119 @@
     </w:lvl>
   </w:abstractNum>
   <w:abstractNum w:abstractNumId="6" w15:restartNumberingAfterBreak="0">
+    <w:nsid w:val="51E05274"/>
+    <w:multiLevelType w:val="hybridMultilevel"/>
+    <w:tmpl w:val="D8E42FB4"/>
+    <w:lvl w:ilvl="0" w:tplc="04160001">
+      <w:start w:val="1"/>
+      <w:numFmt w:val="bullet"/>
+      <w:lvlText w:val=""/>
+      <w:lvlJc w:val="left"/>
+      <w:pPr>
+        <w:ind w:left="720" w:hanging="360"/>
+      </w:pPr>
+      <w:rPr>
+        <w:rFonts w:ascii="Symbol" w:hAnsi="Symbol" w:hint="default"/>
+      </w:rPr>
+    </w:lvl>
+    <w:lvl w:ilvl="1" w:tplc="04160003" w:tentative="1">
+      <w:start w:val="1"/>
+      <w:numFmt w:val="bullet"/>
+      <w:lvlText w:val="o"/>
+      <w:lvlJc w:val="left"/>
+      <w:pPr>
+        <w:ind w:left="1440" w:hanging="360"/>
+      </w:pPr>
+      <w:rPr>
+        <w:rFonts w:ascii="Courier New" w:hAnsi="Courier New" w:cs="Courier New" w:hint="default"/>
+      </w:rPr>
+    </w:lvl>
+    <w:lvl w:ilvl="2" w:tplc="04160005" w:tentative="1">
+      <w:start w:val="1"/>
+      <w:numFmt w:val="bullet"/>
+      <w:lvlText w:val=""/>
+      <w:lvlJc w:val="left"/>
+      <w:pPr>
+        <w:ind w:left="2160" w:hanging="360"/>
+      </w:pPr>
+      <w:rPr>
+        <w:rFonts w:ascii="Wingdings" w:hAnsi="Wingdings" w:hint="default"/>
+      </w:rPr>
+    </w:lvl>
+    <w:lvl w:ilvl="3" w:tplc="04160001" w:tentative="1">
+      <w:start w:val="1"/>
+      <w:numFmt w:val="bullet"/>
+      <w:lvlText w:val=""/>
+      <w:lvlJc w:val="left"/>
+      <w:pPr>
+        <w:ind w:left="2880" w:hanging="360"/>
+      </w:pPr>
+      <w:rPr>
+        <w:rFonts w:ascii="Symbol" w:hAnsi="Symbol" w:hint="default"/>
+      </w:rPr>
+    </w:lvl>
+    <w:lvl w:ilvl="4" w:tplc="04160003" w:tentative="1">
+      <w:start w:val="1"/>
+      <w:numFmt w:val="bullet"/>
+      <w:lvlText w:val="o"/>
+      <w:lvlJc w:val="left"/>
+      <w:pPr>
+        <w:ind w:left="3600" w:hanging="360"/>
+      </w:pPr>
+      <w:rPr>
+        <w:rFonts w:ascii="Courier New" w:hAnsi="Courier New" w:cs="Courier New" w:hint="default"/>
+      </w:rPr>
+    </w:lvl>
+    <w:lvl w:ilvl="5" w:tplc="04160005" w:tentative="1">
+      <w:start w:val="1"/>
+      <w:numFmt w:val="bullet"/>
+      <w:lvlText w:val=""/>
+      <w:lvlJc w:val="left"/>
+      <w:pPr>
+        <w:ind w:left="4320" w:hanging="360"/>
+      </w:pPr>
+      <w:rPr>
+        <w:rFonts w:ascii="Wingdings" w:hAnsi="Wingdings" w:hint="default"/>
+      </w:rPr>
+    </w:lvl>
+    <w:lvl w:ilvl="6" w:tplc="04160001" w:tentative="1">
+      <w:start w:val="1"/>
+      <w:numFmt w:val="bullet"/>
+      <w:lvlText w:val=""/>
+      <w:lvlJc w:val="left"/>
+      <w:pPr>
+        <w:ind w:left="5040" w:hanging="360"/>
+      </w:pPr>
+      <w:rPr>
+        <w:rFonts w:ascii="Symbol" w:hAnsi="Symbol" w:hint="default"/>
+      </w:rPr>
+    </w:lvl>
+    <w:lvl w:ilvl="7" w:tplc="04160003" w:tentative="1">
+      <w:start w:val="1"/>
+      <w:numFmt w:val="bullet"/>
+      <w:lvlText w:val="o"/>
+      <w:lvlJc w:val="left"/>
+      <w:pPr>
+        <w:ind w:left="5760" w:hanging="360"/>
+      </w:pPr>
+      <w:rPr>
+        <w:rFonts w:ascii="Courier New" w:hAnsi="Courier New" w:cs="Courier New" w:hint="default"/>
+      </w:rPr>
+    </w:lvl>
+    <w:lvl w:ilvl="8" w:tplc="04160005" w:tentative="1">
+      <w:start w:val="1"/>
+      <w:numFmt w:val="bullet"/>
+      <w:lvlText w:val=""/>
+      <w:lvlJc w:val="left"/>
+      <w:pPr>
+        <w:ind w:left="6480" w:hanging="360"/>
+      </w:pPr>
+      <w:rPr>
+        <w:rFonts w:ascii="Wingdings" w:hAnsi="Wingdings" w:hint="default"/>
+      </w:rPr>
+    </w:lvl>
+  </w:abstractNum>
+  <w:abstractNum w:abstractNumId="7" w15:restartNumberingAfterBreak="0">
     <w:nsid w:val="55DE784F"/>
     <w:multiLevelType w:val="hybridMultilevel"/>
     <w:tmpl w:val="5DC851B4"/>
@@ -14202,7 +15679,7 @@
       </w:rPr>
     </w:lvl>
   </w:abstractNum>
-  <w:abstractNum w:abstractNumId="7" w15:restartNumberingAfterBreak="0">
+  <w:abstractNum w:abstractNumId="8" w15:restartNumberingAfterBreak="0">
     <w:nsid w:val="5C270E84"/>
     <w:multiLevelType w:val="hybridMultilevel"/>
     <w:tmpl w:val="17C43648"/>
@@ -14315,7 +15792,7 @@
       </w:rPr>
     </w:lvl>
   </w:abstractNum>
-  <w:abstractNum w:abstractNumId="8" w15:restartNumberingAfterBreak="0">
+  <w:abstractNum w:abstractNumId="9" w15:restartNumberingAfterBreak="0">
     <w:nsid w:val="5D2C3BB7"/>
     <w:multiLevelType w:val="hybridMultilevel"/>
     <w:tmpl w:val="152225AA"/>
@@ -14404,7 +15881,7 @@
       </w:pPr>
     </w:lvl>
   </w:abstractNum>
-  <w:abstractNum w:abstractNumId="9" w15:restartNumberingAfterBreak="0">
+  <w:abstractNum w:abstractNumId="10" w15:restartNumberingAfterBreak="0">
     <w:nsid w:val="799B0927"/>
     <w:multiLevelType w:val="hybridMultilevel"/>
     <w:tmpl w:val="B6183382"/>
@@ -14521,7 +15998,7 @@
     <w:abstractNumId w:val="2"/>
   </w:num>
   <w:num w:numId="2">
-    <w:abstractNumId w:val="8"/>
+    <w:abstractNumId w:val="9"/>
   </w:num>
   <w:num w:numId="3">
     <w:abstractNumId w:val="4"/>
@@ -14536,16 +16013,19 @@
     <w:abstractNumId w:val="3"/>
   </w:num>
   <w:num w:numId="7">
-    <w:abstractNumId w:val="6"/>
+    <w:abstractNumId w:val="7"/>
   </w:num>
   <w:num w:numId="8">
     <w:abstractNumId w:val="1"/>
   </w:num>
   <w:num w:numId="9">
-    <w:abstractNumId w:val="9"/>
+    <w:abstractNumId w:val="10"/>
   </w:num>
   <w:num w:numId="10">
-    <w:abstractNumId w:val="7"/>
+    <w:abstractNumId w:val="8"/>
+  </w:num>
+  <w:num w:numId="11">
+    <w:abstractNumId w:val="6"/>
   </w:num>
 </w:numbering>
 </file>
@@ -14951,7 +16431,6 @@
   <w:style w:type="character" w:default="1" w:styleId="Fontepargpadro">
     <w:name w:val="Default Paragraph Font"/>
     <w:uiPriority w:val="1"/>
-    <w:semiHidden/>
     <w:unhideWhenUsed/>
   </w:style>
   <w:style w:type="table" w:default="1" w:styleId="Tabelanormal">
@@ -15324,7 +16803,7 @@
 </file>
 
 <file path=customXml/itemProps1.xml><?xml version="1.0" encoding="utf-8"?>
-<ds:datastoreItem xmlns:ds="http://schemas.openxmlformats.org/officeDocument/2006/customXml" ds:itemID="{578F7DD6-EA1F-4B8A-AC6F-438E7BAC7E17}">
+<ds:datastoreItem xmlns:ds="http://schemas.openxmlformats.org/officeDocument/2006/customXml" ds:itemID="{CF19CE7D-C335-4F05-B743-D902834F0201}">
   <ds:schemaRefs>
     <ds:schemaRef ds:uri="http://schemas.openxmlformats.org/officeDocument/2006/bibliography"/>
   </ds:schemaRefs>

</xml_diff>

<commit_message>
atulização do dia 05/10/2026
</commit_message>
<xml_diff>
--- a/apostila/Projeto Space For Men.docx
+++ b/apostila/Projeto Space For Men.docx
@@ -13476,6 +13476,9 @@
     </w:p>
     <w:p>
       <w:r>
+        <w:rPr>
+          <w:noProof/>
+        </w:rPr>
         <w:drawing>
           <wp:inline distT="0" distB="0" distL="0" distR="0" wp14:anchorId="6C6A77D8" wp14:editId="14606F1B">
             <wp:extent cx="5400040" cy="547370"/>
@@ -13520,6 +13523,9 @@
     </w:p>
     <w:p>
       <w:r>
+        <w:rPr>
+          <w:noProof/>
+        </w:rPr>
         <w:drawing>
           <wp:inline distT="0" distB="0" distL="0" distR="0" wp14:anchorId="29C93B6F" wp14:editId="370ABB19">
             <wp:extent cx="1543265" cy="609685"/>
@@ -13564,6 +13570,9 @@
     </w:p>
     <w:p>
       <w:r>
+        <w:rPr>
+          <w:noProof/>
+        </w:rPr>
         <w:drawing>
           <wp:inline distT="0" distB="0" distL="0" distR="0" wp14:anchorId="03CB68E8" wp14:editId="46A87A79">
             <wp:extent cx="1857634" cy="914528"/>
@@ -13667,6 +13676,9 @@
     </w:p>
     <w:p>
       <w:r>
+        <w:rPr>
+          <w:noProof/>
+        </w:rPr>
         <w:drawing>
           <wp:inline distT="0" distB="0" distL="0" distR="0" wp14:anchorId="23270EF0" wp14:editId="01DEA6E2">
             <wp:extent cx="4324954" cy="2333951"/>
@@ -13738,6 +13750,9 @@
     </w:p>
     <w:p>
       <w:r>
+        <w:rPr>
+          <w:noProof/>
+        </w:rPr>
         <w:drawing>
           <wp:inline distT="0" distB="0" distL="0" distR="0" wp14:anchorId="02BCE2AE" wp14:editId="4C942A02">
             <wp:extent cx="5400040" cy="661670"/>
@@ -13800,6 +13815,9 @@
     </w:p>
     <w:p>
       <w:r>
+        <w:rPr>
+          <w:noProof/>
+        </w:rPr>
         <w:drawing>
           <wp:inline distT="0" distB="0" distL="0" distR="0" wp14:anchorId="124DED83" wp14:editId="0043296F">
             <wp:extent cx="1733792" cy="800212"/>
@@ -13950,6 +13968,9 @@
         <w:t xml:space="preserve"> </w:t>
       </w:r>
       <w:r>
+        <w:rPr>
+          <w:noProof/>
+        </w:rPr>
         <w:drawing>
           <wp:inline distT="0" distB="0" distL="0" distR="0" wp14:anchorId="749B7AD2" wp14:editId="4C935815">
             <wp:extent cx="5400040" cy="1595120"/>
@@ -14068,6 +14089,9 @@
         </mc:AlternateContent>
       </w:r>
       <w:r>
+        <w:rPr>
+          <w:noProof/>
+        </w:rPr>
         <w:drawing>
           <wp:inline distT="0" distB="0" distL="0" distR="0" wp14:anchorId="08D3A409" wp14:editId="3F859016">
             <wp:extent cx="5400040" cy="1595120"/>
@@ -14179,6 +14203,9 @@
     </w:p>
     <w:p>
       <w:r>
+        <w:rPr>
+          <w:noProof/>
+        </w:rPr>
         <w:drawing>
           <wp:inline distT="0" distB="0" distL="0" distR="0" wp14:anchorId="0F0AE737" wp14:editId="0C03D72E">
             <wp:extent cx="2029108" cy="885949"/>
@@ -14284,6 +14311,9 @@
         </mc:AlternateContent>
       </w:r>
       <w:r>
+        <w:rPr>
+          <w:noProof/>
+        </w:rPr>
         <w:drawing>
           <wp:inline distT="0" distB="0" distL="0" distR="0" wp14:anchorId="724FA7B4" wp14:editId="74E1A8F0">
             <wp:extent cx="5400040" cy="1595120"/>
@@ -14331,10 +14361,18 @@
       </w:r>
       <w:proofErr w:type="spellEnd"/>
       <w:r>
-        <w:t xml:space="preserve">: top, incluímos mais dois itens a lista no </w:t>
+        <w:t xml:space="preserve">: top, incluímos mais dois itens </w:t>
       </w:r>
       <w:proofErr w:type="spellStart"/>
       <w:r>
+        <w:t>a</w:t>
+      </w:r>
+      <w:proofErr w:type="spellEnd"/>
+      <w:r>
+        <w:t xml:space="preserve"> lista no </w:t>
+      </w:r>
+      <w:proofErr w:type="spellStart"/>
+      <w:r>
         <w:t>html</w:t>
       </w:r>
       <w:proofErr w:type="spellEnd"/>
@@ -14344,6 +14382,9 @@
     </w:p>
     <w:p>
       <w:r>
+        <w:rPr>
+          <w:noProof/>
+        </w:rPr>
         <w:drawing>
           <wp:inline distT="0" distB="0" distL="0" distR="0" wp14:anchorId="66C85C49" wp14:editId="7B45C679">
             <wp:extent cx="2057687" cy="1705213"/>
@@ -14381,6 +14422,9 @@
         </w:drawing>
       </w:r>
       <w:r>
+        <w:rPr>
+          <w:noProof/>
+        </w:rPr>
         <w:drawing>
           <wp:inline distT="0" distB="0" distL="0" distR="0" wp14:anchorId="4E3DE118" wp14:editId="28BF82CE">
             <wp:extent cx="3305175" cy="1517333"/>
@@ -14433,6 +14477,9 @@
     </w:p>
     <w:p>
       <w:r>
+        <w:rPr>
+          <w:noProof/>
+        </w:rPr>
         <w:drawing>
           <wp:inline distT="0" distB="0" distL="0" distR="0" wp14:anchorId="2C2A7F83" wp14:editId="2F5FC104">
             <wp:extent cx="1762371" cy="543001"/>
@@ -14470,6 +14517,9 @@
         </w:drawing>
       </w:r>
       <w:r>
+        <w:rPr>
+          <w:noProof/>
+        </w:rPr>
         <w:drawing>
           <wp:inline distT="0" distB="0" distL="0" distR="0" wp14:anchorId="793B8221" wp14:editId="330FD037">
             <wp:extent cx="2438740" cy="1247949"/>
@@ -14519,14 +14569,7 @@
           <w:rFonts w:ascii="Segoe UI Symbol" w:hAnsi="Segoe UI Symbol" w:cs="Segoe UI Symbol"/>
           <w:shd w:val="clear" w:color="auto" w:fill="FFFFFF"/>
         </w:rPr>
-        <w:t>★</w:t>
-      </w:r>
-      <w:r>
-        <w:rPr>
-          <w:rFonts w:ascii="Segoe UI Symbol" w:hAnsi="Segoe UI Symbol" w:cs="Segoe UI Symbol"/>
-          <w:shd w:val="clear" w:color="auto" w:fill="FFFFFF"/>
-        </w:rPr>
-        <w:t>”</w:t>
+        <w:t>★”</w:t>
       </w:r>
       <w:r>
         <w:t xml:space="preserve"> na nossa lista benefícios: </w:t>
@@ -14663,6 +14706,9 @@
     </w:p>
     <w:p>
       <w:r>
+        <w:rPr>
+          <w:noProof/>
+        </w:rPr>
         <w:drawing>
           <wp:inline distT="0" distB="0" distL="0" distR="0" wp14:anchorId="432D707C" wp14:editId="7B4A90A0">
             <wp:extent cx="1533739" cy="571580"/>
@@ -14700,6 +14746,9 @@
         </w:drawing>
       </w:r>
       <w:r>
+        <w:rPr>
+          <w:noProof/>
+        </w:rPr>
         <w:drawing>
           <wp:inline distT="0" distB="0" distL="0" distR="0" wp14:anchorId="42BB377B" wp14:editId="103FCE29">
             <wp:extent cx="2324424" cy="1190791"/>
@@ -14744,6 +14793,9 @@
     </w:p>
     <w:p>
       <w:r>
+        <w:rPr>
+          <w:noProof/>
+        </w:rPr>
         <w:drawing>
           <wp:inline distT="0" distB="0" distL="0" distR="0" wp14:anchorId="639F058C" wp14:editId="554D5782">
             <wp:extent cx="1524213" cy="552527"/>
@@ -14791,11 +14843,20 @@
       </w:r>
       <w:proofErr w:type="spellEnd"/>
       <w:r>
-        <w:t xml:space="preserve"> que contem a lista e a imagem benefícios demos uma largura e centralizamos o item (a lista e a imagem) conforme código.</w:t>
-      </w:r>
-    </w:p>
-    <w:p>
-      <w:r>
+        <w:t xml:space="preserve"> que </w:t>
+      </w:r>
+      <w:r>
+        <w:t>contém</w:t>
+      </w:r>
+      <w:r>
+        <w:t xml:space="preserve"> a lista e a imagem benefícios demos uma largura e centralizamos o item (a lista e a imagem) conforme código.</w:t>
+      </w:r>
+    </w:p>
+    <w:p>
+      <w:r>
+        <w:rPr>
+          <w:noProof/>
+        </w:rPr>
         <w:drawing>
           <wp:inline distT="0" distB="0" distL="0" distR="0" wp14:anchorId="6A8B2707" wp14:editId="5A8C70FA">
             <wp:extent cx="1933845" cy="771633"/>
@@ -14831,6 +14892,584 @@
             </a:graphic>
           </wp:inline>
         </w:drawing>
+      </w:r>
+    </w:p>
+    <w:p>
+      <w:r>
+        <w:t xml:space="preserve">110 – Aumentamos o espaço interno da </w:t>
+      </w:r>
+      <w:proofErr w:type="spellStart"/>
+      <w:r>
+        <w:t>section</w:t>
+      </w:r>
+      <w:proofErr w:type="spellEnd"/>
+      <w:r>
+        <w:t xml:space="preserve"> principal e adicionamos uma cor de fundo para fazer o degrade,</w:t>
+      </w:r>
+      <w:r>
+        <w:t xml:space="preserve"> ou seja, é a área onde duas ou mais cores são sobrepostas.</w:t>
+      </w:r>
+    </w:p>
+    <w:p>
+      <w:r>
+        <w:drawing>
+          <wp:inline distT="0" distB="0" distL="0" distR="0" wp14:anchorId="2981FE95" wp14:editId="3C7DD979">
+            <wp:extent cx="2438740" cy="800212"/>
+            <wp:effectExtent l="0" t="0" r="0" b="0"/>
+            <wp:docPr id="231" name="Imagem 231"/>
+            <wp:cNvGraphicFramePr>
+              <a:graphicFrameLocks xmlns:a="http://schemas.openxmlformats.org/drawingml/2006/main" noChangeAspect="1"/>
+            </wp:cNvGraphicFramePr>
+            <a:graphic xmlns:a="http://schemas.openxmlformats.org/drawingml/2006/main">
+              <a:graphicData uri="http://schemas.openxmlformats.org/drawingml/2006/picture">
+                <pic:pic xmlns:pic="http://schemas.openxmlformats.org/drawingml/2006/picture">
+                  <pic:nvPicPr>
+                    <pic:cNvPr id="1" name=""/>
+                    <pic:cNvPicPr/>
+                  </pic:nvPicPr>
+                  <pic:blipFill>
+                    <a:blip r:embed="rId182"/>
+                    <a:stretch>
+                      <a:fillRect/>
+                    </a:stretch>
+                  </pic:blipFill>
+                  <pic:spPr>
+                    <a:xfrm>
+                      <a:off x="0" y="0"/>
+                      <a:ext cx="2438740" cy="800212"/>
+                    </a:xfrm>
+                    <a:prstGeom prst="rect">
+                      <a:avLst/>
+                    </a:prstGeom>
+                  </pic:spPr>
+                </pic:pic>
+              </a:graphicData>
+            </a:graphic>
+          </wp:inline>
+        </w:drawing>
+      </w:r>
+    </w:p>
+    <w:p>
+      <w:r>
+        <w:t xml:space="preserve">111 – Colocamos uma cor de fundo na </w:t>
+      </w:r>
+      <w:proofErr w:type="spellStart"/>
+      <w:r>
+        <w:t>section</w:t>
+      </w:r>
+      <w:proofErr w:type="spellEnd"/>
+      <w:r>
+        <w:t xml:space="preserve"> benefícios para realizar o nosso degrade.</w:t>
+      </w:r>
+    </w:p>
+    <w:p>
+      <w:r>
+        <w:drawing>
+          <wp:inline distT="0" distB="0" distL="0" distR="0" wp14:anchorId="0DA53461" wp14:editId="7B92C12E">
+            <wp:extent cx="2514951" cy="724001"/>
+            <wp:effectExtent l="0" t="0" r="0" b="0"/>
+            <wp:docPr id="236" name="Imagem 236"/>
+            <wp:cNvGraphicFramePr>
+              <a:graphicFrameLocks xmlns:a="http://schemas.openxmlformats.org/drawingml/2006/main" noChangeAspect="1"/>
+            </wp:cNvGraphicFramePr>
+            <a:graphic xmlns:a="http://schemas.openxmlformats.org/drawingml/2006/main">
+              <a:graphicData uri="http://schemas.openxmlformats.org/drawingml/2006/picture">
+                <pic:pic xmlns:pic="http://schemas.openxmlformats.org/drawingml/2006/picture">
+                  <pic:nvPicPr>
+                    <pic:cNvPr id="1" name=""/>
+                    <pic:cNvPicPr/>
+                  </pic:nvPicPr>
+                  <pic:blipFill>
+                    <a:blip r:embed="rId183"/>
+                    <a:stretch>
+                      <a:fillRect/>
+                    </a:stretch>
+                  </pic:blipFill>
+                  <pic:spPr>
+                    <a:xfrm>
+                      <a:off x="0" y="0"/>
+                      <a:ext cx="2514951" cy="724001"/>
+                    </a:xfrm>
+                    <a:prstGeom prst="rect">
+                      <a:avLst/>
+                    </a:prstGeom>
+                  </pic:spPr>
+                </pic:pic>
+              </a:graphicData>
+            </a:graphic>
+          </wp:inline>
+        </w:drawing>
+      </w:r>
+    </w:p>
+    <w:p/>
+    <w:p/>
+    <w:p/>
+    <w:p/>
+    <w:p/>
+    <w:p>
+      <w:r>
+        <w:lastRenderedPageBreak/>
+        <w:t xml:space="preserve">112 </w:t>
+      </w:r>
+      <w:r>
+        <w:t>–</w:t>
+      </w:r>
+      <w:r>
+        <w:t xml:space="preserve"> </w:t>
+      </w:r>
+      <w:r>
+        <w:t xml:space="preserve">Para fazer o degrade tiramos o </w:t>
+      </w:r>
+      <w:proofErr w:type="spellStart"/>
+      <w:r>
+        <w:t>main</w:t>
+      </w:r>
+      <w:proofErr w:type="spellEnd"/>
+      <w:r>
+        <w:t xml:space="preserve"> que estava configurando para a largura de 940px e centralizando o elemento em </w:t>
+      </w:r>
+      <w:proofErr w:type="spellStart"/>
+      <w:r>
+        <w:t>margin</w:t>
+      </w:r>
+      <w:proofErr w:type="spellEnd"/>
+      <w:r>
+        <w:t>: 0 auto</w:t>
+      </w:r>
+    </w:p>
+    <w:p>
+      <w:proofErr w:type="spellStart"/>
+      <w:r>
+        <w:t>Main</w:t>
+      </w:r>
+      <w:proofErr w:type="spellEnd"/>
+      <w:r>
+        <w:t xml:space="preserve"> {</w:t>
+      </w:r>
+    </w:p>
+    <w:p>
+      <w:proofErr w:type="spellStart"/>
+      <w:r>
+        <w:t>Width</w:t>
+      </w:r>
+      <w:proofErr w:type="spellEnd"/>
+      <w:r>
+        <w:t>: 940px;</w:t>
+      </w:r>
+    </w:p>
+    <w:p>
+      <w:proofErr w:type="spellStart"/>
+      <w:r>
+        <w:t>Margin</w:t>
+      </w:r>
+      <w:proofErr w:type="spellEnd"/>
+      <w:r>
+        <w:t>: 0 auto;</w:t>
+      </w:r>
+    </w:p>
+    <w:p>
+      <w:r>
+        <w:t>}</w:t>
+      </w:r>
+    </w:p>
+    <w:p>
+      <w:r>
+        <w:t xml:space="preserve">Isso fazia que todo o conteúdo do </w:t>
+      </w:r>
+      <w:proofErr w:type="spellStart"/>
+      <w:r>
+        <w:t>Main</w:t>
+      </w:r>
+      <w:proofErr w:type="spellEnd"/>
+      <w:r>
+        <w:t xml:space="preserve"> ficasse limitado a 940px e centralizado na página. Consequentemente, quando colocávamos uma cor de fundo nas </w:t>
+      </w:r>
+      <w:proofErr w:type="spellStart"/>
+      <w:r>
+        <w:t>Section</w:t>
+      </w:r>
+      <w:proofErr w:type="spellEnd"/>
+      <w:r>
+        <w:t>. O fundo também ficava limitado à mesma largura.</w:t>
+      </w:r>
+    </w:p>
+    <w:p>
+      <w:r>
+        <w:t xml:space="preserve">Para permitir que cada seção tivesse seu próprio findo e, ao mesmo tempo, manter o conteúdo centralizado, retiramos o </w:t>
+      </w:r>
+      <w:proofErr w:type="spellStart"/>
+      <w:r>
+        <w:t>Width</w:t>
+      </w:r>
+      <w:proofErr w:type="spellEnd"/>
+      <w:r>
+        <w:t xml:space="preserve"> e o </w:t>
+      </w:r>
+      <w:proofErr w:type="spellStart"/>
+      <w:r>
+        <w:t>Margin</w:t>
+      </w:r>
+      <w:proofErr w:type="spellEnd"/>
+      <w:r>
+        <w:t xml:space="preserve"> do </w:t>
+      </w:r>
+      <w:proofErr w:type="spellStart"/>
+      <w:r>
+        <w:t>Main</w:t>
+      </w:r>
+      <w:proofErr w:type="spellEnd"/>
+      <w:r>
+        <w:t xml:space="preserve"> e passamos esse controle para as seções principais:</w:t>
+      </w:r>
+    </w:p>
+    <w:p>
+      <w:r>
+        <w:drawing>
+          <wp:inline distT="0" distB="0" distL="0" distR="0" wp14:anchorId="17918A97" wp14:editId="15C55E19">
+            <wp:extent cx="2448267" cy="1228896"/>
+            <wp:effectExtent l="0" t="0" r="9525" b="0"/>
+            <wp:docPr id="257" name="Imagem 257"/>
+            <wp:cNvGraphicFramePr>
+              <a:graphicFrameLocks xmlns:a="http://schemas.openxmlformats.org/drawingml/2006/main" noChangeAspect="1"/>
+            </wp:cNvGraphicFramePr>
+            <a:graphic xmlns:a="http://schemas.openxmlformats.org/drawingml/2006/main">
+              <a:graphicData uri="http://schemas.openxmlformats.org/drawingml/2006/picture">
+                <pic:pic xmlns:pic="http://schemas.openxmlformats.org/drawingml/2006/picture">
+                  <pic:nvPicPr>
+                    <pic:cNvPr id="1" name=""/>
+                    <pic:cNvPicPr/>
+                  </pic:nvPicPr>
+                  <pic:blipFill>
+                    <a:blip r:embed="rId184"/>
+                    <a:stretch>
+                      <a:fillRect/>
+                    </a:stretch>
+                  </pic:blipFill>
+                  <pic:spPr>
+                    <a:xfrm>
+                      <a:off x="0" y="0"/>
+                      <a:ext cx="2448267" cy="1228896"/>
+                    </a:xfrm>
+                    <a:prstGeom prst="rect">
+                      <a:avLst/>
+                    </a:prstGeom>
+                  </pic:spPr>
+                </pic:pic>
+              </a:graphicData>
+            </a:graphic>
+          </wp:inline>
+        </w:drawing>
+      </w:r>
+      <w:r>
+        <w:drawing>
+          <wp:inline distT="0" distB="0" distL="0" distR="0" wp14:anchorId="4010DF4A" wp14:editId="6252E4A9">
+            <wp:extent cx="2695951" cy="933580"/>
+            <wp:effectExtent l="0" t="0" r="9525" b="0"/>
+            <wp:docPr id="258" name="Imagem 258"/>
+            <wp:cNvGraphicFramePr>
+              <a:graphicFrameLocks xmlns:a="http://schemas.openxmlformats.org/drawingml/2006/main" noChangeAspect="1"/>
+            </wp:cNvGraphicFramePr>
+            <a:graphic xmlns:a="http://schemas.openxmlformats.org/drawingml/2006/main">
+              <a:graphicData uri="http://schemas.openxmlformats.org/drawingml/2006/picture">
+                <pic:pic xmlns:pic="http://schemas.openxmlformats.org/drawingml/2006/picture">
+                  <pic:nvPicPr>
+                    <pic:cNvPr id="1" name=""/>
+                    <pic:cNvPicPr/>
+                  </pic:nvPicPr>
+                  <pic:blipFill>
+                    <a:blip r:embed="rId185"/>
+                    <a:stretch>
+                      <a:fillRect/>
+                    </a:stretch>
+                  </pic:blipFill>
+                  <pic:spPr>
+                    <a:xfrm>
+                      <a:off x="0" y="0"/>
+                      <a:ext cx="2695951" cy="933580"/>
+                    </a:xfrm>
+                    <a:prstGeom prst="rect">
+                      <a:avLst/>
+                    </a:prstGeom>
+                  </pic:spPr>
+                </pic:pic>
+              </a:graphicData>
+            </a:graphic>
+          </wp:inline>
+        </w:drawing>
+      </w:r>
+    </w:p>
+    <w:p>
+      <w:r>
+        <w:t>113 – Centralizamos o mapa. Durante os ajustes, percebemos que o mapa também não estava centralizado corretamente.</w:t>
+      </w:r>
+    </w:p>
+    <w:p>
+      <w:r>
+        <w:t xml:space="preserve">Para solucionar esse problema. Criamos uma </w:t>
+      </w:r>
+      <w:proofErr w:type="spellStart"/>
+      <w:r>
+        <w:t>Div</w:t>
+      </w:r>
+      <w:proofErr w:type="spellEnd"/>
+      <w:r>
+        <w:t xml:space="preserve"> </w:t>
+      </w:r>
+      <w:proofErr w:type="gramStart"/>
+      <w:r>
+        <w:t>chamada .mapa</w:t>
+      </w:r>
+      <w:proofErr w:type="gramEnd"/>
+      <w:r>
+        <w:t>-</w:t>
+      </w:r>
+      <w:proofErr w:type="spellStart"/>
+      <w:r>
+        <w:t>conteudo</w:t>
+      </w:r>
+      <w:proofErr w:type="spellEnd"/>
+      <w:r>
+        <w:t>. Responsável por envolver o mapa:</w:t>
+      </w:r>
+    </w:p>
+    <w:p>
+      <w:r>
+        <w:drawing>
+          <wp:inline distT="0" distB="0" distL="0" distR="0" wp14:anchorId="3D739E91" wp14:editId="12257D0A">
+            <wp:extent cx="5400040" cy="994410"/>
+            <wp:effectExtent l="0" t="0" r="0" b="0"/>
+            <wp:docPr id="259" name="Imagem 259"/>
+            <wp:cNvGraphicFramePr>
+              <a:graphicFrameLocks xmlns:a="http://schemas.openxmlformats.org/drawingml/2006/main" noChangeAspect="1"/>
+            </wp:cNvGraphicFramePr>
+            <a:graphic xmlns:a="http://schemas.openxmlformats.org/drawingml/2006/main">
+              <a:graphicData uri="http://schemas.openxmlformats.org/drawingml/2006/picture">
+                <pic:pic xmlns:pic="http://schemas.openxmlformats.org/drawingml/2006/picture">
+                  <pic:nvPicPr>
+                    <pic:cNvPr id="1" name=""/>
+                    <pic:cNvPicPr/>
+                  </pic:nvPicPr>
+                  <pic:blipFill>
+                    <a:blip r:embed="rId186"/>
+                    <a:stretch>
+                      <a:fillRect/>
+                    </a:stretch>
+                  </pic:blipFill>
+                  <pic:spPr>
+                    <a:xfrm>
+                      <a:off x="0" y="0"/>
+                      <a:ext cx="5400040" cy="994410"/>
+                    </a:xfrm>
+                    <a:prstGeom prst="rect">
+                      <a:avLst/>
+                    </a:prstGeom>
+                  </pic:spPr>
+                </pic:pic>
+              </a:graphicData>
+            </a:graphic>
+          </wp:inline>
+        </w:drawing>
+      </w:r>
+      <w:r>
+        <w:drawing>
+          <wp:inline distT="0" distB="0" distL="0" distR="0" wp14:anchorId="70FE1F51" wp14:editId="2080C73D">
+            <wp:extent cx="1600423" cy="724001"/>
+            <wp:effectExtent l="0" t="0" r="0" b="0"/>
+            <wp:docPr id="260" name="Imagem 260"/>
+            <wp:cNvGraphicFramePr>
+              <a:graphicFrameLocks xmlns:a="http://schemas.openxmlformats.org/drawingml/2006/main" noChangeAspect="1"/>
+            </wp:cNvGraphicFramePr>
+            <a:graphic xmlns:a="http://schemas.openxmlformats.org/drawingml/2006/main">
+              <a:graphicData uri="http://schemas.openxmlformats.org/drawingml/2006/picture">
+                <pic:pic xmlns:pic="http://schemas.openxmlformats.org/drawingml/2006/picture">
+                  <pic:nvPicPr>
+                    <pic:cNvPr id="1" name=""/>
+                    <pic:cNvPicPr/>
+                  </pic:nvPicPr>
+                  <pic:blipFill>
+                    <a:blip r:embed="rId187"/>
+                    <a:stretch>
+                      <a:fillRect/>
+                    </a:stretch>
+                  </pic:blipFill>
+                  <pic:spPr>
+                    <a:xfrm>
+                      <a:off x="0" y="0"/>
+                      <a:ext cx="1600423" cy="724001"/>
+                    </a:xfrm>
+                    <a:prstGeom prst="rect">
+                      <a:avLst/>
+                    </a:prstGeom>
+                  </pic:spPr>
+                </pic:pic>
+              </a:graphicData>
+            </a:graphic>
+          </wp:inline>
+        </w:drawing>
+      </w:r>
+    </w:p>
+    <w:p/>
+    <w:p/>
+    <w:p/>
+    <w:p/>
+    <w:p/>
+    <w:p/>
+    <w:p>
+      <w:r>
+        <w:lastRenderedPageBreak/>
+        <w:t xml:space="preserve">114 </w:t>
+      </w:r>
+      <w:r>
+        <w:t>–</w:t>
+      </w:r>
+      <w:r>
+        <w:t xml:space="preserve"> </w:t>
+      </w:r>
+      <w:r>
+        <w:t xml:space="preserve">Dessa forma, o fundo da </w:t>
+      </w:r>
+      <w:proofErr w:type="gramStart"/>
+      <w:r>
+        <w:t>seção .mapa</w:t>
+      </w:r>
+      <w:proofErr w:type="gramEnd"/>
+      <w:r>
+        <w:t xml:space="preserve"> pode ocupar a área disponível enquanto o conteúdo do mapa permanece centralizado em uma largura de 940px.</w:t>
+      </w:r>
+    </w:p>
+    <w:p>
+      <w:r>
+        <w:t>Aplicando o degrade</w:t>
+      </w:r>
+    </w:p>
+    <w:p>
+      <w:r>
+        <w:rPr>
+          <w:noProof/>
+        </w:rPr>
+        <mc:AlternateContent>
+          <mc:Choice Requires="wps">
+            <w:drawing>
+              <wp:anchor distT="0" distB="0" distL="114300" distR="114300" simplePos="0" relativeHeight="251735040" behindDoc="0" locked="0" layoutInCell="1" allowOverlap="1">
+                <wp:simplePos x="0" y="0"/>
+                <wp:positionH relativeFrom="column">
+                  <wp:posOffset>2082166</wp:posOffset>
+                </wp:positionH>
+                <wp:positionV relativeFrom="paragraph">
+                  <wp:posOffset>145416</wp:posOffset>
+                </wp:positionV>
+                <wp:extent cx="514350" cy="552450"/>
+                <wp:effectExtent l="38100" t="0" r="19050" b="57150"/>
+                <wp:wrapNone/>
+                <wp:docPr id="262" name="Conector de Seta Reta 262"/>
+                <wp:cNvGraphicFramePr/>
+                <a:graphic xmlns:a="http://schemas.openxmlformats.org/drawingml/2006/main">
+                  <a:graphicData uri="http://schemas.microsoft.com/office/word/2010/wordprocessingShape">
+                    <wps:wsp>
+                      <wps:cNvCnPr/>
+                      <wps:spPr>
+                        <a:xfrm flipH="1">
+                          <a:off x="0" y="0"/>
+                          <a:ext cx="514350" cy="552450"/>
+                        </a:xfrm>
+                        <a:prstGeom prst="straightConnector1">
+                          <a:avLst/>
+                        </a:prstGeom>
+                        <a:ln>
+                          <a:tailEnd type="triangle"/>
+                        </a:ln>
+                      </wps:spPr>
+                      <wps:style>
+                        <a:lnRef idx="1">
+                          <a:schemeClr val="accent1"/>
+                        </a:lnRef>
+                        <a:fillRef idx="0">
+                          <a:schemeClr val="accent1"/>
+                        </a:fillRef>
+                        <a:effectRef idx="0">
+                          <a:schemeClr val="accent1"/>
+                        </a:effectRef>
+                        <a:fontRef idx="minor">
+                          <a:schemeClr val="tx1"/>
+                        </a:fontRef>
+                      </wps:style>
+                      <wps:bodyPr/>
+                    </wps:wsp>
+                  </a:graphicData>
+                </a:graphic>
+                <wp14:sizeRelH relativeFrom="margin">
+                  <wp14:pctWidth>0</wp14:pctWidth>
+                </wp14:sizeRelH>
+                <wp14:sizeRelV relativeFrom="margin">
+                  <wp14:pctHeight>0</wp14:pctHeight>
+                </wp14:sizeRelV>
+              </wp:anchor>
+            </w:drawing>
+          </mc:Choice>
+          <mc:Fallback>
+            <w:pict>
+              <v:shapetype w14:anchorId="2DF018DC" id="_x0000_t32" coordsize="21600,21600" o:spt="32" o:oned="t" path="m,l21600,21600e" filled="f">
+                <v:path arrowok="t" fillok="f" o:connecttype="none"/>
+                <o:lock v:ext="edit" shapetype="t"/>
+              </v:shapetype>
+              <v:shape id="Conector de Seta Reta 262" o:spid="_x0000_s1026" type="#_x0000_t32" style="position:absolute;margin-left:163.95pt;margin-top:11.45pt;width:40.5pt;height:43.5pt;flip:x;z-index:251735040;visibility:visible;mso-wrap-style:square;mso-width-percent:0;mso-height-percent:0;mso-wrap-distance-left:9pt;mso-wrap-distance-top:0;mso-wrap-distance-right:9pt;mso-wrap-distance-bottom:0;mso-position-horizontal:absolute;mso-position-horizontal-relative:text;mso-position-vertical:absolute;mso-position-vertical-relative:text;mso-width-percent:0;mso-height-percent:0;mso-width-relative:margin;mso-height-relative:margin" o:gfxdata="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" strokecolor="#4472c4 [3204]" strokeweight=".5pt">
+                <v:stroke endarrow="block" joinstyle="miter"/>
+              </v:shape>
+            </w:pict>
+          </mc:Fallback>
+        </mc:AlternateContent>
+      </w:r>
+      <w:r>
+        <w:t xml:space="preserve">Por fim, aplicamos o degrade na </w:t>
+      </w:r>
+      <w:proofErr w:type="gramStart"/>
+      <w:r>
+        <w:t>seção .mapa</w:t>
+      </w:r>
+      <w:proofErr w:type="gramEnd"/>
+    </w:p>
+    <w:p>
+      <w:r>
+        <w:drawing>
+          <wp:inline distT="0" distB="0" distL="0" distR="0" wp14:anchorId="64337611" wp14:editId="22CC27FA">
+            <wp:extent cx="4163006" cy="933580"/>
+            <wp:effectExtent l="0" t="0" r="9525" b="0"/>
+            <wp:docPr id="261" name="Imagem 261"/>
+            <wp:cNvGraphicFramePr>
+              <a:graphicFrameLocks xmlns:a="http://schemas.openxmlformats.org/drawingml/2006/main" noChangeAspect="1"/>
+            </wp:cNvGraphicFramePr>
+            <a:graphic xmlns:a="http://schemas.openxmlformats.org/drawingml/2006/main">
+              <a:graphicData uri="http://schemas.openxmlformats.org/drawingml/2006/picture">
+                <pic:pic xmlns:pic="http://schemas.openxmlformats.org/drawingml/2006/picture">
+                  <pic:nvPicPr>
+                    <pic:cNvPr id="1" name=""/>
+                    <pic:cNvPicPr/>
+                  </pic:nvPicPr>
+                  <pic:blipFill>
+                    <a:blip r:embed="rId188"/>
+                    <a:stretch>
+                      <a:fillRect/>
+                    </a:stretch>
+                  </pic:blipFill>
+                  <pic:spPr>
+                    <a:xfrm>
+                      <a:off x="0" y="0"/>
+                      <a:ext cx="4163006" cy="933580"/>
+                    </a:xfrm>
+                    <a:prstGeom prst="rect">
+                      <a:avLst/>
+                    </a:prstGeom>
+                  </pic:spPr>
+                </pic:pic>
+              </a:graphicData>
+            </a:graphic>
+          </wp:inline>
+        </w:drawing>
+      </w:r>
+    </w:p>
+    <w:p>
+      <w:r>
+        <w:t>O objetivo é criar uma transição suave entre as cores das seções. Como o mapa está localizado entre a seção principal e a seção de benefícios, o degrade cria uma transição visual entre esses diferentes fundos.</w:t>
       </w:r>
       <w:bookmarkStart w:id="0" w:name="_GoBack"/>
       <w:bookmarkEnd w:id="0"/>
@@ -16431,6 +17070,7 @@
   <w:style w:type="character" w:default="1" w:styleId="Fontepargpadro">
     <w:name w:val="Default Paragraph Font"/>
     <w:uiPriority w:val="1"/>
+    <w:semiHidden/>
     <w:unhideWhenUsed/>
   </w:style>
   <w:style w:type="table" w:default="1" w:styleId="Tabelanormal">
@@ -16803,7 +17443,7 @@
 </file>
 
 <file path=customXml/itemProps1.xml><?xml version="1.0" encoding="utf-8"?>
-<ds:datastoreItem xmlns:ds="http://schemas.openxmlformats.org/officeDocument/2006/customXml" ds:itemID="{CF19CE7D-C335-4F05-B743-D902834F0201}">
+<ds:datastoreItem xmlns:ds="http://schemas.openxmlformats.org/officeDocument/2006/customXml" ds:itemID="{FDDF4CEF-D348-45DC-93E5-6BBC4456C599}">
   <ds:schemaRefs>
     <ds:schemaRef ds:uri="http://schemas.openxmlformats.org/officeDocument/2006/bibliography"/>
   </ds:schemaRefs>

</xml_diff>